<commit_message>
Add literature comparison tables and publication figures to DevSecOps review
</commit_message>
<xml_diff>
--- a/DevSecOps_Review.docx
+++ b/DevSecOps_Review.docx
@@ -418,7 +418,7 @@
         <w:pStyle w:val="BodyText"/>
       </w:pPr>
       <w:r>
-        <w:t xml:space="preserve">Selection was purposive and access-constrained. All five academic manuscripts share a coauthor, creating a substantial concentration of perspective. Author-hosted versions may differ from the final published articles. These constraints permit a transparent, bounded synthesis, but they prevent claims about the prevalence of positions across the entire DevSecOps literature. The proposed broader search protocol is supplied separately.</w:t>
+        <w:t xml:space="preserve">Selection was purposive and access-constrained. All five academic manuscripts share a coauthor, creating a substantial concentration of perspective. Author-hosted versions may differ from the final published articles. These constraints permit a transparent, bounded synthesis, but they prevent claims about the prevalence of positions across the entire DevSecOps literature. A broader, independently reproducible search remains necessary before systematic-review claims are warranted.</w:t>
       </w:r>
     </w:p>
     <w:bookmarkEnd w:id="22"/>
@@ -597,7 +597,7 @@
     </w:p>
     <w:bookmarkEnd w:id="24"/>
     <w:bookmarkEnd w:id="25"/>
-    <w:bookmarkStart w:id="32" w:name="X45abaf4932c3b8ad8c2c0c782801e54e84b52a1"/>
+    <w:bookmarkStart w:id="40" w:name="X45abaf4932c3b8ad8c2c0c782801e54e84b52a1"/>
     <w:p>
       <w:pPr>
         <w:pStyle w:val="Heading2"/>
@@ -734,7 +734,7 @@
       </w:r>
     </w:p>
     <w:bookmarkEnd w:id="29"/>
-    <w:bookmarkStart w:id="30" w:name="X2badc6a0c1d63308f9b349d7f89cb887c75585a"/>
+    <w:bookmarkStart w:id="33" w:name="X2badc6a0c1d63308f9b349d7f89cb887c75585a"/>
     <w:p>
       <w:pPr>
         <w:pStyle w:val="Heading3"/>
@@ -764,33 +764,69 @@
         <w:pStyle w:val="BodyText"/>
       </w:pPr>
       <w:r>
-        <w:t xml:space="preserve">The practical implication is conditional. Combining tools can expand coverage, but correlated rules, noisy results, incomplete mappings, and maintenance burden can limit the gain. The relevant question is the additional correctly identified weaknesses or interrupted attack paths per unit of effort. More alerts alone do not answer it.</w:t>
-      </w:r>
-    </w:p>
-    <w:bookmarkEnd w:id="30"/>
-    <w:bookmarkStart w:id="31" w:name="X067da9fd8030382ef93ab5f82a19b44d6e4767b"/>
-    <w:p>
-      <w:pPr>
-        <w:pStyle w:val="Heading3"/>
-      </w:pPr>
-      <w:r>
-        <w:t xml:space="preserve">3.6 Standards address complementary assurance questions</w:t>
+        <w:t xml:space="preserve">The practical implication is conditional. Combining tools can expand coverage, but correlated rules, noisy results, incomplete mappings, and maintenance burden can limit the gain. The relevant question is the additional correctly identified weaknesses or interrupted attack paths per unit of effort. More alerts alone do not answer it. Figure 1 visualizes the reported precision and recall separately so that distinct detector configurations are not presented as a single improvement estimate.</w:t>
       </w:r>
     </w:p>
     <w:p>
       <w:pPr>
-        <w:pStyle w:val="FirstParagraph"/>
-      </w:pPr>
-      <w:r>
-        <w:t xml:space="preserve">OWASP’s CI/CD taxonomy identifies risks including poisoned pipeline execution, inadequate identity management, credential hygiene, insufficient pipeline access controls, artifact-integrity failures, and limited visibility. Its categories are useful for threat coverage; their existence does not establish incidence rates or the effectiveness of a particular remediation in a particular organization.</w:t>
+        <w:pStyle w:val="BodyText"/>
+        <w:keepNext/>
+        <w:keepLines/>
+      </w:pPr>
+      <w:r>
+        <w:rPr>
+          <w:b/>
+          <w:bCs/>
+        </w:rPr>
+        <w:t xml:space="preserve">Figure 1. Reported detection results in the reviewed Kubernetes configuration study.</w:t>
       </w:r>
     </w:p>
     <w:p>
       <w:pPr>
         <w:pStyle w:val="BodyText"/>
-      </w:pPr>
-      <w:r>
-        <w:t xml:space="preserve">SLSA v1.1 focuses on supply-chain integrity and increasingly strong build guarantees. The reviewed version distinguishes provenance that exists, authenticated provenance from a hosted build platform, and stronger protection against build tampering. This paper deliberately names the reviewed version instead of claiming it is the latest release. SLSA’s own scope excludes guarantees about source-code quality or a producer’s benign intent.</w:t>
+        <w:keepLines/>
+      </w:pPr>
+      <w:r>
+        <w:drawing>
+          <wp:inline>
+            <wp:extent cx="5943600" cy="3219450"/>
+            <wp:effectExtent b="0" l="0" r="0" t="0"/>
+            <wp:docPr descr="Two-panel chart separating best reported individual-tool precision from combined-tool recall in proprietary and open-source datasets." title="" id="31" name="Picture"/>
+            <a:graphic>
+              <a:graphicData uri="http://schemas.openxmlformats.org/drawingml/2006/picture">
+                <pic:pic>
+                  <pic:nvPicPr>
+                    <pic:cNvPr descr="figures/figure_01_detection_results.png" id="32" name="Picture"/>
+                    <pic:cNvPicPr>
+                      <a:picLocks noChangeArrowheads="1" noChangeAspect="1"/>
+                    </pic:cNvPicPr>
+                  </pic:nvPicPr>
+                  <pic:blipFill>
+                    <a:blip r:embed="rId30"/>
+                    <a:stretch>
+                      <a:fillRect/>
+                    </a:stretch>
+                  </pic:blipFill>
+                  <pic:spPr bwMode="auto">
+                    <a:xfrm>
+                      <a:off x="0" y="0"/>
+                      <a:ext cx="5943600" cy="3219450"/>
+                    </a:xfrm>
+                    <a:prstGeom prst="rect">
+                      <a:avLst/>
+                    </a:prstGeom>
+                    <a:noFill/>
+                    <a:ln w="9525">
+                      <a:noFill/>
+                      <a:headEnd/>
+                      <a:tailEnd/>
+                    </a:ln>
+                  </pic:spPr>
+                </pic:pic>
+              </a:graphicData>
+            </a:graphic>
+          </wp:inline>
+        </w:drawing>
       </w:r>
     </w:p>
     <w:p>
@@ -798,15 +834,25 @@
         <w:pStyle w:val="BodyText"/>
       </w:pPr>
       <w:r>
-        <w:t xml:space="preserve">The in-toto specification describes signed metadata and verification of expected supply-chain steps, authorized actors, and artifact relationships. Its contribution is evidence structure and verification semantics. Its protection depends on a correctly specified layout, protected authorization material, and an actual verifier. Recording incomplete materials or accepting overly broad artifact rules can undermine the intended chain.</w:t>
+        <w:t xml:space="preserve">Panel A shows the highest reported individual-tool precision in each dataset; Panel B shows recall when all five tools are combined. The datasets contain 188 proprietary and 356 open-source configuration files. These are different metrics and detector configurations, not before-and-after measurements. The values describe the consulted source version, not current tool rankings; no new uncertainty intervals or experimental results are estimated here.</w:t>
+      </w:r>
+    </w:p>
+    <w:bookmarkEnd w:id="33"/>
+    <w:bookmarkStart w:id="34" w:name="X067da9fd8030382ef93ab5f82a19b44d6e4767b"/>
+    <w:p>
+      <w:pPr>
+        <w:pStyle w:val="Heading3"/>
+      </w:pPr>
+      <w:r>
+        <w:t xml:space="preserve">3.6 Standards address complementary assurance questions</w:t>
       </w:r>
     </w:p>
     <w:p>
       <w:pPr>
-        <w:pStyle w:val="BodyText"/>
-      </w:pPr>
-      <w:r>
-        <w:t xml:space="preserve">OWASP ASVS 5.0.0 provides application-security verification requirements. It is not a scanner and does not automatically verify its own requirements. Some requirements can be supported by automation; others require architectural reasoning, authenticated testing, or manual assessment. Claiming ASVS alignment requires a versioned requirement-to-evidence mapping with stated exclusions.</w:t>
+        <w:pStyle w:val="FirstParagraph"/>
+      </w:pPr>
+      <w:r>
+        <w:t xml:space="preserve">OWASP’s CI/CD taxonomy identifies risks including poisoned pipeline execution, inadequate identity management, credential hygiene, insufficient pipeline access controls, artifact-integrity failures, and limited visibility. Its categories are useful for threat coverage; their existence does not establish incidence rates or the effectiveness of a particular remediation in a particular organization.</w:t>
       </w:r>
     </w:p>
     <w:p>
@@ -814,12 +860,38 @@
         <w:pStyle w:val="BodyText"/>
       </w:pPr>
       <w:r>
-        <w:t xml:space="preserve">OpenSSF’s S2C2F addresses secure consumption of open-source dependencies, while Scorecard exposes security-practice heuristics. These can inform dependency governance, but a practice score is not a calibrated probability of compromise. CISA’s Known Exploited Vulnerabilities catalog supplies evidence of known exploitation for listed vulnerabilities. Absence from that catalog does not establish non-exploitability.</w:t>
+        <w:t xml:space="preserve">SLSA v1.1 focuses on supply-chain integrity and increasingly strong build guarantees. The reviewed version distinguishes provenance that exists, authenticated provenance from a hosted build platform, and stronger protection against build tampering. This paper deliberately names the reviewed version instead of claiming it is the latest release. SLSA’s own scope excludes guarantees about source-code quality or a producer’s benign intent.</w:t>
       </w:r>
     </w:p>
     <w:p>
       <w:pPr>
         <w:pStyle w:val="BodyText"/>
+      </w:pPr>
+      <w:r>
+        <w:t xml:space="preserve">The in-toto specification describes signed metadata and verification of expected supply-chain steps, authorized actors, and artifact relationships. Its contribution is evidence structure and verification semantics. Its protection depends on a correctly specified layout, protected authorization material, and an actual verifier. Recording incomplete materials or accepting overly broad artifact rules can undermine the intended chain.</w:t>
+      </w:r>
+    </w:p>
+    <w:p>
+      <w:pPr>
+        <w:pStyle w:val="BodyText"/>
+      </w:pPr>
+      <w:r>
+        <w:t xml:space="preserve">OWASP ASVS 5.0.0 provides application-security verification requirements. It is not a scanner and does not automatically verify its own requirements. Some requirements can be supported by automation; others require architectural reasoning, authenticated testing, or manual assessment. Claiming ASVS alignment requires a versioned requirement-to-evidence mapping with stated exclusions.</w:t>
+      </w:r>
+    </w:p>
+    <w:p>
+      <w:pPr>
+        <w:pStyle w:val="BodyText"/>
+      </w:pPr>
+      <w:r>
+        <w:t xml:space="preserve">OpenSSF’s S2C2F addresses secure consumption of open-source dependencies, while Scorecard exposes security-practice heuristics. These can inform dependency governance, but a practice score is not a calibrated probability of compromise. CISA’s Known Exploited Vulnerabilities catalog supplies evidence of known exploitation for listed vulnerabilities. Absence from that catalog does not establish non-exploitability.</w:t>
+      </w:r>
+    </w:p>
+    <w:p>
+      <w:pPr>
+        <w:pStyle w:val="BodyText"/>
+        <w:keepNext/>
+        <w:keepLines/>
       </w:pPr>
       <w:r>
         <w:rPr>
@@ -1362,24 +1434,14 @@
         </w:tc>
       </w:tr>
     </w:tbl>
-    <w:bookmarkEnd w:id="31"/>
-    <w:bookmarkEnd w:id="32"/>
-    <w:bookmarkStart w:id="35" w:name="threat-model-and-defensive-objectives"/>
+    <w:bookmarkEnd w:id="34"/>
+    <w:bookmarkStart w:id="38" w:name="Xfe20fc9373e7a0ff39293a9462ec471ae18ab28"/>
     <w:p>
       <w:pPr>
-        <w:pStyle w:val="Heading2"/>
-      </w:pPr>
-      <w:r>
-        <w:t xml:space="preserve">4. Threat Model and Defensive Objectives</w:t>
-      </w:r>
-    </w:p>
-    <w:bookmarkStart w:id="33" w:name="assets-adversaries-and-trust-boundaries"/>
-    <w:p>
-      <w:pPr>
         <w:pStyle w:val="Heading3"/>
       </w:pPr>
       <w:r>
-        <w:t xml:space="preserve">4.1 Assets, adversaries, and trust boundaries</w:t>
+        <w:t xml:space="preserve">3.7 Comparison of the reviewed empirical and secondary studies</w:t>
       </w:r>
     </w:p>
     <w:p>
@@ -1387,207 +1449,1589 @@
         <w:pStyle w:val="FirstParagraph"/>
       </w:pPr>
       <w:r>
-        <w:t xml:space="preserve">The protected assets are source and workflow integrity, credentials, dependency authenticity, build outputs, release decisions, production configuration, and the evidence used to authorize deployment. Confidential source code and application data matter, but this paper focuses on the delivery path and its ability to modify production.</w:t>
+        <w:t xml:space="preserve">Table 2 compares the academic studies by design and evidential contribution. A survey, a mapping study, a mined defect corpus, and a detector evaluation do not provide interchangeable estimates of effectiveness. The comparison therefore retains each study’s unit of analysis and identifies the inference that remains unresolved. It does not rank studies by sample size or treat larger artifact collections as automatically stronger causal evidence.</w:t>
       </w:r>
     </w:p>
     <w:p>
       <w:pPr>
         <w:pStyle w:val="BodyText"/>
-      </w:pPr>
-      <w:r>
-        <w:t xml:space="preserve">Consider adversaries who can submit an untrusted change, compromise a dependency, alter a remotely retrieved build script, exploit a runner, steal a workload credential, or modify an artifact registry. Additional scenarios include a malicious maintainer and an actor with authority to edit security policy. These capabilities differ materially and should not be collapsed into a single</w:t>
-      </w:r>
-      <w:r>
-        <w:t xml:space="preserve"> </w:t>
-      </w:r>
-      <w:r>
-        <w:t xml:space="preserve">“</w:t>
-      </w:r>
-      <w:r>
-        <w:t xml:space="preserve">attacker</w:t>
-      </w:r>
-      <w:r>
-        <w:t xml:space="preserve">”</w:t>
-      </w:r>
-      <w:r>
-        <w:t xml:space="preserve"> </w:t>
-      </w:r>
-      <w:r>
-        <w:t xml:space="preserve">condition.</w:t>
-      </w:r>
-    </w:p>
-    <w:p>
-      <w:pPr>
-        <w:pStyle w:val="BodyText"/>
-      </w:pPr>
-      <w:r>
-        <w:t xml:space="preserve">Trust boundaries separate external contributions from privileged builds; build execution from deployment authorization; artifact storage from artifact acceptance; intended configuration from live state; and operational telemetry from the workloads being monitored. OWASP’s discussion of poisoned pipeline execution explains why protecting only the top-level workflow file is insufficient: tests, build files, plugins, and repository scripts can also execute attacker-controlled commands.</w:t>
-      </w:r>
-    </w:p>
-    <w:p>
-      <w:pPr>
-        <w:pStyle w:val="BodyText"/>
-      </w:pPr>
-      <w:r>
-        <w:t xml:space="preserve">The framework assumes that some root of trust remains intact: for example, protected deployment authorization and its verification keys. If an adversary controls the builder, verifier, policy authority, and logging administration simultaneously, the available evidence cannot establish trustworthy release authorization. Stronger claims require stronger separation or independently operated verification.</w:t>
-      </w:r>
-    </w:p>
-    <w:bookmarkEnd w:id="33"/>
-    <w:bookmarkStart w:id="34" w:name="four-defensive-objectives"/>
-    <w:p>
-      <w:pPr>
-        <w:pStyle w:val="Heading3"/>
-      </w:pPr>
-      <w:r>
-        <w:t xml:space="preserve">4.2 Four defensive objectives</w:t>
-      </w:r>
-    </w:p>
-    <w:p>
-      <w:pPr>
-        <w:pStyle w:val="FirstParagraph"/>
-      </w:pPr>
-      <w:r>
-        <w:t xml:space="preserve">The analysis distinguishes prevention of unauthorized release changes; containment of execution privilege; detection of weaknesses and malicious behavior; and recovery to a known acceptable state. These objectives should be tested separately. A control can fail to prevent an initial execution while still reducing its blast radius or enabling earlier containment.</w:t>
-      </w:r>
-    </w:p>
-    <w:p>
-      <w:pPr>
-        <w:pStyle w:val="BodyText"/>
-      </w:pPr>
-      <w:r>
-        <w:t xml:space="preserve">Defense in depth is most useful when layers address different failure modes or are protected by different authorities. Five scanners running under the same compromised identity may provide less independent assurance than fewer controls distributed across build isolation, authorization, artifact verification, and runtime observation. Counting layers without examining common dependencies overstates resilience.</w:t>
-      </w:r>
-    </w:p>
-    <w:bookmarkEnd w:id="34"/>
-    <w:bookmarkEnd w:id="35"/>
-    <w:bookmarkStart w:id="40" w:name="Xf812c86dd1bcdc9043a78155193fd70381cff6b"/>
-    <w:p>
-      <w:pPr>
-        <w:pStyle w:val="Heading2"/>
-      </w:pPr>
-      <w:r>
-        <w:t xml:space="preserve">5. Historical Failures and the Limits of Proposed Remedies</w:t>
-      </w:r>
-    </w:p>
-    <w:p>
-      <w:pPr>
-        <w:pStyle w:val="FirstParagraph"/>
-      </w:pPr>
-      <w:r>
-        <w:t xml:space="preserve">Historical incidents illustrate mechanisms; they do not prove that a proposed control would have prevented every stage of the actual attack. SolarWinds and Codecov are discussed using published security-taxonomy and supply-chain-framework summaries. Those primary incident reports were not independently retrieved for this review. Log4Shell’s known exploitation is supported directly by CISA’s catalog entry for CVE-2021-44228. Counterfactual defenses below are this paper’s analysis.</w:t>
-      </w:r>
-    </w:p>
-    <w:bookmarkStart w:id="36" w:name="X9f6b0e9c5cd0cfdb1a8014ad5687405aedc004c"/>
-    <w:p>
-      <w:pPr>
-        <w:pStyle w:val="Heading3"/>
-      </w:pPr>
-      <w:r>
-        <w:t xml:space="preserve">5.1 SolarWinds: trusted distribution can preserve malicious output</w:t>
-      </w:r>
-    </w:p>
-    <w:p>
-      <w:pPr>
-        <w:pStyle w:val="FirstParagraph"/>
-      </w:pPr>
-      <w:r>
-        <w:t xml:space="preserve">The SolarWinds incident illustrates compromise of a software production process, rather than merely the inclusion of an obviously vulnerable dependency. The central defensive error is to treat delivery through a recognized producer’s release channel as sufficient evidence of benign content.</w:t>
-      </w:r>
-    </w:p>
-    <w:p>
-      <w:pPr>
-        <w:pStyle w:val="BodyText"/>
-      </w:pPr>
-      <w:r>
-        <w:t xml:space="preserve">A proposed response combines protected build infrastructure, restricted workflow changes, trustworthy provenance, and verification at the point of consumption. For appropriate threat models, independently operated reproducible builds can supply additional evidence. These controls address different questions: provenance describes an artifact’s production; reproducibility compares independently produced outputs; application testing examines behavior.</w:t>
-      </w:r>
-    </w:p>
-    <w:p>
-      <w:pPr>
-        <w:pStyle w:val="BodyText"/>
-      </w:pPr>
-      <w:r>
-        <w:t xml:space="preserve">None of these mechanisms alone proves benign intent. A malicious source change may be reproducibly built and correctly signed. A compromised authority may authenticate misleading evidence. The research requirement is therefore to specify which actor or stage may be compromised and which independent check is expected to expose the discrepancy.</w:t>
-      </w:r>
-    </w:p>
-    <w:bookmarkEnd w:id="36"/>
-    <w:bookmarkStart w:id="37" w:name="X56941c5ad4450349a27debc973190bbfe7442e9"/>
-    <w:p>
-      <w:pPr>
-        <w:pStyle w:val="Heading3"/>
-      </w:pPr>
-      <w:r>
-        <w:t xml:space="preserve">5.2 Codecov: build-time helpers can inherit excessive authority</w:t>
-      </w:r>
-    </w:p>
-    <w:p>
-      <w:pPr>
-        <w:pStyle w:val="FirstParagraph"/>
-      </w:pPr>
-      <w:r>
-        <w:t xml:space="preserve">The Codecov incident illustrates how a compromised externally supplied CI helper can access sensitive information available to a build. Its lesson extends beyond source scanning: operational convenience often grants third-party code the authority of the whole job.</w:t>
-      </w:r>
-    </w:p>
-    <w:p>
-      <w:pPr>
-        <w:pStyle w:val="BodyText"/>
-      </w:pPr>
-      <w:r>
-        <w:t xml:space="preserve">Proposed defenses include immutable dependency references, integrity verification against an independently trusted expectation, separation of low-trust tooling from credential-bearing stages, narrowly scoped temporary credentials, and restricted network egress. A checksum fetched from the same compromised location as its payload supplies weak independent evidence. Similarly, a pinned revision fixes identity but does not establish that the fixed content is benign.</w:t>
-      </w:r>
-    </w:p>
-    <w:p>
-      <w:pPr>
-        <w:pStyle w:val="BodyText"/>
-      </w:pPr>
-      <w:r>
-        <w:t xml:space="preserve">Temporary credentials reduce the duration of exposure; they do not prevent misuse during their validity. Workload identity based on OpenID Connect requires constrained trust conditions, such as expected repository, audience, and execution context. A broad federation policy can simply replace a long-lived overprivileged secret with a repeatedly obtainable overprivileged token.</w:t>
-      </w:r>
-    </w:p>
-    <w:bookmarkEnd w:id="37"/>
-    <w:bookmarkStart w:id="38" w:name="Xb58bba2d1b226d5930f829613527f2e8bf4a9d0"/>
-    <w:p>
-      <w:pPr>
-        <w:pStyle w:val="Heading3"/>
-      </w:pPr>
-      <w:r>
-        <w:t xml:space="preserve">5.3 Log4Shell: inventory is useful only when it drives response</w:t>
-      </w:r>
-    </w:p>
-    <w:p>
-      <w:pPr>
-        <w:pStyle w:val="FirstParagraph"/>
-      </w:pPr>
-      <w:r>
-        <w:t xml:space="preserve">CISA identifies CVE-2021-44228 in Apache Log4j2 as a known exploited remote-code-execution vulnerability. This failure differs from build tampering: a legitimate dependency can introduce exploitable behavior into deployed applications.</w:t>
-      </w:r>
-    </w:p>
-    <w:p>
-      <w:pPr>
-        <w:pStyle w:val="BodyText"/>
-      </w:pPr>
-      <w:r>
-        <w:t xml:space="preserve">An artifact-linked software bill of materials (SBOM) can help locate potentially affected releases. Its usefulness depends on inventory completeness, component identification, connection to deployment records, and the organization’s ability to update or contain affected systems. The SBOM itself neither patches a component nor proves whether a vulnerable code path is reachable.</w:t>
-      </w:r>
-    </w:p>
-    <w:p>
-      <w:pPr>
-        <w:pStyle w:val="BodyText"/>
-      </w:pPr>
-      <w:r>
-        <w:t xml:space="preserve">The proposed response links dependency inventory to deployed artifact digests, rescans retained inventories when new advisories appear, validates affected configurations, and rehearses patching or containment. Reachability analysis can prioritize investigation, but uncertain analysis should not be converted into a confident finding of non-exploitability. A signed vulnerability assessment must still carry supporting evidence and a revision policy.</w:t>
-      </w:r>
-    </w:p>
-    <w:p>
-      <w:pPr>
-        <w:pStyle w:val="BodyText"/>
+        <w:keepNext/>
+        <w:keepLines/>
       </w:pPr>
       <w:r>
         <w:rPr>
           <w:b/>
           <w:bCs/>
         </w:rPr>
-        <w:t xml:space="preserve">Table 2. Historical mechanism, proposed defense, and residual limitation.</w:t>
+        <w:t xml:space="preserve">Table 2. Comparison of research designs, samples, contributions, and limitations.</w:t>
+      </w:r>
+    </w:p>
+    <w:tbl>
+      <w:tblPr>
+        <w:tblStyle w:val="Table"/>
+        <w:tblW w:type="pct" w:w="5000"/>
+        <w:jc w:val="left"/>
+        <w:tblLayout w:type="fixed"/>
+        <w:tblLook w:firstRow="1" w:lastRow="0" w:firstColumn="0" w:lastColumn="0" w:noHBand="0" w:noVBand="0" w:val="0020"/>
+      </w:tblPr>
+      <w:tblGrid>
+        <w:gridCol w:w="2110"/>
+        <w:gridCol w:w="2685"/>
+        <w:gridCol w:w="2589"/>
+        <w:gridCol w:w="2206"/>
+      </w:tblGrid>
+      <w:tr>
+        <w:trPr>
+          <w:tblHeader w:val="on"/>
+          <w:cantSplit/>
+          <w:tblHeader/>
+        </w:trPr>
+        <w:tc>
+          <w:tcPr>
+            <w:tcW w:type="dxa" w:w="2110"/>
+            <w:shd w:fill="18354D"/>
+          </w:tcPr>
+          <w:p>
+            <w:pPr>
+              <w:pStyle w:val="Compact"/>
+              <w:spacing w:after="80" w:before="60" w:line="252" w:lineRule="auto"/>
+              <w:jc w:val="left"/>
+            </w:pPr>
+            <w:r>
+              <w:rPr>
+                <w:rFonts w:ascii="Calibri" w:hAnsi="Calibri"/>
+                <w:b/>
+                <w:color w:val="FFFFFF"/>
+                <w:sz w:val="18"/>
+              </w:rPr>
+              <w:t xml:space="preserve">Study focus</w:t>
+            </w:r>
+          </w:p>
+        </w:tc>
+        <w:tc>
+          <w:tcPr>
+            <w:tcW w:type="dxa" w:w="2685"/>
+            <w:shd w:fill="18354D"/>
+          </w:tcPr>
+          <w:p>
+            <w:pPr>
+              <w:pStyle w:val="Compact"/>
+              <w:spacing w:after="80" w:before="60" w:line="252" w:lineRule="auto"/>
+              <w:jc w:val="left"/>
+            </w:pPr>
+            <w:r>
+              <w:rPr>
+                <w:rFonts w:ascii="Calibri" w:hAnsi="Calibri"/>
+                <w:b/>
+                <w:color w:val="FFFFFF"/>
+                <w:sz w:val="18"/>
+              </w:rPr>
+              <w:t xml:space="preserve">Design and sample</w:t>
+            </w:r>
+          </w:p>
+        </w:tc>
+        <w:tc>
+          <w:tcPr>
+            <w:tcW w:type="dxa" w:w="2589"/>
+            <w:shd w:fill="18354D"/>
+          </w:tcPr>
+          <w:p>
+            <w:pPr>
+              <w:pStyle w:val="Compact"/>
+              <w:spacing w:after="80" w:before="60" w:line="252" w:lineRule="auto"/>
+              <w:jc w:val="left"/>
+            </w:pPr>
+            <w:r>
+              <w:rPr>
+                <w:rFonts w:ascii="Calibri" w:hAnsi="Calibri"/>
+                <w:b/>
+                <w:color w:val="FFFFFF"/>
+                <w:sz w:val="18"/>
+              </w:rPr>
+              <w:t xml:space="preserve">Contribution to this review</w:t>
+            </w:r>
+          </w:p>
+        </w:tc>
+        <w:tc>
+          <w:tcPr>
+            <w:tcW w:type="dxa" w:w="2206"/>
+            <w:shd w:fill="18354D"/>
+          </w:tcPr>
+          <w:p>
+            <w:pPr>
+              <w:pStyle w:val="Compact"/>
+              <w:spacing w:after="80" w:before="60" w:line="252" w:lineRule="auto"/>
+              <w:jc w:val="left"/>
+            </w:pPr>
+            <w:r>
+              <w:rPr>
+                <w:rFonts w:ascii="Calibri" w:hAnsi="Calibri"/>
+                <w:b/>
+                <w:color w:val="FFFFFF"/>
+                <w:sz w:val="18"/>
+              </w:rPr>
+              <w:t xml:space="preserve">Limitation and resulting research need</w:t>
+            </w:r>
+          </w:p>
+        </w:tc>
+      </w:tr>
+      <w:tr>
+        <w:trPr>
+          <w:cantSplit/>
+        </w:trPr>
+        <w:tc>
+          <w:tcPr>
+            <w:tcW w:type="dxa" w:w="2110"/>
+            <w:shd w:fill="F0F4F7"/>
+          </w:tcPr>
+          <w:p>
+            <w:pPr>
+              <w:pStyle w:val="Compact"/>
+              <w:spacing w:after="80" w:before="60" w:line="252" w:lineRule="auto"/>
+              <w:jc w:val="left"/>
+            </w:pPr>
+            <w:r>
+              <w:rPr>
+                <w:rFonts w:ascii="Calibri" w:hAnsi="Calibri"/>
+                <w:sz w:val="18"/>
+              </w:rPr>
+              <w:t xml:space="preserve">Organizational integration</w:t>
+            </w:r>
+          </w:p>
+        </w:tc>
+        <w:tc>
+          <w:tcPr>
+            <w:tcW w:type="dxa" w:w="2685"/>
+            <w:shd w:fill="F0F4F7"/>
+          </w:tcPr>
+          <w:p>
+            <w:pPr>
+              <w:pStyle w:val="Compact"/>
+              <w:spacing w:after="80" w:before="60" w:line="252" w:lineRule="auto"/>
+              <w:jc w:val="left"/>
+            </w:pPr>
+            <w:r>
+              <w:rPr>
+                <w:rFonts w:ascii="Calibri" w:hAnsi="Calibri"/>
+                <w:sz w:val="18"/>
+              </w:rPr>
+              <w:t xml:space="preserve">Exploratory artifact analysis and survey of nine organizations</w:t>
+            </w:r>
+          </w:p>
+        </w:tc>
+        <w:tc>
+          <w:tcPr>
+            <w:tcW w:type="dxa" w:w="2589"/>
+            <w:shd w:fill="F0F4F7"/>
+          </w:tcPr>
+          <w:p>
+            <w:pPr>
+              <w:pStyle w:val="Compact"/>
+              <w:spacing w:after="80" w:before="60" w:line="252" w:lineRule="auto"/>
+              <w:jc w:val="left"/>
+            </w:pPr>
+            <w:r>
+              <w:rPr>
+                <w:rFonts w:ascii="Calibri" w:hAnsi="Calibri"/>
+                <w:sz w:val="18"/>
+              </w:rPr>
+              <w:t xml:space="preserve">Collaboration, security requirements, and shared practices help explain adoption</w:t>
+            </w:r>
+          </w:p>
+        </w:tc>
+        <w:tc>
+          <w:tcPr>
+            <w:tcW w:type="dxa" w:w="2206"/>
+            <w:shd w:fill="F0F4F7"/>
+          </w:tcPr>
+          <w:p>
+            <w:pPr>
+              <w:pStyle w:val="Compact"/>
+              <w:spacing w:after="80" w:before="60" w:line="252" w:lineRule="auto"/>
+              <w:jc w:val="left"/>
+            </w:pPr>
+            <w:r>
+              <w:rPr>
+                <w:rFonts w:ascii="Calibri" w:hAnsi="Calibri"/>
+                <w:sz w:val="18"/>
+              </w:rPr>
+              <w:t xml:space="preserve">Self-report and a small organizational sample do not establish breach reduction; evaluate behavior and outcomes longitudinally</w:t>
+            </w:r>
+          </w:p>
+        </w:tc>
+      </w:tr>
+      <w:tr>
+        <w:trPr>
+          <w:cantSplit/>
+        </w:trPr>
+        <w:tc>
+          <w:tcPr>
+            <w:tcW w:type="dxa" w:w="2110"/>
+          </w:tcPr>
+          <w:p>
+            <w:pPr>
+              <w:pStyle w:val="Compact"/>
+              <w:spacing w:after="80" w:before="60" w:line="252" w:lineRule="auto"/>
+              <w:jc w:val="left"/>
+            </w:pPr>
+            <w:r>
+              <w:rPr>
+                <w:rFonts w:ascii="Calibri" w:hAnsi="Calibri"/>
+                <w:sz w:val="18"/>
+              </w:rPr>
+              <w:t xml:space="preserve">Historical IaC research landscape</w:t>
+            </w:r>
+          </w:p>
+        </w:tc>
+        <w:tc>
+          <w:tcPr>
+            <w:tcW w:type="dxa" w:w="2685"/>
+          </w:tcPr>
+          <w:p>
+            <w:pPr>
+              <w:pStyle w:val="Compact"/>
+              <w:spacing w:after="80" w:before="60" w:line="252" w:lineRule="auto"/>
+              <w:jc w:val="left"/>
+            </w:pPr>
+            <w:r>
+              <w:rPr>
+                <w:rFonts w:ascii="Calibri" w:hAnsi="Calibri"/>
+                <w:sz w:val="18"/>
+              </w:rPr>
+              <w:t xml:space="preserve">Systematic mapping of 32 publications; collection completed in 2017</w:t>
+            </w:r>
+          </w:p>
+        </w:tc>
+        <w:tc>
+          <w:tcPr>
+            <w:tcW w:type="dxa" w:w="2589"/>
+          </w:tcPr>
+          <w:p>
+            <w:pPr>
+              <w:pStyle w:val="Compact"/>
+              <w:spacing w:after="80" w:before="60" w:line="252" w:lineRule="auto"/>
+              <w:jc w:val="left"/>
+            </w:pPr>
+            <w:r>
+              <w:rPr>
+                <w:rFonts w:ascii="Calibri" w:hAnsi="Calibri"/>
+                <w:sz w:val="18"/>
+              </w:rPr>
+              <w:t xml:space="preserve">Half of the selected corpus concerns frameworks or tools, distinguishing proposals from evaluated outcomes</w:t>
+            </w:r>
+          </w:p>
+        </w:tc>
+        <w:tc>
+          <w:tcPr>
+            <w:tcW w:type="dxa" w:w="2206"/>
+          </w:tcPr>
+          <w:p>
+            <w:pPr>
+              <w:pStyle w:val="Compact"/>
+              <w:spacing w:after="80" w:before="60" w:line="252" w:lineRule="auto"/>
+              <w:jc w:val="left"/>
+            </w:pPr>
+            <w:r>
+              <w:rPr>
+                <w:rFonts w:ascii="Calibri" w:hAnsi="Calibri"/>
+                <w:sz w:val="18"/>
+              </w:rPr>
+              <w:t xml:space="preserve">Historical and search-dependent coverage cannot describe today’s field; repeat searches and compare evaluation maturity</w:t>
+            </w:r>
+          </w:p>
+        </w:tc>
+      </w:tr>
+      <w:tr>
+        <w:trPr>
+          <w:cantSplit/>
+        </w:trPr>
+        <w:tc>
+          <w:tcPr>
+            <w:tcW w:type="dxa" w:w="2110"/>
+            <w:shd w:fill="F0F4F7"/>
+          </w:tcPr>
+          <w:p>
+            <w:pPr>
+              <w:pStyle w:val="Compact"/>
+              <w:spacing w:after="80" w:before="60" w:line="252" w:lineRule="auto"/>
+              <w:jc w:val="left"/>
+            </w:pPr>
+            <w:r>
+              <w:rPr>
+                <w:rFonts w:ascii="Calibri" w:hAnsi="Calibri"/>
+                <w:sz w:val="18"/>
+              </w:rPr>
+              <w:t xml:space="preserve">Security smells in IaC</w:t>
+            </w:r>
+          </w:p>
+        </w:tc>
+        <w:tc>
+          <w:tcPr>
+            <w:tcW w:type="dxa" w:w="2685"/>
+            <w:shd w:fill="F0F4F7"/>
+          </w:tcPr>
+          <w:p>
+            <w:pPr>
+              <w:pStyle w:val="Compact"/>
+              <w:spacing w:after="80" w:before="60" w:line="252" w:lineRule="auto"/>
+              <w:jc w:val="left"/>
+            </w:pPr>
+            <w:r>
+              <w:rPr>
+                <w:rFonts w:ascii="Calibri" w:hAnsi="Calibri"/>
+                <w:sz w:val="18"/>
+              </w:rPr>
+              <w:t xml:space="preserve">Static-analysis study of 15,232 scripts from 293 open-source repositories</w:t>
+            </w:r>
+          </w:p>
+        </w:tc>
+        <w:tc>
+          <w:tcPr>
+            <w:tcW w:type="dxa" w:w="2589"/>
+            <w:shd w:fill="F0F4F7"/>
+          </w:tcPr>
+          <w:p>
+            <w:pPr>
+              <w:pStyle w:val="Compact"/>
+              <w:spacing w:after="80" w:before="60" w:line="252" w:lineRule="auto"/>
+              <w:jc w:val="left"/>
+            </w:pPr>
+            <w:r>
+              <w:rPr>
+                <w:rFonts w:ascii="Calibri" w:hAnsi="Calibri"/>
+                <w:sz w:val="18"/>
+              </w:rPr>
+              <w:t xml:space="preserve">Recurring configuration weaknesses motivate automated inspection and contextual triage</w:t>
+            </w:r>
+          </w:p>
+        </w:tc>
+        <w:tc>
+          <w:tcPr>
+            <w:tcW w:type="dxa" w:w="2206"/>
+            <w:shd w:fill="F0F4F7"/>
+          </w:tcPr>
+          <w:p>
+            <w:pPr>
+              <w:pStyle w:val="Compact"/>
+              <w:spacing w:after="80" w:before="60" w:line="252" w:lineRule="auto"/>
+              <w:jc w:val="left"/>
+            </w:pPr>
+            <w:r>
+              <w:rPr>
+                <w:rFonts w:ascii="Calibri" w:hAnsi="Calibri"/>
+                <w:sz w:val="18"/>
+              </w:rPr>
+              <w:t xml:space="preserve">A smell is not a confirmed exploit; validate rules in additional languages and deployed contexts</w:t>
+            </w:r>
+          </w:p>
+        </w:tc>
+      </w:tr>
+      <w:tr>
+        <w:trPr>
+          <w:cantSplit/>
+        </w:trPr>
+        <w:tc>
+          <w:tcPr>
+            <w:tcW w:type="dxa" w:w="2110"/>
+          </w:tcPr>
+          <w:p>
+            <w:pPr>
+              <w:pStyle w:val="Compact"/>
+              <w:spacing w:after="80" w:before="60" w:line="252" w:lineRule="auto"/>
+              <w:jc w:val="left"/>
+            </w:pPr>
+            <w:r>
+              <w:rPr>
+                <w:rFonts w:ascii="Calibri" w:hAnsi="Calibri"/>
+                <w:sz w:val="18"/>
+              </w:rPr>
+              <w:t xml:space="preserve">State reconciliation</w:t>
+            </w:r>
+          </w:p>
+        </w:tc>
+        <w:tc>
+          <w:tcPr>
+            <w:tcW w:type="dxa" w:w="2685"/>
+          </w:tcPr>
+          <w:p>
+            <w:pPr>
+              <w:pStyle w:val="Compact"/>
+              <w:spacing w:after="80" w:before="60" w:line="252" w:lineRule="auto"/>
+              <w:jc w:val="left"/>
+            </w:pPr>
+            <w:r>
+              <w:rPr>
+                <w:rFonts w:ascii="Calibri" w:hAnsi="Calibri"/>
+                <w:sz w:val="18"/>
+              </w:rPr>
+              <w:t xml:space="preserve">Analysis of 5,110 Ansible-related defects, yielding eight categories</w:t>
+            </w:r>
+          </w:p>
+        </w:tc>
+        <w:tc>
+          <w:tcPr>
+            <w:tcW w:type="dxa" w:w="2589"/>
+          </w:tcPr>
+          <w:p>
+            <w:pPr>
+              <w:pStyle w:val="Compact"/>
+              <w:spacing w:after="80" w:before="60" w:line="252" w:lineRule="auto"/>
+              <w:jc w:val="left"/>
+            </w:pPr>
+            <w:r>
+              <w:rPr>
+                <w:rFonts w:ascii="Calibri" w:hAnsi="Calibri"/>
+                <w:sz w:val="18"/>
+              </w:rPr>
+              <w:t xml:space="preserve">Execution-engine behavior can invalidate assumptions based only on approved configuration text</w:t>
+            </w:r>
+          </w:p>
+        </w:tc>
+        <w:tc>
+          <w:tcPr>
+            <w:tcW w:type="dxa" w:w="2206"/>
+          </w:tcPr>
+          <w:p>
+            <w:pPr>
+              <w:pStyle w:val="Compact"/>
+              <w:spacing w:after="80" w:before="60" w:line="252" w:lineRule="auto"/>
+              <w:jc w:val="left"/>
+            </w:pPr>
+            <w:r>
+              <w:rPr>
+                <w:rFonts w:ascii="Calibri" w:hAnsi="Calibri"/>
+                <w:sz w:val="18"/>
+              </w:rPr>
+              <w:t xml:space="preserve">Findings are tied to the investigated orchestrator; test state transitions and live effects in other systems</w:t>
+            </w:r>
+          </w:p>
+        </w:tc>
+      </w:tr>
+      <w:tr>
+        <w:trPr>
+          <w:cantSplit/>
+        </w:trPr>
+        <w:tc>
+          <w:tcPr>
+            <w:tcW w:type="dxa" w:w="2110"/>
+            <w:shd w:fill="F0F4F7"/>
+          </w:tcPr>
+          <w:p>
+            <w:pPr>
+              <w:pStyle w:val="Compact"/>
+              <w:spacing w:after="80" w:before="60" w:line="252" w:lineRule="auto"/>
+              <w:jc w:val="left"/>
+            </w:pPr>
+            <w:r>
+              <w:rPr>
+                <w:rFonts w:ascii="Calibri" w:hAnsi="Calibri"/>
+                <w:sz w:val="18"/>
+              </w:rPr>
+              <w:t xml:space="preserve">Kubernetes configuration detection</w:t>
+            </w:r>
+          </w:p>
+        </w:tc>
+        <w:tc>
+          <w:tcPr>
+            <w:tcW w:type="dxa" w:w="2685"/>
+            <w:shd w:fill="F0F4F7"/>
+          </w:tcPr>
+          <w:p>
+            <w:pPr>
+              <w:pStyle w:val="Compact"/>
+              <w:spacing w:after="80" w:before="60" w:line="252" w:lineRule="auto"/>
+              <w:jc w:val="left"/>
+            </w:pPr>
+            <w:r>
+              <w:rPr>
+                <w:rFonts w:ascii="Calibri" w:hAnsi="Calibri"/>
+                <w:sz w:val="18"/>
+              </w:rPr>
+              <w:t xml:space="preserve">Five tools; 53 prescribed configurations; 544 files and 20 survey respondents</w:t>
+            </w:r>
+          </w:p>
+        </w:tc>
+        <w:tc>
+          <w:tcPr>
+            <w:tcW w:type="dxa" w:w="2589"/>
+            <w:shd w:fill="F0F4F7"/>
+          </w:tcPr>
+          <w:p>
+            <w:pPr>
+              <w:pStyle w:val="Compact"/>
+              <w:spacing w:after="80" w:before="60" w:line="252" w:lineRule="auto"/>
+              <w:jc w:val="left"/>
+            </w:pPr>
+            <w:r>
+              <w:rPr>
+                <w:rFonts w:ascii="Calibri" w:hAnsi="Calibri"/>
+                <w:sz w:val="18"/>
+              </w:rPr>
+              <w:t xml:space="preserve">Reported precision and combined-tool recall reveal detection limitations despite tool availability</w:t>
+            </w:r>
+          </w:p>
+        </w:tc>
+        <w:tc>
+          <w:tcPr>
+            <w:tcW w:type="dxa" w:w="2206"/>
+            <w:shd w:fill="F0F4F7"/>
+          </w:tcPr>
+          <w:p>
+            <w:pPr>
+              <w:pStyle w:val="Compact"/>
+              <w:spacing w:after="80" w:before="60" w:line="252" w:lineRule="auto"/>
+              <w:jc w:val="left"/>
+            </w:pPr>
+            <w:r>
+              <w:rPr>
+                <w:rFonts w:ascii="Calibri" w:hAnsi="Calibri"/>
+                <w:sz w:val="18"/>
+              </w:rPr>
+              <w:t xml:space="preserve">Results depend on versions, rule mappings, and datasets; validate independently and reconcile source-version discrepancies</w:t>
+            </w:r>
+          </w:p>
+        </w:tc>
+      </w:tr>
+    </w:tbl>
+    <w:p>
+      <w:pPr>
+        <w:pStyle w:val="BodyText"/>
+      </w:pPr>
+      <w:r>
+        <w:t xml:space="preserve">The repeated gap across these designs is the distance between an intermediate observation and an operational outcome. Reported collaboration does not prove correct authorization; detected smells do not prove containment; a compliant configuration file does not prove correct execution. Figure 2 maps these evidence streams to the questions the proposed framework must still answer.</w:t>
+      </w:r>
+    </w:p>
+    <w:p>
+      <w:pPr>
+        <w:pStyle w:val="BodyText"/>
+        <w:keepNext/>
+        <w:keepLines/>
+      </w:pPr>
+      <w:r>
+        <w:rPr>
+          <w:b/>
+          <w:bCs/>
+        </w:rPr>
+        <w:t xml:space="preserve">Figure 2. Evidence map linking reviewed literature and incidents to unresolved assurance questions.</w:t>
+      </w:r>
+    </w:p>
+    <w:p>
+      <w:pPr>
+        <w:pStyle w:val="BodyText"/>
+        <w:keepLines/>
+      </w:pPr>
+      <w:r>
+        <w:drawing>
+          <wp:inline>
+            <wp:extent cx="5943600" cy="4044950"/>
+            <wp:effectExtent b="0" l="0" r="0" t="0"/>
+            <wp:docPr descr="Three evidence streams—academic studies, specifications, and incidents—feed a synthesis of adoption, detection, verification, and runtime reassessment." title="" id="36" name="Picture"/>
+            <a:graphic>
+              <a:graphicData uri="http://schemas.openxmlformats.org/drawingml/2006/picture">
+                <pic:pic>
+                  <pic:nvPicPr>
+                    <pic:cNvPr descr="figures/figure_02_evidence_map.png" id="37" name="Picture"/>
+                    <pic:cNvPicPr>
+                      <a:picLocks noChangeArrowheads="1" noChangeAspect="1"/>
+                    </pic:cNvPicPr>
+                  </pic:nvPicPr>
+                  <pic:blipFill>
+                    <a:blip r:embed="rId35"/>
+                    <a:stretch>
+                      <a:fillRect/>
+                    </a:stretch>
+                  </pic:blipFill>
+                  <pic:spPr bwMode="auto">
+                    <a:xfrm>
+                      <a:off x="0" y="0"/>
+                      <a:ext cx="5943600" cy="4044950"/>
+                    </a:xfrm>
+                    <a:prstGeom prst="rect">
+                      <a:avLst/>
+                    </a:prstGeom>
+                    <a:noFill/>
+                    <a:ln w="9525">
+                      <a:noFill/>
+                      <a:headEnd/>
+                      <a:tailEnd/>
+                    </a:ln>
+                  </pic:spPr>
+                </pic:pic>
+              </a:graphicData>
+            </a:graphic>
+          </wp:inline>
+        </w:drawing>
+      </w:r>
+    </w:p>
+    <w:p>
+      <w:pPr>
+        <w:pStyle w:val="BodyText"/>
+      </w:pPr>
+      <w:r>
+        <w:t xml:space="preserve">This is a conceptual synthesis of the selected material. Arrows show how the analysis informs research questions; they do not indicate causality, effect size, a completed systematic-search flow, or a validated maturity scale. The final assurance chain is a proposed response to the identified boundaries, not a result demonstrated by the reviewed studies.</w:t>
+      </w:r>
+    </w:p>
+    <w:bookmarkEnd w:id="38"/>
+    <w:bookmarkStart w:id="39" w:name="X1fba8febed7d1cf35e548d2d4ca78500be75eac"/>
+    <w:p>
+      <w:pPr>
+        <w:pStyle w:val="Heading3"/>
+      </w:pPr>
+      <w:r>
+        <w:t xml:space="preserve">3.8 Comparison of complementary security frameworks</w:t>
+      </w:r>
+    </w:p>
+    <w:p>
+      <w:pPr>
+        <w:pStyle w:val="FirstParagraph"/>
+      </w:pPr>
+      <w:r>
+        <w:t xml:space="preserve">Table 3 compares the primary assurance question addressed by each reviewed framework or information source. The entries describe mechanisms and intended scope, not benchmark results or exclusive capabilities. Their complementarity explains why adopting a single checklist, inventory, or signature mechanism cannot establish end-to-end delivery security.</w:t>
+      </w:r>
+    </w:p>
+    <w:p>
+      <w:pPr>
+        <w:pStyle w:val="BodyText"/>
+        <w:keepNext/>
+        <w:keepLines/>
+      </w:pPr>
+      <w:r>
+        <w:rPr>
+          <w:b/>
+          <w:bCs/>
+        </w:rPr>
+        <w:t xml:space="preserve">Table 3. Comparison of security frameworks, evidence mechanisms, and remaining uncertainty.</w:t>
+      </w:r>
+    </w:p>
+    <w:tbl>
+      <w:tblPr>
+        <w:tblStyle w:val="Table"/>
+        <w:tblW w:type="pct" w:w="5000"/>
+        <w:jc w:val="left"/>
+        <w:tblLayout w:type="fixed"/>
+        <w:tblLook w:firstRow="1" w:lastRow="0" w:firstColumn="0" w:lastColumn="0" w:noHBand="0" w:noVBand="0" w:val="0020"/>
+      </w:tblPr>
+      <w:tblGrid>
+        <w:gridCol w:w="2110"/>
+        <w:gridCol w:w="2685"/>
+        <w:gridCol w:w="2589"/>
+        <w:gridCol w:w="2206"/>
+      </w:tblGrid>
+      <w:tr>
+        <w:trPr>
+          <w:tblHeader w:val="on"/>
+          <w:cantSplit/>
+          <w:tblHeader/>
+        </w:trPr>
+        <w:tc>
+          <w:tcPr>
+            <w:tcW w:type="dxa" w:w="2110"/>
+            <w:shd w:fill="18354D"/>
+          </w:tcPr>
+          <w:p>
+            <w:pPr>
+              <w:pStyle w:val="Compact"/>
+              <w:spacing w:after="80" w:before="60" w:line="252" w:lineRule="auto"/>
+              <w:jc w:val="left"/>
+            </w:pPr>
+            <w:r>
+              <w:rPr>
+                <w:rFonts w:ascii="Calibri" w:hAnsi="Calibri"/>
+                <w:b/>
+                <w:color w:val="FFFFFF"/>
+                <w:sz w:val="18"/>
+              </w:rPr>
+              <w:t xml:space="preserve">Framework or source</w:t>
+            </w:r>
+          </w:p>
+        </w:tc>
+        <w:tc>
+          <w:tcPr>
+            <w:tcW w:type="dxa" w:w="2685"/>
+            <w:shd w:fill="18354D"/>
+          </w:tcPr>
+          <w:p>
+            <w:pPr>
+              <w:pStyle w:val="Compact"/>
+              <w:spacing w:after="80" w:before="60" w:line="252" w:lineRule="auto"/>
+              <w:jc w:val="left"/>
+            </w:pPr>
+            <w:r>
+              <w:rPr>
+                <w:rFonts w:ascii="Calibri" w:hAnsi="Calibri"/>
+                <w:b/>
+                <w:color w:val="FFFFFF"/>
+                <w:sz w:val="18"/>
+              </w:rPr>
+              <w:t xml:space="preserve">Primary question addressed</w:t>
+            </w:r>
+          </w:p>
+        </w:tc>
+        <w:tc>
+          <w:tcPr>
+            <w:tcW w:type="dxa" w:w="2589"/>
+            <w:shd w:fill="18354D"/>
+          </w:tcPr>
+          <w:p>
+            <w:pPr>
+              <w:pStyle w:val="Compact"/>
+              <w:spacing w:after="80" w:before="60" w:line="252" w:lineRule="auto"/>
+              <w:jc w:val="left"/>
+            </w:pPr>
+            <w:r>
+              <w:rPr>
+                <w:rFonts w:ascii="Calibri" w:hAnsi="Calibri"/>
+                <w:b/>
+                <w:color w:val="FFFFFF"/>
+                <w:sz w:val="18"/>
+              </w:rPr>
+              <w:t xml:space="preserve">Evidence or decision mechanism</w:t>
+            </w:r>
+          </w:p>
+        </w:tc>
+        <w:tc>
+          <w:tcPr>
+            <w:tcW w:type="dxa" w:w="2206"/>
+            <w:shd w:fill="18354D"/>
+          </w:tcPr>
+          <w:p>
+            <w:pPr>
+              <w:pStyle w:val="Compact"/>
+              <w:spacing w:after="80" w:before="60" w:line="252" w:lineRule="auto"/>
+              <w:jc w:val="left"/>
+            </w:pPr>
+            <w:r>
+              <w:rPr>
+                <w:rFonts w:ascii="Calibri" w:hAnsi="Calibri"/>
+                <w:b/>
+                <w:color w:val="FFFFFF"/>
+                <w:sz w:val="18"/>
+              </w:rPr>
+              <w:t xml:space="preserve">Remaining uncertainty</w:t>
+            </w:r>
+          </w:p>
+        </w:tc>
+      </w:tr>
+      <w:tr>
+        <w:trPr>
+          <w:cantSplit/>
+        </w:trPr>
+        <w:tc>
+          <w:tcPr>
+            <w:tcW w:type="dxa" w:w="2110"/>
+            <w:shd w:fill="F0F4F7"/>
+          </w:tcPr>
+          <w:p>
+            <w:pPr>
+              <w:pStyle w:val="Compact"/>
+              <w:spacing w:after="80" w:before="60" w:line="252" w:lineRule="auto"/>
+              <w:jc w:val="left"/>
+            </w:pPr>
+            <w:r>
+              <w:rPr>
+                <w:rFonts w:ascii="Calibri" w:hAnsi="Calibri"/>
+                <w:sz w:val="18"/>
+              </w:rPr>
+              <w:t xml:space="preserve">OWASP CI/CD risk taxonomy</w:t>
+            </w:r>
+          </w:p>
+        </w:tc>
+        <w:tc>
+          <w:tcPr>
+            <w:tcW w:type="dxa" w:w="2685"/>
+            <w:shd w:fill="F0F4F7"/>
+          </w:tcPr>
+          <w:p>
+            <w:pPr>
+              <w:pStyle w:val="Compact"/>
+              <w:spacing w:after="80" w:before="60" w:line="252" w:lineRule="auto"/>
+              <w:jc w:val="left"/>
+            </w:pPr>
+            <w:r>
+              <w:rPr>
+                <w:rFonts w:ascii="Calibri" w:hAnsi="Calibri"/>
+                <w:sz w:val="18"/>
+              </w:rPr>
+              <w:t xml:space="preserve">Which delivery-process threats should be considered?</w:t>
+            </w:r>
+          </w:p>
+        </w:tc>
+        <w:tc>
+          <w:tcPr>
+            <w:tcW w:type="dxa" w:w="2589"/>
+            <w:shd w:fill="F0F4F7"/>
+          </w:tcPr>
+          <w:p>
+            <w:pPr>
+              <w:pStyle w:val="Compact"/>
+              <w:spacing w:after="80" w:before="60" w:line="252" w:lineRule="auto"/>
+              <w:jc w:val="left"/>
+            </w:pPr>
+            <w:r>
+              <w:rPr>
+                <w:rFonts w:ascii="Calibri" w:hAnsi="Calibri"/>
+                <w:sz w:val="18"/>
+              </w:rPr>
+              <w:t xml:space="preserve">Threat categories guide pipeline assessment and control selection</w:t>
+            </w:r>
+          </w:p>
+        </w:tc>
+        <w:tc>
+          <w:tcPr>
+            <w:tcW w:type="dxa" w:w="2206"/>
+            <w:shd w:fill="F0F4F7"/>
+          </w:tcPr>
+          <w:p>
+            <w:pPr>
+              <w:pStyle w:val="Compact"/>
+              <w:spacing w:after="80" w:before="60" w:line="252" w:lineRule="auto"/>
+              <w:jc w:val="left"/>
+            </w:pPr>
+            <w:r>
+              <w:rPr>
+                <w:rFonts w:ascii="Calibri" w:hAnsi="Calibri"/>
+                <w:sz w:val="18"/>
+              </w:rPr>
+              <w:t xml:space="preserve">A taxonomy does not measure incidence, deploy controls, or prove their effectiveness</w:t>
+            </w:r>
+          </w:p>
+        </w:tc>
+      </w:tr>
+      <w:tr>
+        <w:trPr>
+          <w:cantSplit/>
+        </w:trPr>
+        <w:tc>
+          <w:tcPr>
+            <w:tcW w:type="dxa" w:w="2110"/>
+          </w:tcPr>
+          <w:p>
+            <w:pPr>
+              <w:pStyle w:val="Compact"/>
+              <w:spacing w:after="80" w:before="60" w:line="252" w:lineRule="auto"/>
+              <w:jc w:val="left"/>
+            </w:pPr>
+            <w:r>
+              <w:rPr>
+                <w:rFonts w:ascii="Calibri" w:hAnsi="Calibri"/>
+                <w:sz w:val="18"/>
+              </w:rPr>
+              <w:t xml:space="preserve">OWASP ASVS 5.0.0</w:t>
+            </w:r>
+          </w:p>
+        </w:tc>
+        <w:tc>
+          <w:tcPr>
+            <w:tcW w:type="dxa" w:w="2685"/>
+          </w:tcPr>
+          <w:p>
+            <w:pPr>
+              <w:pStyle w:val="Compact"/>
+              <w:spacing w:after="80" w:before="60" w:line="252" w:lineRule="auto"/>
+              <w:jc w:val="left"/>
+            </w:pPr>
+            <w:r>
+              <w:rPr>
+                <w:rFonts w:ascii="Calibri" w:hAnsi="Calibri"/>
+                <w:sz w:val="18"/>
+              </w:rPr>
+              <w:t xml:space="preserve">Which application-security requirements should be verified?</w:t>
+            </w:r>
+          </w:p>
+        </w:tc>
+        <w:tc>
+          <w:tcPr>
+            <w:tcW w:type="dxa" w:w="2589"/>
+          </w:tcPr>
+          <w:p>
+            <w:pPr>
+              <w:pStyle w:val="Compact"/>
+              <w:spacing w:after="80" w:before="60" w:line="252" w:lineRule="auto"/>
+              <w:jc w:val="left"/>
+            </w:pPr>
+            <w:r>
+              <w:rPr>
+                <w:rFonts w:ascii="Calibri" w:hAnsi="Calibri"/>
+                <w:sz w:val="18"/>
+              </w:rPr>
+              <w:t xml:space="preserve">Versioned requirements mapped to automated and manual assessment</w:t>
+            </w:r>
+          </w:p>
+        </w:tc>
+        <w:tc>
+          <w:tcPr>
+            <w:tcW w:type="dxa" w:w="2206"/>
+          </w:tcPr>
+          <w:p>
+            <w:pPr>
+              <w:pStyle w:val="Compact"/>
+              <w:spacing w:after="80" w:before="60" w:line="252" w:lineRule="auto"/>
+              <w:jc w:val="left"/>
+            </w:pPr>
+            <w:r>
+              <w:rPr>
+                <w:rFonts w:ascii="Calibri" w:hAnsi="Calibri"/>
+                <w:sz w:val="18"/>
+              </w:rPr>
+              <w:t xml:space="preserve">Requirement coverage and evidence quality must be established; application checks do not secure the builder by themselves</w:t>
+            </w:r>
+          </w:p>
+        </w:tc>
+      </w:tr>
+      <w:tr>
+        <w:trPr>
+          <w:cantSplit/>
+        </w:trPr>
+        <w:tc>
+          <w:tcPr>
+            <w:tcW w:type="dxa" w:w="2110"/>
+            <w:shd w:fill="F0F4F7"/>
+          </w:tcPr>
+          <w:p>
+            <w:pPr>
+              <w:pStyle w:val="Compact"/>
+              <w:spacing w:after="80" w:before="60" w:line="252" w:lineRule="auto"/>
+              <w:jc w:val="left"/>
+            </w:pPr>
+            <w:r>
+              <w:rPr>
+                <w:rFonts w:ascii="Calibri" w:hAnsi="Calibri"/>
+                <w:sz w:val="18"/>
+              </w:rPr>
+              <w:t xml:space="preserve">SLSA v1.1</w:t>
+            </w:r>
+          </w:p>
+        </w:tc>
+        <w:tc>
+          <w:tcPr>
+            <w:tcW w:type="dxa" w:w="2685"/>
+            <w:shd w:fill="F0F4F7"/>
+          </w:tcPr>
+          <w:p>
+            <w:pPr>
+              <w:pStyle w:val="Compact"/>
+              <w:spacing w:after="80" w:before="60" w:line="252" w:lineRule="auto"/>
+              <w:jc w:val="left"/>
+            </w:pPr>
+            <w:r>
+              <w:rPr>
+                <w:rFonts w:ascii="Calibri" w:hAnsi="Calibri"/>
+                <w:sz w:val="18"/>
+              </w:rPr>
+              <w:t xml:space="preserve">How was an artifact built, and what build-integrity guarantees apply?</w:t>
+            </w:r>
+          </w:p>
+        </w:tc>
+        <w:tc>
+          <w:tcPr>
+            <w:tcW w:type="dxa" w:w="2589"/>
+            <w:shd w:fill="F0F4F7"/>
+          </w:tcPr>
+          <w:p>
+            <w:pPr>
+              <w:pStyle w:val="Compact"/>
+              <w:spacing w:after="80" w:before="60" w:line="252" w:lineRule="auto"/>
+              <w:jc w:val="left"/>
+            </w:pPr>
+            <w:r>
+              <w:rPr>
+                <w:rFonts w:ascii="Calibri" w:hAnsi="Calibri"/>
+                <w:sz w:val="18"/>
+              </w:rPr>
+              <w:t xml:space="preserve">Provenance, builder trust, and consumer verification against expectations</w:t>
+            </w:r>
+          </w:p>
+        </w:tc>
+        <w:tc>
+          <w:tcPr>
+            <w:tcW w:type="dxa" w:w="2206"/>
+            <w:shd w:fill="F0F4F7"/>
+          </w:tcPr>
+          <w:p>
+            <w:pPr>
+              <w:pStyle w:val="Compact"/>
+              <w:spacing w:after="80" w:before="60" w:line="252" w:lineRule="auto"/>
+              <w:jc w:val="left"/>
+            </w:pPr>
+            <w:r>
+              <w:rPr>
+                <w:rFonts w:ascii="Calibri" w:hAnsi="Calibri"/>
+                <w:sz w:val="18"/>
+              </w:rPr>
+              <w:t xml:space="preserve">Correct provenance does not prove benign source code or producer intent</w:t>
+            </w:r>
+          </w:p>
+        </w:tc>
+      </w:tr>
+      <w:tr>
+        <w:trPr>
+          <w:cantSplit/>
+        </w:trPr>
+        <w:tc>
+          <w:tcPr>
+            <w:tcW w:type="dxa" w:w="2110"/>
+          </w:tcPr>
+          <w:p>
+            <w:pPr>
+              <w:pStyle w:val="Compact"/>
+              <w:spacing w:after="80" w:before="60" w:line="252" w:lineRule="auto"/>
+              <w:jc w:val="left"/>
+            </w:pPr>
+            <w:r>
+              <w:rPr>
+                <w:rFonts w:ascii="Calibri" w:hAnsi="Calibri"/>
+                <w:sz w:val="18"/>
+              </w:rPr>
+              <w:t xml:space="preserve">in-toto 1.0.0</w:t>
+            </w:r>
+          </w:p>
+        </w:tc>
+        <w:tc>
+          <w:tcPr>
+            <w:tcW w:type="dxa" w:w="2685"/>
+          </w:tcPr>
+          <w:p>
+            <w:pPr>
+              <w:pStyle w:val="Compact"/>
+              <w:spacing w:after="80" w:before="60" w:line="252" w:lineRule="auto"/>
+              <w:jc w:val="left"/>
+            </w:pPr>
+            <w:r>
+              <w:rPr>
+                <w:rFonts w:ascii="Calibri" w:hAnsi="Calibri"/>
+                <w:sz w:val="18"/>
+              </w:rPr>
+              <w:t xml:space="preserve">Were authorized supply-chain steps and artifact relationships followed?</w:t>
+            </w:r>
+          </w:p>
+        </w:tc>
+        <w:tc>
+          <w:tcPr>
+            <w:tcW w:type="dxa" w:w="2589"/>
+          </w:tcPr>
+          <w:p>
+            <w:pPr>
+              <w:pStyle w:val="Compact"/>
+              <w:spacing w:after="80" w:before="60" w:line="252" w:lineRule="auto"/>
+              <w:jc w:val="left"/>
+            </w:pPr>
+            <w:r>
+              <w:rPr>
+                <w:rFonts w:ascii="Calibri" w:hAnsi="Calibri"/>
+                <w:sz w:val="18"/>
+              </w:rPr>
+              <w:t xml:space="preserve">Signed layouts and step metadata checked against defined rules</w:t>
+            </w:r>
+          </w:p>
+        </w:tc>
+        <w:tc>
+          <w:tcPr>
+            <w:tcW w:type="dxa" w:w="2206"/>
+          </w:tcPr>
+          <w:p>
+            <w:pPr>
+              <w:pStyle w:val="Compact"/>
+              <w:spacing w:after="80" w:before="60" w:line="252" w:lineRule="auto"/>
+              <w:jc w:val="left"/>
+            </w:pPr>
+            <w:r>
+              <w:rPr>
+                <w:rFonts w:ascii="Calibri" w:hAnsi="Calibri"/>
+                <w:sz w:val="18"/>
+              </w:rPr>
+              <w:t xml:space="preserve">Incomplete layouts, broad rules, or compromised trust roots can weaken verification</w:t>
+            </w:r>
+          </w:p>
+        </w:tc>
+      </w:tr>
+      <w:tr>
+        <w:trPr>
+          <w:cantSplit/>
+        </w:trPr>
+        <w:tc>
+          <w:tcPr>
+            <w:tcW w:type="dxa" w:w="2110"/>
+            <w:shd w:fill="F0F4F7"/>
+          </w:tcPr>
+          <w:p>
+            <w:pPr>
+              <w:pStyle w:val="Compact"/>
+              <w:spacing w:after="80" w:before="60" w:line="252" w:lineRule="auto"/>
+              <w:jc w:val="left"/>
+            </w:pPr>
+            <w:r>
+              <w:rPr>
+                <w:rFonts w:ascii="Calibri" w:hAnsi="Calibri"/>
+                <w:sz w:val="18"/>
+              </w:rPr>
+              <w:t xml:space="preserve">OpenSSF S2C2F</w:t>
+            </w:r>
+          </w:p>
+        </w:tc>
+        <w:tc>
+          <w:tcPr>
+            <w:tcW w:type="dxa" w:w="2685"/>
+            <w:shd w:fill="F0F4F7"/>
+          </w:tcPr>
+          <w:p>
+            <w:pPr>
+              <w:pStyle w:val="Compact"/>
+              <w:spacing w:after="80" w:before="60" w:line="252" w:lineRule="auto"/>
+              <w:jc w:val="left"/>
+            </w:pPr>
+            <w:r>
+              <w:rPr>
+                <w:rFonts w:ascii="Calibri" w:hAnsi="Calibri"/>
+                <w:sz w:val="18"/>
+              </w:rPr>
+              <w:t xml:space="preserve">How should open-source consumption be governed?</w:t>
+            </w:r>
+          </w:p>
+        </w:tc>
+        <w:tc>
+          <w:tcPr>
+            <w:tcW w:type="dxa" w:w="2589"/>
+            <w:shd w:fill="F0F4F7"/>
+          </w:tcPr>
+          <w:p>
+            <w:pPr>
+              <w:pStyle w:val="Compact"/>
+              <w:spacing w:after="80" w:before="60" w:line="252" w:lineRule="auto"/>
+              <w:jc w:val="left"/>
+            </w:pPr>
+            <w:r>
+              <w:rPr>
+                <w:rFonts w:ascii="Calibri" w:hAnsi="Calibri"/>
+                <w:sz w:val="18"/>
+              </w:rPr>
+              <w:t xml:space="preserve">Dependency-ingestion practices and a maturity-based implementation guide</w:t>
+            </w:r>
+          </w:p>
+        </w:tc>
+        <w:tc>
+          <w:tcPr>
+            <w:tcW w:type="dxa" w:w="2206"/>
+            <w:shd w:fill="F0F4F7"/>
+          </w:tcPr>
+          <w:p>
+            <w:pPr>
+              <w:pStyle w:val="Compact"/>
+              <w:spacing w:after="80" w:before="60" w:line="252" w:lineRule="auto"/>
+              <w:jc w:val="left"/>
+            </w:pPr>
+            <w:r>
+              <w:rPr>
+                <w:rFonts w:ascii="Calibri" w:hAnsi="Calibri"/>
+                <w:sz w:val="18"/>
+              </w:rPr>
+              <w:t xml:space="preserve">A governance model does not itself establish absence of malicious or vulnerable dependencies</w:t>
+            </w:r>
+          </w:p>
+        </w:tc>
+      </w:tr>
+      <w:tr>
+        <w:trPr>
+          <w:cantSplit/>
+        </w:trPr>
+        <w:tc>
+          <w:tcPr>
+            <w:tcW w:type="dxa" w:w="2110"/>
+          </w:tcPr>
+          <w:p>
+            <w:pPr>
+              <w:pStyle w:val="Compact"/>
+              <w:spacing w:after="80" w:before="60" w:line="252" w:lineRule="auto"/>
+              <w:jc w:val="left"/>
+            </w:pPr>
+            <w:r>
+              <w:rPr>
+                <w:rFonts w:ascii="Calibri" w:hAnsi="Calibri"/>
+                <w:sz w:val="18"/>
+              </w:rPr>
+              <w:t xml:space="preserve">OpenSSF Scorecard</w:t>
+            </w:r>
+          </w:p>
+        </w:tc>
+        <w:tc>
+          <w:tcPr>
+            <w:tcW w:type="dxa" w:w="2685"/>
+          </w:tcPr>
+          <w:p>
+            <w:pPr>
+              <w:pStyle w:val="Compact"/>
+              <w:spacing w:after="80" w:before="60" w:line="252" w:lineRule="auto"/>
+              <w:jc w:val="left"/>
+            </w:pPr>
+            <w:r>
+              <w:rPr>
+                <w:rFonts w:ascii="Calibri" w:hAnsi="Calibri"/>
+                <w:sz w:val="18"/>
+              </w:rPr>
+              <w:t xml:space="preserve">Which observable security-practice heuristics warrant attention?</w:t>
+            </w:r>
+          </w:p>
+        </w:tc>
+        <w:tc>
+          <w:tcPr>
+            <w:tcW w:type="dxa" w:w="2589"/>
+          </w:tcPr>
+          <w:p>
+            <w:pPr>
+              <w:pStyle w:val="Compact"/>
+              <w:spacing w:after="80" w:before="60" w:line="252" w:lineRule="auto"/>
+              <w:jc w:val="left"/>
+            </w:pPr>
+            <w:r>
+              <w:rPr>
+                <w:rFonts w:ascii="Calibri" w:hAnsi="Calibri"/>
+                <w:sz w:val="18"/>
+              </w:rPr>
+              <w:t xml:space="preserve">Automated checks provide signals for maintenance and dependency decisions</w:t>
+            </w:r>
+          </w:p>
+        </w:tc>
+        <w:tc>
+          <w:tcPr>
+            <w:tcW w:type="dxa" w:w="2206"/>
+          </w:tcPr>
+          <w:p>
+            <w:pPr>
+              <w:pStyle w:val="Compact"/>
+              <w:spacing w:after="80" w:before="60" w:line="252" w:lineRule="auto"/>
+              <w:jc w:val="left"/>
+            </w:pPr>
+            <w:r>
+              <w:rPr>
+                <w:rFonts w:ascii="Calibri" w:hAnsi="Calibri"/>
+                <w:sz w:val="18"/>
+              </w:rPr>
+              <w:t xml:space="preserve">A score is not a calibrated compromise probability or proof of safe behavior</w:t>
+            </w:r>
+          </w:p>
+        </w:tc>
+      </w:tr>
+      <w:tr>
+        <w:trPr>
+          <w:cantSplit/>
+        </w:trPr>
+        <w:tc>
+          <w:tcPr>
+            <w:tcW w:type="dxa" w:w="2110"/>
+            <w:shd w:fill="F0F4F7"/>
+          </w:tcPr>
+          <w:p>
+            <w:pPr>
+              <w:pStyle w:val="Compact"/>
+              <w:spacing w:after="80" w:before="60" w:line="252" w:lineRule="auto"/>
+              <w:jc w:val="left"/>
+            </w:pPr>
+            <w:r>
+              <w:rPr>
+                <w:rFonts w:ascii="Calibri" w:hAnsi="Calibri"/>
+                <w:sz w:val="18"/>
+              </w:rPr>
+              <w:t xml:space="preserve">CISA exploitation catalog</w:t>
+            </w:r>
+          </w:p>
+        </w:tc>
+        <w:tc>
+          <w:tcPr>
+            <w:tcW w:type="dxa" w:w="2685"/>
+            <w:shd w:fill="F0F4F7"/>
+          </w:tcPr>
+          <w:p>
+            <w:pPr>
+              <w:pStyle w:val="Compact"/>
+              <w:spacing w:after="80" w:before="60" w:line="252" w:lineRule="auto"/>
+              <w:jc w:val="left"/>
+            </w:pPr>
+            <w:r>
+              <w:rPr>
+                <w:rFonts w:ascii="Calibri" w:hAnsi="Calibri"/>
+                <w:sz w:val="18"/>
+              </w:rPr>
+              <w:t xml:space="preserve">Is exploitation of a listed vulnerability already known?</w:t>
+            </w:r>
+          </w:p>
+        </w:tc>
+        <w:tc>
+          <w:tcPr>
+            <w:tcW w:type="dxa" w:w="2589"/>
+            <w:shd w:fill="F0F4F7"/>
+          </w:tcPr>
+          <w:p>
+            <w:pPr>
+              <w:pStyle w:val="Compact"/>
+              <w:spacing w:after="80" w:before="60" w:line="252" w:lineRule="auto"/>
+              <w:jc w:val="left"/>
+            </w:pPr>
+            <w:r>
+              <w:rPr>
+                <w:rFonts w:ascii="Calibri" w:hAnsi="Calibri"/>
+                <w:sz w:val="18"/>
+              </w:rPr>
+              <w:t xml:space="preserve">Catalog entries support prioritization of affected assets</w:t>
+            </w:r>
+          </w:p>
+        </w:tc>
+        <w:tc>
+          <w:tcPr>
+            <w:tcW w:type="dxa" w:w="2206"/>
+            <w:shd w:fill="F0F4F7"/>
+          </w:tcPr>
+          <w:p>
+            <w:pPr>
+              <w:pStyle w:val="Compact"/>
+              <w:spacing w:after="80" w:before="60" w:line="252" w:lineRule="auto"/>
+              <w:jc w:val="left"/>
+            </w:pPr>
+            <w:r>
+              <w:rPr>
+                <w:rFonts w:ascii="Calibri" w:hAnsi="Calibri"/>
+                <w:sz w:val="18"/>
+              </w:rPr>
+              <w:t xml:space="preserve">Unlisted weaknesses may still be exploitable; asset exposure must be assessed separately</w:t>
+            </w:r>
+          </w:p>
+        </w:tc>
+      </w:tr>
+    </w:tbl>
+    <w:p>
+      <w:pPr>
+        <w:pStyle w:val="BodyText"/>
+      </w:pPr>
+      <w:r>
+        <w:t xml:space="preserve">Together, Tables 2 and 3 motivate evaluating the complete claim-to-decision chain. Empirical observations can identify a weakness; a specification can structure evidence; an enforcement point must still decide whether the evidence applies to the exact artifact and deployment context. Runtime reassessment is needed when that context changes.</w:t>
+      </w:r>
+    </w:p>
+    <w:bookmarkEnd w:id="39"/>
+    <w:bookmarkEnd w:id="40"/>
+    <w:bookmarkStart w:id="43" w:name="threat-model-and-defensive-objectives"/>
+    <w:p>
+      <w:pPr>
+        <w:pStyle w:val="Heading2"/>
+      </w:pPr>
+      <w:r>
+        <w:t xml:space="preserve">4. Threat Model and Defensive Objectives</w:t>
+      </w:r>
+    </w:p>
+    <w:bookmarkStart w:id="41" w:name="assets-adversaries-and-trust-boundaries"/>
+    <w:p>
+      <w:pPr>
+        <w:pStyle w:val="Heading3"/>
+      </w:pPr>
+      <w:r>
+        <w:t xml:space="preserve">4.1 Assets, adversaries, and trust boundaries</w:t>
+      </w:r>
+    </w:p>
+    <w:p>
+      <w:pPr>
+        <w:pStyle w:val="FirstParagraph"/>
+      </w:pPr>
+      <w:r>
+        <w:t xml:space="preserve">The protected assets are source and workflow integrity, credentials, dependency authenticity, build outputs, release decisions, production configuration, and the evidence used to authorize deployment. Confidential source code and application data matter, but this paper focuses on the delivery path and its ability to modify production.</w:t>
+      </w:r>
+    </w:p>
+    <w:p>
+      <w:pPr>
+        <w:pStyle w:val="BodyText"/>
+      </w:pPr>
+      <w:r>
+        <w:t xml:space="preserve">Consider adversaries who can submit an untrusted change, compromise a dependency, alter a remotely retrieved build script, exploit a runner, steal a workload credential, or modify an artifact registry. Additional scenarios include a malicious maintainer and an actor with authority to edit security policy. These capabilities differ materially and should not be collapsed into a single</w:t>
+      </w:r>
+      <w:r>
+        <w:t xml:space="preserve"> </w:t>
+      </w:r>
+      <w:r>
+        <w:t xml:space="preserve">“</w:t>
+      </w:r>
+      <w:r>
+        <w:t xml:space="preserve">attacker</w:t>
+      </w:r>
+      <w:r>
+        <w:t xml:space="preserve">”</w:t>
+      </w:r>
+      <w:r>
+        <w:t xml:space="preserve"> </w:t>
+      </w:r>
+      <w:r>
+        <w:t xml:space="preserve">condition.</w:t>
+      </w:r>
+    </w:p>
+    <w:p>
+      <w:pPr>
+        <w:pStyle w:val="BodyText"/>
+      </w:pPr>
+      <w:r>
+        <w:t xml:space="preserve">Trust boundaries separate external contributions from privileged builds; build execution from deployment authorization; artifact storage from artifact acceptance; intended configuration from live state; and operational telemetry from the workloads being monitored. OWASP’s discussion of poisoned pipeline execution explains why protecting only the top-level workflow file is insufficient: tests, build files, plugins, and repository scripts can also execute attacker-controlled commands.</w:t>
+      </w:r>
+    </w:p>
+    <w:p>
+      <w:pPr>
+        <w:pStyle w:val="BodyText"/>
+      </w:pPr>
+      <w:r>
+        <w:t xml:space="preserve">The framework assumes that some root of trust remains intact: for example, protected deployment authorization and its verification keys. If an adversary controls the builder, verifier, policy authority, and logging administration simultaneously, the available evidence cannot establish trustworthy release authorization. Stronger claims require stronger separation or independently operated verification.</w:t>
+      </w:r>
+    </w:p>
+    <w:bookmarkEnd w:id="41"/>
+    <w:bookmarkStart w:id="42" w:name="four-defensive-objectives"/>
+    <w:p>
+      <w:pPr>
+        <w:pStyle w:val="Heading3"/>
+      </w:pPr>
+      <w:r>
+        <w:t xml:space="preserve">4.2 Four defensive objectives</w:t>
+      </w:r>
+    </w:p>
+    <w:p>
+      <w:pPr>
+        <w:pStyle w:val="FirstParagraph"/>
+      </w:pPr>
+      <w:r>
+        <w:t xml:space="preserve">The analysis distinguishes prevention of unauthorized release changes; containment of execution privilege; detection of weaknesses and malicious behavior; and recovery to a known acceptable state. These objectives should be tested separately. A control can fail to prevent an initial execution while still reducing its blast radius or enabling earlier containment.</w:t>
+      </w:r>
+    </w:p>
+    <w:p>
+      <w:pPr>
+        <w:pStyle w:val="BodyText"/>
+      </w:pPr>
+      <w:r>
+        <w:t xml:space="preserve">Defense in depth is most useful when layers address different failure modes or are protected by different authorities. Five scanners running under the same compromised identity may provide less independent assurance than fewer controls distributed across build isolation, authorization, artifact verification, and runtime observation. Counting layers without examining common dependencies overstates resilience.</w:t>
+      </w:r>
+    </w:p>
+    <w:bookmarkEnd w:id="42"/>
+    <w:bookmarkEnd w:id="43"/>
+    <w:bookmarkStart w:id="48" w:name="Xf812c86dd1bcdc9043a78155193fd70381cff6b"/>
+    <w:p>
+      <w:pPr>
+        <w:pStyle w:val="Heading2"/>
+      </w:pPr>
+      <w:r>
+        <w:t xml:space="preserve">5. Historical Failures and the Limits of Proposed Remedies</w:t>
+      </w:r>
+    </w:p>
+    <w:p>
+      <w:pPr>
+        <w:pStyle w:val="FirstParagraph"/>
+      </w:pPr>
+      <w:r>
+        <w:t xml:space="preserve">Historical incidents illustrate mechanisms; they do not prove that a proposed control would have prevented every stage of the actual attack. SolarWinds and Codecov are discussed using published security-taxonomy and supply-chain-framework summaries. Those primary incident reports were not independently retrieved for this review. Log4Shell’s known exploitation is supported directly by CISA’s catalog entry for CVE-2021-44228. Counterfactual defenses below are this paper’s analysis.</w:t>
+      </w:r>
+    </w:p>
+    <w:bookmarkStart w:id="44" w:name="X9f6b0e9c5cd0cfdb1a8014ad5687405aedc004c"/>
+    <w:p>
+      <w:pPr>
+        <w:pStyle w:val="Heading3"/>
+      </w:pPr>
+      <w:r>
+        <w:t xml:space="preserve">5.1 SolarWinds: trusted distribution can preserve malicious output</w:t>
+      </w:r>
+    </w:p>
+    <w:p>
+      <w:pPr>
+        <w:pStyle w:val="FirstParagraph"/>
+      </w:pPr>
+      <w:r>
+        <w:t xml:space="preserve">The SolarWinds incident illustrates compromise of a software production process, rather than merely the inclusion of an obviously vulnerable dependency. The central defensive error is to treat delivery through a recognized producer’s release channel as sufficient evidence of benign content.</w:t>
+      </w:r>
+    </w:p>
+    <w:p>
+      <w:pPr>
+        <w:pStyle w:val="BodyText"/>
+      </w:pPr>
+      <w:r>
+        <w:t xml:space="preserve">A proposed response combines protected build infrastructure, restricted workflow changes, trustworthy provenance, and verification at the point of consumption. For appropriate threat models, independently operated reproducible builds can supply additional evidence. These controls address different questions: provenance describes an artifact’s production; reproducibility compares independently produced outputs; application testing examines behavior.</w:t>
+      </w:r>
+    </w:p>
+    <w:p>
+      <w:pPr>
+        <w:pStyle w:val="BodyText"/>
+      </w:pPr>
+      <w:r>
+        <w:t xml:space="preserve">None of these mechanisms alone proves benign intent. A malicious source change may be reproducibly built and correctly signed. A compromised authority may authenticate misleading evidence. The research requirement is therefore to specify which actor or stage may be compromised and which independent check is expected to expose the discrepancy.</w:t>
+      </w:r>
+    </w:p>
+    <w:bookmarkEnd w:id="44"/>
+    <w:bookmarkStart w:id="45" w:name="X56941c5ad4450349a27debc973190bbfe7442e9"/>
+    <w:p>
+      <w:pPr>
+        <w:pStyle w:val="Heading3"/>
+      </w:pPr>
+      <w:r>
+        <w:t xml:space="preserve">5.2 Codecov: build-time helpers can inherit excessive authority</w:t>
+      </w:r>
+    </w:p>
+    <w:p>
+      <w:pPr>
+        <w:pStyle w:val="FirstParagraph"/>
+      </w:pPr>
+      <w:r>
+        <w:t xml:space="preserve">The Codecov incident illustrates how a compromised externally supplied CI helper can access sensitive information available to a build. Its lesson extends beyond source scanning: operational convenience often grants third-party code the authority of the whole job.</w:t>
+      </w:r>
+    </w:p>
+    <w:p>
+      <w:pPr>
+        <w:pStyle w:val="BodyText"/>
+      </w:pPr>
+      <w:r>
+        <w:t xml:space="preserve">Proposed defenses include immutable dependency references, integrity verification against an independently trusted expectation, separation of low-trust tooling from credential-bearing stages, narrowly scoped temporary credentials, and restricted network egress. A checksum fetched from the same compromised location as its payload supplies weak independent evidence. Similarly, a pinned revision fixes identity but does not establish that the fixed content is benign.</w:t>
+      </w:r>
+    </w:p>
+    <w:p>
+      <w:pPr>
+        <w:pStyle w:val="BodyText"/>
+      </w:pPr>
+      <w:r>
+        <w:t xml:space="preserve">Temporary credentials reduce the duration of exposure; they do not prevent misuse during their validity. Workload identity based on OpenID Connect requires constrained trust conditions, such as expected repository, audience, and execution context. A broad federation policy can simply replace a long-lived overprivileged secret with a repeatedly obtainable overprivileged token.</w:t>
+      </w:r>
+    </w:p>
+    <w:bookmarkEnd w:id="45"/>
+    <w:bookmarkStart w:id="46" w:name="Xb58bba2d1b226d5930f829613527f2e8bf4a9d0"/>
+    <w:p>
+      <w:pPr>
+        <w:pStyle w:val="Heading3"/>
+      </w:pPr>
+      <w:r>
+        <w:t xml:space="preserve">5.3 Log4Shell: inventory is useful only when it drives response</w:t>
+      </w:r>
+    </w:p>
+    <w:p>
+      <w:pPr>
+        <w:pStyle w:val="FirstParagraph"/>
+      </w:pPr>
+      <w:r>
+        <w:t xml:space="preserve">CISA identifies CVE-2021-44228 in Apache Log4j2 as a known exploited remote-code-execution vulnerability. This failure differs from build tampering: a legitimate dependency can introduce exploitable behavior into deployed applications.</w:t>
+      </w:r>
+    </w:p>
+    <w:p>
+      <w:pPr>
+        <w:pStyle w:val="BodyText"/>
+      </w:pPr>
+      <w:r>
+        <w:t xml:space="preserve">An artifact-linked software bill of materials (SBOM) can help locate potentially affected releases. Its usefulness depends on inventory completeness, component identification, connection to deployment records, and the organization’s ability to update or contain affected systems. The SBOM itself neither patches a component nor proves whether a vulnerable code path is reachable.</w:t>
+      </w:r>
+    </w:p>
+    <w:p>
+      <w:pPr>
+        <w:pStyle w:val="BodyText"/>
+      </w:pPr>
+      <w:r>
+        <w:t xml:space="preserve">The proposed response links dependency inventory to deployed artifact digests, rescans retained inventories when new advisories appear, validates affected configurations, and rehearses patching or containment. Reachability analysis can prioritize investigation, but uncertain analysis should not be converted into a confident finding of non-exploitability. A signed vulnerability assessment must still carry supporting evidence and a revision policy.</w:t>
+      </w:r>
+    </w:p>
+    <w:p>
+      <w:pPr>
+        <w:pStyle w:val="BodyText"/>
+        <w:keepNext/>
+        <w:keepLines/>
+      </w:pPr>
+      <w:r>
+        <w:rPr>
+          <w:b/>
+          <w:bCs/>
+        </w:rPr>
+        <w:t xml:space="preserve">Table 4. Historical mechanism, proposed defense, and residual limitation.</w:t>
       </w:r>
     </w:p>
     <w:tbl>
@@ -1951,8 +3395,8 @@
         </w:tc>
       </w:tr>
     </w:tbl>
-    <w:bookmarkEnd w:id="38"/>
-    <w:bookmarkStart w:id="39" w:name="X3a65d28b373c2ea20738654c15bc5b96d020656"/>
+    <w:bookmarkEnd w:id="46"/>
+    <w:bookmarkStart w:id="47" w:name="X3a65d28b373c2ea20738654c15bc5b96d020656"/>
     <w:p>
       <w:pPr>
         <w:pStyle w:val="Heading3"/>
@@ -1966,19 +3410,21 @@
         <w:pStyle w:val="FirstParagraph"/>
       </w:pPr>
       <w:r>
-        <w:t xml:space="preserve">Security technologies can fail through mismatched assumptions, incomplete adoption, or inappropriate use. Analyzing the failure mechanism produces more actionable conclusions than labeling an entire technology inherently unsafe. Table 3 reframes problematic practices as testable anti-patterns. These are analytical categories, not estimates of how often organizations use them.</w:t>
+        <w:t xml:space="preserve">Security technologies can fail through mismatched assumptions, incomplete adoption, or inappropriate use. Analyzing the failure mechanism produces more actionable conclusions than labeling an entire technology inherently unsafe. Table 5 reframes problematic practices as testable anti-patterns. These are analytical categories, not estimates of how often organizations use them.</w:t>
       </w:r>
     </w:p>
     <w:p>
       <w:pPr>
         <w:pStyle w:val="BodyText"/>
+        <w:keepNext/>
+        <w:keepLines/>
       </w:pPr>
       <w:r>
         <w:rPr>
           <w:b/>
           <w:bCs/>
         </w:rPr>
-        <w:t xml:space="preserve">Table 3. Failure-prone practices and defensible alternatives.</w:t>
+        <w:t xml:space="preserve">Table 5. Failure-prone practices and defensible alternatives.</w:t>
       </w:r>
     </w:p>
     <w:tbl>
@@ -2641,9 +4087,9 @@
         </w:tc>
       </w:tr>
     </w:tbl>
-    <w:bookmarkEnd w:id="39"/>
-    <w:bookmarkEnd w:id="40"/>
-    <w:bookmarkStart w:id="46" w:name="proposed-continuous-assurance-framework"/>
+    <w:bookmarkEnd w:id="47"/>
+    <w:bookmarkEnd w:id="48"/>
+    <w:bookmarkStart w:id="57" w:name="proposed-continuous-assurance-framework"/>
     <w:p>
       <w:pPr>
         <w:pStyle w:val="Heading2"/>
@@ -2652,7 +4098,7 @@
         <w:t xml:space="preserve">6. Proposed Continuous Assurance Framework</w:t>
       </w:r>
     </w:p>
-    <w:bookmarkStart w:id="41" w:name="X8031abca7619d75424d56a70883a074a7b2dc67"/>
+    <w:bookmarkStart w:id="49" w:name="X8031abca7619d75424d56a70883a074a7b2dc67"/>
     <w:p>
       <w:pPr>
         <w:pStyle w:val="Heading3"/>
@@ -2714,8 +4160,8 @@
         <w:t xml:space="preserve">becomes a claim about a named artifact digest, accepted source revision, authorized builder, required attestations, and a deployment verifier. The evidence must be bound to the same artifact that is admitted. The claim is invalidated if deployment uses a mutable tag resolving to different bytes or if its policy is changed without authorization.</w:t>
       </w:r>
     </w:p>
-    <w:bookmarkEnd w:id="41"/>
-    <w:bookmarkStart w:id="42" w:name="five-assurance-boundaries"/>
+    <w:bookmarkEnd w:id="49"/>
+    <w:bookmarkStart w:id="53" w:name="five-assurance-boundaries"/>
     <w:p>
       <w:pPr>
         <w:pStyle w:val="Heading3"/>
@@ -2819,45 +4265,63 @@
         <w:pStyle w:val="BodyText"/>
       </w:pPr>
       <w:r>
+        <w:t xml:space="preserve">Figure 3 separates artifact production from the authority that evaluates evidence and authorizes release. Artifact identity binds the evidence bundle to the bytes being admitted. The runtime feedback path invalidates stale claims when new vulnerabilities, configuration changes, or credential events occur.</w:t>
+      </w:r>
+    </w:p>
+    <w:p>
+      <w:pPr>
+        <w:pStyle w:val="BodyText"/>
+        <w:keepNext/>
+        <w:keepLines/>
+      </w:pPr>
+      <w:r>
         <w:rPr>
           <w:b/>
           <w:bCs/>
         </w:rPr>
-        <w:t xml:space="preserve">Figure 1. Proposed flow of artifacts, evidence, and release decisions.</w:t>
+        <w:t xml:space="preserve">Figure 3. Proposed architecture separating artifact production, evidence, and release authority.</w:t>
       </w:r>
     </w:p>
     <w:p>
       <w:pPr>
-        <w:pStyle w:val="SourceCode"/>
+        <w:pStyle w:val="BodyText"/>
         <w:keepLines/>
       </w:pPr>
       <w:r>
         <w:drawing>
           <wp:inline>
-            <wp:extent cx="5943600" cy="3304642"/>
-            <wp:docPr id="1" name="Picture 1"/>
-            <wp:cNvGraphicFramePr>
-              <a:graphicFrameLocks noChangeAspect="1"/>
-            </wp:cNvGraphicFramePr>
+            <wp:extent cx="5943600" cy="4457700"/>
+            <wp:effectExtent b="0" l="0" r="0" t="0"/>
+            <wp:docPr descr="Artifact and evidence flows converge at a protected verifier, followed by deployment of the verified digest and runtime reassessment." title="" id="51" name="Picture"/>
             <a:graphic>
               <a:graphicData uri="http://schemas.openxmlformats.org/drawingml/2006/picture">
                 <pic:pic>
                   <pic:nvPicPr>
-                    <pic:cNvPr id="0" name="devsecops-assurance-diagram.png"/>
-                    <pic:cNvPicPr/>
+                    <pic:cNvPr descr="figures/figure_03_assurance_architecture.png" id="52" name="Picture"/>
+                    <pic:cNvPicPr>
+                      <a:picLocks noChangeArrowheads="1" noChangeAspect="1"/>
+                    </pic:cNvPicPr>
                   </pic:nvPicPr>
                   <pic:blipFill>
-                    <a:blip r:embed="rId10"/>
+                    <a:blip r:embed="rId50"/>
                     <a:stretch>
                       <a:fillRect/>
                     </a:stretch>
                   </pic:blipFill>
-                  <pic:spPr>
+                  <pic:spPr bwMode="auto">
                     <a:xfrm>
                       <a:off x="0" y="0"/>
-                      <a:ext cx="5943600" cy="3304642"/>
+                      <a:ext cx="5943600" cy="4457700"/>
                     </a:xfrm>
-                    <a:prstGeom prst="rect"/>
+                    <a:prstGeom prst="rect">
+                      <a:avLst/>
+                    </a:prstGeom>
+                    <a:noFill/>
+                    <a:ln w="9525">
+                      <a:noFill/>
+                      <a:headEnd/>
+                      <a:tailEnd/>
+                    </a:ln>
                   </pic:spPr>
                 </pic:pic>
               </a:graphicData>
@@ -2868,10 +4332,10 @@
     </w:p>
     <w:p>
       <w:pPr>
-        <w:pStyle w:val="FirstParagraph"/>
-      </w:pPr>
-      <w:r>
-        <w:t xml:space="preserve">The diagram is a proposed architecture.</w:t>
+        <w:pStyle w:val="BodyText"/>
+      </w:pPr>
+      <w:r>
+        <w:t xml:space="preserve">The diagram is a proposed architecture, not a tested implementation.</w:t>
       </w:r>
       <w:r>
         <w:t xml:space="preserve"> </w:t>
@@ -2889,11 +4353,11 @@
         <w:t xml:space="preserve"> </w:t>
       </w:r>
       <w:r>
-        <w:t xml:space="preserve">is a requirement to establish in an implementation, not a property created by drawing the verifier as a separate box.</w:t>
+        <w:t xml:space="preserve">requires independently controlled policy and authorization that survive the modeled build compromise. A separate box alone does not establish independence. The feedback arrow represents reassessment rather than automatic permission to deploy again.</w:t>
       </w:r>
     </w:p>
-    <w:bookmarkEnd w:id="42"/>
-    <w:bookmarkStart w:id="43" w:name="release-policy-and-exception-governance"/>
+    <w:bookmarkEnd w:id="53"/>
+    <w:bookmarkStart w:id="54" w:name="release-policy-and-exception-governance"/>
     <w:p>
       <w:pPr>
         <w:pStyle w:val="Heading3"/>
@@ -3020,8 +4484,8 @@
         <w:t xml:space="preserve">Unknown evidence must remain unknown. A scanner timeout, parser error, or zero-test execution is not equivalent to a clean result. For high-impact releases, missing mandatory evidence blocks normal authorization. Lower-impact environments can use different documented rules. This proportionality is preferable to silently failing open or making all environments equally restrictive.</w:t>
       </w:r>
     </w:p>
-    <w:bookmarkEnd w:id="43"/>
-    <w:bookmarkStart w:id="44" w:name="X91d85a6a53565d1e369ecac45ef95ff9418404e"/>
+    <w:bookmarkEnd w:id="54"/>
+    <w:bookmarkStart w:id="55" w:name="X91d85a6a53565d1e369ecac45ef95ff9418404e"/>
     <w:p>
       <w:pPr>
         <w:pStyle w:val="Heading3"/>
@@ -3046,8 +4510,8 @@
         <w:t xml:space="preserve">Conflicting evidence also requires a decision rule. A passing IaC scan and a live resource exposed to the public Internet describe different states. The latter should trigger investigation rather than be averaged into a favorable score. Similarly, an attestation about one digest cannot support a decision about another, even if both artifacts have the same release label.</w:t>
       </w:r>
     </w:p>
-    <w:bookmarkEnd w:id="44"/>
-    <w:bookmarkStart w:id="45" w:name="practical-control-mapping"/>
+    <w:bookmarkEnd w:id="55"/>
+    <w:bookmarkStart w:id="56" w:name="practical-control-mapping"/>
     <w:p>
       <w:pPr>
         <w:pStyle w:val="Heading3"/>
@@ -3059,13 +4523,15 @@
     <w:p>
       <w:pPr>
         <w:pStyle w:val="FirstParagraph"/>
+        <w:keepNext/>
+        <w:keepLines/>
       </w:pPr>
       <w:r>
         <w:rPr>
           <w:b/>
           <w:bCs/>
         </w:rPr>
-        <w:t xml:space="preserve">Table 4. Illustrative mechanisms and the evidence they must produce.</w:t>
+        <w:t xml:space="preserve">Table 6. Illustrative mechanisms and the evidence they must produce.</w:t>
       </w:r>
     </w:p>
     <w:tbl>
@@ -3769,9 +5235,9 @@
         <w:t xml:space="preserve">Products such as Gitleaks, Semgrep, Trivy, Checkov, OPA, Cosign, and Falco are possible implementations of parts of this mapping. This review does not benchmark, recommend a mandatory combination of, or establish current feature completeness for those products. Cluster configuration assessment belongs to an appropriate cluster context; an application image scan does not establish the security of the target cluster.</w:t>
       </w:r>
     </w:p>
-    <w:bookmarkEnd w:id="45"/>
-    <w:bookmarkEnd w:id="46"/>
-    <w:bookmarkStart w:id="53" w:name="evaluation-design-and-research-agenda"/>
+    <w:bookmarkEnd w:id="56"/>
+    <w:bookmarkEnd w:id="57"/>
+    <w:bookmarkStart w:id="67" w:name="evaluation-design-and-research-agenda"/>
     <w:p>
       <w:pPr>
         <w:pStyle w:val="Heading2"/>
@@ -3780,7 +5246,7 @@
         <w:t xml:space="preserve">7. Evaluation Design and Research Agenda</w:t>
       </w:r>
     </w:p>
-    <w:bookmarkStart w:id="47" w:name="comparators-and-experimental-scope"/>
+    <w:bookmarkStart w:id="61" w:name="comparators-and-experimental-scope"/>
     <w:p>
       <w:pPr>
         <w:pStyle w:val="Heading3"/>
@@ -3862,52 +5328,132 @@
         <w:t xml:space="preserve">Use versioned applications, dependency sets, infrastructure configurations, and delivery workflows. Include at least one setting with meaningful authenticated application behavior and one infrastructure deployment scenario. Match control configurations across conditions where possible, and preserve legitimate approvals and emergency needs. Never expose production systems or use real customer secrets for attack experiments.</w:t>
       </w:r>
     </w:p>
-    <w:bookmarkEnd w:id="47"/>
-    <w:bookmarkStart w:id="48" w:name="X3d4204bbb411743c5c05e2f8bf668117b01a63c"/>
     <w:p>
       <w:pPr>
-        <w:pStyle w:val="Heading3"/>
-      </w:pPr>
-      <w:r>
-        <w:t xml:space="preserve">7.2 Threat-specific tests and independent ground truth</w:t>
+        <w:pStyle w:val="BodyText"/>
+      </w:pPr>
+      <w:r>
+        <w:t xml:space="preserve">Figure 4 summarizes the proposed comparison. The same independently labeled scenario set is exercised in each condition; the outcome domains remain separate. The design tests whether additional verification and isolation change attack outcomes and operational cost, rather than assuming that the condition with more controls must perform better.</w:t>
       </w:r>
     </w:p>
     <w:p>
       <w:pPr>
-        <w:pStyle w:val="FirstParagraph"/>
-      </w:pPr>
-      <w:r>
-        <w:t xml:space="preserve">Construct benign and malicious cases with an oracle independent of the evaluated scanner. Cases should include a seeded configuration weakness, an untrusted change attempting to access a canary credential, an altered artifact after scanning, missing or mismatched provenance, a scanner failure, a newly disclosed test advisory affecting a previously built artifact, and drift between approved and deployed state.</w:t>
-      </w:r>
-    </w:p>
-    <w:p>
-      <w:pPr>
         <w:pStyle w:val="BodyText"/>
-      </w:pPr>
-      <w:r>
-        <w:t xml:space="preserve">Each case needs a declared attack capability, precondition, expected observation, enforcement point, and success criterion. Preventing a deployment and detecting the attempted attack are separate outcomes. A substituted artifact should be rejected because its identity fails verification, even if its contents happen to pass application tests. A legitimate release must also succeed; otherwise, a system that blocks everything could appear perfectly secure.</w:t>
-      </w:r>
-    </w:p>
-    <w:bookmarkEnd w:id="48"/>
-    <w:bookmarkStart w:id="49" w:name="outcome-measures-and-denominators"/>
-    <w:p>
-      <w:pPr>
-        <w:pStyle w:val="Heading3"/>
-      </w:pPr>
-      <w:r>
-        <w:t xml:space="preserve">7.3 Outcome measures and denominators</w:t>
-      </w:r>
-    </w:p>
-    <w:p>
-      <w:pPr>
-        <w:pStyle w:val="FirstParagraph"/>
+        <w:keepNext/>
+        <w:keepLines/>
       </w:pPr>
       <w:r>
         <w:rPr>
           <w:b/>
           <w:bCs/>
         </w:rPr>
-        <w:t xml:space="preserve">Table 5. Proposed measures for evaluating assurance and operational cost.</w:t>
+        <w:t xml:space="preserve">Figure 4. Proposed comparative evaluation of existing safeguards, added scanning, and continuous assurance.</w:t>
+      </w:r>
+    </w:p>
+    <w:p>
+      <w:pPr>
+        <w:pStyle w:val="BodyText"/>
+        <w:keepLines/>
+      </w:pPr>
+      <w:r>
+        <w:drawing>
+          <wp:inline>
+            <wp:extent cx="5943600" cy="3879850"/>
+            <wp:effectExtent b="0" l="0" r="0" t="0"/>
+            <wp:docPr descr="Three baseline conditions feed the same labeled scenario suite and are evaluated for detection, enforcement, containment, response, and operational cost." title="" id="59" name="Picture"/>
+            <a:graphic>
+              <a:graphicData uri="http://schemas.openxmlformats.org/drawingml/2006/picture">
+                <pic:pic>
+                  <pic:nvPicPr>
+                    <pic:cNvPr descr="figures/figure_04_evaluation_design.png" id="60" name="Picture"/>
+                    <pic:cNvPicPr>
+                      <a:picLocks noChangeArrowheads="1" noChangeAspect="1"/>
+                    </pic:cNvPicPr>
+                  </pic:nvPicPr>
+                  <pic:blipFill>
+                    <a:blip r:embed="rId58"/>
+                    <a:stretch>
+                      <a:fillRect/>
+                    </a:stretch>
+                  </pic:blipFill>
+                  <pic:spPr bwMode="auto">
+                    <a:xfrm>
+                      <a:off x="0" y="0"/>
+                      <a:ext cx="5943600" cy="3879850"/>
+                    </a:xfrm>
+                    <a:prstGeom prst="rect">
+                      <a:avLst/>
+                    </a:prstGeom>
+                    <a:noFill/>
+                    <a:ln w="9525">
+                      <a:noFill/>
+                      <a:headEnd/>
+                      <a:tailEnd/>
+                    </a:ln>
+                  </pic:spPr>
+                </pic:pic>
+              </a:graphicData>
+            </a:graphic>
+          </wp:inline>
+        </w:drawing>
+      </w:r>
+    </w:p>
+    <w:p>
+      <w:pPr>
+        <w:pStyle w:val="BodyText"/>
+      </w:pPr>
+      <w:r>
+        <w:t xml:space="preserve">This figure specifies a study to be conducted. It contains no measured performance values, and the framework’s effectiveness remains unestablished. Existing safeguards in B0 must be preserved and documented to avoid an artificially weak comparator.</w:t>
+      </w:r>
+    </w:p>
+    <w:bookmarkEnd w:id="61"/>
+    <w:bookmarkStart w:id="62" w:name="X3d4204bbb411743c5c05e2f8bf668117b01a63c"/>
+    <w:p>
+      <w:pPr>
+        <w:pStyle w:val="Heading3"/>
+      </w:pPr>
+      <w:r>
+        <w:t xml:space="preserve">7.2 Threat-specific tests and independent ground truth</w:t>
+      </w:r>
+    </w:p>
+    <w:p>
+      <w:pPr>
+        <w:pStyle w:val="FirstParagraph"/>
+      </w:pPr>
+      <w:r>
+        <w:t xml:space="preserve">Construct benign and malicious cases with an oracle independent of the evaluated scanner. Cases should include a seeded configuration weakness, an untrusted change attempting to access a canary credential, an altered artifact after scanning, missing or mismatched provenance, a scanner failure, a newly disclosed test advisory affecting a previously built artifact, and drift between approved and deployed state.</w:t>
+      </w:r>
+    </w:p>
+    <w:p>
+      <w:pPr>
+        <w:pStyle w:val="BodyText"/>
+      </w:pPr>
+      <w:r>
+        <w:t xml:space="preserve">Each case needs a declared attack capability, precondition, expected observation, enforcement point, and success criterion. Preventing a deployment and detecting the attempted attack are separate outcomes. A substituted artifact should be rejected because its identity fails verification, even if its contents happen to pass application tests. A legitimate release must also succeed; otherwise, a system that blocks everything could appear perfectly secure.</w:t>
+      </w:r>
+    </w:p>
+    <w:bookmarkEnd w:id="62"/>
+    <w:bookmarkStart w:id="63" w:name="outcome-measures-and-denominators"/>
+    <w:p>
+      <w:pPr>
+        <w:pStyle w:val="Heading3"/>
+      </w:pPr>
+      <w:r>
+        <w:t xml:space="preserve">7.3 Outcome measures and denominators</w:t>
+      </w:r>
+    </w:p>
+    <w:p>
+      <w:pPr>
+        <w:pStyle w:val="FirstParagraph"/>
+        <w:keepNext/>
+        <w:keepLines/>
+      </w:pPr>
+      <w:r>
+        <w:rPr>
+          <w:b/>
+          <w:bCs/>
+        </w:rPr>
+        <w:t xml:space="preserve">Table 7. Proposed measures for evaluating assurance and operational cost.</w:t>
       </w:r>
     </w:p>
     <w:tbl>
@@ -4586,8 +6132,8 @@
         <w:t xml:space="preserve">Delivery frequency, change lead time, deployment-related failure, and recovery measures can describe operational effects, but they are not direct measures of security. Specify the definition and reporting version used for each; a generic incident-recovery average should not be silently substituted for recovery from a failed deployment. Service-level indicators and objectives can constrain acceptable availability impact while security outcomes are evaluated separately.</w:t>
       </w:r>
     </w:p>
-    <w:bookmarkEnd w:id="49"/>
-    <w:bookmarkStart w:id="50" w:name="X0364c028c94ad301afd973cf8c29c04cfcd07ff"/>
+    <w:bookmarkEnd w:id="63"/>
+    <w:bookmarkStart w:id="64" w:name="X0364c028c94ad301afd973cf8c29c04cfcd07ff"/>
     <w:p>
       <w:pPr>
         <w:pStyle w:val="Heading3"/>
@@ -4638,8 +6184,8 @@
         <w:t xml:space="preserve">A reproducibility package should contain testbed code, sanitized fixtures, artifact digests, scanner and rule versions, policy versions, oracle labels, adjudication rules, run identifiers, and scripts for analysis. Release enough information to reproduce the result without exposing operational credentials. Team-level field studies would require additional designs, such as a staged rollout with adjustment for project and time effects; a before-and-after chart alone cannot isolate causality.</w:t>
       </w:r>
     </w:p>
-    <w:bookmarkEnd w:id="50"/>
-    <w:bookmarkStart w:id="51" w:name="falsifiable-hypotheses"/>
+    <w:bookmarkEnd w:id="64"/>
+    <w:bookmarkStart w:id="65" w:name="falsifiable-hypotheses"/>
     <w:p>
       <w:pPr>
         <w:pStyle w:val="Heading3"/>
@@ -4766,8 +6312,8 @@
         <w:t xml:space="preserve">Each hypothesis can fail. For example, policy complexity may increase false blocking, incomplete inventories may erase the benefit of reassessment, or nominal separation may still share a vulnerable administrator account. These are research findings to report, not inconvenient exceptions to exclude.</w:t>
       </w:r>
     </w:p>
-    <w:bookmarkEnd w:id="51"/>
-    <w:bookmarkStart w:id="52" w:name="research-gaps-as-bounded-opportunities"/>
+    <w:bookmarkEnd w:id="65"/>
+    <w:bookmarkStart w:id="66" w:name="research-gaps-as-bounded-opportunities"/>
     <w:p>
       <w:pPr>
         <w:pStyle w:val="Heading3"/>
@@ -4792,9 +6338,9 @@
         <w:t xml:space="preserve">AI assistance deserves similarly bounded investigation. The defect-discovery study supports examining generated test inputs in a defined setting. It does not justify autonomous release authorization. Future work should measure functional correctness, security validity, reproducibility, and the ability to reject misleading generated explanations.</w:t>
       </w:r>
     </w:p>
-    <w:bookmarkEnd w:id="52"/>
-    <w:bookmarkEnd w:id="53"/>
-    <w:bookmarkStart w:id="57" w:name="discussion-and-threats-to-validity"/>
+    <w:bookmarkEnd w:id="66"/>
+    <w:bookmarkEnd w:id="67"/>
+    <w:bookmarkStart w:id="71" w:name="discussion-and-threats-to-validity"/>
     <w:p>
       <w:pPr>
         <w:pStyle w:val="Heading2"/>
@@ -4803,7 +6349,7 @@
         <w:t xml:space="preserve">8. Discussion and Threats to Validity</w:t>
       </w:r>
     </w:p>
-    <w:bookmarkStart w:id="54" w:name="answers-to-the-research-questions"/>
+    <w:bookmarkStart w:id="68" w:name="answers-to-the-research-questions"/>
     <w:p>
       <w:pPr>
         <w:pStyle w:val="Heading3"/>
@@ -4880,8 +6426,8 @@
         <w:t xml:space="preserve">, evaluation must independently test detection, enforcement, containment, and response while measuring false blocking and operational cost. Tool execution and reported findings are intermediate observations.</w:t>
       </w:r>
     </w:p>
-    <w:bookmarkEnd w:id="54"/>
-    <w:bookmarkStart w:id="55" w:name="trade-offs-and-adoption-implications"/>
+    <w:bookmarkEnd w:id="68"/>
+    <w:bookmarkStart w:id="69" w:name="trade-offs-and-adoption-implications"/>
     <w:p>
       <w:pPr>
         <w:pStyle w:val="Heading3"/>
@@ -4914,8 +6460,8 @@
         <w:t xml:space="preserve">Compliance evidence is valuable but narrower than security assurance. A baseline check can show that a known rule was evaluated against a particular input. It cannot establish the absence of unmodeled threats, future vulnerabilities, or malicious business logic. Conversely, a justified exception is not automatically a failure when its scope and compensating controls are explicit and evaluated.</w:t>
       </w:r>
     </w:p>
-    <w:bookmarkEnd w:id="55"/>
-    <w:bookmarkStart w:id="56" w:name="limitations-of-this-review-and-proposal"/>
+    <w:bookmarkEnd w:id="69"/>
+    <w:bookmarkStart w:id="70" w:name="limitations-of-this-review-and-proposal"/>
     <w:p>
       <w:pPr>
         <w:pStyle w:val="Heading3"/>
@@ -5014,9 +6560,9 @@
         <w:t xml:space="preserve">Evidence generation, retention, verification, and access control can impose real costs and confidentiality risks. A production implementation would need retention policy, authorized access, and data minimization. Evidence quality must be maintained over time rather than demonstrated only during an initial experiment.</w:t>
       </w:r>
     </w:p>
-    <w:bookmarkEnd w:id="56"/>
-    <w:bookmarkEnd w:id="57"/>
-    <w:bookmarkStart w:id="58" w:name="conclusion"/>
+    <w:bookmarkEnd w:id="70"/>
+    <w:bookmarkEnd w:id="71"/>
+    <w:bookmarkStart w:id="72" w:name="conclusion"/>
     <w:p>
       <w:pPr>
         <w:pStyle w:val="Heading2"/>
@@ -5041,7 +6587,7 @@
         <w:t xml:space="preserve">Historical failures show why the delivery process itself must be treated as an attack surface. The proposed continuous assurance framework links claims to versioned, artifact-specific evidence, protects the authority that evaluates that evidence, and revisits decisions when conditions change. Its value remains an empirical question. The research agenda is therefore to test whether these arrangements interrupt relevant attacks, limit privilege, and improve response at an acceptable operational cost, while reporting missed cases, false blocking, and residual uncertainty.</w:t>
       </w:r>
     </w:p>
-    <w:bookmarkEnd w:id="58"/>
+    <w:bookmarkEnd w:id="72"/>
     <w:sectPr>
       <w:footerReference r:id="rId9" w:type="default"/>
       <w:pgSz w:h="16838" w:w="11905"/>

</xml_diff>

<commit_message>
Rephrase DevSecOps review in clear student academic language
</commit_message>
<xml_diff>
--- a/DevSecOps_Review.docx
+++ b/DevSecOps_Review.docx
@@ -45,61 +45,55 @@
         <w:t xml:space="preserve"> </w:t>
       </w:r>
       <w:r>
-        <w:t xml:space="preserve">Critical</w:t>
+        <w:t xml:space="preserve">Review</w:t>
       </w:r>
       <w:r>
         <w:t xml:space="preserve"> </w:t>
       </w:r>
       <w:r>
-        <w:t xml:space="preserve">Review</w:t>
+        <w:t xml:space="preserve">of</w:t>
       </w:r>
       <w:r>
         <w:t xml:space="preserve"> </w:t>
       </w:r>
       <w:r>
-        <w:t xml:space="preserve">of</w:t>
+        <w:t xml:space="preserve">Existing</w:t>
       </w:r>
       <w:r>
         <w:t xml:space="preserve"> </w:t>
       </w:r>
       <w:r>
-        <w:t xml:space="preserve">Existing</w:t>
+        <w:t xml:space="preserve">Studies,</w:t>
       </w:r>
       <w:r>
         <w:t xml:space="preserve"> </w:t>
       </w:r>
       <w:r>
-        <w:t xml:space="preserve">Research,</w:t>
+        <w:t xml:space="preserve">Security</w:t>
       </w:r>
       <w:r>
         <w:t xml:space="preserve"> </w:t>
       </w:r>
       <w:r>
-        <w:t xml:space="preserve">Defensive</w:t>
+        <w:t xml:space="preserve">Practices,</w:t>
       </w:r>
       <w:r>
         <w:t xml:space="preserve"> </w:t>
       </w:r>
       <w:r>
-        <w:t xml:space="preserve">Practices,</w:t>
+        <w:t xml:space="preserve">and</w:t>
       </w:r>
       <w:r>
         <w:t xml:space="preserve"> </w:t>
       </w:r>
       <w:r>
-        <w:t xml:space="preserve">and</w:t>
+        <w:t xml:space="preserve">Research</w:t>
       </w:r>
       <w:r>
         <w:t xml:space="preserve"> </w:t>
       </w:r>
       <w:r>
-        <w:t xml:space="preserve">Open</w:t>
-      </w:r>
-      <w:r>
-        <w:t xml:space="preserve"> </w:t>
-      </w:r>
-      <w:r>
-        <w:t xml:space="preserve">Challenges</w:t>
+        <w:t xml:space="preserve">Gaps</w:t>
       </w:r>
     </w:p>
     <w:bookmarkStart w:id="20" w:name="abstract"/>
@@ -116,7 +110,7 @@
         <w:pStyle w:val="FirstParagraph"/>
       </w:pPr>
       <w:r>
-        <w:t xml:space="preserve">DevSecOps integrates security responsibilities and practices into continuous integration and continuous delivery or deployment (CI/CD). Existing research addresses organizational collaboration, automated vulnerability detection, infrastructure configuration, software supply-chain integrity, and continuous monitoring. However, these contributions differ in purpose, evidence, and scope: a practitioner survey describes adoption, a scanner study examines selected weaknesses, and a security specification defines requirements without independently demonstrating operational effectiveness. This paper critically reviews selected academic studies, official security frameworks, and documented delivery-related incidents. The literature is organized into six themes: organizational integration, application and dependency security, infrastructure as code, identity and secrets management, artifact and build integrity, and runtime monitoring. Comparative tables distinguish study designs, reported contributions, limitations, and unresolved questions. Conceptual figures summarize literature themes, evidence types, lifecycle coverage, and research gaps. The synthesis shows that early detection, deployment safeguards, and runtime observation address complementary concerns. Recurring limitations include context-dependent detection, differences between declared and actual infrastructure state, excessive pipeline privilege, incomplete verification of artifacts, and the gap between monitoring and effective response. Historical incidents illustrate why security must encompass the delivery process as well as application code. The paper concludes with a discussion of established defensive approaches and open research questions. Its contribution is a qualitative synthesis of existing work; it introduces no new implementation, experimental results, tested architecture, or experimental evaluation plan.</w:t>
+        <w:t xml:space="preserve">DevSecOps aims to include security throughout software development and delivery. In continuous integration and continuous delivery or deployment (CI/CD), this involves checking application code, dependencies, infrastructure settings, credentials, and release processes. Although many security tools and frameworks are available, they address different problems and have different limitations. This paper reviews selected studies and official guidance to explain how security is integrated into CI/CD pipelines. The discussion covers teamwork, vulnerability detection, infrastructure as code, identity and secrets management, software supply-chain security, and monitoring after deployment. Comparison tables summarize the methods, main findings, and limitations of the reviewed studies and frameworks. The figures show the main literature themes, the types of sources considered, the placement of security practices across the delivery lifecycle, and the remaining research questions. The reviewed material suggests that no single tool provides complete protection. Effective security also depends on appropriate permissions, reliable configuration, verification of released software, and timely responses to problems. SolarWinds, Codecov, and Log4Shell illustrate different weaknesses in software production and dependency management. The review identifies continuing challenges in detection coverage, tool integration, configuration changes, and incident response. It concludes that DevSecOps requires a combination of technical controls and clearly assigned responsibilities. This paper discusses existing research and does not report new experiments or propose a new technical system.</w:t>
       </w:r>
     </w:p>
     <w:p>
@@ -134,7 +128,7 @@
         <w:t xml:space="preserve"> </w:t>
       </w:r>
       <w:r>
-        <w:t xml:space="preserve">DevSecOps; CI/CD; literature review; software supply-chain security; infrastructure as code; vulnerability detection; secrets management; continuous monitoring.</w:t>
+        <w:t xml:space="preserve">DevSecOps; CI/CD; literature review; software security; infrastructure as code; supply-chain security; secrets management; continuous monitoring.</w:t>
       </w:r>
     </w:p>
     <w:bookmarkEnd w:id="20"/>
@@ -152,7 +146,7 @@
         <w:pStyle w:val="FirstParagraph"/>
       </w:pPr>
       <w:r>
-        <w:t xml:space="preserve">Continuous integration and continuous delivery or deployment have changed how software is built, tested, and released. Pipelines connect source repositories, dependency registries, testing environments, artifact stores, cloud identities, and production infrastructure. Their automation can improve consistency, but it also concentrates execution authority. A weakness in a build script, dependency, credential, or deployment configuration can affect systems beyond the application under development.</w:t>
+        <w:t xml:space="preserve">Software teams use CI/CD pipelines to automate activities such as building, testing, and releasing applications. Continuous integration checks changes as developers combine their work. Continuous delivery keeps software ready for release, while continuous deployment automatically releases changes that meet the required checks. These practices can make delivery more consistent, but they also create security risks.</w:t>
       </w:r>
     </w:p>
     <w:p>
@@ -160,7 +154,7 @@
         <w:pStyle w:val="BodyText"/>
       </w:pPr>
       <w:r>
-        <w:t xml:space="preserve">DevSecOps addresses this problem by extending security responsibilities across development and operations. It includes technical mechanisms such as source-code analysis, dependency inspection, configuration checks, artifact verification, and monitoring. It also includes the organizational work of defining ownership, communicating risks, maintaining policies, and responding to findings. The literature consequently spans software engineering, application security, cloud configuration, identity management, and software supply-chain assurance.</w:t>
+        <w:t xml:space="preserve">A pipeline connects several systems, including source repositories, package registries, testing environments, and cloud services. It may also have permission to publish software or change production infrastructure. If an attacker compromises a script, dependency, or credential, the effect can extend beyond one application. For this reason, security needs to cover both the software and the process used to deliver it.</w:t>
       </w:r>
     </w:p>
     <w:p>
@@ -168,7 +162,7 @@
         <w:pStyle w:val="BodyText"/>
       </w:pPr>
       <w:r>
-        <w:t xml:space="preserve">These areas should not be treated as interchangeable. A tool that identifies a configuration weakness does not necessarily establish whether that weakness exists in a deployed environment. A signature can authenticate an artifact without demonstrating that its contents are benign. A team can report strong collaboration while still allowing a privileged pipeline to execute unreviewed code. A useful review must therefore explain both the contribution of each approach and the boundary of the conclusion it supports.</w:t>
+        <w:t xml:space="preserve">DevSecOps brings security into the shared work of development and operations teams. It includes practices such as code review, vulnerability scanning, configuration checks, access control, and monitoring. It also involves deciding who should investigate findings, approve changes, and respond to incidents. Adding a tool is only one part of this process.</w:t>
       </w:r>
     </w:p>
     <w:p>
@@ -176,7 +170,7 @@
         <w:pStyle w:val="BodyText"/>
       </w:pPr>
       <w:r>
-        <w:t xml:space="preserve">This paper reviews existing work on security integration in CI/CD, concentrating on defensive practices and their limitations. It compares research methods and contributions, relates security approaches to delivery stages, and examines unresolved issues across the selected literature. Historical incidents are used to illustrate mechanisms already discussed in security guidance. They are not used to estimate incident frequency or to claim that one control would have prevented an entire attack.</w:t>
+        <w:t xml:space="preserve">The studies and frameworks discussed in this paper examine different parts of DevSecOps. Some describe how teams adopt security practices. Others investigate weaknesses in infrastructure code or compare detection tools. Security frameworks provide requirements and guidance for application testing, dependency management, and artifact verification. These contributions are useful, but they should be interpreted according to their purpose and limitations.</w:t>
       </w:r>
     </w:p>
     <w:p>
@@ -184,7 +178,7 @@
         <w:pStyle w:val="BodyText"/>
       </w:pPr>
       <w:r>
-        <w:t xml:space="preserve">The review addresses four questions:</w:t>
+        <w:t xml:space="preserve">This review examines how existing work explains security integration in CI/CD. It compares the approaches, discusses lessons from past incidents, and identifies questions that remain open. The review addresses four research questions:</w:t>
       </w:r>
     </w:p>
     <w:p>
@@ -206,7 +200,7 @@
         <w:t xml:space="preserve"> </w:t>
       </w:r>
       <w:r>
-        <w:t xml:space="preserve">How does existing research describe organizational and technical integration of security into CI/CD?</w:t>
+        <w:t xml:space="preserve">How do existing studies describe teamwork and technical security practices in CI/CD?</w:t>
       </w:r>
     </w:p>
     <w:p>
@@ -228,7 +222,7 @@
         <w:t xml:space="preserve"> </w:t>
       </w:r>
       <w:r>
-        <w:t xml:space="preserve">Which existing defensive approaches address different stages and risks in the delivery lifecycle?</w:t>
+        <w:t xml:space="preserve">Which security approaches are used at different stages of the delivery lifecycle?</w:t>
       </w:r>
     </w:p>
     <w:p>
@@ -250,7 +244,7 @@
         <w:t xml:space="preserve"> </w:t>
       </w:r>
       <w:r>
-        <w:t xml:space="preserve">How do the contributions and limitations of the reviewed studies and security frameworks compare?</w:t>
+        <w:t xml:space="preserve">What are the main contributions and limitations of the reviewed studies and frameworks?</w:t>
       </w:r>
     </w:p>
     <w:p>
@@ -272,7 +266,7 @@
         <w:t xml:space="preserve"> </w:t>
       </w:r>
       <w:r>
-        <w:t xml:space="preserve">Which unresolved challenges and research gaps emerge from this comparison?</w:t>
+        <w:t xml:space="preserve">What challenges and research gaps remain in the selected literature?</w:t>
       </w:r>
     </w:p>
     <w:p>
@@ -280,7 +274,7 @@
         <w:pStyle w:val="FirstParagraph"/>
       </w:pPr>
       <w:r>
-        <w:t xml:space="preserve">The contribution is a critical synthesis of existing literature. The figures are explanatory diagrams and the tables are comparisons of reviewed material. The paper does not propose a new delivery framework, report an implementation, or present an experimental study.</w:t>
+        <w:t xml:space="preserve">The paper is organized as a review of existing material. The figures explain relationships between topics, and the tables compare studies and approaches. No new implementation or experimental results are presented.</w:t>
       </w:r>
     </w:p>
     <w:bookmarkEnd w:id="21"/>
@@ -293,13 +287,13 @@
         <w:t xml:space="preserve">2. Review Scope and Approach</w:t>
       </w:r>
     </w:p>
-    <w:bookmarkStart w:id="22" w:name="type-of-review-and-material-considered"/>
+    <w:bookmarkStart w:id="22" w:name="sources-included-in-the-review"/>
     <w:p>
       <w:pPr>
         <w:pStyle w:val="Heading3"/>
       </w:pPr>
       <w:r>
-        <w:t xml:space="preserve">2.1 Type of review and material considered</w:t>
+        <w:t xml:space="preserve">2.1 Sources included in the review</w:t>
       </w:r>
     </w:p>
     <w:p>
@@ -307,7 +301,7 @@
         <w:pStyle w:val="FirstParagraph"/>
       </w:pPr>
       <w:r>
-        <w:t xml:space="preserve">This is a focused critical literature review. Source selection was purposive rather than the result of a completed, independently reproducible systematic search. The paper therefore does not claim exhaustive coverage, a PRISMA screening record, or a representative distribution of all DevSecOps publications.</w:t>
+        <w:t xml:space="preserve">This paper uses a focused literature review. Sources were selected for their relevance to security in CI/CD. The selection was not based on a complete systematic search, so the review does not claim to include every relevant publication.</w:t>
       </w:r>
     </w:p>
     <w:p>
@@ -315,7 +309,7 @@
         <w:pStyle w:val="BodyText"/>
       </w:pPr>
       <w:r>
-        <w:t xml:space="preserve">The material examined comprises five academic manuscripts and seven official project or agency sources. The academic material covers practitioner security integration, a historical mapping of infrastructure-as-code research, security smells in infrastructure scripts, state-reconciliation defects, and Kubernetes configuration detection. The official material covers CI/CD threat categories, application-security requirements, supply-chain provenance, authorized production steps, dependency consumption, security-practice heuristics, and known exploitation.</w:t>
+        <w:t xml:space="preserve">The material consists of five academic manuscripts and seven official project or agency sources. The academic studies cover security practices in DevOps, infrastructure-as-code research, recurring weaknesses in infrastructure scripts, defects in infrastructure automation, and Kubernetes configuration checks. The official sources discuss pipeline risks, application requirements, build information, dependency management, security-practice checks, and known exploitation.</w:t>
       </w:r>
     </w:p>
     <w:p>
@@ -323,17 +317,17 @@
         <w:pStyle w:val="BodyText"/>
       </w:pPr>
       <w:r>
-        <w:t xml:space="preserve">The academic manuscripts were available through an author’s publication archive. All five share a coauthor, which creates a significant concentration of perspective. They were inspected as author-hosted versions rather than independently checked final publisher copies. This limits field-wide conclusions and makes broader scholarship an important requirement for a comprehensive review. Sources were retrieved on 23 October 2026; that date does not imply complete coverage through 2026.</w:t>
+        <w:t xml:space="preserve">The academic manuscripts were obtained from an author’s publication archive. All five include a common coauthor, so the review has limited diversity of research perspectives. The available manuscripts may also differ from their final published versions. Sources were retrieved on 23 October 2026, but this does not mean that the review covers all research published up to that date.</w:t>
       </w:r>
     </w:p>
     <w:bookmarkEnd w:id="22"/>
-    <w:bookmarkStart w:id="23" w:name="basis-of-comparison"/>
+    <w:bookmarkStart w:id="23" w:name="how-the-sources-were-compared"/>
     <w:p>
       <w:pPr>
         <w:pStyle w:val="Heading3"/>
       </w:pPr>
       <w:r>
-        <w:t xml:space="preserve">2.2 Basis of comparison</w:t>
+        <w:t xml:space="preserve">2.2 How the sources were compared</w:t>
       </w:r>
     </w:p>
     <w:p>
@@ -341,7 +335,7 @@
         <w:pStyle w:val="FirstParagraph"/>
       </w:pPr>
       <w:r>
-        <w:t xml:space="preserve">Each academic study is compared by research focus, method, reported sample or corpus, principal contribution, and limitation. A sample size is used to describe the scope of its source study, not as a result generated by this review. Frameworks are compared by the security question they address, the mechanism they define, and what remains outside that mechanism’s assurance.</w:t>
+        <w:t xml:space="preserve">The academic studies are compared by their topic, method, reported sample, main contribution, and limitations. Sample sizes describe the studies being reviewed. They are not data collected for this paper. Frameworks are compared by the security problem they address, the guidance they provide, and the questions they leave unanswered.</w:t>
       </w:r>
     </w:p>
     <w:p>
@@ -349,7 +343,7 @@
         <w:pStyle w:val="BodyText"/>
       </w:pPr>
       <w:r>
-        <w:t xml:space="preserve">The analysis separates three forms of evidence:</w:t>
+        <w:t xml:space="preserve">Three types of sources are considered:</w:t>
       </w:r>
     </w:p>
     <w:p>
@@ -365,13 +359,13 @@
           <w:b/>
           <w:bCs/>
         </w:rPr>
-        <w:t xml:space="preserve">Academic studies:</w:t>
+        <w:t xml:space="preserve">Academic studies</w:t>
       </w:r>
       <w:r>
         <w:t xml:space="preserve"> </w:t>
       </w:r>
       <w:r>
-        <w:t xml:space="preserve">observations, classifications, and findings produced in defined research settings.</w:t>
+        <w:t xml:space="preserve">report findings from surveys, software repositories, defect records, or other research material.</w:t>
       </w:r>
     </w:p>
     <w:p>
@@ -387,13 +381,13 @@
           <w:b/>
           <w:bCs/>
         </w:rPr>
-        <w:t xml:space="preserve">Specifications and guidance:</w:t>
+        <w:t xml:space="preserve">Standards and guidance</w:t>
       </w:r>
       <w:r>
         <w:t xml:space="preserve"> </w:t>
       </w:r>
       <w:r>
-        <w:t xml:space="preserve">requirements, threat categories, and recommended mechanisms.</w:t>
+        <w:t xml:space="preserve">describe requirements, risks, and recommended security practices.</w:t>
       </w:r>
     </w:p>
     <w:p>
@@ -409,13 +403,13 @@
           <w:b/>
           <w:bCs/>
         </w:rPr>
-        <w:t xml:space="preserve">Incident material:</w:t>
+        <w:t xml:space="preserve">Incident accounts</w:t>
       </w:r>
       <w:r>
         <w:t xml:space="preserve"> </w:t>
       </w:r>
       <w:r>
-        <w:t xml:space="preserve">accounts that illustrate how particular delivery-related failures can occur.</w:t>
+        <w:t xml:space="preserve">explain how particular security failures occurred.</w:t>
       </w:r>
     </w:p>
     <w:p>
@@ -423,17 +417,17 @@
         <w:pStyle w:val="FirstParagraph"/>
       </w:pPr>
       <w:r>
-        <w:t xml:space="preserve">These forms answer different questions. A specification explains what a verifier should check; an empirical study may show how a tool behaves on a particular dataset; an incident demonstrates that a failure mechanism occurred in a particular setting. Their conclusions cannot be combined into a single security-effect percentage.</w:t>
+        <w:t xml:space="preserve">These sources provide different kinds of information. A survey describes participants’ experiences, while a tool study examines particular files or rules. A standard explains what should be checked, but does not prove that an organization has applied those checks correctly. An incident illustrates a failure without showing how common that failure is across all organizations.</w:t>
       </w:r>
     </w:p>
     <w:bookmarkEnd w:id="23"/>
-    <w:bookmarkStart w:id="24" w:name="interpretation-and-claim-boundaries"/>
+    <w:bookmarkStart w:id="24" w:name="interpreting-the-findings-carefully"/>
     <w:p>
       <w:pPr>
         <w:pStyle w:val="Heading3"/>
       </w:pPr>
       <w:r>
-        <w:t xml:space="preserve">2.3 Interpretation and claim boundaries</w:t>
+        <w:t xml:space="preserve">2.3 Interpreting the findings carefully</w:t>
       </w:r>
     </w:p>
     <w:p>
@@ -441,7 +435,7 @@
         <w:pStyle w:val="FirstParagraph"/>
       </w:pPr>
       <w:r>
-        <w:t xml:space="preserve">The review distinguishes adoption from effectiveness, detection from prevention, artifact authenticity from benign behavior, and alert generation from incident response. It does not treat zero scanner findings as proof that no vulnerabilities exist. It also does not reproduce universal remediation-cost multipliers or claims about the leading cause of cloud breaches without a defined population and suitable evidence.</w:t>
+        <w:t xml:space="preserve">This review separates the use of a security practice from evidence that it is effective. For example, running a scanner does not prove that all vulnerabilities have been found. Similarly, generating an alert does not prove that a team has resolved the problem.</w:t>
       </w:r>
     </w:p>
     <w:p>
@@ -449,27 +443,27 @@
         <w:pStyle w:val="BodyText"/>
       </w:pPr>
       <w:r>
-        <w:t xml:space="preserve">Some consulted manuscripts contain discrepancies between numerical summaries, table entries, or associated publication pages. The discussion consequently emphasizes consistent qualitative findings and avoids the disputed prevalence and acceptance figures. No numerical performance chart, pooled effect estimate, or new experimental result is presented.</w:t>
+        <w:t xml:space="preserve">Some source versions contain differences between their numerical summaries and other reported information. The discussion therefore emphasizes findings that can be interpreted consistently. Disputed figures and broad claims about breach frequency or remediation costs are not repeated. The review presents a qualitative comparison rather than a combined performance score.</w:t>
       </w:r>
     </w:p>
     <w:bookmarkEnd w:id="24"/>
     <w:bookmarkEnd w:id="25"/>
-    <w:bookmarkStart w:id="39" w:name="critical-review-of-existing-research"/>
+    <w:bookmarkStart w:id="39" w:name="review-of-existing-studies"/>
     <w:p>
       <w:pPr>
         <w:pStyle w:val="Heading2"/>
       </w:pPr>
       <w:r>
-        <w:t xml:space="preserve">3. Critical Review of Existing Research</w:t>
+        <w:t xml:space="preserve">3. Review of Existing Studies</w:t>
       </w:r>
     </w:p>
-    <w:bookmarkStart w:id="26" w:name="X5af28e0bea1db8193576a07b9e0fdb977e513ed"/>
+    <w:bookmarkStart w:id="26" w:name="Xc6ef4732598de6a25b86bc67d2b91c4c6ec36b5"/>
     <w:p>
       <w:pPr>
         <w:pStyle w:val="Heading3"/>
       </w:pPr>
       <w:r>
-        <w:t xml:space="preserve">3.1 Organizational integration and shared responsibility</w:t>
+        <w:t xml:space="preserve">3.1 Teamwork and shared security responsibility</w:t>
       </w:r>
     </w:p>
     <w:p>
@@ -477,7 +471,7 @@
         <w:pStyle w:val="FirstParagraph"/>
       </w:pPr>
       <w:r>
-        <w:t xml:space="preserve">An exploratory practitioner study combines analysis of Internet artifacts with a survey of representatives from nine organizations. Its contribution is to show how security requirements, configuration practices, monitoring, and collaboration appear within DevOps activity. The study treats security integration as more than a technical stage added to an existing pipeline.</w:t>
+        <w:t xml:space="preserve">One practitioner study examines online material and surveys representatives from nine organizations. It describes how teams use security requirements, configuration practices, monitoring, and collaboration within DevOps. The study shows that security integration includes organizational practices as well as automated checks.</w:t>
       </w:r>
     </w:p>
     <w:p>
@@ -485,7 +479,7 @@
         <w:pStyle w:val="BodyText"/>
       </w:pPr>
       <w:r>
-        <w:t xml:space="preserve">The organizational argument is persuasive because developers, operations staff, and security specialists influence different parts of the same delivery system. Developers modify application and build logic, operations staff maintain execution and deployment infrastructure, and security specialists help interpret threats and requirements. Findings that cross these boundaries need ownership and communication if they are to produce action.</w:t>
+        <w:t xml:space="preserve">Developers, operations staff, and security specialists work on different parts of the same delivery process. Developers change application and build code. Operations staff manage infrastructure and deployment environments. Security specialists help identify risks and interpret requirements. A security finding may need input from more than one of these groups before it can be resolved.</w:t>
       </w:r>
     </w:p>
     <w:p>
@@ -493,7 +487,7 @@
         <w:pStyle w:val="BodyText"/>
       </w:pPr>
       <w:r>
-        <w:t xml:space="preserve">However, collaboration should not be confused with unrestricted access. The reviewed work also discusses the danger of inappropriate resource access and the possibility that rapid deployment overlooks security practices. Shared responsibility therefore does not require shared administrator credentials or the removal of authorization boundaries.</w:t>
+        <w:t xml:space="preserve">However, shared responsibility does not mean that everyone needs unrestricted access. Teams can work together while keeping deployment permissions and administrator accounts limited. The reviewed study also discusses risks from inappropriate access and from rapid releases that overlook security work.</w:t>
       </w:r>
     </w:p>
     <w:p>
@@ -501,17 +495,17 @@
         <w:pStyle w:val="BodyText"/>
       </w:pPr>
       <w:r>
-        <w:t xml:space="preserve">The evidence is exploratory and partly self-reported. The study does not establish a causal relationship between automation and the security of deployed software. Its findings support an account of adoption and reported practice, rather than a general claim that a particular team structure reduces breaches. This distinction recurs throughout DevSecOps research: organizational enablers are important, but their operational consequences require separate evidence.</w:t>
+        <w:t xml:space="preserve">The study is useful for understanding reported practices, but its sample is small and some information is self-reported. It does not prove that a particular team structure causes fewer breaches. Its main value for this review is showing why collaboration and clear responsibilities matter during adoption.</w:t>
       </w:r>
     </w:p>
     <w:bookmarkEnd w:id="26"/>
-    <w:bookmarkStart w:id="27" w:name="X70ac5dd3d34565a3218c4ecef14debd2fc84b29"/>
+    <w:bookmarkStart w:id="27" w:name="research-on-infrastructure-as-code"/>
     <w:p>
       <w:pPr>
         <w:pStyle w:val="Heading3"/>
       </w:pPr>
       <w:r>
-        <w:t xml:space="preserve">3.2 The development of infrastructure-as-code research</w:t>
+        <w:t xml:space="preserve">3.2 Research on infrastructure as code</w:t>
       </w:r>
     </w:p>
     <w:p>
@@ -519,7 +513,7 @@
         <w:pStyle w:val="FirstParagraph"/>
       </w:pPr>
       <w:r>
-        <w:t xml:space="preserve">A historical mapping study organizes infrastructure as code (IaC) research into frameworks or tools, adoption, empirical investigation, and testing. Its selected corpus contains 32 publications, with collection completed in 2017. Half of that corpus is classified as framework or tool work. This describes a particular historical literature set and should not be interpreted as the present distribution of DevSecOps research.</w:t>
+        <w:t xml:space="preserve">A historical mapping study reviews infrastructure as code (IaC), which uses configuration files and automation to manage computing resources. It groups the literature into tools and frameworks, adoption, empirical studies, and testing. The study includes 32 publications collected through 2017, with half classified as tool or framework work.</w:t>
       </w:r>
     </w:p>
     <w:p>
@@ -527,7 +521,7 @@
         <w:pStyle w:val="BodyText"/>
       </w:pPr>
       <w:r>
-        <w:t xml:space="preserve">The mapping nevertheless provides an important distinction for this review. A tool proposal, an integration demonstration, and an investigation of weaknesses are different research contributions. A paper can establish that a mechanism is technically feasible while leaving its accuracy, usability, maintenance demands, or operational benefit unresolved.</w:t>
+        <w:t xml:space="preserve">This classification helps explain the different contributions made by research papers. A paper that introduces a tool may show that an approach is possible. It may not show whether the tool remains accurate, useful, or easy to maintain in different organizations. A study of existing defects answers a different question by examining what has already gone wrong.</w:t>
       </w:r>
     </w:p>
     <w:p>
@@ -535,17 +529,25 @@
         <w:pStyle w:val="BodyText"/>
       </w:pPr>
       <w:r>
-        <w:t xml:space="preserve">Infrastructure as code is especially relevant because the same automation that makes infrastructure repeatable can reproduce insecure choices. Reviewable configuration files can improve visibility, but their safety depends on the rules applied, the values supplied, and the behavior of the executing platform. Treating configuration as code creates an opportunity for security review; it does not automatically make the resulting infrastructure secure.</w:t>
+        <w:t xml:space="preserve">The mapping is historical, so its publication counts do not describe the current field. Nevertheless, it highlights the need to distinguish between introducing a method and understanding its practical use.</w:t>
+      </w:r>
+    </w:p>
+    <w:p>
+      <w:pPr>
+        <w:pStyle w:val="BodyText"/>
+      </w:pPr>
+      <w:r>
+        <w:t xml:space="preserve">IaC is important to DevSecOps because automation can repeat both secure and insecure configurations. Storing configuration in reviewable files makes inspection easier. The resulting infrastructure still depends on the settings supplied, the checks performed, and the behavior of the automation tool.</w:t>
       </w:r>
     </w:p>
     <w:bookmarkEnd w:id="27"/>
-    <w:bookmarkStart w:id="28" w:name="X27d2d91b3f5ed3ee769ee28e728688922b214fd"/>
+    <w:bookmarkStart w:id="28" w:name="X50a7839a81f3b7f5d1ccaf3454cb6ef8717dfa0"/>
     <w:p>
       <w:pPr>
         <w:pStyle w:val="Heading3"/>
       </w:pPr>
       <w:r>
-        <w:t xml:space="preserve">3.3 Security smells and contextual interpretation</w:t>
+        <w:t xml:space="preserve">3.3 Recurring weaknesses in infrastructure scripts</w:t>
       </w:r>
     </w:p>
     <w:p>
@@ -553,7 +555,7 @@
         <w:pStyle w:val="FirstParagraph"/>
       </w:pPr>
       <w:r>
-        <w:t xml:space="preserve">A security-smell study examines 15,232 infrastructure scripts from 293 open-source repositories. It identifies recurring weakness patterns and develops static analysis to locate them. Examples include hard-coded secrets and insecure defaults. The work supports the inclusion of infrastructure artifacts within security analysis, rather than limiting attention to application source code.</w:t>
+        <w:t xml:space="preserve">A study of security smells examines 15,232 infrastructure scripts from 293 open-source repositories. A security smell is a recurring pattern that may indicate a weakness. Examples include hard-coded secrets and insecure default settings. The study uses static analysis to identify such patterns.</w:t>
       </w:r>
     </w:p>
     <w:p>
@@ -561,7 +563,7 @@
         <w:pStyle w:val="BodyText"/>
       </w:pPr>
       <w:r>
-        <w:t xml:space="preserve">A central interpretive point is that a smell indicates a potential weakness. It is not equivalent to a confirmed exploit or a documented production incident. Its consequence may depend on whether a script is an example, whether a credential is valid, which environment uses the configuration, and what external restrictions apply.</w:t>
+        <w:t xml:space="preserve">This work shows why infrastructure scripts should be included in security reviews. An application may have secure source code while its infrastructure exposes credentials or grants unnecessary permissions. Reviewing application code alone would miss these issues.</w:t>
       </w:r>
     </w:p>
     <w:p>
@@ -569,7 +571,7 @@
         <w:pStyle w:val="BodyText"/>
       </w:pPr>
       <w:r>
-        <w:t xml:space="preserve">Context also complicates developer responses. A pattern intended for training may have limited immediate exposure while still encouraging unsafe reuse. Conversely, treating every example or test fixture as a production vulnerability can produce unnecessary noise. The literature therefore supports contextual investigation and accountable decisions rather than unconditional acceptance or dismissal of every finding.</w:t>
+        <w:t xml:space="preserve">At the same time, a smell is a warning that needs investigation. It does not prove that an attacker has exploited the system. The risk may depend on whether the script is used in production, whether a credential is valid, and what other controls are present.</w:t>
       </w:r>
     </w:p>
     <w:p>
@@ -577,17 +579,25 @@
         <w:pStyle w:val="BodyText"/>
       </w:pPr>
       <w:r>
-        <w:t xml:space="preserve">The study’s language and repository setting also limit generalization. Results from one infrastructure language do not demonstrate complete coverage of Terraform, Kubernetes, managed-cloud services, or provider-specific runtime semantics. Security patterns need to be interpreted within the environment in which they are used.</w:t>
+        <w:t xml:space="preserve">Context can also affect how developers respond. A hard-coded value in a training example may not expose a live account, but someone could copy the example into a real deployment. Reporting every example as an urgent production problem could also create unnecessary work. The study supports examining findings in context instead of accepting or rejecting every warning automatically.</w:t>
+      </w:r>
+    </w:p>
+    <w:p>
+      <w:pPr>
+        <w:pStyle w:val="BodyText"/>
+      </w:pPr>
+      <w:r>
+        <w:t xml:space="preserve">The findings are also limited by the infrastructure language and repositories studied. They do not establish complete coverage of Terraform, Kubernetes, or every cloud service. Similar patterns need to be examined in the environments where they are used.</w:t>
       </w:r>
     </w:p>
     <w:bookmarkEnd w:id="28"/>
-    <w:bookmarkStart w:id="29" w:name="Xddd26aca7e760f67989f3db50bcac08b3fd57b2"/>
+    <w:bookmarkStart w:id="29" w:name="defects-in-infrastructure-automation"/>
     <w:p>
       <w:pPr>
         <w:pStyle w:val="Heading3"/>
       </w:pPr>
       <w:r>
-        <w:t xml:space="preserve">3.4 State reconciliation and actual infrastructure behavior</w:t>
+        <w:t xml:space="preserve">3.4 Defects in infrastructure automation</w:t>
       </w:r>
     </w:p>
     <w:p>
@@ -595,7 +605,7 @@
         <w:pStyle w:val="FirstParagraph"/>
       </w:pPr>
       <w:r>
-        <w:t xml:space="preserve">A study of 5,110 Ansible-related state-reconciliation defects identifies eight defect categories. State reconciliation is the process through which an automation engine compares intended and existing infrastructure state and determines the changes to apply. Examining defects in that engine extends the discussion beyond the configuration file itself.</w:t>
+        <w:t xml:space="preserve">Another study examines 5,110 Ansible-related defects in state reconciliation and identifies eight categories. State reconciliation is the process of comparing the desired infrastructure state with the current state and deciding which changes to make.</w:t>
       </w:r>
     </w:p>
     <w:p>
@@ -603,7 +613,7 @@
         <w:pStyle w:val="BodyText"/>
       </w:pPr>
       <w:r>
-        <w:t xml:space="preserve">This contribution explains a limitation of relying exclusively on static configuration approval. A declaration is interpreted through an orchestrator, inventory, variables, providers, and remote interfaces. Defects or unexpected interactions in those components can produce behavior that differs from the reviewed text.</w:t>
+        <w:t xml:space="preserve">This study adds an important point to the review: a configuration file is only one part of infrastructure behavior. An automation engine interprets that file using variables, inventories, providers, and remote interfaces. A defect in these components can cause the actual result to differ from the intended configuration.</w:t>
       </w:r>
     </w:p>
     <w:p>
@@ -611,7 +621,7 @@
         <w:pStyle w:val="BodyText"/>
       </w:pPr>
       <w:r>
-        <w:t xml:space="preserve">The implication is not that static analysis lacks value. Static checks and observations of deployed state address different parts of the same problem. The former examine known patterns before a change is applied; the latter help reveal execution effects and later drift. Their contributions are complementary.</w:t>
+        <w:t xml:space="preserve">Static configuration checks are still useful because they can identify known problems before deployment. Observing the deployed environment provides different information about what actually happened and what changed later. Both types of checks help explain infrastructure security.</w:t>
       </w:r>
     </w:p>
     <w:p>
@@ -619,17 +629,17 @@
         <w:pStyle w:val="BodyText"/>
       </w:pPr>
       <w:r>
-        <w:t xml:space="preserve">The reviewed defect study is specific to its investigated setting and should not be generalized into a claim that all infrastructure tools fail in the same way. Its use of generated inputs for defect discovery also does not establish reliable autonomous remediation. For a literature review, the relevant lesson is that infrastructure security depends on both declared configuration and execution semantics.</w:t>
+        <w:t xml:space="preserve">The findings apply to the setting examined in the study. They do not show that every automation tool has the same defects. The study’s use of generated inputs to discover problems also does not prove that software can safely repair infrastructure without human review.</w:t>
       </w:r>
     </w:p>
     <w:bookmarkEnd w:id="29"/>
-    <w:bookmarkStart w:id="30" w:name="X8a3ef7da4250ecedbd63cc7f7dddec5483c3a83"/>
+    <w:bookmarkStart w:id="30" w:name="kubernetes-configuration-checks"/>
     <w:p>
       <w:pPr>
         <w:pStyle w:val="Heading3"/>
       </w:pPr>
       <w:r>
-        <w:t xml:space="preserve">3.5 Kubernetes configuration and detection limitations</w:t>
+        <w:t xml:space="preserve">3.5 Kubernetes configuration checks</w:t>
       </w:r>
     </w:p>
     <w:p>
@@ -637,7 +647,7 @@
         <w:pStyle w:val="FirstParagraph"/>
       </w:pPr>
       <w:r>
-        <w:t xml:space="preserve">A Kubernetes configuration study examines 53 security configurations prescribed by the Center for Internet Security (CIS), 544 configuration files, and 20 survey respondents. It compares the support and detection behavior of five static-analysis tools. The study contributes evidence that tool availability and recommendation coverage do not necessarily establish adequate detection in practice.</w:t>
+        <w:t xml:space="preserve">A Kubernetes study examines 53 security configurations prescribed by the Center for Internet Security (CIS), 544 configuration files, and 20 survey respondents. It compares the support and detection behavior of five static-analysis tools. The study reports limitations in what these tools cover and detect.</w:t>
       </w:r>
     </w:p>
     <w:p>
@@ -645,7 +655,7 @@
         <w:pStyle w:val="BodyText"/>
       </w:pPr>
       <w:r>
-        <w:t xml:space="preserve">Its findings depend on the studied tool versions, rule mappings, configuration files, and interpretation of prescribed settings. They should not be presented as permanent rankings of current products. In addition, inconsistencies in parts of the consulted source version limit which numerical summaries can be repeated confidently. This review therefore summarizes the contribution qualitatively rather than reproducing a performance graph.</w:t>
+        <w:t xml:space="preserve">Its findings should be read in relation to the versions, rules, and files used in that study. They are not permanent rankings of current products. Some numerical summaries in the available source version also require further checking. This paper therefore discusses the findings without reproducing a performance chart.</w:t>
       </w:r>
     </w:p>
     <w:p>
@@ -653,7 +663,7 @@
         <w:pStyle w:val="BodyText"/>
       </w:pPr>
       <w:r>
-        <w:t xml:space="preserve">The broader point is that combining tools can increase the number of patterns inspected while also introducing duplicated findings, inconsistent classifications, and maintenance costs. Tools that share similar rules can share blind spots. A large alert volume does not by itself demonstrate broader meaningful coverage.</w:t>
+        <w:t xml:space="preserve">Using several tools may increase the number of patterns checked. It can also produce repeated warnings or different descriptions of the same issue. Tools with similar rules may miss the same problems. The number of alerts alone is therefore not a reliable measure of security coverage.</w:t>
       </w:r>
     </w:p>
     <w:p>
@@ -661,17 +671,17 @@
         <w:pStyle w:val="BodyText"/>
       </w:pPr>
       <w:r>
-        <w:t xml:space="preserve">Configuration analysis also depends on context. A static file may omit values that are inserted later, use templates that require rendering, or describe only one part of a cluster’s configuration. The literature consequently supports distinguishing rule support, detection behavior, and actual deployed exposure.</w:t>
+        <w:t xml:space="preserve">Configuration checks can also lack information that becomes available later. A template may be filled with values during deployment, or a file may describe only part of a cluster. The study helps explain why support for a rule, detection of a warning, and exposure in a running system are different questions.</w:t>
       </w:r>
     </w:p>
     <w:bookmarkEnd w:id="30"/>
-    <w:bookmarkStart w:id="34" w:name="X665bd791a885e67720a5660f61f618dc6195ebe"/>
+    <w:bookmarkStart w:id="34" w:name="main-themes-in-the-literature"/>
     <w:p>
       <w:pPr>
         <w:pStyle w:val="Heading3"/>
       </w:pPr>
       <w:r>
-        <w:t xml:space="preserve">3.6 Major themes across the selected literature</w:t>
+        <w:t xml:space="preserve">3.6 Main themes in the literature</w:t>
       </w:r>
     </w:p>
     <w:p>
@@ -679,7 +689,7 @@
         <w:pStyle w:val="FirstParagraph"/>
       </w:pPr>
       <w:r>
-        <w:t xml:space="preserve">Figure 1 groups the reviewed topics into six connected themes. Organizational integration establishes responsibility; code and dependency checks examine selected weaknesses; infrastructure analysis addresses configuration and execution; identity management constrains authority; supply-chain mechanisms protect production and distribution relationships; and monitoring informs operational awareness.</w:t>
+        <w:t xml:space="preserve">Figure 1 organizes the reviewed material into six themes. These cover teamwork, code and dependencies, infrastructure, identities and secrets, supply-chain integrity, and monitoring. The themes provide a simple way to follow the discussion across the studies and guidance.</w:t>
       </w:r>
     </w:p>
     <w:p>
@@ -693,7 +703,7 @@
           <w:b/>
           <w:bCs/>
         </w:rPr>
-        <w:t xml:space="preserve">Figure 1. Major themes in the reviewed DevSecOps literature.</w:t>
+        <w:t xml:space="preserve">Figure 1. Main topics covered by the reviewed DevSecOps literature.</w:t>
       </w:r>
     </w:p>
     <w:p>
@@ -706,7 +716,7 @@
           <wp:inline>
             <wp:extent cx="5943600" cy="3962400"/>
             <wp:effectExtent b="0" l="0" r="0" t="0"/>
-            <wp:docPr descr="Six literature themes: organizational integration, application and dependency security, infrastructure security, identity and secrets, supply-chain integrity, and runtime monitoring." title="" id="32" name="Picture"/>
+            <wp:docPr descr="Six review topics: teamwork, code and dependencies, infrastructure, identity and secrets, supply-chain integrity, and monitoring." title="" id="32" name="Picture"/>
             <a:graphic>
               <a:graphicData uri="http://schemas.openxmlformats.org/drawingml/2006/picture">
                 <pic:pic>
@@ -749,15 +759,7 @@
         <w:pStyle w:val="BodyText"/>
       </w:pPr>
       <w:r>
-        <w:t xml:space="preserve">The figure is a qualitative organization of selected material. The size and placement of the themes do not represent publication counts, effect sizes, or their relative importance in every organization.</w:t>
-      </w:r>
-    </w:p>
-    <w:p>
-      <w:pPr>
-        <w:pStyle w:val="BodyText"/>
-      </w:pPr>
-      <w:r>
-        <w:t xml:space="preserve">The themes overlap. A dependency-installation script can be simultaneously a supply-chain input, an execution risk, and a route to credential exposure. A configuration finding may require both a code change and an authorization decision. These overlaps explain why a review organized only by product names would miss important relationships.</w:t>
+        <w:t xml:space="preserve">The topics overlap. For example, a dependency script may introduce unsafe code and also gain access to credentials. A configuration problem may require both a code change and a permissions change. These connections help explain why DevSecOps cannot be understood through a list of tools alone. The figure shows topic groups, not how common or effective each practice is.</w:t>
       </w:r>
     </w:p>
     <w:p>
@@ -771,7 +773,7 @@
           <w:b/>
           <w:bCs/>
         </w:rPr>
-        <w:t xml:space="preserve">Table 1. Contributions and inference boundaries of the reviewed evidence.</w:t>
+        <w:t xml:space="preserve">Table 1. What the reviewed sources explain and where their conclusions are limited.</w:t>
       </w:r>
     </w:p>
     <w:tbl>
@@ -811,7 +813,7 @@
                 <w:color w:val="FFFFFF"/>
                 <w:sz w:val="18"/>
               </w:rPr>
-              <w:t xml:space="preserve">Evidence stream</w:t>
+              <w:t xml:space="preserve">Type of source</w:t>
             </w:r>
           </w:p>
         </w:tc>
@@ -833,7 +835,7 @@
                 <w:color w:val="FFFFFF"/>
                 <w:sz w:val="18"/>
               </w:rPr>
-              <w:t xml:space="preserve">Contribution to understanding DevSecOps</w:t>
+              <w:t xml:space="preserve">What it explains</w:t>
             </w:r>
           </w:p>
         </w:tc>
@@ -855,7 +857,7 @@
                 <w:color w:val="FFFFFF"/>
                 <w:sz w:val="18"/>
               </w:rPr>
-              <w:t xml:space="preserve">Conclusion it does not establish</w:t>
+              <w:t xml:space="preserve">Main limit</w:t>
             </w:r>
           </w:p>
         </w:tc>
@@ -900,7 +902,7 @@
                 <w:rFonts w:ascii="Calibri" w:hAnsi="Calibri"/>
                 <w:sz w:val="18"/>
               </w:rPr>
-              <w:t xml:space="preserve">Reported collaboration and security practices</w:t>
+              <w:t xml:space="preserve">Reported teamwork and security practices</w:t>
             </w:r>
           </w:p>
         </w:tc>
@@ -920,7 +922,7 @@
                 <w:rFonts w:ascii="Calibri" w:hAnsi="Calibri"/>
                 <w:sz w:val="18"/>
               </w:rPr>
-              <w:t xml:space="preserve">Universal causal reduction in breaches</w:t>
+              <w:t xml:space="preserve">Does not prove a general reduction in breaches</w:t>
             </w:r>
           </w:p>
         </w:tc>
@@ -963,7 +965,7 @@
                 <w:rFonts w:ascii="Calibri" w:hAnsi="Calibri"/>
                 <w:sz w:val="18"/>
               </w:rPr>
-              <w:t xml:space="preserve">Classification of a selected body of IaC research</w:t>
+              <w:t xml:space="preserve">Topics covered by a selected set of IaC papers</w:t>
             </w:r>
           </w:p>
         </w:tc>
@@ -982,7 +984,7 @@
                 <w:rFonts w:ascii="Calibri" w:hAnsi="Calibri"/>
                 <w:sz w:val="18"/>
               </w:rPr>
-              <w:t xml:space="preserve">Current distribution of all DevSecOps scholarship</w:t>
+              <w:t xml:space="preserve">Does not describe the whole current research field</w:t>
             </w:r>
           </w:p>
         </w:tc>
@@ -1027,7 +1029,7 @@
                 <w:rFonts w:ascii="Calibri" w:hAnsi="Calibri"/>
                 <w:sz w:val="18"/>
               </w:rPr>
-              <w:t xml:space="preserve">Recurring weakness patterns in sampled scripts</w:t>
+              <w:t xml:space="preserve">Repeated warning patterns in infrastructure scripts</w:t>
             </w:r>
           </w:p>
         </w:tc>
@@ -1047,7 +1049,7 @@
                 <w:rFonts w:ascii="Calibri" w:hAnsi="Calibri"/>
                 <w:sz w:val="18"/>
               </w:rPr>
-              <w:t xml:space="preserve">Successful exploitation of every flagged pattern</w:t>
+              <w:t xml:space="preserve">A warning does not prove successful exploitation</w:t>
             </w:r>
           </w:p>
         </w:tc>
@@ -1071,7 +1073,7 @@
                 <w:rFonts w:ascii="Calibri" w:hAnsi="Calibri"/>
                 <w:sz w:val="18"/>
               </w:rPr>
-              <w:t xml:space="preserve">Reconciliation-defect research</w:t>
+              <w:t xml:space="preserve">Automation-defect research</w:t>
             </w:r>
           </w:p>
         </w:tc>
@@ -1090,7 +1092,7 @@
                 <w:rFonts w:ascii="Calibri" w:hAnsi="Calibri"/>
                 <w:sz w:val="18"/>
               </w:rPr>
-              <w:t xml:space="preserve">Weaknesses in infrastructure execution behavior</w:t>
+              <w:t xml:space="preserve">Problems in how infrastructure changes are carried out</w:t>
             </w:r>
           </w:p>
         </w:tc>
@@ -1109,7 +1111,7 @@
                 <w:rFonts w:ascii="Calibri" w:hAnsi="Calibri"/>
                 <w:sz w:val="18"/>
               </w:rPr>
-              <w:t xml:space="preserve">Correct live state from static approval alone</w:t>
+              <w:t xml:space="preserve">An approved file does not guarantee the expected live state</w:t>
             </w:r>
           </w:p>
         </w:tc>
@@ -1134,7 +1136,7 @@
                 <w:rFonts w:ascii="Calibri" w:hAnsi="Calibri"/>
                 <w:sz w:val="18"/>
               </w:rPr>
-              <w:t xml:space="preserve">Configuration-tool comparison</w:t>
+              <w:t xml:space="preserve">Configuration-tool studies</w:t>
             </w:r>
           </w:p>
         </w:tc>
@@ -1154,7 +1156,7 @@
                 <w:rFonts w:ascii="Calibri" w:hAnsi="Calibri"/>
                 <w:sz w:val="18"/>
               </w:rPr>
-              <w:t xml:space="preserve">Context-specific detection and coverage limitations</w:t>
+              <w:t xml:space="preserve">Detection and coverage in a particular setting</w:t>
             </w:r>
           </w:p>
         </w:tc>
@@ -1174,7 +1176,7 @@
                 <w:rFonts w:ascii="Calibri" w:hAnsi="Calibri"/>
                 <w:sz w:val="18"/>
               </w:rPr>
-              <w:t xml:space="preserve">Permanent rankings of current products</w:t>
+              <w:t xml:space="preserve">Findings depend on the tools, versions, and files examined</w:t>
             </w:r>
           </w:p>
         </w:tc>
@@ -1198,7 +1200,7 @@
                 <w:rFonts w:ascii="Calibri" w:hAnsi="Calibri"/>
                 <w:sz w:val="18"/>
               </w:rPr>
-              <w:t xml:space="preserve">Security specifications</w:t>
+              <w:t xml:space="preserve">Security standards</w:t>
             </w:r>
           </w:p>
         </w:tc>
@@ -1217,7 +1219,7 @@
                 <w:rFonts w:ascii="Calibri" w:hAnsi="Calibri"/>
                 <w:sz w:val="18"/>
               </w:rPr>
-              <w:t xml:space="preserve">Defined requirements and verification mechanisms</w:t>
+              <w:t xml:space="preserve">Requirements and recommended checks</w:t>
             </w:r>
           </w:p>
         </w:tc>
@@ -1236,7 +1238,7 @@
                 <w:rFonts w:ascii="Calibri" w:hAnsi="Calibri"/>
                 <w:sz w:val="18"/>
               </w:rPr>
-              <w:t xml:space="preserve">Operational benefit from adoption alone</w:t>
+              <w:t xml:space="preserve">Publication of a requirement does not prove correct use</w:t>
             </w:r>
           </w:p>
         </w:tc>
@@ -1261,7 +1263,7 @@
                 <w:rFonts w:ascii="Calibri" w:hAnsi="Calibri"/>
                 <w:sz w:val="18"/>
               </w:rPr>
-              <w:t xml:space="preserve">Incident and exploitation material</w:t>
+              <w:t xml:space="preserve">Incident accounts</w:t>
             </w:r>
           </w:p>
         </w:tc>
@@ -1281,7 +1283,7 @@
                 <w:rFonts w:ascii="Calibri" w:hAnsi="Calibri"/>
                 <w:sz w:val="18"/>
               </w:rPr>
-              <w:t xml:space="preserve">Examples of observed failure mechanisms</w:t>
+              <w:t xml:space="preserve">Examples of security failures</w:t>
             </w:r>
           </w:p>
         </w:tc>
@@ -1301,20 +1303,20 @@
                 <w:rFonts w:ascii="Calibri" w:hAnsi="Calibri"/>
                 <w:sz w:val="18"/>
               </w:rPr>
-              <w:t xml:space="preserve">Population-wide frequency or guaranteed prevention</w:t>
+              <w:t xml:space="preserve">One incident does not establish overall frequency</w:t>
             </w:r>
           </w:p>
         </w:tc>
       </w:tr>
     </w:tbl>
     <w:bookmarkEnd w:id="34"/>
-    <w:bookmarkStart w:id="38" w:name="comparison-of-the-academic-studies"/>
+    <w:bookmarkStart w:id="38" w:name="comparison-of-the-reviewed-studies"/>
     <w:p>
       <w:pPr>
         <w:pStyle w:val="Heading3"/>
       </w:pPr>
       <w:r>
-        <w:t xml:space="preserve">3.7 Comparison of the academic studies</w:t>
+        <w:t xml:space="preserve">3.7 Comparison of the reviewed studies</w:t>
       </w:r>
     </w:p>
     <w:p>
@@ -1322,7 +1324,7 @@
         <w:pStyle w:val="FirstParagraph"/>
       </w:pPr>
       <w:r>
-        <w:t xml:space="preserve">Table 2 compares the five academic studies by scope and contribution. Their units of analysis differ: organizations, publications, scripts, defect records, and configuration files. Those units are retained to prevent an apparent sample-size ranking from replacing critical interpretation.</w:t>
+        <w:t xml:space="preserve">Table 2 summarizes the five academic studies. Their samples include organizations, publications, scripts, defect records, and configuration files. These are different units, so a larger sample does not automatically make one study more suitable for every question.</w:t>
       </w:r>
     </w:p>
     <w:p>
@@ -1336,7 +1338,7 @@
           <w:b/>
           <w:bCs/>
         </w:rPr>
-        <w:t xml:space="preserve">Table 2. Comparison of reviewed study designs, reported scope, contributions, and limitations.</w:t>
+        <w:t xml:space="preserve">Table 2. Comparison of the reviewed studies, their methods, and their limitations.</w:t>
       </w:r>
     </w:p>
     <w:tbl>
@@ -1377,7 +1379,7 @@
                 <w:color w:val="FFFFFF"/>
                 <w:sz w:val="18"/>
               </w:rPr>
-              <w:t xml:space="preserve">Study focus</w:t>
+              <w:t xml:space="preserve">Study topic</w:t>
             </w:r>
           </w:p>
         </w:tc>
@@ -1399,7 +1401,7 @@
                 <w:color w:val="FFFFFF"/>
                 <w:sz w:val="18"/>
               </w:rPr>
-              <w:t xml:space="preserve">Design and reported scope</w:t>
+              <w:t xml:space="preserve">Method and reported scope</w:t>
             </w:r>
           </w:p>
         </w:tc>
@@ -1443,7 +1445,7 @@
                 <w:color w:val="FFFFFF"/>
                 <w:sz w:val="18"/>
               </w:rPr>
-              <w:t xml:space="preserve">Limitation and open question</w:t>
+              <w:t xml:space="preserve">Main limitation</w:t>
             </w:r>
           </w:p>
         </w:tc>
@@ -1468,7 +1470,7 @@
                 <w:rFonts w:ascii="Calibri" w:hAnsi="Calibri"/>
                 <w:sz w:val="18"/>
               </w:rPr>
-              <w:t xml:space="preserve">Organizational integration</w:t>
+              <w:t xml:space="preserve">Security integration in teams</w:t>
             </w:r>
           </w:p>
         </w:tc>
@@ -1488,7 +1490,7 @@
                 <w:rFonts w:ascii="Calibri" w:hAnsi="Calibri"/>
                 <w:sz w:val="18"/>
               </w:rPr>
-              <w:t xml:space="preserve">Exploratory artifact analysis and survey of nine organizations</w:t>
+              <w:t xml:space="preserve">Online-material analysis and survey of nine organizations</w:t>
             </w:r>
           </w:p>
         </w:tc>
@@ -1508,7 +1510,7 @@
                 <w:rFonts w:ascii="Calibri" w:hAnsi="Calibri"/>
                 <w:sz w:val="18"/>
               </w:rPr>
-              <w:t xml:space="preserve">Explains reported collaboration, requirements, and security practices</w:t>
+              <w:t xml:space="preserve">Describes collaboration, requirements, and security practices</w:t>
             </w:r>
           </w:p>
         </w:tc>
@@ -1528,7 +1530,7 @@
                 <w:rFonts w:ascii="Calibri" w:hAnsi="Calibri"/>
                 <w:sz w:val="18"/>
               </w:rPr>
-              <w:t xml:space="preserve">Small and partly self-reported sample; operational consequences remain context-dependent</w:t>
+              <w:t xml:space="preserve">Small sample and partly self-reported information</w:t>
             </w:r>
           </w:p>
         </w:tc>
@@ -1571,7 +1573,7 @@
                 <w:rFonts w:ascii="Calibri" w:hAnsi="Calibri"/>
                 <w:sz w:val="18"/>
               </w:rPr>
-              <w:t xml:space="preserve">Mapping of 32 publications, collected through 2017</w:t>
+              <w:t xml:space="preserve">Mapping of 32 publications collected through 2017</w:t>
             </w:r>
           </w:p>
         </w:tc>
@@ -1590,7 +1592,7 @@
                 <w:rFonts w:ascii="Calibri" w:hAnsi="Calibri"/>
                 <w:sz w:val="18"/>
               </w:rPr>
-              <w:t xml:space="preserve">Distinguishes tool, adoption, empirical, and testing work</w:t>
+              <w:t xml:space="preserve">Groups work on tools, adoption, empirical studies, and testing</w:t>
             </w:r>
           </w:p>
         </w:tc>
@@ -1609,7 +1611,7 @@
                 <w:rFonts w:ascii="Calibri" w:hAnsi="Calibri"/>
                 <w:sz w:val="18"/>
               </w:rPr>
-              <w:t xml:space="preserve">Historical and search-dependent corpus; broader and updated coverage is needed</w:t>
+              <w:t xml:space="preserve">Historical coverage does not represent the whole current field</w:t>
             </w:r>
           </w:p>
         </w:tc>
@@ -1654,7 +1656,7 @@
                 <w:rFonts w:ascii="Calibri" w:hAnsi="Calibri"/>
                 <w:sz w:val="18"/>
               </w:rPr>
-              <w:t xml:space="preserve">Static-analysis study of 15,232 scripts from 293 repositories</w:t>
+              <w:t xml:space="preserve">Static analysis of 15,232 scripts from 293 repositories</w:t>
             </w:r>
           </w:p>
         </w:tc>
@@ -1674,7 +1676,7 @@
                 <w:rFonts w:ascii="Calibri" w:hAnsi="Calibri"/>
                 <w:sz w:val="18"/>
               </w:rPr>
-              <w:t xml:space="preserve">Characterizes recurring weakness patterns and their interpretation</w:t>
+              <w:t xml:space="preserve">Identifies recurring patterns that may indicate weaknesses</w:t>
             </w:r>
           </w:p>
         </w:tc>
@@ -1694,7 +1696,7 @@
                 <w:rFonts w:ascii="Calibri" w:hAnsi="Calibri"/>
                 <w:sz w:val="18"/>
               </w:rPr>
-              <w:t xml:space="preserve">Smells are not confirmed exploits; language and deployment context limit generalization</w:t>
+              <w:t xml:space="preserve">Findings depend on language and context; smells are not confirmed exploits</w:t>
             </w:r>
           </w:p>
         </w:tc>
@@ -1737,7 +1739,7 @@
                 <w:rFonts w:ascii="Calibri" w:hAnsi="Calibri"/>
                 <w:sz w:val="18"/>
               </w:rPr>
-              <w:t xml:space="preserve">Study of 5,110 Ansible-related defects and eight categories</w:t>
+              <w:t xml:space="preserve">Analysis of 5,110 Ansible-related defects and eight categories</w:t>
             </w:r>
           </w:p>
         </w:tc>
@@ -1756,7 +1758,7 @@
                 <w:rFonts w:ascii="Calibri" w:hAnsi="Calibri"/>
                 <w:sz w:val="18"/>
               </w:rPr>
-              <w:t xml:space="preserve">Shows why execution-engine behavior matters alongside configuration text</w:t>
+              <w:t xml:space="preserve">Shows why automation behavior matters as well as configuration text</w:t>
             </w:r>
           </w:p>
         </w:tc>
@@ -1775,7 +1777,7 @@
                 <w:rFonts w:ascii="Calibri" w:hAnsi="Calibri"/>
                 <w:sz w:val="18"/>
               </w:rPr>
-              <w:t xml:space="preserve">Orchestrator-specific setting; findings do not establish universal infrastructure behavior</w:t>
+              <w:t xml:space="preserve">Findings are specific to the tools and setting examined</w:t>
             </w:r>
           </w:p>
         </w:tc>
@@ -1820,7 +1822,7 @@
                 <w:rFonts w:ascii="Calibri" w:hAnsi="Calibri"/>
                 <w:sz w:val="18"/>
               </w:rPr>
-              <w:t xml:space="preserve">Five tools, 53 prescribed configurations, 544 files, and 20 respondents</w:t>
+              <w:t xml:space="preserve">Five tools, 53 prescribed settings, 544 files, and 20 respondents</w:t>
             </w:r>
           </w:p>
         </w:tc>
@@ -1840,7 +1842,7 @@
                 <w:rFonts w:ascii="Calibri" w:hAnsi="Calibri"/>
                 <w:sz w:val="18"/>
               </w:rPr>
-              <w:t xml:space="preserve">Shows limitations in recommendation coverage and configuration detection</w:t>
+              <w:t xml:space="preserve">Identifies limitations in configuration checks and tool coverage</w:t>
             </w:r>
           </w:p>
         </w:tc>
@@ -1860,7 +1862,7 @@
                 <w:rFonts w:ascii="Calibri" w:hAnsi="Calibri"/>
                 <w:sz w:val="18"/>
               </w:rPr>
-              <w:t xml:space="preserve">Version, mapping, and dataset dependence; source discrepancies require caution</w:t>
+              <w:t xml:space="preserve">Version and dataset differences affect findings; some source figures need checking</w:t>
             </w:r>
           </w:p>
         </w:tc>
@@ -1871,7 +1873,7 @@
         <w:pStyle w:val="BodyText"/>
       </w:pPr>
       <w:r>
-        <w:t xml:space="preserve">Across these studies, a recurring boundary separates an intermediate observation from an operational conclusion. Collaboration is not correct authorization; a detected smell is not containment; and a configuration declaration is not the deployed system. Figure 2 summarizes how the different evidence streams inform the review’s comparative questions.</w:t>
+        <w:t xml:space="preserve">Together, these studies explain different parts of security integration. They do not provide one common measure of DevSecOps effectiveness. Figure 2 shows how the review uses academic studies, standards, and incident accounts to compare existing knowledge and remaining questions.</w:t>
       </w:r>
     </w:p>
     <w:p>
@@ -1885,7 +1887,7 @@
           <w:b/>
           <w:bCs/>
         </w:rPr>
-        <w:t xml:space="preserve">Figure 2. Evidence types used in the review and the questions they support.</w:t>
+        <w:t xml:space="preserve">Figure 2. Types of sources used to compare existing knowledge and open questions.</w:t>
       </w:r>
     </w:p>
     <w:p>
@@ -1898,7 +1900,7 @@
           <wp:inline>
             <wp:extent cx="5943600" cy="4044950"/>
             <wp:effectExtent b="0" l="0" r="0" t="0"/>
-            <wp:docPr descr="Academic studies, specifications, and incident accounts support comparison of contributions, limitations, and open questions." title="" id="36" name="Picture"/>
+            <wp:docPr descr="Academic studies, standards, and incident accounts support a review of contributions, limitations, and open questions." title="" id="36" name="Picture"/>
             <a:graphic>
               <a:graphicData uri="http://schemas.openxmlformats.org/drawingml/2006/picture">
                 <pic:pic>
@@ -1941,7 +1943,7 @@
         <w:pStyle w:val="BodyText"/>
       </w:pPr>
       <w:r>
-        <w:t xml:space="preserve">The arrows indicate the organization of the review. They are not causal relationships or a systematic-search screening flow. The figure describes how existing material is interpreted, not a new technical framework.</w:t>
+        <w:t xml:space="preserve">The arrows show how the discussion is organized. They do not represent a cause-and-effect model or the screening stages of a systematic review.</w:t>
       </w:r>
     </w:p>
     <w:bookmarkEnd w:id="38"/>
@@ -1955,13 +1957,13 @@
         <w:t xml:space="preserve">4. Comparison of Existing Security Approaches</w:t>
       </w:r>
     </w:p>
-    <w:bookmarkStart w:id="40" w:name="Xbbab68f9ee169e35a3400af84e3514b7afde33e"/>
+    <w:bookmarkStart w:id="40" w:name="security-frameworks-and-their-purposes"/>
     <w:p>
       <w:pPr>
         <w:pStyle w:val="Heading3"/>
       </w:pPr>
       <w:r>
-        <w:t xml:space="preserve">4.1 Security frameworks address different questions</w:t>
+        <w:t xml:space="preserve">4.1 Security frameworks and their purposes</w:t>
       </w:r>
     </w:p>
     <w:p>
@@ -1969,7 +1971,7 @@
         <w:pStyle w:val="FirstParagraph"/>
       </w:pPr>
       <w:r>
-        <w:t xml:space="preserve">OWASP’s CI/CD risk taxonomy identifies delivery-process risks such as poisoned pipeline execution, inadequate identity controls, exposed credentials, artifact-integrity failures, and insufficient visibility. Its main contribution is to organize threats for assessment. A taxonomy does not deploy controls or measure how frequently those threats occur.</w:t>
+        <w:t xml:space="preserve">The OWASP CI/CD risk taxonomy groups common pipeline risks. These include unsafe execution of pipeline code, weak access controls, exposed credentials, poor artifact verification, and limited visibility. The taxonomy helps teams decide what to examine. It does not show how often each risk occurs or whether a particular organization has addressed it successfully.</w:t>
       </w:r>
     </w:p>
     <w:p>
@@ -1977,7 +1979,7 @@
         <w:pStyle w:val="BodyText"/>
       </w:pPr>
       <w:r>
-        <w:t xml:space="preserve">The OWASP Application Security Verification Standard (ASVS) provides application-security verification requirements. Its contribution is a versioned basis for asking what should be checked in an application. Some requirements can be supported by automated checks, while others need architectural reasoning or manual assessment. ASVS is therefore distinct from a scanner and does not automatically verify compliance with its own requirements.</w:t>
+        <w:t xml:space="preserve">The OWASP Application Security Verification Standard (ASVS) describes requirements for assessing application security. Some can be checked automatically, while others require manual review or an understanding of the application’s design. ASVS is a requirements standard rather than a scanner. Teams still need to show how each relevant requirement has been checked.</w:t>
       </w:r>
     </w:p>
     <w:p>
@@ -1985,7 +1987,7 @@
         <w:pStyle w:val="BodyText"/>
       </w:pPr>
       <w:r>
-        <w:t xml:space="preserve">Supply-chain Levels for Software Artifacts (SLSA) v1.1, the version examined here, describes supply-chain and build-integrity guarantees using provenance and consumer verification. It addresses whether an artifact’s production can be connected to expected processes and trusted builders. It does not establish that the source is benign or that a producer has good intentions. Naming the reviewed version is important because the specification evolves.</w:t>
+        <w:t xml:space="preserve">Supply-chain Levels for Software Artifacts (SLSA) describes expectations for build integrity and information about software production. The version reviewed here is v1.1. It uses provenance, which records how an artifact was produced, together with checks against trusted production expectations. This information can help identify unexpected production steps or changes. It does not prove that the original source code is harmless.</w:t>
       </w:r>
     </w:p>
     <w:p>
@@ -1993,7 +1995,7 @@
         <w:pStyle w:val="BodyText"/>
       </w:pPr>
       <w:r>
-        <w:t xml:space="preserve">The in-toto specification describes authorized production steps and artifact relationships through signed metadata and defined verification rules. Its contribution is to make expected handling explicit and checkable. Protection still depends on complete rules, correctly authorized actors, protected trust material, and actual verification by a consumer.</w:t>
+        <w:t xml:space="preserve">The in-toto specification describes expected supply-chain steps and the people or systems authorized to perform them. Signed records can be checked against these rules. This makes the expected process clearer, but protection still depends on complete rules, protected verification material, and someone actually checking the records.</w:t>
       </w:r>
     </w:p>
     <w:p>
@@ -2001,7 +2003,7 @@
         <w:pStyle w:val="BodyText"/>
       </w:pPr>
       <w:r>
-        <w:t xml:space="preserve">The OpenSSF Secure Supply Chain Consumption Framework (S2C2F) concentrates on secure consumption of open-source components. Scorecard provides security-practice heuristics that can inform maintenance and dependency decisions. The Cybersecurity and Infrastructure Security Agency (CISA) exploitation catalog supplies information about known exploitation of listed vulnerabilities. Each informs a different part of the decision process; none alone describes the complete security of an application and its delivery system.</w:t>
+        <w:t xml:space="preserve">The OpenSSF Secure Supply Chain Consumption Framework (S2C2F) focuses on using open-source components securely. OpenSSF Scorecard checks selected security practices and provides signals that can support maintenance and dependency decisions. The Cybersecurity and Infrastructure Security Agency (CISA) catalog identifies vulnerabilities known to have been exploited. These sources serve different purposes and should be used with that distinction in mind.</w:t>
       </w:r>
     </w:p>
     <w:p>
@@ -2015,7 +2017,7 @@
           <w:b/>
           <w:bCs/>
         </w:rPr>
-        <w:t xml:space="preserve">Table 3. Comparison of reviewed frameworks and information sources.</w:t>
+        <w:t xml:space="preserve">Table 3. Comparison of security frameworks and information sources.</w:t>
       </w:r>
     </w:p>
     <w:tbl>
@@ -2078,7 +2080,7 @@
                 <w:color w:val="FFFFFF"/>
                 <w:sz w:val="18"/>
               </w:rPr>
-              <w:t xml:space="preserve">Primary question</w:t>
+              <w:t xml:space="preserve">Main question</w:t>
             </w:r>
           </w:p>
         </w:tc>
@@ -2100,7 +2102,7 @@
                 <w:color w:val="FFFFFF"/>
                 <w:sz w:val="18"/>
               </w:rPr>
-              <w:t xml:space="preserve">Mechanism or contribution</w:t>
+              <w:t xml:space="preserve">What it provides</w:t>
             </w:r>
           </w:p>
         </w:tc>
@@ -2122,7 +2124,7 @@
                 <w:color w:val="FFFFFF"/>
                 <w:sz w:val="18"/>
               </w:rPr>
-              <w:t xml:space="preserve">Remaining limitation</w:t>
+              <w:t xml:space="preserve">Main limitation</w:t>
             </w:r>
           </w:p>
         </w:tc>
@@ -2167,7 +2169,7 @@
                 <w:rFonts w:ascii="Calibri" w:hAnsi="Calibri"/>
                 <w:sz w:val="18"/>
               </w:rPr>
-              <w:t xml:space="preserve">Which delivery-process threats deserve attention?</w:t>
+              <w:t xml:space="preserve">Which pipeline risks should be considered?</w:t>
             </w:r>
           </w:p>
         </w:tc>
@@ -2187,7 +2189,7 @@
                 <w:rFonts w:ascii="Calibri" w:hAnsi="Calibri"/>
                 <w:sz w:val="18"/>
               </w:rPr>
-              <w:t xml:space="preserve">Risk categories for pipeline assessment and control selection</w:t>
+              <w:t xml:space="preserve">Risk categories for reviewing delivery processes</w:t>
             </w:r>
           </w:p>
         </w:tc>
@@ -2207,7 +2209,7 @@
                 <w:rFonts w:ascii="Calibri" w:hAnsi="Calibri"/>
                 <w:sz w:val="18"/>
               </w:rPr>
-              <w:t xml:space="preserve">Categories do not measure incidence or establish control effectiveness</w:t>
+              <w:t xml:space="preserve">Categories do not show risk frequency or prove effective protection</w:t>
             </w:r>
           </w:p>
         </w:tc>
@@ -2250,7 +2252,7 @@
                 <w:rFonts w:ascii="Calibri" w:hAnsi="Calibri"/>
                 <w:sz w:val="18"/>
               </w:rPr>
-              <w:t xml:space="preserve">Which application requirements should be verified?</w:t>
+              <w:t xml:space="preserve">Which application requirements should be checked?</w:t>
             </w:r>
           </w:p>
         </w:tc>
@@ -2269,7 +2271,7 @@
                 <w:rFonts w:ascii="Calibri" w:hAnsi="Calibri"/>
                 <w:sz w:val="18"/>
               </w:rPr>
-              <w:t xml:space="preserve">Versioned requirements for automated and manual assessment</w:t>
+              <w:t xml:space="preserve">Requirements for automated and manual security assessment</w:t>
             </w:r>
           </w:p>
         </w:tc>
@@ -2288,7 +2290,7 @@
                 <w:rFonts w:ascii="Calibri" w:hAnsi="Calibri"/>
                 <w:sz w:val="18"/>
               </w:rPr>
-              <w:t xml:space="preserve">Requirement coverage and evidence quality must be established</w:t>
+              <w:t xml:space="preserve">Teams must still show which requirements were checked and how</w:t>
             </w:r>
           </w:p>
         </w:tc>
@@ -2333,7 +2335,7 @@
                 <w:rFonts w:ascii="Calibri" w:hAnsi="Calibri"/>
                 <w:sz w:val="18"/>
               </w:rPr>
-              <w:t xml:space="preserve">What build-integrity guarantees accompany an artifact?</w:t>
+              <w:t xml:space="preserve">What is known about an artifact’s build process?</w:t>
             </w:r>
           </w:p>
         </w:tc>
@@ -2353,7 +2355,7 @@
                 <w:rFonts w:ascii="Calibri" w:hAnsi="Calibri"/>
                 <w:sz w:val="18"/>
               </w:rPr>
-              <w:t xml:space="preserve">Provenance and verification against trusted production expectations</w:t>
+              <w:t xml:space="preserve">Provenance and checks against trusted build expectations</w:t>
             </w:r>
           </w:p>
         </w:tc>
@@ -2373,7 +2375,7 @@
                 <w:rFonts w:ascii="Calibri" w:hAnsi="Calibri"/>
                 <w:sz w:val="18"/>
               </w:rPr>
-              <w:t xml:space="preserve">Correct provenance does not prove benign source or producer intent</w:t>
+              <w:t xml:space="preserve">Correct build information does not prove harmless source code</w:t>
             </w:r>
           </w:p>
         </w:tc>
@@ -2416,7 +2418,7 @@
                 <w:rFonts w:ascii="Calibri" w:hAnsi="Calibri"/>
                 <w:sz w:val="18"/>
               </w:rPr>
-              <w:t xml:space="preserve">Were authorized steps and artifact relationships followed?</w:t>
+              <w:t xml:space="preserve">Were the expected steps carried out by authorized actors?</w:t>
             </w:r>
           </w:p>
         </w:tc>
@@ -2435,7 +2437,7 @@
                 <w:rFonts w:ascii="Calibri" w:hAnsi="Calibri"/>
                 <w:sz w:val="18"/>
               </w:rPr>
-              <w:t xml:space="preserve">Signed layouts and step metadata with verification rules</w:t>
+              <w:t xml:space="preserve">Signed process records and verification rules</w:t>
             </w:r>
           </w:p>
         </w:tc>
@@ -2454,7 +2456,7 @@
                 <w:rFonts w:ascii="Calibri" w:hAnsi="Calibri"/>
                 <w:sz w:val="18"/>
               </w:rPr>
-              <w:t xml:space="preserve">Incomplete rules and compromised trust roots can weaken protection</w:t>
+              <w:t xml:space="preserve">Missing rules or compromised trust material can weaken the checks</w:t>
             </w:r>
           </w:p>
         </w:tc>
@@ -2499,7 +2501,7 @@
                 <w:rFonts w:ascii="Calibri" w:hAnsi="Calibri"/>
                 <w:sz w:val="18"/>
               </w:rPr>
-              <w:t xml:space="preserve">How should open-source consumption be governed?</w:t>
+              <w:t xml:space="preserve">How should open-source components be managed?</w:t>
             </w:r>
           </w:p>
         </w:tc>
@@ -2519,7 +2521,7 @@
                 <w:rFonts w:ascii="Calibri" w:hAnsi="Calibri"/>
                 <w:sz w:val="18"/>
               </w:rPr>
-              <w:t xml:space="preserve">Dependency-ingestion practices and maturity guidance</w:t>
+              <w:t xml:space="preserve">Guidance on dependency use and organizational practices</w:t>
             </w:r>
           </w:p>
         </w:tc>
@@ -2539,7 +2541,7 @@
                 <w:rFonts w:ascii="Calibri" w:hAnsi="Calibri"/>
                 <w:sz w:val="18"/>
               </w:rPr>
-              <w:t xml:space="preserve">Governance does not establish the absence of vulnerable or malicious components</w:t>
+              <w:t xml:space="preserve">Guidance does not guarantee that components are free from weaknesses</w:t>
             </w:r>
           </w:p>
         </w:tc>
@@ -2582,7 +2584,7 @@
                 <w:rFonts w:ascii="Calibri" w:hAnsi="Calibri"/>
                 <w:sz w:val="18"/>
               </w:rPr>
-              <w:t xml:space="preserve">Which observable security practices warrant attention?</w:t>
+              <w:t xml:space="preserve">Which visible security practices need attention?</w:t>
             </w:r>
           </w:p>
         </w:tc>
@@ -2601,7 +2603,7 @@
                 <w:rFonts w:ascii="Calibri" w:hAnsi="Calibri"/>
                 <w:sz w:val="18"/>
               </w:rPr>
-              <w:t xml:space="preserve">Automated heuristic checks for maintenance and dependency assessment</w:t>
+              <w:t xml:space="preserve">Automated checks that support project and dependency review</w:t>
             </w:r>
           </w:p>
         </w:tc>
@@ -2620,7 +2622,7 @@
                 <w:rFonts w:ascii="Calibri" w:hAnsi="Calibri"/>
                 <w:sz w:val="18"/>
               </w:rPr>
-              <w:t xml:space="preserve">A score is not a calibrated probability of compromise</w:t>
+              <w:t xml:space="preserve">A score does not give the probability of a compromise</w:t>
             </w:r>
           </w:p>
         </w:tc>
@@ -2685,7 +2687,7 @@
                 <w:rFonts w:ascii="Calibri" w:hAnsi="Calibri"/>
                 <w:sz w:val="18"/>
               </w:rPr>
-              <w:t xml:space="preserve">Information supporting prioritization of affected assets</w:t>
+              <w:t xml:space="preserve">Information that helps prioritize affected software</w:t>
             </w:r>
           </w:p>
         </w:tc>
@@ -2705,20 +2707,20 @@
                 <w:rFonts w:ascii="Calibri" w:hAnsi="Calibri"/>
                 <w:sz w:val="18"/>
               </w:rPr>
-              <w:t xml:space="preserve">Unlisted vulnerabilities can still be exploitable</w:t>
+              <w:t xml:space="preserve">A vulnerability may still be exploitable even if it is not listed</w:t>
             </w:r>
           </w:p>
         </w:tc>
       </w:tr>
     </w:tbl>
     <w:bookmarkEnd w:id="40"/>
-    <w:bookmarkStart w:id="44" w:name="placement-across-the-delivery-lifecycle"/>
+    <w:bookmarkStart w:id="44" w:name="security-across-the-delivery-lifecycle"/>
     <w:p>
       <w:pPr>
         <w:pStyle w:val="Heading3"/>
       </w:pPr>
       <w:r>
-        <w:t xml:space="preserve">4.2 Placement across the delivery lifecycle</w:t>
+        <w:t xml:space="preserve">4.2 Security across the delivery lifecycle</w:t>
       </w:r>
     </w:p>
     <w:p>
@@ -2726,7 +2728,7 @@
         <w:pStyle w:val="FirstParagraph"/>
       </w:pPr>
       <w:r>
-        <w:t xml:space="preserve">The reviewed approaches address different lifecycle stages. Threat modeling and security requirements inform planning. Source analysis and secret detection support development. Dependency inspection, controlled build inputs, and provenance concern production of artifacts. Application assessment examines behavior. Release and deployment safeguards address artifact acceptance, configuration, and authority. Operational monitoring addresses the system after deployment.</w:t>
+        <w:t xml:space="preserve">Different security practices are used at different points in delivery. Planning includes threat modeling and security requirements. Coding includes source review and secret detection. Building includes dependency checks and control of build inputs. Testing examines application behavior. Release and deployment activities address artifact verification, infrastructure settings, and permissions. Monitoring continues after deployment.</w:t>
       </w:r>
     </w:p>
     <w:p>
@@ -2734,7 +2736,7 @@
         <w:pStyle w:val="BodyText"/>
       </w:pPr>
       <w:r>
-        <w:t xml:space="preserve">Figure 3 summarizes these common placements. It is an explanatory map of established practices rather than a proposed implementation. In practice, several controls operate repeatedly or at multiple stages; placing them at one location in a diagram does not imply exclusive use there.</w:t>
+        <w:t xml:space="preserve">Figure 3 summarizes these stages. Some practices can be repeated or used at several stages. Their placement in the figure is an example of how existing approaches fit into the lifecycle, rather than a required design for every organization.</w:t>
       </w:r>
     </w:p>
     <w:p>
@@ -2748,7 +2750,7 @@
           <w:b/>
           <w:bCs/>
         </w:rPr>
-        <w:t xml:space="preserve">Figure 3. Existing security approaches across the CI/CD and operational lifecycle.</w:t>
+        <w:t xml:space="preserve">Figure 3. Existing security practices across the software delivery lifecycle.</w:t>
       </w:r>
     </w:p>
     <w:p>
@@ -2761,7 +2763,7 @@
           <wp:inline>
             <wp:extent cx="5943600" cy="4044950"/>
             <wp:effectExtent b="0" l="0" r="0" t="0"/>
-            <wp:docPr descr="Lifecycle map of planning, coding, building, testing, releasing, deploying, and operating, with corresponding security practices." title="" id="42" name="Picture"/>
+            <wp:docPr descr="Security practices used during planning, coding, building, testing, release, deployment, and operation." title="" id="42" name="Picture"/>
             <a:graphic>
               <a:graphicData uri="http://schemas.openxmlformats.org/drawingml/2006/picture">
                 <pic:pic>
@@ -2804,17 +2806,17 @@
         <w:pStyle w:val="BodyText"/>
       </w:pPr>
       <w:r>
-        <w:t xml:space="preserve">Operational feedback informs planning and maintenance. This feedback relationship explains the term continuous security, but it does not imply that every organization has implemented or validated the same sequence of controls.</w:t>
+        <w:t xml:space="preserve">Information from operation and monitoring can guide later planning and maintenance. This ongoing feedback helps explain continuous security: teams need to keep reviewing conditions after a release has passed its initial checks.</w:t>
       </w:r>
     </w:p>
     <w:bookmarkEnd w:id="44"/>
-    <w:bookmarkStart w:id="45" w:name="X588ced3054dd9fe2d15fafa0547caf88ae05124"/>
+    <w:bookmarkStart w:id="45" w:name="X590bd841ffd084547f7407df94b329ffddc0a69"/>
     <w:p>
       <w:pPr>
         <w:pStyle w:val="Heading3"/>
       </w:pPr>
       <w:r>
-        <w:t xml:space="preserve">4.3 Application, dependency, and infrastructure analysis</w:t>
+        <w:t xml:space="preserve">4.3 Application, dependency, and infrastructure checks</w:t>
       </w:r>
     </w:p>
     <w:p>
@@ -2822,7 +2824,7 @@
         <w:pStyle w:val="FirstParagraph"/>
       </w:pPr>
       <w:r>
-        <w:t xml:space="preserve">Static application security testing (SAST) examines source or related representations for selected weakness patterns. Software composition analysis (SCA) examines dependencies and known vulnerability information. Dynamic application security testing (DAST) examines behavior in a running environment. Infrastructure analysis examines configuration and resource relationships. These approaches observe different objects and have different visibility limits.</w:t>
+        <w:t xml:space="preserve">Static application security testing (SAST) examines source code or related representations for selected weakness patterns. Software composition analysis (SCA) examines dependencies and known vulnerability information. Dynamic application security testing (DAST) examines a running application’s behavior. Infrastructure checks examine settings and relationships between resources.</w:t>
       </w:r>
     </w:p>
     <w:p>
@@ -2830,7 +2832,7 @@
         <w:pStyle w:val="BodyText"/>
       </w:pPr>
       <w:r>
-        <w:t xml:space="preserve">For example, application source analysis may not reveal an unsafe cloud identity assigned during deployment. A dependency inventory may identify a vulnerable component without establishing whether its vulnerable behavior is reachable. A static infrastructure check may not observe a later manual change. Dynamic assessment may miss authenticated or state-dependent behavior that the test session does not exercise.</w:t>
+        <w:t xml:space="preserve">Each approach has limits. Source-code analysis may not reveal an unsafe cloud role assigned at deployment. A dependency check may identify an affected component without showing whether the vulnerable function is used. A configuration check may not see a later manual change. Dynamic testing may miss behavior that requires a particular account, session, or sequence of actions.</w:t>
       </w:r>
     </w:p>
     <w:p>
@@ -2838,17 +2840,17 @@
         <w:pStyle w:val="BodyText"/>
       </w:pPr>
       <w:r>
-        <w:t xml:space="preserve">These limitations explain why combining approaches is common in guidance. They also caution against assuming that every additional tool supplies independent coverage. Overlapping rules can increase duplicate work, while inconsistent classifications can complicate triage. The literature supports comparing what is observed and what remains unseen rather than comparing products solely by the number of reported findings.</w:t>
+        <w:t xml:space="preserve">These differences explain why guidance often recommends combining approaches. However, adding more tools does not always add independent coverage. Similar rules may produce duplicate findings or miss the same weakness. A useful comparison considers what each approach can observe and what information it lacks.</w:t>
       </w:r>
     </w:p>
     <w:bookmarkEnd w:id="45"/>
-    <w:bookmarkStart w:id="46" w:name="X06cbae8cb278be9a0f7593135936453cf345dd5"/>
+    <w:bookmarkStart w:id="46" w:name="identity-and-secrets-management"/>
     <w:p>
       <w:pPr>
         <w:pStyle w:val="Heading3"/>
       </w:pPr>
       <w:r>
-        <w:t xml:space="preserve">4.4 Identity, credentials, and execution privilege</w:t>
+        <w:t xml:space="preserve">4.4 Identity and secrets management</w:t>
       </w:r>
     </w:p>
     <w:p>
@@ -2856,7 +2858,7 @@
         <w:pStyle w:val="FirstParagraph"/>
       </w:pPr>
       <w:r>
-        <w:t xml:space="preserve">Credential security in CI/CD concerns more than detecting secrets in a repository. Secrets can also appear in logs, container layers, caches, temporary files, and execution environments. A clean source scan therefore does not establish that a pipeline exposes no credentials.</w:t>
+        <w:t xml:space="preserve">Secrets can be exposed in more places than the source repository. They may appear in logs, container layers, caches, temporary files, or build environments. A successful source scan therefore does not prove that every credential is protected.</w:t>
       </w:r>
     </w:p>
     <w:p>
@@ -2864,7 +2866,7 @@
         <w:pStyle w:val="BodyText"/>
       </w:pPr>
       <w:r>
-        <w:t xml:space="preserve">Existing guidance emphasizes limiting the identities and resources available to each execution context. Unreviewed contributions and third-party helpers should not automatically receive the authority used to publish releases or modify production. Shared credentials and broad permissions can allow compromise in one stage to affect unrelated environments.</w:t>
+        <w:t xml:space="preserve">Identity and access management (IAM) helps control what a pipeline or service is allowed to do. Existing guidance recommends limiting access according to the task being performed. Code from an unreviewed contribution should not automatically receive the permissions used to publish a release or change production infrastructure.</w:t>
       </w:r>
     </w:p>
     <w:p>
@@ -2872,17 +2874,17 @@
         <w:pStyle w:val="BodyText"/>
       </w:pPr>
       <w:r>
-        <w:t xml:space="preserve">Temporary workload credentials reduce the period in which an exposed credential can be reused. Their value still depends on narrow trust conditions and permissions. A temporary administrator token remains powerful during its validity, and a broad federation policy can allow repeated issuance. Least privilege is therefore an effective-permission question, not simply a property implied by a role’s name.</w:t>
+        <w:t xml:space="preserve">Temporary credentials can reduce how long an exposed credential remains useful. Their permissions still matter. A temporary administrator token can cause harm while it is valid, and broad identity rules may allow another token to be issued. Least privilege means examining the access actually granted, rather than relying on a role’s name or a token’s short lifetime.</w:t>
       </w:r>
     </w:p>
     <w:bookmarkEnd w:id="46"/>
-    <w:bookmarkStart w:id="47" w:name="Xd10db011742ac038f8a56816b417d18492e1953"/>
+    <w:bookmarkStart w:id="47" w:name="Xdd8a236add4402b004db85c6ae36a4d2acb01ca"/>
     <w:p>
       <w:pPr>
         <w:pStyle w:val="Heading3"/>
       </w:pPr>
       <w:r>
-        <w:t xml:space="preserve">4.5 Artifact integrity, provenance, and inventories</w:t>
+        <w:t xml:space="preserve">4.5 Signatures, provenance, and component inventories</w:t>
       </w:r>
     </w:p>
     <w:p>
@@ -2890,7 +2892,7 @@
         <w:pStyle w:val="FirstParagraph"/>
       </w:pPr>
       <w:r>
-        <w:t xml:space="preserve">Artifact signatures, provenance, and component inventories describe different properties. A signature authenticates a statement or artifact identity. Provenance records information about production. An inventory describes included components. Their usefulness depends on connecting them to the exact artifact being consumed or deployed.</w:t>
+        <w:t xml:space="preserve">Signatures, provenance, and software inventories describe different properties. A digital signature can authenticate a statement or identify who signed an artifact. Provenance records information about how software was produced. An inventory lists its components. These records are most useful when they refer to the exact artifact being released or deployed.</w:t>
       </w:r>
     </w:p>
     <w:p>
@@ -2898,7 +2900,7 @@
         <w:pStyle w:val="BodyText"/>
       </w:pPr>
       <w:r>
-        <w:t xml:space="preserve">A release label or mutable tag is weaker than an immutable digest for establishing that two stages handled the same bytes. Equally, collecting an attestation without checking its signer, expected producer, and subject leaves its intended protection incomplete. Existing supply-chain guidance therefore concerns both evidence production and evidence consumption.</w:t>
+        <w:t xml:space="preserve">An immutable digest, a hash used to identify particular file contents, can help establish that different stages handled the same bytes. A release name or changeable tag may not provide the same assurance. Verification also requires checking the signer, the expected producer, and the artifact to which a statement applies. Collecting a signed record without checking these details leaves important questions unanswered.</w:t>
       </w:r>
     </w:p>
     <w:p>
@@ -2906,18 +2908,18 @@
         <w:pStyle w:val="BodyText"/>
       </w:pPr>
       <w:r>
-        <w:t xml:space="preserve">A software bill of materials (SBOM) can assist later vulnerability response when it is connected to deployed artifacts and maintained as information changes. It does not patch software, guarantee completeness, or prove non-exploitability. The review consequently distinguishes visibility into components from action on affected systems.</w:t>
+        <w:t xml:space="preserve">A software bill of materials (SBOM) can help teams locate affected releases when a new vulnerability is disclosed. It needs to be connected to deployment records and kept useful as information changes. An SBOM does not install a patch or prove that an application cannot be exploited. It supports response by helping teams understand what they use.</w:t>
       </w:r>
     </w:p>
     <w:bookmarkEnd w:id="47"/>
     <w:bookmarkEnd w:id="48"/>
-    <w:bookmarkStart w:id="53" w:name="X2a9421895c1d18b9d4b821ae9c000cbbc29f6c4"/>
+    <w:bookmarkStart w:id="53" w:name="lessons-from-past-security-incidents"/>
     <w:p>
       <w:pPr>
         <w:pStyle w:val="Heading2"/>
       </w:pPr>
       <w:r>
-        <w:t xml:space="preserve">5. Historical Failures and Defensive Lessons</w:t>
+        <w:t xml:space="preserve">5. Lessons from Past Security Incidents</w:t>
       </w:r>
     </w:p>
     <w:p>
@@ -2925,16 +2927,16 @@
         <w:pStyle w:val="FirstParagraph"/>
       </w:pPr>
       <w:r>
-        <w:t xml:space="preserve">Historical incidents illustrate why the delivery process belongs within security analysis. SolarWinds and Codecov are discussed through summaries in the reviewed supply-chain guidance and CI/CD taxonomy; their primary incident reports were not independently retrieved for this review. The Log4Shell discussion uses the known-exploitation catalog entry for CVE-2021-44228. These cases illustrate different mechanisms and should not be treated as identical examples of a generic pipeline weakness.</w:t>
+        <w:t xml:space="preserve">The incidents in this section illustrate different weaknesses in software delivery. SolarWinds and Codecov are discussed using summaries in the reviewed guidance; their primary incident reports were not independently retrieved for this review. The Log4Shell discussion uses CISA’s entry for CVE-2021-44228. These examples help explain security concerns, but they do not establish how frequently each type of failure occurs.</w:t>
       </w:r>
     </w:p>
-    <w:bookmarkStart w:id="49" w:name="Xa65d413c36c8cec19e52ba441344beb81630b29"/>
+    <w:bookmarkStart w:id="49" w:name="Xfc29b9d5f9d72f9ba6c546934ea8bc1b0a1b075"/>
     <w:p>
       <w:pPr>
         <w:pStyle w:val="Heading3"/>
       </w:pPr>
       <w:r>
-        <w:t xml:space="preserve">5.1 SolarWinds and trust in software production</w:t>
+        <w:t xml:space="preserve">5.1 SolarWinds: trust in the production process</w:t>
       </w:r>
     </w:p>
     <w:p>
@@ -2942,7 +2944,7 @@
         <w:pStyle w:val="FirstParagraph"/>
       </w:pPr>
       <w:r>
-        <w:t xml:space="preserve">The SolarWinds incident illustrates compromise of a software production process. The review lesson is that distribution through a recognized producer’s release channel is not sufficient evidence of benign content. Trust in the producer, integrity of the build environment, and authenticity of the distributed artifact are related but distinct concerns.</w:t>
+        <w:t xml:space="preserve">The SolarWinds incident shows why the software production process needs protection. Receiving software through a recognized supplier’s release channel does not, on its own, prove that the software is harmless. Trust in a supplier, protection of the build environment, and verification of the final artifact are related but separate issues.</w:t>
       </w:r>
     </w:p>
     <w:p>
@@ -2950,7 +2952,7 @@
         <w:pStyle w:val="BodyText"/>
       </w:pPr>
       <w:r>
-        <w:t xml:space="preserve">Existing defensive approaches include protecting build infrastructure, restricting changes to production logic, verifying provenance, and maintaining separation between production and release authority. Independent reproduction can provide additional information in suitable settings. None of these establishes benign behavior by itself: malicious authorized source can be built reproducibly and signed correctly.</w:t>
+        <w:t xml:space="preserve">Existing approaches include protecting build systems, restricting changes to production scripts, checking provenance, and separating build permissions from release approval. Independent reproduction of a build can provide further information where it is practical. Even so, a malicious source change could be reproduced and signed correctly.</w:t>
       </w:r>
     </w:p>
     <w:p>
@@ -2958,17 +2960,17 @@
         <w:pStyle w:val="BodyText"/>
       </w:pPr>
       <w:r>
-        <w:t xml:space="preserve">The case therefore supports a careful interpretation of supply-chain controls. They can constrain particular routes of tampering, but their guarantees depend on stated trust assumptions. The literature should not be read as promising that one signature or checklist prevents every form of producer compromise.</w:t>
+        <w:t xml:space="preserve">The main lesson is that supply-chain controls address particular risks under particular assumptions. A valid signature is useful information, but it cannot answer every question about the software’s behavior or the trustworthiness of its production.</w:t>
       </w:r>
     </w:p>
     <w:bookmarkEnd w:id="49"/>
-    <w:bookmarkStart w:id="50" w:name="X1a462b526528ce1e36b7aaa45aa0088d4de2319"/>
+    <w:bookmarkStart w:id="50" w:name="codecov-access-given-to-build-helpers"/>
     <w:p>
       <w:pPr>
         <w:pStyle w:val="Heading3"/>
       </w:pPr>
       <w:r>
-        <w:t xml:space="preserve">5.2 Codecov and authority inherited by CI helpers</w:t>
+        <w:t xml:space="preserve">5.2 Codecov: access given to build helpers</w:t>
       </w:r>
     </w:p>
     <w:p>
@@ -2976,7 +2978,7 @@
         <w:pStyle w:val="FirstParagraph"/>
       </w:pPr>
       <w:r>
-        <w:t xml:space="preserve">The Codecov incident illustrates how externally supplied helper code can gain access to sensitive information in a build environment. The relevant issue is the authority inherited by code executed for an apparently limited purpose. A helper does not need to be responsible for deployment to cause harm if it can read deployment credentials.</w:t>
+        <w:t xml:space="preserve">The Codecov incident illustrates the risk of giving externally supplied helper code access to sensitive build information. A helper may perform a small task while still being able to read credentials available to the whole job. That access can create consequences beyond the helper’s intended purpose.</w:t>
       </w:r>
     </w:p>
     <w:p>
@@ -2984,7 +2986,7 @@
         <w:pStyle w:val="BodyText"/>
       </w:pPr>
       <w:r>
-        <w:t xml:space="preserve">Existing guidance addresses this through controlled inputs, integrity verification, execution separation, scoped credentials, and network restrictions. Pinning a dependency limits unexpected changes, while checking an independently trusted integrity expectation helps detect substitution. Neither establishes that an approved version is inherently safe.</w:t>
+        <w:t xml:space="preserve">Guidance addresses this risk through controlled inputs, verification of downloaded content, separate execution environments, limited credentials, and network restrictions. Fixing a dependency to a particular version can reduce unexpected changes. Checking it against a trusted integrity value can help detect substitution. Neither measure proves that the selected version is harmless.</w:t>
       </w:r>
     </w:p>
     <w:p>
@@ -2992,17 +2994,17 @@
         <w:pStyle w:val="BodyText"/>
       </w:pPr>
       <w:r>
-        <w:t xml:space="preserve">The lesson connects dependency security and identity management. Assessing the origin of a helper and limiting the resources it can access are complementary measures. Source inspection alone does not replace an execution boundary, and a short-lived credential does not eliminate misuse during a valid session.</w:t>
+        <w:t xml:space="preserve">This example connects dependency security with access control. Teams need to consider both where helper code comes from and what it can do when executed. Temporary credentials reduce the time available for misuse, but do not remove the need to limit permissions.</w:t>
       </w:r>
     </w:p>
     <w:bookmarkEnd w:id="50"/>
-    <w:bookmarkStart w:id="51" w:name="X6dbf76157103a0038ece8774d80c85adcfa1f8e"/>
+    <w:bookmarkStart w:id="51" w:name="X5666885f7f1f9bd14f6bdf12bcd1f6dde661237"/>
     <w:p>
       <w:pPr>
         <w:pStyle w:val="Heading3"/>
       </w:pPr>
       <w:r>
-        <w:t xml:space="preserve">5.3 Log4Shell and vulnerability response after deployment</w:t>
+        <w:t xml:space="preserve">5.3 Log4Shell: responding to vulnerable dependencies</w:t>
       </w:r>
     </w:p>
     <w:p>
@@ -3010,7 +3012,7 @@
         <w:pStyle w:val="FirstParagraph"/>
       </w:pPr>
       <w:r>
-        <w:t xml:space="preserve">Log4Shell illustrates the operational consequences of a vulnerable legitimate dependency. CISA identifies CVE-2021-44228 in Apache Log4j2 as a known exploited remote-code-execution vulnerability. This differs from artifact substitution: the affected component can be genuine while still exposing dangerous behavior.</w:t>
+        <w:t xml:space="preserve">Log4Shell illustrates a different problem: a genuine and widely used component can contain a serious vulnerability. CISA identifies CVE-2021-44228 in Apache Log4j2 as a known exploited remote-code-execution vulnerability. The issue concerns vulnerable behavior in a legitimate dependency, rather than simply a substituted artifact.</w:t>
       </w:r>
     </w:p>
     <w:p>
@@ -3018,7 +3020,7 @@
         <w:pStyle w:val="BodyText"/>
       </w:pPr>
       <w:r>
-        <w:t xml:space="preserve">The case highlights the importance of component visibility, deployment records, advisory interpretation, and update or containment capability. An accurate inventory can support identifying potentially affected software, but identifying that software is only one part of response. Ownership and the ability to change affected deployments remain necessary.</w:t>
+        <w:t xml:space="preserve">The case highlights the value of knowing which components are used and where they are deployed. Inventories and deployment records can help teams identify potentially affected systems. Teams must also be able to update or contain those systems and assign responsibility for the work.</w:t>
       </w:r>
     </w:p>
     <w:p>
@@ -3026,7 +3028,7 @@
         <w:pStyle w:val="BodyText"/>
       </w:pPr>
       <w:r>
-        <w:t xml:space="preserve">Reachability and configuration can help interpret exposure, but incomplete analysis should not be treated as proof that exploitation is impossible. The literature lesson is that dependency security continues after an artifact has passed a build-time check, especially when knowledge about vulnerabilities changes.</w:t>
+        <w:t xml:space="preserve">Configuration and the use of vulnerable functions can help determine exposure. However, an incomplete assessment should not be treated as proof that exploitation is impossible. Dependency security needs continuing attention because new information can change the assessment of software that has already been released.</w:t>
       </w:r>
     </w:p>
     <w:p>
@@ -3040,7 +3042,7 @@
           <w:b/>
           <w:bCs/>
         </w:rPr>
-        <w:t xml:space="preserve">Table 4. Comparison of historical failure mechanisms and defensive lessons.</w:t>
+        <w:t xml:space="preserve">Table 4. Comparison of past incidents and their security lessons.</w:t>
       </w:r>
     </w:p>
     <w:tbl>
@@ -3081,7 +3083,7 @@
                 <w:color w:val="FFFFFF"/>
                 <w:sz w:val="18"/>
               </w:rPr>
-              <w:t xml:space="preserve">Case</w:t>
+              <w:t xml:space="preserve">Incident</w:t>
             </w:r>
           </w:p>
         </w:tc>
@@ -3103,7 +3105,7 @@
                 <w:color w:val="FFFFFF"/>
                 <w:sz w:val="18"/>
               </w:rPr>
-              <w:t xml:space="preserve">Failure mechanism illustrated</w:t>
+              <w:t xml:space="preserve">Problem illustrated</w:t>
             </w:r>
           </w:p>
         </w:tc>
@@ -3125,7 +3127,7 @@
                 <w:color w:val="FFFFFF"/>
                 <w:sz w:val="18"/>
               </w:rPr>
-              <w:t xml:space="preserve">Relevant existing approaches</w:t>
+              <w:t xml:space="preserve">Relevant security practices</w:t>
             </w:r>
           </w:p>
         </w:tc>
@@ -3147,7 +3149,7 @@
                 <w:color w:val="FFFFFF"/>
                 <w:sz w:val="18"/>
               </w:rPr>
-              <w:t xml:space="preserve">Scope of the lesson</w:t>
+              <w:t xml:space="preserve">Main lesson</w:t>
             </w:r>
           </w:p>
         </w:tc>
@@ -3192,7 +3194,7 @@
                 <w:rFonts w:ascii="Calibri" w:hAnsi="Calibri"/>
                 <w:sz w:val="18"/>
               </w:rPr>
-              <w:t xml:space="preserve">Compromise of a software production process</w:t>
+              <w:t xml:space="preserve">Compromise of the software production process</w:t>
             </w:r>
           </w:p>
         </w:tc>
@@ -3212,7 +3214,7 @@
                 <w:rFonts w:ascii="Calibri" w:hAnsi="Calibri"/>
                 <w:sz w:val="18"/>
               </w:rPr>
-              <w:t xml:space="preserve">Protected builds, provenance, controlled production changes, independent release authority</w:t>
+              <w:t xml:space="preserve">Protected builds, controlled changes, provenance checks, separate release approval</w:t>
             </w:r>
           </w:p>
         </w:tc>
@@ -3232,7 +3234,7 @@
                 <w:rFonts w:ascii="Calibri" w:hAnsi="Calibri"/>
                 <w:sz w:val="18"/>
               </w:rPr>
-              <w:t xml:space="preserve">Trusted distribution and valid signatures do not alone prove benign content</w:t>
+              <w:t xml:space="preserve">A trusted release channel or valid signature does not prove harmless content</w:t>
             </w:r>
           </w:p>
         </w:tc>
@@ -3275,7 +3277,7 @@
                 <w:rFonts w:ascii="Calibri" w:hAnsi="Calibri"/>
                 <w:sz w:val="18"/>
               </w:rPr>
-              <w:t xml:space="preserve">CI helper code inherits access to sensitive build information</w:t>
+              <w:t xml:space="preserve">Helper code can access sensitive build information</w:t>
             </w:r>
           </w:p>
         </w:tc>
@@ -3294,7 +3296,7 @@
                 <w:rFonts w:ascii="Calibri" w:hAnsi="Calibri"/>
                 <w:sz w:val="18"/>
               </w:rPr>
-              <w:t xml:space="preserve">Controlled inputs, isolated execution, narrow identities, integrity verification</w:t>
+              <w:t xml:space="preserve">Controlled inputs, isolated execution, limited permissions, integrity checks</w:t>
             </w:r>
           </w:p>
         </w:tc>
@@ -3313,7 +3315,7 @@
                 <w:rFonts w:ascii="Calibri" w:hAnsi="Calibri"/>
                 <w:sz w:val="18"/>
               </w:rPr>
-              <w:t xml:space="preserve">Dependency origin and execution privilege must both be considered</w:t>
+              <w:t xml:space="preserve">The source of helper code and its execution permissions both matter</w:t>
             </w:r>
           </w:p>
         </w:tc>
@@ -3358,7 +3360,7 @@
                 <w:rFonts w:ascii="Calibri" w:hAnsi="Calibri"/>
                 <w:sz w:val="18"/>
               </w:rPr>
-              <w:t xml:space="preserve">Vulnerable legitimate component remains in deployed software</w:t>
+              <w:t xml:space="preserve">A vulnerable genuine component remains in deployed software</w:t>
             </w:r>
           </w:p>
         </w:tc>
@@ -3378,7 +3380,7 @@
                 <w:rFonts w:ascii="Calibri" w:hAnsi="Calibri"/>
                 <w:sz w:val="18"/>
               </w:rPr>
-              <w:t xml:space="preserve">Component inventories, advisory response, update and containment processes</w:t>
+              <w:t xml:space="preserve">Component inventories, advisory monitoring, updates, containment</w:t>
             </w:r>
           </w:p>
         </w:tc>
@@ -3398,20 +3400,20 @@
                 <w:rFonts w:ascii="Calibri" w:hAnsi="Calibri"/>
                 <w:sz w:val="18"/>
               </w:rPr>
-              <w:t xml:space="preserve">Inventory supports response but does not remediate exposure itself</w:t>
+              <w:t xml:space="preserve">Finding affected software is useful only when it leads to an effective response</w:t>
             </w:r>
           </w:p>
         </w:tc>
       </w:tr>
     </w:tbl>
     <w:bookmarkEnd w:id="51"/>
-    <w:bookmarkStart w:id="52" w:name="X94b883941bdd31536ac7678755f1b5ab7826420"/>
+    <w:bookmarkStart w:id="52" w:name="weak-practices-and-better-alternatives"/>
     <w:p>
       <w:pPr>
         <w:pStyle w:val="Heading3"/>
       </w:pPr>
       <w:r>
-        <w:t xml:space="preserve">5.4 Failure-prone practices and established alternatives</w:t>
+        <w:t xml:space="preserve">5.4 Weak practices and better alternatives</w:t>
       </w:r>
     </w:p>
     <w:p>
@@ -3419,7 +3421,7 @@
         <w:pStyle w:val="FirstParagraph"/>
       </w:pPr>
       <w:r>
-        <w:t xml:space="preserve">Security approaches can fail when their assumptions do not match the execution context or their implementation grants excessive trust. Table 5 compares problematic practices discussed in delivery-security guidance with established defensive alternatives. It is a qualitative synthesis, not an estimate of how frequently organizations use each practice.</w:t>
+        <w:t xml:space="preserve">Security problems often arise when a practice is used without considering its assumptions or the access it grants. Table 5 summarizes practices discussed in the reviewed guidance and compares them with established alternatives. The table does not estimate how often organizations use these practices.</w:t>
       </w:r>
     </w:p>
     <w:p>
@@ -3433,7 +3435,7 @@
           <w:b/>
           <w:bCs/>
         </w:rPr>
-        <w:t xml:space="preserve">Table 5. Comparison of failure-prone practices and defensive alternatives.</w:t>
+        <w:t xml:space="preserve">Table 5. Comparison of weak security practices and established alternatives.</w:t>
       </w:r>
     </w:p>
     <w:tbl>
@@ -3495,7 +3497,7 @@
                 <w:color w:val="FFFFFF"/>
                 <w:sz w:val="18"/>
               </w:rPr>
-              <w:t xml:space="preserve">Why it is limited</w:t>
+              <w:t xml:space="preserve">Why it can cause problems</w:t>
             </w:r>
           </w:p>
         </w:tc>
@@ -3517,7 +3519,7 @@
                 <w:color w:val="FFFFFF"/>
                 <w:sz w:val="18"/>
               </w:rPr>
-              <w:t xml:space="preserve">Existing defensive alternative</w:t>
+              <w:t xml:space="preserve">Established alternative</w:t>
             </w:r>
           </w:p>
         </w:tc>
@@ -3542,7 +3544,7 @@
                 <w:rFonts w:ascii="Calibri" w:hAnsi="Calibri"/>
                 <w:sz w:val="18"/>
               </w:rPr>
-              <w:t xml:space="preserve">Security only at the final release checkpoint</w:t>
+              <w:t xml:space="preserve">Check security only before the final release</w:t>
             </w:r>
           </w:p>
         </w:tc>
@@ -3562,7 +3564,7 @@
                 <w:rFonts w:ascii="Calibri" w:hAnsi="Calibri"/>
                 <w:sz w:val="18"/>
               </w:rPr>
-              <w:t xml:space="preserve">Important weaknesses may be discovered after dependent work accumulates</w:t>
+              <w:t xml:space="preserve">Important problems may be found after other work depends on them</w:t>
             </w:r>
           </w:p>
         </w:tc>
@@ -3582,7 +3584,7 @@
                 <w:rFonts w:ascii="Calibri" w:hAnsi="Calibri"/>
                 <w:sz w:val="18"/>
               </w:rPr>
-              <w:t xml:space="preserve">Earlier feedback alongside release and operational safeguards</w:t>
+              <w:t xml:space="preserve">Provide earlier feedback and continue checks during release and operation</w:t>
             </w:r>
           </w:p>
         </w:tc>
@@ -3606,7 +3608,7 @@
                 <w:rFonts w:ascii="Calibri" w:hAnsi="Calibri"/>
                 <w:sz w:val="18"/>
               </w:rPr>
-              <w:t xml:space="preserve">Shared deployment identity across environments</w:t>
+              <w:t xml:space="preserve">Share one deployment identity across environments</w:t>
             </w:r>
           </w:p>
         </w:tc>
@@ -3625,7 +3627,7 @@
                 <w:rFonts w:ascii="Calibri" w:hAnsi="Calibri"/>
                 <w:sz w:val="18"/>
               </w:rPr>
-              <w:t xml:space="preserve">A single compromise can cross project and environment boundaries</w:t>
+              <w:t xml:space="preserve">A compromise can affect several projects or environments</w:t>
             </w:r>
           </w:p>
         </w:tc>
@@ -3644,7 +3646,7 @@
                 <w:rFonts w:ascii="Calibri" w:hAnsi="Calibri"/>
                 <w:sz w:val="18"/>
               </w:rPr>
-              <w:t xml:space="preserve">Narrow workload identities and context-specific permissions</w:t>
+              <w:t xml:space="preserve">Limit identities and permissions to their tasks and environments</w:t>
             </w:r>
           </w:p>
         </w:tc>
@@ -3669,7 +3671,7 @@
                 <w:rFonts w:ascii="Calibri" w:hAnsi="Calibri"/>
                 <w:sz w:val="18"/>
               </w:rPr>
-              <w:t xml:space="preserve">Mutable external scripts in privileged jobs</w:t>
+              <w:t xml:space="preserve">Run changeable external scripts in privileged jobs</w:t>
             </w:r>
           </w:p>
         </w:tc>
@@ -3689,7 +3691,7 @@
                 <w:rFonts w:ascii="Calibri" w:hAnsi="Calibri"/>
                 <w:sz w:val="18"/>
               </w:rPr>
-              <w:t xml:space="preserve">Retrieved code can change without a reviewed repository change</w:t>
+              <w:t xml:space="preserve">Downloaded code can change without a reviewed repository change</w:t>
             </w:r>
           </w:p>
         </w:tc>
@@ -3709,7 +3711,7 @@
                 <w:rFonts w:ascii="Calibri" w:hAnsi="Calibri"/>
                 <w:sz w:val="18"/>
               </w:rPr>
-              <w:t xml:space="preserve">Controlled inputs, trusted integrity expectations, and isolated execution</w:t>
+              <w:t xml:space="preserve">Control inputs, check trusted integrity values, and separate execution</w:t>
             </w:r>
           </w:p>
         </w:tc>
@@ -3733,7 +3735,7 @@
                 <w:rFonts w:ascii="Calibri" w:hAnsi="Calibri"/>
                 <w:sz w:val="18"/>
               </w:rPr>
-              <w:t xml:space="preserve">Treat every warning as equally important</w:t>
+              <w:t xml:space="preserve">Treat every warning as equally urgent</w:t>
             </w:r>
           </w:p>
         </w:tc>
@@ -3752,7 +3754,7 @@
                 <w:rFonts w:ascii="Calibri" w:hAnsi="Calibri"/>
                 <w:sz w:val="18"/>
               </w:rPr>
-              <w:t xml:space="preserve">Noise and missing context can undermine triage</w:t>
+              <w:t xml:space="preserve">Missing context and repeated alerts can make prioritization difficult</w:t>
             </w:r>
           </w:p>
         </w:tc>
@@ -3771,7 +3773,7 @@
                 <w:rFonts w:ascii="Calibri" w:hAnsi="Calibri"/>
                 <w:sz w:val="18"/>
               </w:rPr>
-              <w:t xml:space="preserve">Contextual prioritization, ownership, and documented exceptions</w:t>
+              <w:t xml:space="preserve">Review relevance, assign owners, and document exceptions</w:t>
             </w:r>
           </w:p>
         </w:tc>
@@ -3796,7 +3798,7 @@
                 <w:rFonts w:ascii="Calibri" w:hAnsi="Calibri"/>
                 <w:sz w:val="18"/>
               </w:rPr>
-              <w:t xml:space="preserve">Treat a signature as proof of safe behavior</w:t>
+              <w:t xml:space="preserve">Assume a signature proves software is safe</w:t>
             </w:r>
           </w:p>
         </w:tc>
@@ -3816,7 +3818,7 @@
                 <w:rFonts w:ascii="Calibri" w:hAnsi="Calibri"/>
                 <w:sz w:val="18"/>
               </w:rPr>
-              <w:t xml:space="preserve">Authenticated origin does not establish benign content</w:t>
+              <w:t xml:space="preserve">A signature authenticates a statement or origin, not all behavior</w:t>
             </w:r>
           </w:p>
         </w:tc>
@@ -3836,7 +3838,7 @@
                 <w:rFonts w:ascii="Calibri" w:hAnsi="Calibri"/>
                 <w:sz w:val="18"/>
               </w:rPr>
-              <w:t xml:space="preserve">Verification of identity and production expectations alongside application assessment</w:t>
+              <w:t xml:space="preserve">Check artifact identity and production information alongside application security</w:t>
             </w:r>
           </w:p>
         </w:tc>
@@ -3860,7 +3862,7 @@
                 <w:rFonts w:ascii="Calibri" w:hAnsi="Calibri"/>
                 <w:sz w:val="18"/>
               </w:rPr>
-              <w:t xml:space="preserve">Produce an SBOM only for an audit</w:t>
+              <w:t xml:space="preserve">Create an SBOM only for an audit</w:t>
             </w:r>
           </w:p>
         </w:tc>
@@ -3879,7 +3881,7 @@
                 <w:rFonts w:ascii="Calibri" w:hAnsi="Calibri"/>
                 <w:sz w:val="18"/>
               </w:rPr>
-              <w:t xml:space="preserve">An unused or stale inventory does not support timely response</w:t>
+              <w:t xml:space="preserve">An unused or outdated inventory does not support a timely response</w:t>
             </w:r>
           </w:p>
         </w:tc>
@@ -3898,7 +3900,7 @@
                 <w:rFonts w:ascii="Calibri" w:hAnsi="Calibri"/>
                 <w:sz w:val="18"/>
               </w:rPr>
-              <w:t xml:space="preserve">Connect component information to deployed artifacts and advisory handling</w:t>
+              <w:t xml:space="preserve">Connect component information to deployments and vulnerability handling</w:t>
             </w:r>
           </w:p>
         </w:tc>
@@ -3923,7 +3925,7 @@
                 <w:rFonts w:ascii="Calibri" w:hAnsi="Calibri"/>
                 <w:sz w:val="18"/>
               </w:rPr>
-              <w:t xml:space="preserve">Assume reconciliation guarantees security</w:t>
+              <w:t xml:space="preserve">Assume automation always restores secure infrastructure</w:t>
             </w:r>
           </w:p>
         </w:tc>
@@ -3943,7 +3945,7 @@
                 <w:rFonts w:ascii="Calibri" w:hAnsi="Calibri"/>
                 <w:sz w:val="18"/>
               </w:rPr>
-              <w:t xml:space="preserve">Automation can repeatedly restore an unsafe intended state</w:t>
+              <w:t xml:space="preserve">Automation can repeatedly apply an unsafe configuration</w:t>
             </w:r>
           </w:p>
         </w:tc>
@@ -3963,7 +3965,7 @@
                 <w:rFonts w:ascii="Calibri" w:hAnsi="Calibri"/>
                 <w:sz w:val="18"/>
               </w:rPr>
-              <w:t xml:space="preserve">Review desired configuration and observe actual infrastructure behavior</w:t>
+              <w:t xml:space="preserve">Review the intended settings and observe the actual environment</w:t>
             </w:r>
           </w:p>
         </w:tc>
@@ -3987,7 +3989,7 @@
                 <w:rFonts w:ascii="Calibri" w:hAnsi="Calibri"/>
                 <w:sz w:val="18"/>
               </w:rPr>
-              <w:t xml:space="preserve">Treat alert generation as incident response</w:t>
+              <w:t xml:space="preserve">Treat an alert as a completed response</w:t>
             </w:r>
           </w:p>
         </w:tc>
@@ -4006,7 +4008,7 @@
                 <w:rFonts w:ascii="Calibri" w:hAnsi="Calibri"/>
                 <w:sz w:val="18"/>
               </w:rPr>
-              <w:t xml:space="preserve">A warning may have no owner or effective containment path</w:t>
+              <w:t xml:space="preserve">The problem may remain unresolved without an owner or action</w:t>
             </w:r>
           </w:p>
         </w:tc>
@@ -4025,7 +4027,7 @@
                 <w:rFonts w:ascii="Calibri" w:hAnsi="Calibri"/>
                 <w:sz w:val="18"/>
               </w:rPr>
-              <w:t xml:space="preserve">Actionable monitoring, assigned responsibility, and maintained response processes</w:t>
+              <w:t xml:space="preserve">Maintain clear responsibilities and practical response processes</w:t>
             </w:r>
           </w:p>
         </w:tc>
@@ -4033,22 +4035,22 @@
     </w:tbl>
     <w:bookmarkEnd w:id="52"/>
     <w:bookmarkEnd w:id="53"/>
-    <w:bookmarkStart w:id="63" w:name="Xc3835317bca79e60c50a9850a619004ea65bba4"/>
+    <w:bookmarkStart w:id="63" w:name="common-challenges-and-research-gaps"/>
     <w:p>
       <w:pPr>
         <w:pStyle w:val="Heading2"/>
       </w:pPr>
       <w:r>
-        <w:t xml:space="preserve">6. Cross-Cutting Challenges and Research Gaps</w:t>
+        <w:t xml:space="preserve">6. Common Challenges and Research Gaps</w:t>
       </w:r>
     </w:p>
-    <w:bookmarkStart w:id="54" w:name="X7130a1d84e06ba1fe6062b202f1a64d70d10b59"/>
+    <w:bookmarkStart w:id="54" w:name="detection-coverage-and-context"/>
     <w:p>
       <w:pPr>
         <w:pStyle w:val="Heading3"/>
       </w:pPr>
       <w:r>
-        <w:t xml:space="preserve">6.1 Context and coverage of automated detection</w:t>
+        <w:t xml:space="preserve">6.1 Detection coverage and context</w:t>
       </w:r>
     </w:p>
     <w:p>
@@ -4056,7 +4058,7 @@
         <w:pStyle w:val="FirstParagraph"/>
       </w:pPr>
       <w:r>
-        <w:t xml:space="preserve">The reviewed configuration and security-smell studies show the value of automated inspection, while also exposing the importance of context. Detection can be constrained by language support, rule design, rendering, configuration combinations, and interpretation of intended behavior. No single inspected source demonstrates complete coverage of all delivery risks.</w:t>
+        <w:t xml:space="preserve">The reviewed studies show that automated checks can identify useful warning patterns. Their coverage still depends on supported languages, rules, input files, and deployment information. A tool may understand one part of a system while missing settings added later.</w:t>
       </w:r>
     </w:p>
     <w:p>
@@ -4064,17 +4066,17 @@
         <w:pStyle w:val="BodyText"/>
       </w:pPr>
       <w:r>
-        <w:t xml:space="preserve">A recurring open question concerns how findings should express their assumptions. A warning that explains the affected resource, relevant configuration, and consequence can be more actionable than a label detached from deployment context. This issue links technical detection with the human work of investigating and maintaining fixes.</w:t>
+        <w:t xml:space="preserve">An important question is how tools can communicate the assumptions behind a finding. A warning that identifies the affected resource and explains its possible consequence can be easier to investigate than a general label. This connects the accuracy of detection with the practical work of understanding and fixing a problem.</w:t>
       </w:r>
     </w:p>
     <w:bookmarkEnd w:id="54"/>
-    <w:bookmarkStart w:id="55" w:name="X718515e8694c26bffca603795291330096a0fef"/>
+    <w:bookmarkStart w:id="55" w:name="X268bad6dea0e3f114a981f81130319d0f2c698d"/>
     <w:p>
       <w:pPr>
         <w:pStyle w:val="Heading3"/>
       </w:pPr>
       <w:r>
-        <w:t xml:space="preserve">6.2 Intended state, execution, and configuration drift</w:t>
+        <w:t xml:space="preserve">6.2 Intended configuration and actual infrastructure</w:t>
       </w:r>
     </w:p>
     <w:p>
@@ -4082,7 +4084,7 @@
         <w:pStyle w:val="FirstParagraph"/>
       </w:pPr>
       <w:r>
-        <w:t xml:space="preserve">Infrastructure security spans declared state, transformation by an automation engine, and the live environment. Static approval concerns the first of these; reconciliation defects concern the second; drift concerns the third. The reviewed material supports treating them as connected but distinct areas of visibility.</w:t>
+        <w:t xml:space="preserve">Infrastructure security involves the configuration that a team intends to apply, the actions performed by automation, and the state of the running environment. These can differ because of defects, defaults, manual changes, or interactions between services.</w:t>
       </w:r>
     </w:p>
     <w:p>
@@ -4090,17 +4092,25 @@
         <w:pStyle w:val="BodyText"/>
       </w:pPr>
       <w:r>
-        <w:t xml:space="preserve">An unresolved challenge is maintaining a clear relationship among those states without assuming that one is a complete substitute for the others. The problem becomes more complex when templates, multiple repositories, provider defaults, and manual changes interact. This motivates a review of complementary observations rather than a claim that one tool resolves the whole lifecycle.</w:t>
+        <w:t xml:space="preserve">Static checks examine the declared settings. Research on reconciliation examines how automation carries out changes. Live-state monitoring helps identify later differences. The reviewed material suggests that these sources of information are useful together, but one should not be assumed to replace all the others.</w:t>
+      </w:r>
+    </w:p>
+    <w:p>
+      <w:pPr>
+        <w:pStyle w:val="BodyText"/>
+      </w:pPr>
+      <w:r>
+        <w:t xml:space="preserve">The remaining challenge is keeping these views connected, especially when several repositories, templates, and service providers are involved. This is a wider issue than checking one configuration file.</w:t>
       </w:r>
     </w:p>
     <w:bookmarkEnd w:id="55"/>
-    <w:bookmarkStart w:id="56" w:name="Xb1ebcca19f1bdb61a4af65cfb32d2f4f5617362"/>
+    <w:bookmarkStart w:id="56" w:name="understanding-security-records-and-trust"/>
     <w:p>
       <w:pPr>
         <w:pStyle w:val="Heading3"/>
       </w:pPr>
       <w:r>
-        <w:t xml:space="preserve">6.3 Independence and interpretation of security information</w:t>
+        <w:t xml:space="preserve">6.3 Understanding security records and trust</w:t>
       </w:r>
     </w:p>
     <w:p>
@@ -4108,7 +4118,7 @@
         <w:pStyle w:val="FirstParagraph"/>
       </w:pPr>
       <w:r>
-        <w:t xml:space="preserve">Supply-chain specifications provide structures for expressing artifact relationships and production information. Their value depends on which actors are trusted and which statements consumers actually verify. Evidence generated and accepted under a single compromised authority can share the same failure boundary.</w:t>
+        <w:t xml:space="preserve">Supply-chain specifications make production steps and artifact relationships easier to record and verify. Their usefulness depends on who creates the records, which identities are trusted, and what checks the receiving system performs.</w:t>
       </w:r>
     </w:p>
     <w:p>
@@ -4116,17 +4126,25 @@
         <w:pStyle w:val="BodyText"/>
       </w:pPr>
       <w:r>
-        <w:t xml:space="preserve">This does not make signed information useless. It means that its interpretation must remain proportional to its source and scope. A statement about how software was produced, an application test, and a runtime observation provide different kinds of knowledge. Combining them is an organizational and technical integration challenge, not a justification for collapsing them into one unqualified score.</w:t>
+        <w:t xml:space="preserve">If the same compromised authority can create and approve a record, both activities may be affected. This does not make signed information worthless. It means that teams need to understand what the record proves and which assumptions it relies on.</w:t>
+      </w:r>
+    </w:p>
+    <w:p>
+      <w:pPr>
+        <w:pStyle w:val="BodyText"/>
+      </w:pPr>
+      <w:r>
+        <w:t xml:space="preserve">Build information, application tests, and observations from a running system answer different questions. Combining them requires careful interpretation. A single score can hide differences in coverage and trust if those details are not retained.</w:t>
       </w:r>
     </w:p>
     <w:bookmarkEnd w:id="56"/>
-    <w:bookmarkStart w:id="57" w:name="Xbe6b805eb5ec7054d6099f8a8e7380df16ac29b"/>
+    <w:bookmarkStart w:id="57" w:name="tool-maintenance-and-developer-adoption"/>
     <w:p>
       <w:pPr>
         <w:pStyle w:val="Heading3"/>
       </w:pPr>
       <w:r>
-        <w:t xml:space="preserve">6.4 Maintenance burden and developer adoption</w:t>
+        <w:t xml:space="preserve">6.4 Tool maintenance and developer adoption</w:t>
       </w:r>
     </w:p>
     <w:p>
@@ -4134,7 +4152,7 @@
         <w:pStyle w:val="FirstParagraph"/>
       </w:pPr>
       <w:r>
-        <w:t xml:space="preserve">DevSecOps controls require upkeep. Rules change, dependencies evolve, exceptions expire, identities drift, and teams change responsibilities. A successful initial integration does not establish that a control will remain accurate or usable over time.</w:t>
+        <w:t xml:space="preserve">Security controls need continuing maintenance. Rules and dependencies change, exceptions expire, and teams take on new responsibilities. A tool that worked during initial installation may later become inaccurate, difficult to use, or poorly matched to the system.</w:t>
       </w:r>
     </w:p>
     <w:p>
@@ -4142,17 +4160,25 @@
         <w:pStyle w:val="BodyText"/>
       </w:pPr>
       <w:r>
-        <w:t xml:space="preserve">The practitioner literature also highlights the importance of collaboration and non-automated activity. Tool findings must enter an understandable workflow with an accountable owner. Too many overlapping results can consume effort without resolving the most relevant exposure. The open issue is sustained, context-sensitive use, not simply whether a pipeline can execute a scanner.</w:t>
+        <w:t xml:space="preserve">The practitioner study also highlights the value of collaboration and activities that cannot be fully automated. Findings need clear explanations and an owner who can act on them. Several overlapping tools can create extra work without resolving the most important risk.</w:t>
+      </w:r>
+    </w:p>
+    <w:p>
+      <w:pPr>
+        <w:pStyle w:val="BodyText"/>
+      </w:pPr>
+      <w:r>
+        <w:t xml:space="preserve">The research gap concerns sustained use as well as initial adoption. More accounts from different organizations would help explain how teams maintain these practices over time.</w:t>
       </w:r>
     </w:p>
     <w:bookmarkEnd w:id="57"/>
-    <w:bookmarkStart w:id="58" w:name="runtime-visibility-and-response"/>
+    <w:bookmarkStart w:id="58" w:name="monitoring-and-incident-response"/>
     <w:p>
       <w:pPr>
         <w:pStyle w:val="Heading3"/>
       </w:pPr>
       <w:r>
-        <w:t xml:space="preserve">6.5 Runtime visibility and response</w:t>
+        <w:t xml:space="preserve">6.5 Monitoring and incident response</w:t>
       </w:r>
     </w:p>
     <w:p>
@@ -4160,7 +4186,7 @@
         <w:pStyle w:val="FirstParagraph"/>
       </w:pPr>
       <w:r>
-        <w:t xml:space="preserve">Monitoring can reveal changes that pre-deployment checks cannot observe, but visibility is not equivalent to successful response. Logs can be incomplete, alerts can lack context, and remediation can be delayed by unclear ownership. Protecting telemetry and maintaining response responsibility therefore remain part of the reviewed defensive picture.</w:t>
+        <w:t xml:space="preserve">Monitoring can reveal changes that earlier checks cannot observe. However, logs may be incomplete, alerts may lack context, and action may be delayed when responsibilities are unclear. Collecting information is therefore only part of operational security.</w:t>
       </w:r>
     </w:p>
     <w:p>
@@ -4168,7 +4194,7 @@
         <w:pStyle w:val="BodyText"/>
       </w:pPr>
       <w:r>
-        <w:t xml:space="preserve">The literature also cautions against relying exclusively on build-time information. Newly disclosed vulnerabilities and changed deployments can alter the interpretation of an existing release. Continuous security is best understood here as continued attention to changing conditions, rather than a promise that automation has eliminated residual risk.</w:t>
+        <w:t xml:space="preserve">Teams also need to review software after deployment. A newly disclosed vulnerability or a changed configuration can affect a release that previously passed its checks. Continuous security involves responding to this changing information rather than assuming that a successful build check remains sufficient indefinitely.</w:t>
       </w:r>
     </w:p>
     <w:p>
@@ -4182,7 +4208,7 @@
           <w:b/>
           <w:bCs/>
         </w:rPr>
-        <w:t xml:space="preserve">Table 6. Comparison of existing approaches by lifecycle stage.</w:t>
+        <w:t xml:space="preserve">Table 6. Comparison of security approaches across lifecycle stages.</w:t>
       </w:r>
     </w:p>
     <w:tbl>
@@ -4267,7 +4293,7 @@
                 <w:color w:val="FFFFFF"/>
                 <w:sz w:val="18"/>
               </w:rPr>
-              <w:t xml:space="preserve">Main contribution</w:t>
+              <w:t xml:space="preserve">Main benefit</w:t>
             </w:r>
           </w:p>
         </w:tc>
@@ -4334,7 +4360,7 @@
                 <w:rFonts w:ascii="Calibri" w:hAnsi="Calibri"/>
                 <w:sz w:val="18"/>
               </w:rPr>
-              <w:t xml:space="preserve">Threat modeling, security requirements, ownership</w:t>
+              <w:t xml:space="preserve">Threat modeling, requirements, assigned responsibilities</w:t>
             </w:r>
           </w:p>
         </w:tc>
@@ -4354,7 +4380,7 @@
                 <w:rFonts w:ascii="Calibri" w:hAnsi="Calibri"/>
                 <w:sz w:val="18"/>
               </w:rPr>
-              <w:t xml:space="preserve">Clarifies assets, assumptions, and responsibility</w:t>
+              <w:t xml:space="preserve">Clarifies what needs protection and who is responsible</w:t>
             </w:r>
           </w:p>
         </w:tc>
@@ -4374,7 +4400,7 @@
                 <w:rFonts w:ascii="Calibri" w:hAnsi="Calibri"/>
                 <w:sz w:val="18"/>
               </w:rPr>
-              <w:t xml:space="preserve">Analysis can become outdated or remain disconnected from implementation</w:t>
+              <w:t xml:space="preserve">The analysis can become outdated or disconnected from development</w:t>
             </w:r>
           </w:p>
         </w:tc>
@@ -4417,7 +4443,7 @@
                 <w:rFonts w:ascii="Calibri" w:hAnsi="Calibri"/>
                 <w:sz w:val="18"/>
               </w:rPr>
-              <w:t xml:space="preserve">Source analysis, secret detection, review</w:t>
+              <w:t xml:space="preserve">Source analysis, secret detection, code review</w:t>
             </w:r>
           </w:p>
         </w:tc>
@@ -4436,7 +4462,7 @@
                 <w:rFonts w:ascii="Calibri" w:hAnsi="Calibri"/>
                 <w:sz w:val="18"/>
               </w:rPr>
-              <w:t xml:space="preserve">Identifies selected weaknesses before release</w:t>
+              <w:t xml:space="preserve">Finds selected weaknesses before release</w:t>
             </w:r>
           </w:p>
         </w:tc>
@@ -4455,7 +4481,7 @@
                 <w:rFonts w:ascii="Calibri" w:hAnsi="Calibri"/>
                 <w:sz w:val="18"/>
               </w:rPr>
-              <w:t xml:space="preserve">Pattern coverage and context remain incomplete</w:t>
+              <w:t xml:space="preserve">Rules and available context do not cover every problem</w:t>
             </w:r>
           </w:p>
         </w:tc>
@@ -4500,7 +4526,7 @@
                 <w:rFonts w:ascii="Calibri" w:hAnsi="Calibri"/>
                 <w:sz w:val="18"/>
               </w:rPr>
-              <w:t xml:space="preserve">Dependency inspection, controlled inputs, build isolation</w:t>
+              <w:t xml:space="preserve">Dependency checks, controlled inputs, isolated builds</w:t>
             </w:r>
           </w:p>
         </w:tc>
@@ -4520,7 +4546,7 @@
                 <w:rFonts w:ascii="Calibri" w:hAnsi="Calibri"/>
                 <w:sz w:val="18"/>
               </w:rPr>
-              <w:t xml:space="preserve">Examines components and limits production-process exposure</w:t>
+              <w:t xml:space="preserve">Examines components and limits exposure during production</w:t>
             </w:r>
           </w:p>
         </w:tc>
@@ -4540,7 +4566,7 @@
                 <w:rFonts w:ascii="Calibri" w:hAnsi="Calibri"/>
                 <w:sz w:val="18"/>
               </w:rPr>
-              <w:t xml:space="preserve">Unknown flaws and trusted-component compromise remain possible</w:t>
+              <w:t xml:space="preserve">Unknown flaws and compromised trusted inputs remain possible</w:t>
             </w:r>
           </w:p>
         </w:tc>
@@ -4583,7 +4609,7 @@
                 <w:rFonts w:ascii="Calibri" w:hAnsi="Calibri"/>
                 <w:sz w:val="18"/>
               </w:rPr>
-              <w:t xml:space="preserve">Application assessment and requirement-based verification</w:t>
+              <w:t xml:space="preserve">Application testing and requirements-based assessment</w:t>
             </w:r>
           </w:p>
         </w:tc>
@@ -4602,7 +4628,7 @@
                 <w:rFonts w:ascii="Calibri" w:hAnsi="Calibri"/>
                 <w:sz w:val="18"/>
               </w:rPr>
-              <w:t xml:space="preserve">Examines behavior and application requirements</w:t>
+              <w:t xml:space="preserve">Examines behavior and security requirements</w:t>
             </w:r>
           </w:p>
         </w:tc>
@@ -4621,7 +4647,7 @@
                 <w:rFonts w:ascii="Calibri" w:hAnsi="Calibri"/>
                 <w:sz w:val="18"/>
               </w:rPr>
-              <w:t xml:space="preserve">Unexercised paths and environment differences limit conclusions</w:t>
+              <w:t xml:space="preserve">Untested paths and different environments limit coverage</w:t>
             </w:r>
           </w:p>
         </w:tc>
@@ -4666,7 +4692,7 @@
                 <w:rFonts w:ascii="Calibri" w:hAnsi="Calibri"/>
                 <w:sz w:val="18"/>
               </w:rPr>
-              <w:t xml:space="preserve">Artifact signatures, provenance, authorized acceptance</w:t>
+              <w:t xml:space="preserve">Signatures, provenance, artifact verification</w:t>
             </w:r>
           </w:p>
         </w:tc>
@@ -4686,7 +4712,7 @@
                 <w:rFonts w:ascii="Calibri" w:hAnsi="Calibri"/>
                 <w:sz w:val="18"/>
               </w:rPr>
-              <w:t xml:space="preserve">Connects consumed artifacts to expected identity and production</w:t>
+              <w:t xml:space="preserve">Helps confirm artifact identity and expected production</w:t>
             </w:r>
           </w:p>
         </w:tc>
@@ -4706,7 +4732,7 @@
                 <w:rFonts w:ascii="Calibri" w:hAnsi="Calibri"/>
                 <w:sz w:val="18"/>
               </w:rPr>
-              <w:t xml:space="preserve">Valid statements do not establish benign content</w:t>
+              <w:t xml:space="preserve">Valid records do not prove harmless content</w:t>
             </w:r>
           </w:p>
         </w:tc>
@@ -4749,7 +4775,7 @@
                 <w:rFonts w:ascii="Calibri" w:hAnsi="Calibri"/>
                 <w:sz w:val="18"/>
               </w:rPr>
-              <w:t xml:space="preserve">IaC inspection, scoped identities, configuration policy</w:t>
+              <w:t xml:space="preserve">IaC checks, limited identities, configuration policies</w:t>
             </w:r>
           </w:p>
         </w:tc>
@@ -4768,7 +4794,7 @@
                 <w:rFonts w:ascii="Calibri" w:hAnsi="Calibri"/>
                 <w:sz w:val="18"/>
               </w:rPr>
-              <w:t xml:space="preserve">Addresses intended resources and deployment authority</w:t>
+              <w:t xml:space="preserve">Reviews intended settings and deployment permissions</w:t>
             </w:r>
           </w:p>
         </w:tc>
@@ -4787,7 +4813,7 @@
                 <w:rFonts w:ascii="Calibri" w:hAnsi="Calibri"/>
                 <w:sz w:val="18"/>
               </w:rPr>
-              <w:t xml:space="preserve">Execution semantics and subsequent drift can change actual exposure</w:t>
+              <w:t xml:space="preserve">Automation behavior and later changes can affect the actual result</w:t>
             </w:r>
           </w:p>
         </w:tc>
@@ -4832,7 +4858,7 @@
                 <w:rFonts w:ascii="Calibri" w:hAnsi="Calibri"/>
                 <w:sz w:val="18"/>
               </w:rPr>
-              <w:t xml:space="preserve">Live-state observation, telemetry, advisory response</w:t>
+              <w:t xml:space="preserve">Live-state checks, logs, vulnerability monitoring</w:t>
             </w:r>
           </w:p>
         </w:tc>
@@ -4852,7 +4878,7 @@
                 <w:rFonts w:ascii="Calibri" w:hAnsi="Calibri"/>
                 <w:sz w:val="18"/>
               </w:rPr>
-              <w:t xml:space="preserve">Supports awareness of changing conditions after deployment</w:t>
+              <w:t xml:space="preserve">Helps identify changing conditions after deployment</w:t>
             </w:r>
           </w:p>
         </w:tc>
@@ -4872,20 +4898,20 @@
                 <w:rFonts w:ascii="Calibri" w:hAnsi="Calibri"/>
                 <w:sz w:val="18"/>
               </w:rPr>
-              <w:t xml:space="preserve">Visibility can remain incomplete or fail to produce effective response</w:t>
+              <w:t xml:space="preserve">Missing information or unclear ownership can delay response</w:t>
             </w:r>
           </w:p>
         </w:tc>
       </w:tr>
     </w:tbl>
     <w:bookmarkEnd w:id="58"/>
-    <w:bookmarkStart w:id="62" w:name="synthesis-of-open-questions"/>
+    <w:bookmarkStart w:id="62" w:name="summary-of-open-questions"/>
     <w:p>
       <w:pPr>
         <w:pStyle w:val="Heading3"/>
       </w:pPr>
       <w:r>
-        <w:t xml:space="preserve">6.6 Synthesis of open questions</w:t>
+        <w:t xml:space="preserve">6.6 Summary of open questions</w:t>
       </w:r>
     </w:p>
     <w:p>
@@ -4893,7 +4919,7 @@
         <w:pStyle w:val="FirstParagraph"/>
       </w:pPr>
       <w:r>
-        <w:t xml:space="preserve">Figure 4 and Table 7 summarize the gaps suggested by the selected material. They describe unresolved relationships between existing contributions and broader security conclusions. They do not claim that no prior publication has considered these issues; establishing such absence would require a more comprehensive search.</w:t>
+        <w:t xml:space="preserve">Figure 4 and Table 7 bring together the main questions identified in the selected material. These are areas that need further attention within this review. They should not be read as proof that no other researchers have studied them.</w:t>
       </w:r>
     </w:p>
     <w:p>
@@ -4907,7 +4933,7 @@
           <w:b/>
           <w:bCs/>
         </w:rPr>
-        <w:t xml:space="preserve">Figure 4. Open questions emerging from the comparison of existing literature.</w:t>
+        <w:t xml:space="preserve">Figure 4. Open questions identified through the literature comparison.</w:t>
       </w:r>
     </w:p>
     <w:p>
@@ -4920,7 +4946,7 @@
           <wp:inline>
             <wp:extent cx="5943600" cy="4044950"/>
             <wp:effectExtent b="0" l="0" r="0" t="0"/>
-            <wp:docPr descr="Qualitative gap map comparing adoption knowledge, static detection, artifact integrity, monitoring, and tool integration with unresolved questions." title="" id="60" name="Picture"/>
+            <wp:docPr descr="Questions about long-term security outcomes, detection coverage, trust, response, and tool maintenance." title="" id="60" name="Picture"/>
             <a:graphic>
               <a:graphicData uri="http://schemas.openxmlformats.org/drawingml/2006/picture">
                 <pic:pic>
@@ -4963,7 +4989,7 @@
         <w:pStyle w:val="BodyText"/>
       </w:pPr>
       <w:r>
-        <w:t xml:space="preserve">The figure contains no performance values or new experimental findings. It visualizes the review’s interpretation of remaining questions across the selected sources.</w:t>
+        <w:t xml:space="preserve">The figure summarizes the discussion. It contains no performance measurements or new experimental findings.</w:t>
       </w:r>
     </w:p>
     <w:p>
@@ -4977,7 +5003,7 @@
           <w:b/>
           <w:bCs/>
         </w:rPr>
-        <w:t xml:space="preserve">Table 7. Research gaps synthesized from the reviewed material.</w:t>
+        <w:t xml:space="preserve">Table 7. Research gaps and possible directions for further study.</w:t>
       </w:r>
     </w:p>
     <w:tbl>
@@ -5018,7 +5044,7 @@
                 <w:color w:val="FFFFFF"/>
                 <w:sz w:val="18"/>
               </w:rPr>
-              <w:t xml:space="preserve">Theme</w:t>
+              <w:t xml:space="preserve">Topic</w:t>
             </w:r>
           </w:p>
         </w:tc>
@@ -5040,7 +5066,7 @@
                 <w:color w:val="FFFFFF"/>
                 <w:sz w:val="18"/>
               </w:rPr>
-              <w:t xml:space="preserve">Existing contribution</w:t>
+              <w:t xml:space="preserve">What existing work explains</w:t>
             </w:r>
           </w:p>
         </w:tc>
@@ -5062,7 +5088,7 @@
                 <w:color w:val="FFFFFF"/>
                 <w:sz w:val="18"/>
               </w:rPr>
-              <w:t xml:space="preserve">Unresolved issue</w:t>
+              <w:t xml:space="preserve">Remaining question</w:t>
             </w:r>
           </w:p>
         </w:tc>
@@ -5084,7 +5110,7 @@
                 <w:color w:val="FFFFFF"/>
                 <w:sz w:val="18"/>
               </w:rPr>
-              <w:t xml:space="preserve">Direction for further literature development</w:t>
+              <w:t xml:space="preserve">Further work needed</w:t>
             </w:r>
           </w:p>
         </w:tc>
@@ -5109,7 +5135,7 @@
                 <w:rFonts w:ascii="Calibri" w:hAnsi="Calibri"/>
                 <w:sz w:val="18"/>
               </w:rPr>
-              <w:t xml:space="preserve">Organizational integration</w:t>
+              <w:t xml:space="preserve">Teamwork and adoption</w:t>
             </w:r>
           </w:p>
         </w:tc>
@@ -5129,7 +5155,7 @@
                 <w:rFonts w:ascii="Calibri" w:hAnsi="Calibri"/>
                 <w:sz w:val="18"/>
               </w:rPr>
-              <w:t xml:space="preserve">Descriptions of collaboration and adoption practices</w:t>
+              <w:t xml:space="preserve">How teams report security practices and collaboration</w:t>
             </w:r>
           </w:p>
         </w:tc>
@@ -5149,7 +5175,7 @@
                 <w:rFonts w:ascii="Calibri" w:hAnsi="Calibri"/>
                 <w:sz w:val="18"/>
               </w:rPr>
-              <w:t xml:space="preserve">Relationship to sustained operational security remains context-dependent</w:t>
+              <w:t xml:space="preserve">How these practices support security over time in different settings</w:t>
             </w:r>
           </w:p>
         </w:tc>
@@ -5169,7 +5195,7 @@
                 <w:rFonts w:ascii="Calibri" w:hAnsi="Calibri"/>
                 <w:sz w:val="18"/>
               </w:rPr>
-              <w:t xml:space="preserve">Broader synthesis of organizational settings and long-term experience</w:t>
+              <w:t xml:space="preserve">Reviews of more organizations and longer-term experience</w:t>
             </w:r>
           </w:p>
         </w:tc>
@@ -5212,7 +5238,7 @@
                 <w:rFonts w:ascii="Calibri" w:hAnsi="Calibri"/>
                 <w:sz w:val="18"/>
               </w:rPr>
-              <w:t xml:space="preserve">Identification of known code and configuration patterns</w:t>
+              <w:t xml:space="preserve">How tools identify selected weakness patterns</w:t>
             </w:r>
           </w:p>
         </w:tc>
@@ -5231,7 +5257,7 @@
                 <w:rFonts w:ascii="Calibri" w:hAnsi="Calibri"/>
                 <w:sz w:val="18"/>
               </w:rPr>
-              <w:t xml:space="preserve">Context, language coverage, and meaning of combined findings</w:t>
+              <w:t xml:space="preserve">How context, coverage, and repeated findings affect usefulness</w:t>
             </w:r>
           </w:p>
         </w:tc>
@@ -5250,7 +5276,7 @@
                 <w:rFonts w:ascii="Calibri" w:hAnsi="Calibri"/>
                 <w:sz w:val="18"/>
               </w:rPr>
-              <w:t xml:space="preserve">More comparable reporting of scope, assumptions, and limitations</w:t>
+              <w:t xml:space="preserve">Clearer comparison of tool scope, assumptions, and limitations</w:t>
             </w:r>
           </w:p>
         </w:tc>
@@ -5295,7 +5321,7 @@
                 <w:rFonts w:ascii="Calibri" w:hAnsi="Calibri"/>
                 <w:sz w:val="18"/>
               </w:rPr>
-              <w:t xml:space="preserve">Studies of declarations and reconciliation defects</w:t>
+              <w:t xml:space="preserve">How declarations and automation defects affect resources</w:t>
             </w:r>
           </w:p>
         </w:tc>
@@ -5315,7 +5341,7 @@
                 <w:rFonts w:ascii="Calibri" w:hAnsi="Calibri"/>
                 <w:sz w:val="18"/>
               </w:rPr>
-              <w:t xml:space="preserve">Relationship among intended, executed, and live state</w:t>
+              <w:t xml:space="preserve">How intended settings relate to executed changes and live state</w:t>
             </w:r>
           </w:p>
         </w:tc>
@@ -5335,7 +5361,7 @@
                 <w:rFonts w:ascii="Calibri" w:hAnsi="Calibri"/>
                 <w:sz w:val="18"/>
               </w:rPr>
-              <w:t xml:space="preserve">Integration of knowledge across configuration and runtime research</w:t>
+              <w:t xml:space="preserve">Closer connection between configuration and runtime research</w:t>
             </w:r>
           </w:p>
         </w:tc>
@@ -5378,7 +5404,7 @@
                 <w:rFonts w:ascii="Calibri" w:hAnsi="Calibri"/>
                 <w:sz w:val="18"/>
               </w:rPr>
-              <w:t xml:space="preserve">Provenance, signatures, and authorized-step specifications</w:t>
+              <w:t xml:space="preserve">How signatures and provenance describe production</w:t>
             </w:r>
           </w:p>
         </w:tc>
@@ -5397,7 +5423,7 @@
                 <w:rFonts w:ascii="Calibri" w:hAnsi="Calibri"/>
                 <w:sz w:val="18"/>
               </w:rPr>
-              <w:t xml:space="preserve">Difference between authenticated production and benign behavior</w:t>
+              <w:t xml:space="preserve">What verified records establish about behavior and producer trust</w:t>
             </w:r>
           </w:p>
         </w:tc>
@@ -5416,7 +5442,7 @@
                 <w:rFonts w:ascii="Calibri" w:hAnsi="Calibri"/>
                 <w:sz w:val="18"/>
               </w:rPr>
-              <w:t xml:space="preserve">Clearer synthesis of trust assumptions and consumer verification</w:t>
+              <w:t xml:space="preserve">Clearer explanations of trust assumptions and receiving-system checks</w:t>
             </w:r>
           </w:p>
         </w:tc>
@@ -5461,7 +5487,7 @@
                 <w:rFonts w:ascii="Calibri" w:hAnsi="Calibri"/>
                 <w:sz w:val="18"/>
               </w:rPr>
-              <w:t xml:space="preserve">Guidance on credential hygiene and narrow permissions</w:t>
+              <w:t xml:space="preserve">Why credential hygiene and limited access matter</w:t>
             </w:r>
           </w:p>
         </w:tc>
@@ -5481,7 +5507,7 @@
                 <w:rFonts w:ascii="Calibri" w:hAnsi="Calibri"/>
                 <w:sz w:val="18"/>
               </w:rPr>
-              <w:t xml:space="preserve">Effective privilege across connected tools and temporary identities</w:t>
+              <w:t xml:space="preserve">How permissions interact across connected tools and temporary identities</w:t>
             </w:r>
           </w:p>
         </w:tc>
@@ -5501,7 +5527,7 @@
                 <w:rFonts w:ascii="Calibri" w:hAnsi="Calibri"/>
                 <w:sz w:val="18"/>
               </w:rPr>
-              <w:t xml:space="preserve">Closer treatment of identity relationships throughout delivery</w:t>
+              <w:t xml:space="preserve">More detailed accounts of access relationships throughout delivery</w:t>
             </w:r>
           </w:p>
         </w:tc>
@@ -5525,7 +5551,7 @@
                 <w:rFonts w:ascii="Calibri" w:hAnsi="Calibri"/>
                 <w:sz w:val="18"/>
               </w:rPr>
-              <w:t xml:space="preserve">Runtime response</w:t>
+              <w:t xml:space="preserve">Monitoring and response</w:t>
             </w:r>
           </w:p>
         </w:tc>
@@ -5544,7 +5570,7 @@
                 <w:rFonts w:ascii="Calibri" w:hAnsi="Calibri"/>
                 <w:sz w:val="18"/>
               </w:rPr>
-              <w:t xml:space="preserve">Monitoring and post-deployment visibility</w:t>
+              <w:t xml:space="preserve">How monitoring reveals conditions after deployment</w:t>
             </w:r>
           </w:p>
         </w:tc>
@@ -5563,7 +5589,7 @@
                 <w:rFonts w:ascii="Calibri" w:hAnsi="Calibri"/>
                 <w:sz w:val="18"/>
               </w:rPr>
-              <w:t xml:space="preserve">Ownership, actionability, and changing exposure</w:t>
+              <w:t xml:space="preserve">How findings become timely action with clear ownership</w:t>
             </w:r>
           </w:p>
         </w:tc>
@@ -5582,7 +5608,7 @@
                 <w:rFonts w:ascii="Calibri" w:hAnsi="Calibri"/>
                 <w:sz w:val="18"/>
               </w:rPr>
-              <w:t xml:space="preserve">Stronger connection between detection literature and response practice</w:t>
+              <w:t xml:space="preserve">Stronger connections between detection and response studies</w:t>
             </w:r>
           </w:p>
         </w:tc>
@@ -5627,7 +5653,7 @@
                 <w:rFonts w:ascii="Calibri" w:hAnsi="Calibri"/>
                 <w:sz w:val="18"/>
               </w:rPr>
-              <w:t xml:space="preserve">Multiple specialized mechanisms across the lifecycle</w:t>
+              <w:t xml:space="preserve">How specialized controls fit into delivery stages</w:t>
             </w:r>
           </w:p>
         </w:tc>
@@ -5647,7 +5673,7 @@
                 <w:rFonts w:ascii="Calibri" w:hAnsi="Calibri"/>
                 <w:sz w:val="18"/>
               </w:rPr>
-              <w:t xml:space="preserve">Duplication, interoperability, and continuing maintenance effort</w:t>
+              <w:t xml:space="preserve">How duplication and maintenance affect continued use</w:t>
             </w:r>
           </w:p>
         </w:tc>
@@ -5667,7 +5693,7 @@
                 <w:rFonts w:ascii="Calibri" w:hAnsi="Calibri"/>
                 <w:sz w:val="18"/>
               </w:rPr>
-              <w:t xml:space="preserve">Comparative accounts of integration costs and sustained usability</w:t>
+              <w:t xml:space="preserve">More comparison of integration effort and developer experience</w:t>
             </w:r>
           </w:p>
         </w:tc>
@@ -5675,22 +5701,22 @@
     </w:tbl>
     <w:bookmarkEnd w:id="62"/>
     <w:bookmarkEnd w:id="63"/>
-    <w:bookmarkStart w:id="67" w:name="discussion-and-review-limitations"/>
+    <w:bookmarkStart w:id="67" w:name="discussion-and-limitations"/>
     <w:p>
       <w:pPr>
         <w:pStyle w:val="Heading2"/>
       </w:pPr>
       <w:r>
-        <w:t xml:space="preserve">7. Discussion and Review Limitations</w:t>
+        <w:t xml:space="preserve">7. Discussion and Limitations</w:t>
       </w:r>
     </w:p>
-    <w:bookmarkStart w:id="64" w:name="answers-to-the-review-questions"/>
+    <w:bookmarkStart w:id="64" w:name="answers-to-the-research-questions"/>
     <w:p>
       <w:pPr>
         <w:pStyle w:val="Heading3"/>
       </w:pPr>
       <w:r>
-        <w:t xml:space="preserve">7.1 Answers to the review questions</w:t>
+        <w:t xml:space="preserve">7.1 Answers to the research questions</w:t>
       </w:r>
     </w:p>
     <w:p>
@@ -5711,7 +5737,7 @@
         <w:t xml:space="preserve">RQ1</w:t>
       </w:r>
       <w:r>
-        <w:t xml:space="preserve">, existing work describes security integration as a combination of organizational practices and technical mechanisms. Collaboration and ownership influence whether security concerns become part of normal delivery work. Technical controls extend visibility into code, components, infrastructure, artifacts, and running systems.</w:t>
+        <w:t xml:space="preserve">, the reviewed studies describe DevSecOps as both a team practice and a technical process. Collaboration and clear ownership help teams include security in everyday delivery work. Technical controls examine code, dependencies, infrastructure, released artifacts, and running systems.</w:t>
       </w:r>
     </w:p>
     <w:p>
@@ -5732,7 +5758,7 @@
         <w:t xml:space="preserve">RQ2</w:t>
       </w:r>
       <w:r>
-        <w:t xml:space="preserve">, the approaches differ in what they observe and control. Source and configuration analysis inspect selected pre-deployment weaknesses; identity controls limit authority; supply-chain mechanisms establish expected production relationships; and monitoring addresses conditions after deployment. Their overlap is useful, but it does not eliminate individual limitations.</w:t>
+        <w:t xml:space="preserve">, different approaches support different stages. Source and configuration checks identify selected weaknesses before deployment. Access controls limit permissions. Supply-chain checks help verify expected production and artifact identity. Monitoring examines conditions after deployment.</w:t>
       </w:r>
     </w:p>
     <w:p>
@@ -5753,7 +5779,7 @@
         <w:t xml:space="preserve">RQ3</w:t>
       </w:r>
       <w:r>
-        <w:t xml:space="preserve">, the academic studies provide context-specific observations and classifications, while frameworks define requirements or verification mechanisms. Table 2 distinguishes the research contributions and their inference boundaries. Table 3 shows why the frameworks are complementary rather than interchangeable measures of security.</w:t>
+        <w:t xml:space="preserve">, the studies provide findings from specific settings, while frameworks describe risks, requirements, or recommended checks. Table 2 compares the studies’ methods and limitations. Table 3 explains why the frameworks serve different purposes and cannot be treated as interchangeable security measures.</w:t>
       </w:r>
     </w:p>
     <w:p>
@@ -5774,17 +5800,17 @@
         <w:t xml:space="preserve">RQ4</w:t>
       </w:r>
       <w:r>
-        <w:t xml:space="preserve">, the recurring gaps concern context-aware detection, infrastructure execution, interpretation of signed information, effective privilege, maintenance burden, and operational response. These are conclusions from comparing the selected material, not claims of a newly discovered absence across the entire research field.</w:t>
+        <w:t xml:space="preserve">, the main remaining issues are detection context, infrastructure behavior, trust in security records, effective permissions, maintenance effort, and response. These questions come from comparing the selected material. A wider search may identify additional work or different conclusions.</w:t>
       </w:r>
     </w:p>
     <w:bookmarkEnd w:id="64"/>
-    <w:bookmarkStart w:id="65" w:name="implications-for-understanding-devsecops"/>
+    <w:bookmarkStart w:id="65" w:name="what-the-comparison-suggests"/>
     <w:p>
       <w:pPr>
         <w:pStyle w:val="Heading3"/>
       </w:pPr>
       <w:r>
-        <w:t xml:space="preserve">7.2 Implications for understanding DevSecOps</w:t>
+        <w:t xml:space="preserve">7.2 What the comparison suggests</w:t>
       </w:r>
     </w:p>
     <w:p>
@@ -5792,7 +5818,7 @@
         <w:pStyle w:val="FirstParagraph"/>
       </w:pPr>
       <w:r>
-        <w:t xml:space="preserve">The review supports moving beyond a binary account of pipelines with or without security. Actual systems contain partial coverage, inherited protections, exceptions, and different operational constraints. A meaningful comparison explains which risks an approach addresses and what remains uncertain.</w:t>
+        <w:t xml:space="preserve">The reviewed material suggests that security cannot be described simply by whether a pipeline has security tools. Real systems have different controls, exceptions, inherited protections, and operating constraints. Comparing approaches requires explaining the risk each one addresses and the questions it leaves open.</w:t>
       </w:r>
     </w:p>
     <w:p>
@@ -5800,7 +5826,7 @@
         <w:pStyle w:val="BodyText"/>
       </w:pPr>
       <w:r>
-        <w:t xml:space="preserve">Likewise, the number of tools is a weak summary of the security process. Several tools can depend on the same rules or execution authority. A framework can improve consistency of questions without answering them automatically. A monitoring platform can collect data without ensuring that a relevant event receives action.</w:t>
+        <w:t xml:space="preserve">The number of installed tools is also an incomplete measure. Tools may repeat the same checks or rely on the same execution environment. A framework can guide a review without automatically satisfying its requirements. Monitoring can collect information without ensuring that a problem is resolved.</w:t>
       </w:r>
     </w:p>
     <w:p>
@@ -5808,7 +5834,7 @@
         <w:pStyle w:val="BodyText"/>
       </w:pPr>
       <w:r>
-        <w:t xml:space="preserve">The defensive lesson across the literature is therefore one of complementarity and explicit assumptions. Early feedback, bounded execution, artifact verification, configuration visibility, and maintained response address different concerns. Their suitability depends on the application, infrastructure, organization, and threats under consideration.</w:t>
+        <w:t xml:space="preserve">The main lesson is that technical controls and team responsibilities need to work together. Early feedback, limited permissions, artifact verification, configuration checks, and ongoing response address different concerns. Their use should reflect the application, infrastructure, organization, and risks involved.</w:t>
       </w:r>
     </w:p>
     <w:bookmarkEnd w:id="65"/>
@@ -5830,13 +5856,13 @@
           <w:b/>
           <w:bCs/>
         </w:rPr>
-        <w:t xml:space="preserve">Selection and breadth:</w:t>
+        <w:t xml:space="preserve">Source selection:</w:t>
       </w:r>
       <w:r>
         <w:t xml:space="preserve"> </w:t>
       </w:r>
       <w:r>
-        <w:t xml:space="preserve">The review uses a purposive, access-constrained source set. The academic sources share a coauthor, and independent viewpoints are underrepresented. The synthesis cannot establish field-wide prevalence or exhaustive novelty claims.</w:t>
+        <w:t xml:space="preserve">The review uses a selected set of accessible sources rather than a complete systematic search. The five academic studies share a coauthor, so independent perspectives are limited. The discussion cannot represent the whole field.</w:t>
       </w:r>
     </w:p>
     <w:p>
@@ -5854,7 +5880,7 @@
         <w:t xml:space="preserve"> </w:t>
       </w:r>
       <w:r>
-        <w:t xml:space="preserve">Author-hosted manuscripts may differ from final publications, and project specifications evolve. Some numerical inconsistencies limit the conclusions that can be repeated from the consulted versions. The discussion therefore favors supported qualitative interpretations and names the reviewed specification versions.</w:t>
+        <w:t xml:space="preserve">The available manuscripts may differ from final publications, and standards change over time. Some numerical differences in the source versions require caution. This paper therefore emphasizes consistent qualitative findings and identifies the framework versions reviewed.</w:t>
       </w:r>
     </w:p>
     <w:p>
@@ -5866,13 +5892,13 @@
           <w:b/>
           <w:bCs/>
         </w:rPr>
-        <w:t xml:space="preserve">Different forms of evidence:</w:t>
+        <w:t xml:space="preserve">Different evidence types:</w:t>
       </w:r>
       <w:r>
         <w:t xml:space="preserve"> </w:t>
       </w:r>
       <w:r>
-        <w:t xml:space="preserve">Practitioner reports, mined artifacts, standards, and incidents have different strengths and limitations. Their findings are compared narratively rather than pooled into a single performance estimate.</w:t>
+        <w:t xml:space="preserve">Surveys, software artifacts, standards, and incidents have different strengths and limitations. Their findings are discussed together, but are not combined into one performance estimate.</w:t>
       </w:r>
     </w:p>
     <w:p>
@@ -5884,13 +5910,13 @@
           <w:b/>
           <w:bCs/>
         </w:rPr>
-        <w:t xml:space="preserve">Incident interpretation:</w:t>
+        <w:t xml:space="preserve">Incident information:</w:t>
       </w:r>
       <w:r>
         <w:t xml:space="preserve"> </w:t>
       </w:r>
       <w:r>
-        <w:t xml:space="preserve">The SolarWinds and Codecov discussion relies on summaries in the reviewed guidance. Incidents illustrate mechanisms but do not demonstrate how frequently those mechanisms occur or prove that a specific combination of controls would have prevented the entire attack.</w:t>
+        <w:t xml:space="preserve">The SolarWinds and Codecov sections rely on summaries in the reviewed guidance. These examples help explain possible failures, but do not show their overall frequency or prove that one set of controls would have prevented an entire attack.</w:t>
       </w:r>
     </w:p>
     <w:p>
@@ -5902,13 +5928,13 @@
           <w:b/>
           <w:bCs/>
         </w:rPr>
-        <w:t xml:space="preserve">Generalizability:</w:t>
+        <w:t xml:space="preserve">Application to other settings:</w:t>
       </w:r>
       <w:r>
         <w:t xml:space="preserve"> </w:t>
       </w:r>
       <w:r>
-        <w:t xml:space="preserve">Technology, organizational context, and attacker capability vary. The review does not establish that an approach is universally sufficient, nor does it present an implementation with independently validated benefits.</w:t>
+        <w:t xml:space="preserve">Organizations use different technologies and face different threats. The review does not establish that any approach provides complete protection in every setting.</w:t>
       </w:r>
     </w:p>
     <w:bookmarkEnd w:id="66"/>
@@ -5927,7 +5953,7 @@
         <w:pStyle w:val="FirstParagraph"/>
       </w:pPr>
       <w:r>
-        <w:t xml:space="preserve">Existing DevSecOps research addresses a broad set of organizational and technical concerns across CI/CD. The reviewed studies contribute knowledge about collaboration, infrastructure weaknesses, execution defects, and configuration detection. Security frameworks provide complementary ways to organize application requirements, delivery threats, dependency governance, and artifact verification.</w:t>
+        <w:t xml:space="preserve">This paper reviewed selected studies and guidance on security integration in CI/CD pipelines. The academic studies describe teamwork, infrastructure weaknesses, automation defects, and configuration-tool limitations. The frameworks provide different ways to examine application requirements, pipeline risks, dependencies, and artifact verification.</w:t>
       </w:r>
     </w:p>
     <w:p>
@@ -5935,7 +5961,7 @@
         <w:pStyle w:val="BodyText"/>
       </w:pPr>
       <w:r>
-        <w:t xml:space="preserve">The comparison shows why these contributions should be interpreted within their scope. Adoption does not prove effectiveness; a warning does not establish an exploit; intended configuration does not guarantee actual behavior; and authenticated production does not prove benign content. Historical incidents reinforce the need to consider the delivery process as well as application code.</w:t>
+        <w:t xml:space="preserve">The comparison suggests that each approach should be understood within its scope. A reported practice does not prove effective protection, and a warning does not prove that exploitation has occurred. Similarly, an approved configuration may differ from the live environment, and a valid signature does not guarantee harmless software.</w:t>
       </w:r>
     </w:p>
     <w:p>
@@ -5943,7 +5969,7 @@
         <w:pStyle w:val="BodyText"/>
       </w:pPr>
       <w:r>
-        <w:t xml:space="preserve">The figures and tables organize these relationships and the remaining questions in existing work. The principal review finding is that DevSecOps depends on complementary practices, contextual interpretation, and continued maintenance across the lifecycle. Broader, more diverse literature coverage remains necessary for a comprehensive systematic synthesis. This paper contributes a focused critical review, not new experimental evidence or a proposed technical system.</w:t>
+        <w:t xml:space="preserve">The figures and tables summarize these relationships and the questions that remain open. The main conclusion is that DevSecOps requires several supporting practices, clear responsibilities, and continued maintenance across the delivery lifecycle. Broader literature coverage would strengthen the review and include more independent perspectives. The paper provides a focused discussion of existing work, without claiming new experimental results or a new technical solution.</w:t>
       </w:r>
     </w:p>
     <w:bookmarkEnd w:id="68"/>

</xml_diff>

<commit_message>
Add four explanatory diagrams to the DevSecOps literature review
</commit_message>
<xml_diff>
--- a/DevSecOps_Review.docx
+++ b/DevSecOps_Review.docx
@@ -1948,7 +1948,7 @@
     </w:p>
     <w:bookmarkEnd w:id="38"/>
     <w:bookmarkEnd w:id="39"/>
-    <w:bookmarkStart w:id="48" w:name="Xb4b759e58d5a6387bcd89372a95ab1dc17a6ae5"/>
+    <w:bookmarkStart w:id="57" w:name="Xb4b759e58d5a6387bcd89372a95ab1dc17a6ae5"/>
     <w:p>
       <w:pPr>
         <w:pStyle w:val="Heading2"/>
@@ -2810,7 +2810,7 @@
       </w:r>
     </w:p>
     <w:bookmarkEnd w:id="44"/>
-    <w:bookmarkStart w:id="45" w:name="X590bd841ffd084547f7407df94b329ffddc0a69"/>
+    <w:bookmarkStart w:id="48" w:name="X590bd841ffd084547f7407df94b329ffddc0a69"/>
     <w:p>
       <w:pPr>
         <w:pStyle w:val="Heading3"/>
@@ -2843,30 +2843,74 @@
         <w:t xml:space="preserve">These differences explain why guidance often recommends combining approaches. However, adding more tools does not always add independent coverage. Similar rules may produce duplicate findings or miss the same weakness. A useful comparison considers what each approach can observe and what information it lacks.</w:t>
       </w:r>
     </w:p>
-    <w:bookmarkEnd w:id="45"/>
-    <w:bookmarkStart w:id="46" w:name="identity-and-secrets-management"/>
     <w:p>
       <w:pPr>
-        <w:pStyle w:val="Heading3"/>
-      </w:pPr>
-      <w:r>
-        <w:t xml:space="preserve">4.4 Identity and secrets management</w:t>
+        <w:pStyle w:val="BodyText"/>
+      </w:pPr>
+      <w:r>
+        <w:t xml:space="preserve">Figure 4 compares the main inputs and limits of these approaches. It shows why a source-code check, a dependency check, a running-application test, and an infrastructure check should be interpreted differently. The diagram compares general methods, rather than ranking particular products.</w:t>
       </w:r>
     </w:p>
     <w:p>
       <w:pPr>
-        <w:pStyle w:val="FirstParagraph"/>
-      </w:pPr>
-      <w:r>
-        <w:t xml:space="preserve">Secrets can be exposed in more places than the source repository. They may appear in logs, container layers, caches, temporary files, or build environments. A successful source scan therefore does not prove that every credential is protected.</w:t>
+        <w:pStyle w:val="BodyText"/>
+        <w:keepNext/>
+        <w:keepLines/>
+      </w:pPr>
+      <w:r>
+        <w:rPr>
+          <w:b/>
+          <w:bCs/>
+        </w:rPr>
+        <w:t xml:space="preserve">Figure 4. Comparison of what SAST, SCA, DAST, and IaC checks examine.</w:t>
       </w:r>
     </w:p>
     <w:p>
       <w:pPr>
         <w:pStyle w:val="BodyText"/>
-      </w:pPr>
-      <w:r>
-        <w:t xml:space="preserve">Identity and access management (IAM) helps control what a pipeline or service is allowed to do. Existing guidance recommends limiting access according to the task being performed. Code from an unreviewed contribution should not automatically receive the permissions used to publish a release or change production infrastructure.</w:t>
+        <w:keepLines/>
+      </w:pPr>
+      <w:r>
+        <w:drawing>
+          <wp:inline>
+            <wp:extent cx="5943600" cy="4457700"/>
+            <wp:effectExtent b="0" l="0" r="0" t="0"/>
+            <wp:docPr descr="Comparison of source-code analysis, dependency analysis, running-application tests, and infrastructure configuration checks, including their main limitations." title="" id="46" name="Picture"/>
+            <a:graphic>
+              <a:graphicData uri="http://schemas.openxmlformats.org/drawingml/2006/picture">
+                <pic:pic>
+                  <pic:nvPicPr>
+                    <pic:cNvPr descr="figures/figure_04_security_check_comparison.png" id="47" name="Picture"/>
+                    <pic:cNvPicPr>
+                      <a:picLocks noChangeArrowheads="1" noChangeAspect="1"/>
+                    </pic:cNvPicPr>
+                  </pic:nvPicPr>
+                  <pic:blipFill>
+                    <a:blip r:embed="rId45"/>
+                    <a:stretch>
+                      <a:fillRect/>
+                    </a:stretch>
+                  </pic:blipFill>
+                  <pic:spPr bwMode="auto">
+                    <a:xfrm>
+                      <a:off x="0" y="0"/>
+                      <a:ext cx="5943600" cy="4457700"/>
+                    </a:xfrm>
+                    <a:prstGeom prst="rect">
+                      <a:avLst/>
+                    </a:prstGeom>
+                    <a:noFill/>
+                    <a:ln w="9525">
+                      <a:noFill/>
+                      <a:headEnd/>
+                      <a:tailEnd/>
+                    </a:ln>
+                  </pic:spPr>
+                </pic:pic>
+              </a:graphicData>
+            </a:graphic>
+          </wp:inline>
+        </w:drawing>
       </w:r>
     </w:p>
     <w:p>
@@ -2874,17 +2918,17 @@
         <w:pStyle w:val="BodyText"/>
       </w:pPr>
       <w:r>
-        <w:t xml:space="preserve">Temporary credentials can reduce how long an exposed credential remains useful. Their permissions still matter. A temporary administrator token can cause harm while it is valid, and broad identity rules may allow another token to be issued. Least privilege means examining the access actually granted, rather than relying on a role’s name or a token’s short lifetime.</w:t>
+        <w:t xml:space="preserve">The examples describe common uses. Actual coverage depends on the tool, its configuration, and the information available to it.</w:t>
       </w:r>
     </w:p>
-    <w:bookmarkEnd w:id="46"/>
-    <w:bookmarkStart w:id="47" w:name="Xdd8a236add4402b004db85c6ae36a4d2acb01ca"/>
+    <w:bookmarkEnd w:id="48"/>
+    <w:bookmarkStart w:id="52" w:name="identity-and-secrets-management"/>
     <w:p>
       <w:pPr>
         <w:pStyle w:val="Heading3"/>
       </w:pPr>
       <w:r>
-        <w:t xml:space="preserve">4.5 Signatures, provenance, and component inventories</w:t>
+        <w:t xml:space="preserve">4.4 Identity and secrets management</w:t>
       </w:r>
     </w:p>
     <w:p>
@@ -2892,7 +2936,7 @@
         <w:pStyle w:val="FirstParagraph"/>
       </w:pPr>
       <w:r>
-        <w:t xml:space="preserve">Signatures, provenance, and software inventories describe different properties. A digital signature can authenticate a statement or identify who signed an artifact. Provenance records information about how software was produced. An inventory lists its components. These records are most useful when they refer to the exact artifact being released or deployed.</w:t>
+        <w:t xml:space="preserve">Secrets can be exposed in more places than the source repository. They may appear in logs, container layers, caches, temporary files, or build environments. A successful source scan therefore does not prove that every credential is protected.</w:t>
       </w:r>
     </w:p>
     <w:p>
@@ -2900,7 +2944,7 @@
         <w:pStyle w:val="BodyText"/>
       </w:pPr>
       <w:r>
-        <w:t xml:space="preserve">An immutable digest, a hash used to identify particular file contents, can help establish that different stages handled the same bytes. A release name or changeable tag may not provide the same assurance. Verification also requires checking the signer, the expected producer, and the artifact to which a statement applies. Collecting a signed record without checking these details leaves important questions unanswered.</w:t>
+        <w:t xml:space="preserve">Identity and access management (IAM) helps control what a pipeline or service is allowed to do. Existing guidance recommends limiting access according to the task being performed. Code from an unreviewed contribution should not automatically receive the permissions used to publish a release or change production infrastructure.</w:t>
       </w:r>
     </w:p>
     <w:p>
@@ -2908,51 +2952,77 @@
         <w:pStyle w:val="BodyText"/>
       </w:pPr>
       <w:r>
-        <w:t xml:space="preserve">A software bill of materials (SBOM) can help teams locate affected releases when a new vulnerability is disclosed. It needs to be connected to deployment records and kept useful as information changes. An SBOM does not install a patch or prove that an application cannot be exploited. It supports response by helping teams understand what they use.</w:t>
-      </w:r>
-    </w:p>
-    <w:bookmarkEnd w:id="47"/>
-    <w:bookmarkEnd w:id="48"/>
-    <w:bookmarkStart w:id="53" w:name="lessons-from-past-security-incidents"/>
-    <w:p>
-      <w:pPr>
-        <w:pStyle w:val="Heading2"/>
-      </w:pPr>
-      <w:r>
-        <w:t xml:space="preserve">5. Lessons from Past Security Incidents</w:t>
+        <w:t xml:space="preserve">Temporary credentials can reduce how long an exposed credential remains useful. Their permissions still matter. A temporary administrator token can cause harm while it is valid, and broad identity rules may allow another token to be issued. Least privilege means examining the access actually granted, rather than relying on a role’s name or a token’s short lifetime.</w:t>
       </w:r>
     </w:p>
     <w:p>
       <w:pPr>
-        <w:pStyle w:val="FirstParagraph"/>
-      </w:pPr>
-      <w:r>
-        <w:t xml:space="preserve">The incidents in this section illustrate different weaknesses in software delivery. SolarWinds and Codecov are discussed using summaries in the reviewed guidance; their primary incident reports were not independently retrieved for this review. The Log4Shell discussion uses CISA’s entry for CVE-2021-44228. These examples help explain security concerns, but they do not establish how frequently each type of failure occurs.</w:t>
-      </w:r>
-    </w:p>
-    <w:bookmarkStart w:id="49" w:name="Xfc29b9d5f9d72f9ba6c546934ea8bc1b0a1b075"/>
-    <w:p>
-      <w:pPr>
-        <w:pStyle w:val="Heading3"/>
-      </w:pPr>
-      <w:r>
-        <w:t xml:space="preserve">5.1 SolarWinds: trust in the production process</w:t>
+        <w:pStyle w:val="BodyText"/>
+      </w:pPr>
+      <w:r>
+        <w:t xml:space="preserve">Figure 5 links common locations of credential exposure with established safeguards. A credential’s location affects how it can be exposed, while its permissions affect which resources may be reached. The controls shown address different parts of this problem; none guarantees that credentials can never be misused.</w:t>
       </w:r>
     </w:p>
     <w:p>
       <w:pPr>
-        <w:pStyle w:val="FirstParagraph"/>
-      </w:pPr>
-      <w:r>
-        <w:t xml:space="preserve">The SolarWinds incident shows why the software production process needs protection. Receiving software through a recognized supplier’s release channel does not, on its own, prove that the software is harmless. Trust in a supplier, protection of the build environment, and verification of the final artifact are related but separate issues.</w:t>
+        <w:pStyle w:val="BodyText"/>
+        <w:keepNext/>
+        <w:keepLines/>
+      </w:pPr>
+      <w:r>
+        <w:rPr>
+          <w:b/>
+          <w:bCs/>
+        </w:rPr>
+        <w:t xml:space="preserve">Figure 5. Credential exposure risks and established safeguards in CI/CD.</w:t>
       </w:r>
     </w:p>
     <w:p>
       <w:pPr>
         <w:pStyle w:val="BodyText"/>
-      </w:pPr>
-      <w:r>
-        <w:t xml:space="preserve">Existing approaches include protecting build systems, restricting changes to production scripts, checking provenance, and separating build permissions from release approval. Independent reproduction of a build can provide further information where it is practical. Even so, a malicious source change could be reproduced and signed correctly.</w:t>
+        <w:keepLines/>
+      </w:pPr>
+      <w:r>
+        <w:drawing>
+          <wp:inline>
+            <wp:extent cx="5943600" cy="4292600"/>
+            <wp:effectExtent b="0" l="0" r="0" t="0"/>
+            <wp:docPr descr="Common exposure locations include source files, job environments, logs, caches, and image layers; safeguards cover storage, scoped use, and response to exposure." title="" id="50" name="Picture"/>
+            <a:graphic>
+              <a:graphicData uri="http://schemas.openxmlformats.org/drawingml/2006/picture">
+                <pic:pic>
+                  <pic:nvPicPr>
+                    <pic:cNvPr descr="figures/figure_05_credential_risks.png" id="51" name="Picture"/>
+                    <pic:cNvPicPr>
+                      <a:picLocks noChangeArrowheads="1" noChangeAspect="1"/>
+                    </pic:cNvPicPr>
+                  </pic:nvPicPr>
+                  <pic:blipFill>
+                    <a:blip r:embed="rId49"/>
+                    <a:stretch>
+                      <a:fillRect/>
+                    </a:stretch>
+                  </pic:blipFill>
+                  <pic:spPr bwMode="auto">
+                    <a:xfrm>
+                      <a:off x="0" y="0"/>
+                      <a:ext cx="5943600" cy="4292600"/>
+                    </a:xfrm>
+                    <a:prstGeom prst="rect">
+                      <a:avLst/>
+                    </a:prstGeom>
+                    <a:noFill/>
+                    <a:ln w="9525">
+                      <a:noFill/>
+                      <a:headEnd/>
+                      <a:tailEnd/>
+                    </a:ln>
+                  </pic:spPr>
+                </pic:pic>
+              </a:graphicData>
+            </a:graphic>
+          </wp:inline>
+        </w:drawing>
       </w:r>
     </w:p>
     <w:p>
@@ -2960,17 +3030,17 @@
         <w:pStyle w:val="BodyText"/>
       </w:pPr>
       <w:r>
-        <w:t xml:space="preserve">The main lesson is that supply-chain controls address particular risks under particular assumptions. A valid signature is useful information, but it cannot answer every question about the software’s behavior or the trustworthiness of its production.</w:t>
+        <w:t xml:space="preserve">The arrows show possible relationships, not an inevitable attack sequence. Temporary credentials can limit reuse time, but narrow permissions and an effective response are still important.</w:t>
       </w:r>
     </w:p>
-    <w:bookmarkEnd w:id="49"/>
-    <w:bookmarkStart w:id="50" w:name="codecov-access-given-to-build-helpers"/>
+    <w:bookmarkEnd w:id="52"/>
+    <w:bookmarkStart w:id="56" w:name="Xdd8a236add4402b004db85c6ae36a4d2acb01ca"/>
     <w:p>
       <w:pPr>
         <w:pStyle w:val="Heading3"/>
       </w:pPr>
       <w:r>
-        <w:t xml:space="preserve">5.2 Codecov: access given to build helpers</w:t>
+        <w:t xml:space="preserve">4.5 Signatures, provenance, and component inventories</w:t>
       </w:r>
     </w:p>
     <w:p>
@@ -2978,7 +3048,7 @@
         <w:pStyle w:val="FirstParagraph"/>
       </w:pPr>
       <w:r>
-        <w:t xml:space="preserve">The Codecov incident illustrates the risk of giving externally supplied helper code access to sensitive build information. A helper may perform a small task while still being able to read credentials available to the whole job. That access can create consequences beyond the helper’s intended purpose.</w:t>
+        <w:t xml:space="preserve">Signatures, provenance, and software inventories describe different properties. A digital signature can authenticate a statement or identify who signed an artifact. Provenance records information about how software was produced. An inventory lists its components. These records are most useful when they refer to the exact artifact being released or deployed.</w:t>
       </w:r>
     </w:p>
     <w:p>
@@ -2986,7 +3056,7 @@
         <w:pStyle w:val="BodyText"/>
       </w:pPr>
       <w:r>
-        <w:t xml:space="preserve">Guidance addresses this risk through controlled inputs, verification of downloaded content, separate execution environments, limited credentials, and network restrictions. Fixing a dependency to a particular version can reduce unexpected changes. Checking it against a trusted integrity value can help detect substitution. Neither measure proves that the selected version is harmless.</w:t>
+        <w:t xml:space="preserve">An immutable digest, a hash used to identify particular file contents, can help establish that different stages handled the same bytes. A release name or changeable tag may not provide the same assurance. Verification also requires checking the signer, the expected producer, and the artifact to which a statement applies. Collecting a signed record without checking these details leaves important questions unanswered.</w:t>
       </w:r>
     </w:p>
     <w:p>
@@ -2994,11 +3064,175 @@
         <w:pStyle w:val="BodyText"/>
       </w:pPr>
       <w:r>
+        <w:t xml:space="preserve">A software bill of materials (SBOM) can help teams locate affected releases when a new vulnerability is disclosed. It needs to be connected to deployment records and kept useful as information changes. An SBOM does not install a patch or prove that an application cannot be exploited. It supports response by helping teams understand what they use.</w:t>
+      </w:r>
+    </w:p>
+    <w:p>
+      <w:pPr>
+        <w:pStyle w:val="BodyText"/>
+      </w:pPr>
+      <w:r>
+        <w:t xml:space="preserve">Figure 6 separates the questions answered by signatures, provenance, and an SBOM. These records can support one another, but they describe different properties. Their usefulness depends on connecting them to the correct artifact and checking the information before relying on it.</w:t>
+      </w:r>
+    </w:p>
+    <w:p>
+      <w:pPr>
+        <w:pStyle w:val="BodyText"/>
+        <w:keepNext/>
+        <w:keepLines/>
+      </w:pPr>
+      <w:r>
+        <w:rPr>
+          <w:b/>
+          <w:bCs/>
+        </w:rPr>
+        <w:t xml:space="preserve">Figure 6. Different roles of signatures, provenance, and an SBOM.</w:t>
+      </w:r>
+    </w:p>
+    <w:p>
+      <w:pPr>
+        <w:pStyle w:val="BodyText"/>
+        <w:keepLines/>
+      </w:pPr>
+      <w:r>
+        <w:drawing>
+          <wp:inline>
+            <wp:extent cx="5943600" cy="4292600"/>
+            <wp:effectExtent b="0" l="0" r="0" t="0"/>
+            <wp:docPr descr="Signatures concern signer identity and integrity, provenance describes production, and an SBOM lists components; each leaves different questions unanswered." title="" id="54" name="Picture"/>
+            <a:graphic>
+              <a:graphicData uri="http://schemas.openxmlformats.org/drawingml/2006/picture">
+                <pic:pic>
+                  <pic:nvPicPr>
+                    <pic:cNvPr descr="figures/figure_06_supply_chain_records.png" id="55" name="Picture"/>
+                    <pic:cNvPicPr>
+                      <a:picLocks noChangeArrowheads="1" noChangeAspect="1"/>
+                    </pic:cNvPicPr>
+                  </pic:nvPicPr>
+                  <pic:blipFill>
+                    <a:blip r:embed="rId53"/>
+                    <a:stretch>
+                      <a:fillRect/>
+                    </a:stretch>
+                  </pic:blipFill>
+                  <pic:spPr bwMode="auto">
+                    <a:xfrm>
+                      <a:off x="0" y="0"/>
+                      <a:ext cx="5943600" cy="4292600"/>
+                    </a:xfrm>
+                    <a:prstGeom prst="rect">
+                      <a:avLst/>
+                    </a:prstGeom>
+                    <a:noFill/>
+                    <a:ln w="9525">
+                      <a:noFill/>
+                      <a:headEnd/>
+                      <a:tailEnd/>
+                    </a:ln>
+                  </pic:spPr>
+                </pic:pic>
+              </a:graphicData>
+            </a:graphic>
+          </wp:inline>
+        </w:drawing>
+      </w:r>
+    </w:p>
+    <w:p>
+      <w:pPr>
+        <w:pStyle w:val="BodyText"/>
+      </w:pPr>
+      <w:r>
+        <w:t xml:space="preserve">The comparison summarizes the reviewed approaches. It does not imply that any one record proves complete software security.</w:t>
+      </w:r>
+    </w:p>
+    <w:bookmarkEnd w:id="56"/>
+    <w:bookmarkEnd w:id="57"/>
+    <w:bookmarkStart w:id="62" w:name="lessons-from-past-security-incidents"/>
+    <w:p>
+      <w:pPr>
+        <w:pStyle w:val="Heading2"/>
+      </w:pPr>
+      <w:r>
+        <w:t xml:space="preserve">5. Lessons from Past Security Incidents</w:t>
+      </w:r>
+    </w:p>
+    <w:p>
+      <w:pPr>
+        <w:pStyle w:val="FirstParagraph"/>
+      </w:pPr>
+      <w:r>
+        <w:t xml:space="preserve">The incidents in this section illustrate different weaknesses in software delivery. SolarWinds and Codecov are discussed using summaries in the reviewed guidance; their primary incident reports were not independently retrieved for this review. The Log4Shell discussion uses CISA’s entry for CVE-2021-44228. These examples help explain security concerns, but they do not establish how frequently each type of failure occurs.</w:t>
+      </w:r>
+    </w:p>
+    <w:bookmarkStart w:id="58" w:name="Xfc29b9d5f9d72f9ba6c546934ea8bc1b0a1b075"/>
+    <w:p>
+      <w:pPr>
+        <w:pStyle w:val="Heading3"/>
+      </w:pPr>
+      <w:r>
+        <w:t xml:space="preserve">5.1 SolarWinds: trust in the production process</w:t>
+      </w:r>
+    </w:p>
+    <w:p>
+      <w:pPr>
+        <w:pStyle w:val="FirstParagraph"/>
+      </w:pPr>
+      <w:r>
+        <w:t xml:space="preserve">The SolarWinds incident shows why the software production process needs protection. Receiving software through a recognized supplier’s release channel does not, on its own, prove that the software is harmless. Trust in a supplier, protection of the build environment, and verification of the final artifact are related but separate issues.</w:t>
+      </w:r>
+    </w:p>
+    <w:p>
+      <w:pPr>
+        <w:pStyle w:val="BodyText"/>
+      </w:pPr>
+      <w:r>
+        <w:t xml:space="preserve">Existing approaches include protecting build systems, restricting changes to production scripts, checking provenance, and separating build permissions from release approval. Independent reproduction of a build can provide further information where it is practical. Even so, a malicious source change could be reproduced and signed correctly.</w:t>
+      </w:r>
+    </w:p>
+    <w:p>
+      <w:pPr>
+        <w:pStyle w:val="BodyText"/>
+      </w:pPr>
+      <w:r>
+        <w:t xml:space="preserve">The main lesson is that supply-chain controls address particular risks under particular assumptions. A valid signature is useful information, but it cannot answer every question about the software’s behavior or the trustworthiness of its production.</w:t>
+      </w:r>
+    </w:p>
+    <w:bookmarkEnd w:id="58"/>
+    <w:bookmarkStart w:id="59" w:name="codecov-access-given-to-build-helpers"/>
+    <w:p>
+      <w:pPr>
+        <w:pStyle w:val="Heading3"/>
+      </w:pPr>
+      <w:r>
+        <w:t xml:space="preserve">5.2 Codecov: access given to build helpers</w:t>
+      </w:r>
+    </w:p>
+    <w:p>
+      <w:pPr>
+        <w:pStyle w:val="FirstParagraph"/>
+      </w:pPr>
+      <w:r>
+        <w:t xml:space="preserve">The Codecov incident illustrates the risk of giving externally supplied helper code access to sensitive build information. A helper may perform a small task while still being able to read credentials available to the whole job. That access can create consequences beyond the helper’s intended purpose.</w:t>
+      </w:r>
+    </w:p>
+    <w:p>
+      <w:pPr>
+        <w:pStyle w:val="BodyText"/>
+      </w:pPr>
+      <w:r>
+        <w:t xml:space="preserve">Guidance addresses this risk through controlled inputs, verification of downloaded content, separate execution environments, limited credentials, and network restrictions. Fixing a dependency to a particular version can reduce unexpected changes. Checking it against a trusted integrity value can help detect substitution. Neither measure proves that the selected version is harmless.</w:t>
+      </w:r>
+    </w:p>
+    <w:p>
+      <w:pPr>
+        <w:pStyle w:val="BodyText"/>
+      </w:pPr>
+      <w:r>
         <w:t xml:space="preserve">This example connects dependency security with access control. Teams need to consider both where helper code comes from and what it can do when executed. Temporary credentials reduce the time available for misuse, but do not remove the need to limit permissions.</w:t>
       </w:r>
     </w:p>
-    <w:bookmarkEnd w:id="50"/>
-    <w:bookmarkStart w:id="51" w:name="X5666885f7f1f9bd14f6bdf12bcd1f6dde661237"/>
+    <w:bookmarkEnd w:id="59"/>
+    <w:bookmarkStart w:id="60" w:name="X5666885f7f1f9bd14f6bdf12bcd1f6dde661237"/>
     <w:p>
       <w:pPr>
         <w:pStyle w:val="Heading3"/>
@@ -3406,8 +3640,8 @@
         </w:tc>
       </w:tr>
     </w:tbl>
-    <w:bookmarkEnd w:id="51"/>
-    <w:bookmarkStart w:id="52" w:name="weak-practices-and-better-alternatives"/>
+    <w:bookmarkEnd w:id="60"/>
+    <w:bookmarkStart w:id="61" w:name="weak-practices-and-better-alternatives"/>
     <w:p>
       <w:pPr>
         <w:pStyle w:val="Heading3"/>
@@ -4033,9 +4267,9 @@
         </w:tc>
       </w:tr>
     </w:tbl>
-    <w:bookmarkEnd w:id="52"/>
-    <w:bookmarkEnd w:id="53"/>
-    <w:bookmarkStart w:id="63" w:name="common-challenges-and-research-gaps"/>
+    <w:bookmarkEnd w:id="61"/>
+    <w:bookmarkEnd w:id="62"/>
+    <w:bookmarkStart w:id="75" w:name="common-challenges-and-research-gaps"/>
     <w:p>
       <w:pPr>
         <w:pStyle w:val="Heading2"/>
@@ -4044,7 +4278,7 @@
         <w:t xml:space="preserve">6. Common Challenges and Research Gaps</w:t>
       </w:r>
     </w:p>
-    <w:bookmarkStart w:id="54" w:name="detection-coverage-and-context"/>
+    <w:bookmarkStart w:id="63" w:name="detection-coverage-and-context"/>
     <w:p>
       <w:pPr>
         <w:pStyle w:val="Heading3"/>
@@ -4069,8 +4303,8 @@
         <w:t xml:space="preserve">An important question is how tools can communicate the assumptions behind a finding. A warning that identifies the affected resource and explains its possible consequence can be easier to investigate than a general label. This connects the accuracy of detection with the practical work of understanding and fixing a problem.</w:t>
       </w:r>
     </w:p>
-    <w:bookmarkEnd w:id="54"/>
-    <w:bookmarkStart w:id="55" w:name="X268bad6dea0e3f114a981f81130319d0f2c698d"/>
+    <w:bookmarkEnd w:id="63"/>
+    <w:bookmarkStart w:id="64" w:name="X268bad6dea0e3f114a981f81130319d0f2c698d"/>
     <w:p>
       <w:pPr>
         <w:pStyle w:val="Heading3"/>
@@ -4103,8 +4337,8 @@
         <w:t xml:space="preserve">The remaining challenge is keeping these views connected, especially when several repositories, templates, and service providers are involved. This is a wider issue than checking one configuration file.</w:t>
       </w:r>
     </w:p>
-    <w:bookmarkEnd w:id="55"/>
-    <w:bookmarkStart w:id="56" w:name="understanding-security-records-and-trust"/>
+    <w:bookmarkEnd w:id="64"/>
+    <w:bookmarkStart w:id="65" w:name="understanding-security-records-and-trust"/>
     <w:p>
       <w:pPr>
         <w:pStyle w:val="Heading3"/>
@@ -4137,8 +4371,8 @@
         <w:t xml:space="preserve">Build information, application tests, and observations from a running system answer different questions. Combining them requires careful interpretation. A single score can hide differences in coverage and trust if those details are not retained.</w:t>
       </w:r>
     </w:p>
-    <w:bookmarkEnd w:id="56"/>
-    <w:bookmarkStart w:id="57" w:name="tool-maintenance-and-developer-adoption"/>
+    <w:bookmarkEnd w:id="65"/>
+    <w:bookmarkStart w:id="66" w:name="tool-maintenance-and-developer-adoption"/>
     <w:p>
       <w:pPr>
         <w:pStyle w:val="Heading3"/>
@@ -4171,8 +4405,8 @@
         <w:t xml:space="preserve">The research gap concerns sustained use as well as initial adoption. More accounts from different organizations would help explain how teams maintain these practices over time.</w:t>
       </w:r>
     </w:p>
-    <w:bookmarkEnd w:id="57"/>
-    <w:bookmarkStart w:id="58" w:name="monitoring-and-incident-response"/>
+    <w:bookmarkEnd w:id="66"/>
+    <w:bookmarkStart w:id="70" w:name="monitoring-and-incident-response"/>
     <w:p>
       <w:pPr>
         <w:pStyle w:val="Heading3"/>
@@ -4195,6 +4429,84 @@
       </w:pPr>
       <w:r>
         <w:t xml:space="preserve">Teams also need to review software after deployment. A newly disclosed vulnerability or a changed configuration can affect a release that previously passed its checks. Continuous security involves responding to this changing information rather than assuming that a successful build check remains sufficient indefinitely.</w:t>
+      </w:r>
+    </w:p>
+    <w:p>
+      <w:pPr>
+        <w:pStyle w:val="BodyText"/>
+      </w:pPr>
+      <w:r>
+        <w:t xml:space="preserve">Figure 7 groups the reviewed practices by three functions: prevention, detection, and response. This distinction helps explain why finding a weakness is different from limiting the opportunity for misuse or taking action after a problem is identified. The functions overlap, and some controls can support more than one of them.</w:t>
+      </w:r>
+    </w:p>
+    <w:p>
+      <w:pPr>
+        <w:pStyle w:val="BodyText"/>
+        <w:keepNext/>
+        <w:keepLines/>
+      </w:pPr>
+      <w:r>
+        <w:rPr>
+          <w:b/>
+          <w:bCs/>
+        </w:rPr>
+        <w:t xml:space="preserve">Figure 7. Prevention, detection, and response in the reviewed security practices.</w:t>
+      </w:r>
+    </w:p>
+    <w:p>
+      <w:pPr>
+        <w:pStyle w:val="BodyText"/>
+        <w:keepLines/>
+      </w:pPr>
+      <w:r>
+        <w:drawing>
+          <wp:inline>
+            <wp:extent cx="5943600" cy="4292600"/>
+            <wp:effectExtent b="0" l="0" r="0" t="0"/>
+            <wp:docPr descr="Three complementary functions: prevention limits opportunities for misuse, detection identifies weaknesses or changes, and response assigns action to identified problems." title="" id="68" name="Picture"/>
+            <a:graphic>
+              <a:graphicData uri="http://schemas.openxmlformats.org/drawingml/2006/picture">
+                <pic:pic>
+                  <pic:nvPicPr>
+                    <pic:cNvPr descr="figures/figure_07_defensive_functions.png" id="69" name="Picture"/>
+                    <pic:cNvPicPr>
+                      <a:picLocks noChangeArrowheads="1" noChangeAspect="1"/>
+                    </pic:cNvPicPr>
+                  </pic:nvPicPr>
+                  <pic:blipFill>
+                    <a:blip r:embed="rId67"/>
+                    <a:stretch>
+                      <a:fillRect/>
+                    </a:stretch>
+                  </pic:blipFill>
+                  <pic:spPr bwMode="auto">
+                    <a:xfrm>
+                      <a:off x="0" y="0"/>
+                      <a:ext cx="5943600" cy="4292600"/>
+                    </a:xfrm>
+                    <a:prstGeom prst="rect">
+                      <a:avLst/>
+                    </a:prstGeom>
+                    <a:noFill/>
+                    <a:ln w="9525">
+                      <a:noFill/>
+                      <a:headEnd/>
+                      <a:tailEnd/>
+                    </a:ln>
+                  </pic:spPr>
+                </pic:pic>
+              </a:graphicData>
+            </a:graphic>
+          </wp:inline>
+        </w:drawing>
+      </w:r>
+    </w:p>
+    <w:p>
+      <w:pPr>
+        <w:pStyle w:val="BodyText"/>
+      </w:pPr>
+      <w:r>
+        <w:t xml:space="preserve">This is an explanatory grouping of existing practices, not a new security framework or a measured comparison of effectiveness.</w:t>
       </w:r>
     </w:p>
     <w:p>
@@ -4904,8 +5216,8 @@
         </w:tc>
       </w:tr>
     </w:tbl>
-    <w:bookmarkEnd w:id="58"/>
-    <w:bookmarkStart w:id="62" w:name="summary-of-open-questions"/>
+    <w:bookmarkEnd w:id="70"/>
+    <w:bookmarkStart w:id="74" w:name="summary-of-open-questions"/>
     <w:p>
       <w:pPr>
         <w:pStyle w:val="Heading3"/>
@@ -4919,7 +5231,7 @@
         <w:pStyle w:val="FirstParagraph"/>
       </w:pPr>
       <w:r>
-        <w:t xml:space="preserve">Figure 4 and Table 7 bring together the main questions identified in the selected material. These are areas that need further attention within this review. They should not be read as proof that no other researchers have studied them.</w:t>
+        <w:t xml:space="preserve">Figure 8 and Table 7 bring together the main questions identified in the selected material. These are areas that need further attention within this review. They should not be read as proof that no other researchers have studied them.</w:t>
       </w:r>
     </w:p>
     <w:p>
@@ -4933,7 +5245,7 @@
           <w:b/>
           <w:bCs/>
         </w:rPr>
-        <w:t xml:space="preserve">Figure 4. Open questions identified through the literature comparison.</w:t>
+        <w:t xml:space="preserve">Figure 8. Open questions identified through the literature comparison.</w:t>
       </w:r>
     </w:p>
     <w:p>
@@ -4946,18 +5258,18 @@
           <wp:inline>
             <wp:extent cx="5943600" cy="4044950"/>
             <wp:effectExtent b="0" l="0" r="0" t="0"/>
-            <wp:docPr descr="Questions about long-term security outcomes, detection coverage, trust, response, and tool maintenance." title="" id="60" name="Picture"/>
+            <wp:docPr descr="Questions about long-term security outcomes, detection coverage, trust, response, and tool maintenance." title="" id="72" name="Picture"/>
             <a:graphic>
               <a:graphicData uri="http://schemas.openxmlformats.org/drawingml/2006/picture">
                 <pic:pic>
                   <pic:nvPicPr>
-                    <pic:cNvPr descr="figures/figure_04_literature_gaps.png" id="61" name="Picture"/>
+                    <pic:cNvPr descr="figures/figure_08_literature_gaps.png" id="73" name="Picture"/>
                     <pic:cNvPicPr>
                       <a:picLocks noChangeArrowheads="1" noChangeAspect="1"/>
                     </pic:cNvPicPr>
                   </pic:nvPicPr>
                   <pic:blipFill>
-                    <a:blip r:embed="rId59"/>
+                    <a:blip r:embed="rId71"/>
                     <a:stretch>
                       <a:fillRect/>
                     </a:stretch>
@@ -5699,9 +6011,9 @@
         </w:tc>
       </w:tr>
     </w:tbl>
-    <w:bookmarkEnd w:id="62"/>
-    <w:bookmarkEnd w:id="63"/>
-    <w:bookmarkStart w:id="67" w:name="discussion-and-limitations"/>
+    <w:bookmarkEnd w:id="74"/>
+    <w:bookmarkEnd w:id="75"/>
+    <w:bookmarkStart w:id="79" w:name="discussion-and-limitations"/>
     <w:p>
       <w:pPr>
         <w:pStyle w:val="Heading2"/>
@@ -5710,7 +6022,7 @@
         <w:t xml:space="preserve">7. Discussion and Limitations</w:t>
       </w:r>
     </w:p>
-    <w:bookmarkStart w:id="64" w:name="answers-to-the-research-questions"/>
+    <w:bookmarkStart w:id="76" w:name="answers-to-the-research-questions"/>
     <w:p>
       <w:pPr>
         <w:pStyle w:val="Heading3"/>
@@ -5803,8 +6115,8 @@
         <w:t xml:space="preserve">, the main remaining issues are detection context, infrastructure behavior, trust in security records, effective permissions, maintenance effort, and response. These questions come from comparing the selected material. A wider search may identify additional work or different conclusions.</w:t>
       </w:r>
     </w:p>
-    <w:bookmarkEnd w:id="64"/>
-    <w:bookmarkStart w:id="65" w:name="what-the-comparison-suggests"/>
+    <w:bookmarkEnd w:id="76"/>
+    <w:bookmarkStart w:id="77" w:name="what-the-comparison-suggests"/>
     <w:p>
       <w:pPr>
         <w:pStyle w:val="Heading3"/>
@@ -5837,8 +6149,8 @@
         <w:t xml:space="preserve">The main lesson is that technical controls and team responsibilities need to work together. Early feedback, limited permissions, artifact verification, configuration checks, and ongoing response address different concerns. Their use should reflect the application, infrastructure, organization, and risks involved.</w:t>
       </w:r>
     </w:p>
-    <w:bookmarkEnd w:id="65"/>
-    <w:bookmarkStart w:id="66" w:name="limitations-of-this-review"/>
+    <w:bookmarkEnd w:id="77"/>
+    <w:bookmarkStart w:id="78" w:name="limitations-of-this-review"/>
     <w:p>
       <w:pPr>
         <w:pStyle w:val="Heading3"/>
@@ -5937,9 +6249,9 @@
         <w:t xml:space="preserve">Organizations use different technologies and face different threats. The review does not establish that any approach provides complete protection in every setting.</w:t>
       </w:r>
     </w:p>
-    <w:bookmarkEnd w:id="66"/>
-    <w:bookmarkEnd w:id="67"/>
-    <w:bookmarkStart w:id="68" w:name="conclusion"/>
+    <w:bookmarkEnd w:id="78"/>
+    <w:bookmarkEnd w:id="79"/>
+    <w:bookmarkStart w:id="80" w:name="conclusion"/>
     <w:p>
       <w:pPr>
         <w:pStyle w:val="Heading2"/>
@@ -5972,7 +6284,7 @@
         <w:t xml:space="preserve">The figures and tables summarize these relationships and the questions that remain open. The main conclusion is that DevSecOps requires several supporting practices, clear responsibilities, and continued maintenance across the delivery lifecycle. Broader literature coverage would strengthen the review and include more independent perspectives. The paper provides a focused discussion of existing work, without claiming new experimental results or a new technical solution.</w:t>
       </w:r>
     </w:p>
-    <w:bookmarkEnd w:id="68"/>
+    <w:bookmarkEnd w:id="80"/>
     <w:sectPr>
       <w:footerReference r:id="rId9" w:type="default"/>
       <w:pgSz w:h="16838" w:w="11905"/>

</xml_diff>

<commit_message>
Shorten review explanations while preserving core points and comparisons
</commit_message>
<xml_diff>
--- a/DevSecOps_Review.docx
+++ b/DevSecOps_Review.docx
@@ -110,7 +110,15 @@
         <w:pStyle w:val="FirstParagraph"/>
       </w:pPr>
       <w:r>
-        <w:t xml:space="preserve">DevSecOps aims to include security throughout software development and delivery. In continuous integration and continuous delivery or deployment (CI/CD), this involves checking application code, dependencies, infrastructure settings, credentials, and release processes. Although many security tools and frameworks are available, they address different problems and have different limitations. This paper reviews selected studies and official guidance to explain how security is integrated into CI/CD pipelines. The discussion covers teamwork, vulnerability detection, infrastructure as code, identity and secrets management, software supply-chain security, and monitoring after deployment. Comparison tables summarize the methods, main findings, and limitations of the reviewed studies and frameworks. The figures show the main literature themes, the types of sources considered, the placement of security practices across the delivery lifecycle, and the remaining research questions. The reviewed material suggests that no single tool provides complete protection. Effective security also depends on appropriate permissions, reliable configuration, verification of released software, and timely responses to problems. SolarWinds, Codecov, and Log4Shell illustrate different weaknesses in software production and dependency management. The review identifies continuing challenges in detection coverage, tool integration, configuration changes, and incident response. It concludes that DevSecOps requires a combination of technical controls and clearly assigned responsibilities. This paper discusses existing research and does not report new experiments or propose a new technical system.</w:t>
+        <w:t xml:space="preserve">DevSecOps integrates security into software development and delivery. This paper reviews selected studies and guidance on continuous integration and continuous delivery or deployment (CI/CD). It examines teamwork, vulnerability detection, infrastructure as code, credentials, supply-chain integrity, and monitoring. Comparison tables and conceptual figures summarize existing approaches, their contributions, and their limitations.</w:t>
+      </w:r>
+    </w:p>
+    <w:p>
+      <w:pPr>
+        <w:pStyle w:val="BodyText"/>
+      </w:pPr>
+      <w:r>
+        <w:t xml:space="preserve">The review suggests that security depends on complementary controls and clear responsibilities. Key challenges include incomplete detection, excessive permissions, configuration changes, and delayed response. Past incidents illustrate these concerns. The paper discusses existing research and presents no new experiments or technical system.</w:t>
       </w:r>
     </w:p>
     <w:p>
@@ -128,7 +136,7 @@
         <w:t xml:space="preserve"> </w:t>
       </w:r>
       <w:r>
-        <w:t xml:space="preserve">DevSecOps; CI/CD; literature review; software security; infrastructure as code; supply-chain security; secrets management; continuous monitoring.</w:t>
+        <w:t xml:space="preserve">DevSecOps; CI/CD; literature review; software security; infrastructure as code; supply-chain security; secrets management; monitoring.</w:t>
       </w:r>
     </w:p>
     <w:bookmarkEnd w:id="20"/>
@@ -146,7 +154,7 @@
         <w:pStyle w:val="FirstParagraph"/>
       </w:pPr>
       <w:r>
-        <w:t xml:space="preserve">Software teams use CI/CD pipelines to automate activities such as building, testing, and releasing applications. Continuous integration checks changes as developers combine their work. Continuous delivery keeps software ready for release, while continuous deployment automatically releases changes that meet the required checks. These practices can make delivery more consistent, but they also create security risks.</w:t>
+        <w:t xml:space="preserve">CI/CD automates software integration, testing, and release. Continuous delivery keeps changes ready for release; continuous deployment releases qualifying changes automatically. Pipelines also connect repositories, dependencies, credentials, and production services, making the delivery process itself a security concern.</w:t>
       </w:r>
     </w:p>
     <w:p>
@@ -154,7 +162,7 @@
         <w:pStyle w:val="BodyText"/>
       </w:pPr>
       <w:r>
-        <w:t xml:space="preserve">A pipeline connects several systems, including source repositories, package registries, testing environments, and cloud services. It may also have permission to publish software or change production infrastructure. If an attacker compromises a script, dependency, or credential, the effect can extend beyond one application. For this reason, security needs to cover both the software and the process used to deliver it.</w:t>
+        <w:t xml:space="preserve">DevSecOps combines security checks with shared responsibility across development, operations, and security teams. This review compares existing practices, explains their limitations, and identifies remaining questions.</w:t>
       </w:r>
     </w:p>
     <w:p>
@@ -162,23 +170,7 @@
         <w:pStyle w:val="BodyText"/>
       </w:pPr>
       <w:r>
-        <w:t xml:space="preserve">DevSecOps brings security into the shared work of development and operations teams. It includes practices such as code review, vulnerability scanning, configuration checks, access control, and monitoring. It also involves deciding who should investigate findings, approve changes, and respond to incidents. Adding a tool is only one part of this process.</w:t>
-      </w:r>
-    </w:p>
-    <w:p>
-      <w:pPr>
-        <w:pStyle w:val="BodyText"/>
-      </w:pPr>
-      <w:r>
-        <w:t xml:space="preserve">The studies and frameworks discussed in this paper examine different parts of DevSecOps. Some describe how teams adopt security practices. Others investigate weaknesses in infrastructure code or compare detection tools. Security frameworks provide requirements and guidance for application testing, dependency management, and artifact verification. These contributions are useful, but they should be interpreted according to their purpose and limitations.</w:t>
-      </w:r>
-    </w:p>
-    <w:p>
-      <w:pPr>
-        <w:pStyle w:val="BodyText"/>
-      </w:pPr>
-      <w:r>
-        <w:t xml:space="preserve">This review examines how existing work explains security integration in CI/CD. It compares the approaches, discusses lessons from past incidents, and identifies questions that remain open. The review addresses four research questions:</w:t>
+        <w:t xml:space="preserve">The review addresses four questions:</w:t>
       </w:r>
     </w:p>
     <w:p>
@@ -200,7 +192,7 @@
         <w:t xml:space="preserve"> </w:t>
       </w:r>
       <w:r>
-        <w:t xml:space="preserve">How do existing studies describe teamwork and technical security practices in CI/CD?</w:t>
+        <w:t xml:space="preserve">How do teams integrate security into CI/CD?</w:t>
       </w:r>
     </w:p>
     <w:p>
@@ -222,7 +214,7 @@
         <w:t xml:space="preserve"> </w:t>
       </w:r>
       <w:r>
-        <w:t xml:space="preserve">Which security approaches are used at different stages of the delivery lifecycle?</w:t>
+        <w:t xml:space="preserve">Which security approaches support each delivery stage?</w:t>
       </w:r>
     </w:p>
     <w:p>
@@ -244,7 +236,7 @@
         <w:t xml:space="preserve"> </w:t>
       </w:r>
       <w:r>
-        <w:t xml:space="preserve">What are the main contributions and limitations of the reviewed studies and frameworks?</w:t>
+        <w:t xml:space="preserve">What do existing studies and frameworks contribute?</w:t>
       </w:r>
     </w:p>
     <w:p>
@@ -266,15 +258,7 @@
         <w:t xml:space="preserve"> </w:t>
       </w:r>
       <w:r>
-        <w:t xml:space="preserve">What challenges and research gaps remain in the selected literature?</w:t>
-      </w:r>
-    </w:p>
-    <w:p>
-      <w:pPr>
-        <w:pStyle w:val="FirstParagraph"/>
-      </w:pPr>
-      <w:r>
-        <w:t xml:space="preserve">The paper is organized as a review of existing material. The figures explain relationships between topics, and the tables compare studies and approaches. No new implementation or experimental results are presented.</w:t>
+        <w:t xml:space="preserve">Which challenges and research gaps remain?</w:t>
       </w:r>
     </w:p>
     <w:bookmarkEnd w:id="21"/>
@@ -287,13 +271,13 @@
         <w:t xml:space="preserve">2. Review Scope and Approach</w:t>
       </w:r>
     </w:p>
-    <w:bookmarkStart w:id="22" w:name="sources-included-in-the-review"/>
+    <w:bookmarkStart w:id="22" w:name="sources-included"/>
     <w:p>
       <w:pPr>
         <w:pStyle w:val="Heading3"/>
       </w:pPr>
       <w:r>
-        <w:t xml:space="preserve">2.1 Sources included in the review</w:t>
+        <w:t xml:space="preserve">2.1 Sources included</w:t>
       </w:r>
     </w:p>
     <w:p>
@@ -301,7 +285,7 @@
         <w:pStyle w:val="FirstParagraph"/>
       </w:pPr>
       <w:r>
-        <w:t xml:space="preserve">This paper uses a focused literature review. Sources were selected for their relevance to security in CI/CD. The selection was not based on a complete systematic search, so the review does not claim to include every relevant publication.</w:t>
+        <w:t xml:space="preserve">The review considers five academic manuscripts and seven official project or agency sources, selected for relevance. It is a focused review, not a completed systematic search or an exhaustive account of DevSecOps research.</w:t>
       </w:r>
     </w:p>
     <w:p>
@@ -309,41 +293,25 @@
         <w:pStyle w:val="BodyText"/>
       </w:pPr>
       <w:r>
-        <w:t xml:space="preserve">The material consists of five academic manuscripts and seven official project or agency sources. The academic studies cover security practices in DevOps, infrastructure-as-code research, recurring weaknesses in infrastructure scripts, defects in infrastructure automation, and Kubernetes configuration checks. The official sources discuss pipeline risks, application requirements, build information, dependency management, security-practice checks, and known exploitation.</w:t>
+        <w:t xml:space="preserve">The academic manuscripts come from an author’s archive and share a coauthor, limiting independent perspectives. They may differ from final publications. Sources were retrieved on 23 October 2026; coverage through that date is not claimed.</w:t>
+      </w:r>
+    </w:p>
+    <w:bookmarkEnd w:id="22"/>
+    <w:bookmarkStart w:id="23" w:name="basis-of-comparison"/>
+    <w:p>
+      <w:pPr>
+        <w:pStyle w:val="Heading3"/>
+      </w:pPr>
+      <w:r>
+        <w:t xml:space="preserve">2.2 Basis of comparison</w:t>
       </w:r>
     </w:p>
     <w:p>
       <w:pPr>
-        <w:pStyle w:val="BodyText"/>
-      </w:pPr>
-      <w:r>
-        <w:t xml:space="preserve">The academic manuscripts were obtained from an author’s publication archive. All five include a common coauthor, so the review has limited diversity of research perspectives. The available manuscripts may also differ from their final published versions. Sources were retrieved on 23 October 2026, but this does not mean that the review covers all research published up to that date.</w:t>
-      </w:r>
-    </w:p>
-    <w:bookmarkEnd w:id="22"/>
-    <w:bookmarkStart w:id="23" w:name="how-the-sources-were-compared"/>
-    <w:p>
-      <w:pPr>
-        <w:pStyle w:val="Heading3"/>
-      </w:pPr>
-      <w:r>
-        <w:t xml:space="preserve">2.2 How the sources were compared</w:t>
-      </w:r>
-    </w:p>
-    <w:p>
-      <w:pPr>
         <w:pStyle w:val="FirstParagraph"/>
       </w:pPr>
       <w:r>
-        <w:t xml:space="preserve">The academic studies are compared by their topic, method, reported sample, main contribution, and limitations. Sample sizes describe the studies being reviewed. They are not data collected for this paper. Frameworks are compared by the security problem they address, the guidance they provide, and the questions they leave unanswered.</w:t>
-      </w:r>
-    </w:p>
-    <w:p>
-      <w:pPr>
-        <w:pStyle w:val="BodyText"/>
-      </w:pPr>
-      <w:r>
-        <w:t xml:space="preserve">Three types of sources are considered:</w:t>
+        <w:t xml:space="preserve">Studies are compared by topic, method, reported scope, contribution, and limitation. Frameworks are compared by purpose and coverage. Sample sizes belong to the reviewed studies, not new data collected for this paper.</w:t>
       </w:r>
     </w:p>
     <w:p>
@@ -365,7 +333,7 @@
         <w:t xml:space="preserve"> </w:t>
       </w:r>
       <w:r>
-        <w:t xml:space="preserve">report findings from surveys, software repositories, defect records, or other research material.</w:t>
+        <w:t xml:space="preserve">provide findings from particular research settings.</w:t>
       </w:r>
     </w:p>
     <w:p>
@@ -387,7 +355,7 @@
         <w:t xml:space="preserve"> </w:t>
       </w:r>
       <w:r>
-        <w:t xml:space="preserve">describe requirements, risks, and recommended security practices.</w:t>
+        <w:t xml:space="preserve">define requirements and recommended practices.</w:t>
       </w:r>
     </w:p>
     <w:p>
@@ -409,7 +377,7 @@
         <w:t xml:space="preserve"> </w:t>
       </w:r>
       <w:r>
-        <w:t xml:space="preserve">explain how particular security failures occurred.</w:t>
+        <w:t xml:space="preserve">illustrate specific security failures.</w:t>
       </w:r>
     </w:p>
     <w:p>
@@ -417,17 +385,17 @@
         <w:pStyle w:val="FirstParagraph"/>
       </w:pPr>
       <w:r>
-        <w:t xml:space="preserve">These sources provide different kinds of information. A survey describes participants’ experiences, while a tool study examines particular files or rules. A standard explains what should be checked, but does not prove that an organization has applied those checks correctly. An incident illustrates a failure without showing how common that failure is across all organizations.</w:t>
+        <w:t xml:space="preserve">These sources answer different questions and are not combined into one performance score.</w:t>
       </w:r>
     </w:p>
     <w:bookmarkEnd w:id="23"/>
-    <w:bookmarkStart w:id="24" w:name="interpreting-the-findings-carefully"/>
+    <w:bookmarkStart w:id="24" w:name="interpreting-findings"/>
     <w:p>
       <w:pPr>
         <w:pStyle w:val="Heading3"/>
       </w:pPr>
       <w:r>
-        <w:t xml:space="preserve">2.3 Interpreting the findings carefully</w:t>
+        <w:t xml:space="preserve">2.3 Interpreting findings</w:t>
       </w:r>
     </w:p>
     <w:p>
@@ -435,15 +403,7 @@
         <w:pStyle w:val="FirstParagraph"/>
       </w:pPr>
       <w:r>
-        <w:t xml:space="preserve">This review separates the use of a security practice from evidence that it is effective. For example, running a scanner does not prove that all vulnerabilities have been found. Similarly, generating an alert does not prove that a team has resolved the problem.</w:t>
-      </w:r>
-    </w:p>
-    <w:p>
-      <w:pPr>
-        <w:pStyle w:val="BodyText"/>
-      </w:pPr>
-      <w:r>
-        <w:t xml:space="preserve">Some source versions contain differences between their numerical summaries and other reported information. The discussion therefore emphasizes findings that can be interpreted consistently. Disputed figures and broad claims about breach frequency or remediation costs are not repeated. The review presents a qualitative comparison rather than a combined performance score.</w:t>
+        <w:t xml:space="preserve">Using a control does not prove effective protection. A scanner may miss weaknesses, and an alert may remain unresolved. Disputed source figures and unsupported claims about breach frequency or remediation costs are excluded.</w:t>
       </w:r>
     </w:p>
     <w:bookmarkEnd w:id="24"/>
@@ -457,13 +417,13 @@
         <w:t xml:space="preserve">3. Review of Existing Studies</w:t>
       </w:r>
     </w:p>
-    <w:bookmarkStart w:id="26" w:name="Xc6ef4732598de6a25b86bc67d2b91c4c6ec36b5"/>
+    <w:bookmarkStart w:id="26" w:name="teamwork-and-shared-responsibility"/>
     <w:p>
       <w:pPr>
         <w:pStyle w:val="Heading3"/>
       </w:pPr>
       <w:r>
-        <w:t xml:space="preserve">3.1 Teamwork and shared security responsibility</w:t>
+        <w:t xml:space="preserve">3.1 Teamwork and shared responsibility</w:t>
       </w:r>
     </w:p>
     <w:p>
@@ -471,165 +431,61 @@
         <w:pStyle w:val="FirstParagraph"/>
       </w:pPr>
       <w:r>
-        <w:t xml:space="preserve">One practitioner study examines online material and surveys representatives from nine organizations. It describes how teams use security requirements, configuration practices, monitoring, and collaboration within DevOps. The study shows that security integration includes organizational practices as well as automated checks.</w:t>
+        <w:t xml:space="preserve">The practitioner study describes collaboration, requirements, and security practices within DevOps. It supports clear ownership while retaining limited access. Its small, partly self-reported sample does not establish that collaboration alone reduces breaches.</w:t>
+      </w:r>
+    </w:p>
+    <w:bookmarkEnd w:id="26"/>
+    <w:bookmarkStart w:id="27" w:name="infrastructure-as-code"/>
+    <w:p>
+      <w:pPr>
+        <w:pStyle w:val="Heading3"/>
+      </w:pPr>
+      <w:r>
+        <w:t xml:space="preserve">3.2 Infrastructure as code</w:t>
       </w:r>
     </w:p>
     <w:p>
       <w:pPr>
-        <w:pStyle w:val="BodyText"/>
-      </w:pPr>
-      <w:r>
-        <w:t xml:space="preserve">Developers, operations staff, and security specialists work on different parts of the same delivery process. Developers change application and build code. Operations staff manage infrastructure and deployment environments. Security specialists help identify risks and interpret requirements. A security finding may need input from more than one of these groups before it can be resolved.</w:t>
+        <w:pStyle w:val="FirstParagraph"/>
+      </w:pPr>
+      <w:r>
+        <w:t xml:space="preserve">Infrastructure as code (IaC) uses files and automation to manage resources. The historical mapping study distinguishes tool proposals, adoption, empirical work, and testing. Its older literature set cannot represent the current field, but shows why introducing a tool differs from demonstrating sustained usefulness.</w:t>
+      </w:r>
+    </w:p>
+    <w:bookmarkEnd w:id="27"/>
+    <w:bookmarkStart w:id="28" w:name="Xd77f8b5a5e9a75043f441ccf70752b81427ef8c"/>
+    <w:p>
+      <w:pPr>
+        <w:pStyle w:val="Heading3"/>
+      </w:pPr>
+      <w:r>
+        <w:t xml:space="preserve">3.3 Security smells in infrastructure scripts</w:t>
       </w:r>
     </w:p>
     <w:p>
       <w:pPr>
-        <w:pStyle w:val="BodyText"/>
-      </w:pPr>
-      <w:r>
-        <w:t xml:space="preserve">However, shared responsibility does not mean that everyone needs unrestricted access. Teams can work together while keeping deployment permissions and administrator accounts limited. The reviewed study also discusses risks from inappropriate access and from rapid releases that overlook security work.</w:t>
+        <w:pStyle w:val="FirstParagraph"/>
+      </w:pPr>
+      <w:r>
+        <w:t xml:space="preserve">Security smells are patterns that may indicate weaknesses, such as hard-coded secrets or insecure defaults. The reviewed study supports inspecting infrastructure code. Findings still require context: a warning is not proof of exploitation, and language-specific rules may not transfer to other platforms.</w:t>
+      </w:r>
+    </w:p>
+    <w:bookmarkEnd w:id="28"/>
+    <w:bookmarkStart w:id="29" w:name="infrastructure-automation-defects"/>
+    <w:p>
+      <w:pPr>
+        <w:pStyle w:val="Heading3"/>
+      </w:pPr>
+      <w:r>
+        <w:t xml:space="preserve">3.4 Infrastructure automation defects</w:t>
       </w:r>
     </w:p>
     <w:p>
       <w:pPr>
-        <w:pStyle w:val="BodyText"/>
-      </w:pPr>
-      <w:r>
-        <w:t xml:space="preserve">The study is useful for understanding reported practices, but its sample is small and some information is self-reported. It does not prove that a particular team structure causes fewer breaches. Its main value for this review is showing why collaboration and clear responsibilities matter during adoption.</w:t>
-      </w:r>
-    </w:p>
-    <w:bookmarkEnd w:id="26"/>
-    <w:bookmarkStart w:id="27" w:name="research-on-infrastructure-as-code"/>
-    <w:p>
-      <w:pPr>
-        <w:pStyle w:val="Heading3"/>
-      </w:pPr>
-      <w:r>
-        <w:t xml:space="preserve">3.2 Research on infrastructure as code</w:t>
-      </w:r>
-    </w:p>
-    <w:p>
-      <w:pPr>
         <w:pStyle w:val="FirstParagraph"/>
       </w:pPr>
       <w:r>
-        <w:t xml:space="preserve">A historical mapping study reviews infrastructure as code (IaC), which uses configuration files and automation to manage computing resources. It groups the literature into tools and frameworks, adoption, empirical studies, and testing. The study includes 32 publications collected through 2017, with half classified as tool or framework work.</w:t>
-      </w:r>
-    </w:p>
-    <w:p>
-      <w:pPr>
-        <w:pStyle w:val="BodyText"/>
-      </w:pPr>
-      <w:r>
-        <w:t xml:space="preserve">This classification helps explain the different contributions made by research papers. A paper that introduces a tool may show that an approach is possible. It may not show whether the tool remains accurate, useful, or easy to maintain in different organizations. A study of existing defects answers a different question by examining what has already gone wrong.</w:t>
-      </w:r>
-    </w:p>
-    <w:p>
-      <w:pPr>
-        <w:pStyle w:val="BodyText"/>
-      </w:pPr>
-      <w:r>
-        <w:t xml:space="preserve">The mapping is historical, so its publication counts do not describe the current field. Nevertheless, it highlights the need to distinguish between introducing a method and understanding its practical use.</w:t>
-      </w:r>
-    </w:p>
-    <w:p>
-      <w:pPr>
-        <w:pStyle w:val="BodyText"/>
-      </w:pPr>
-      <w:r>
-        <w:t xml:space="preserve">IaC is important to DevSecOps because automation can repeat both secure and insecure configurations. Storing configuration in reviewable files makes inspection easier. The resulting infrastructure still depends on the settings supplied, the checks performed, and the behavior of the automation tool.</w:t>
-      </w:r>
-    </w:p>
-    <w:bookmarkEnd w:id="27"/>
-    <w:bookmarkStart w:id="28" w:name="X50a7839a81f3b7f5d1ccaf3454cb6ef8717dfa0"/>
-    <w:p>
-      <w:pPr>
-        <w:pStyle w:val="Heading3"/>
-      </w:pPr>
-      <w:r>
-        <w:t xml:space="preserve">3.3 Recurring weaknesses in infrastructure scripts</w:t>
-      </w:r>
-    </w:p>
-    <w:p>
-      <w:pPr>
-        <w:pStyle w:val="FirstParagraph"/>
-      </w:pPr>
-      <w:r>
-        <w:t xml:space="preserve">A study of security smells examines 15,232 infrastructure scripts from 293 open-source repositories. A security smell is a recurring pattern that may indicate a weakness. Examples include hard-coded secrets and insecure default settings. The study uses static analysis to identify such patterns.</w:t>
-      </w:r>
-    </w:p>
-    <w:p>
-      <w:pPr>
-        <w:pStyle w:val="BodyText"/>
-      </w:pPr>
-      <w:r>
-        <w:t xml:space="preserve">This work shows why infrastructure scripts should be included in security reviews. An application may have secure source code while its infrastructure exposes credentials or grants unnecessary permissions. Reviewing application code alone would miss these issues.</w:t>
-      </w:r>
-    </w:p>
-    <w:p>
-      <w:pPr>
-        <w:pStyle w:val="BodyText"/>
-      </w:pPr>
-      <w:r>
-        <w:t xml:space="preserve">At the same time, a smell is a warning that needs investigation. It does not prove that an attacker has exploited the system. The risk may depend on whether the script is used in production, whether a credential is valid, and what other controls are present.</w:t>
-      </w:r>
-    </w:p>
-    <w:p>
-      <w:pPr>
-        <w:pStyle w:val="BodyText"/>
-      </w:pPr>
-      <w:r>
-        <w:t xml:space="preserve">Context can also affect how developers respond. A hard-coded value in a training example may not expose a live account, but someone could copy the example into a real deployment. Reporting every example as an urgent production problem could also create unnecessary work. The study supports examining findings in context instead of accepting or rejecting every warning automatically.</w:t>
-      </w:r>
-    </w:p>
-    <w:p>
-      <w:pPr>
-        <w:pStyle w:val="BodyText"/>
-      </w:pPr>
-      <w:r>
-        <w:t xml:space="preserve">The findings are also limited by the infrastructure language and repositories studied. They do not establish complete coverage of Terraform, Kubernetes, or every cloud service. Similar patterns need to be examined in the environments where they are used.</w:t>
-      </w:r>
-    </w:p>
-    <w:bookmarkEnd w:id="28"/>
-    <w:bookmarkStart w:id="29" w:name="defects-in-infrastructure-automation"/>
-    <w:p>
-      <w:pPr>
-        <w:pStyle w:val="Heading3"/>
-      </w:pPr>
-      <w:r>
-        <w:t xml:space="preserve">3.4 Defects in infrastructure automation</w:t>
-      </w:r>
-    </w:p>
-    <w:p>
-      <w:pPr>
-        <w:pStyle w:val="FirstParagraph"/>
-      </w:pPr>
-      <w:r>
-        <w:t xml:space="preserve">Another study examines 5,110 Ansible-related defects in state reconciliation and identifies eight categories. State reconciliation is the process of comparing the desired infrastructure state with the current state and deciding which changes to make.</w:t>
-      </w:r>
-    </w:p>
-    <w:p>
-      <w:pPr>
-        <w:pStyle w:val="BodyText"/>
-      </w:pPr>
-      <w:r>
-        <w:t xml:space="preserve">This study adds an important point to the review: a configuration file is only one part of infrastructure behavior. An automation engine interprets that file using variables, inventories, providers, and remote interfaces. A defect in these components can cause the actual result to differ from the intended configuration.</w:t>
-      </w:r>
-    </w:p>
-    <w:p>
-      <w:pPr>
-        <w:pStyle w:val="BodyText"/>
-      </w:pPr>
-      <w:r>
-        <w:t xml:space="preserve">Static configuration checks are still useful because they can identify known problems before deployment. Observing the deployed environment provides different information about what actually happened and what changed later. Both types of checks help explain infrastructure security.</w:t>
-      </w:r>
-    </w:p>
-    <w:p>
-      <w:pPr>
-        <w:pStyle w:val="BodyText"/>
-      </w:pPr>
-      <w:r>
-        <w:t xml:space="preserve">The findings apply to the setting examined in the study. They do not show that every automation tool has the same defects. The study’s use of generated inputs to discover problems also does not prove that software can safely repair infrastructure without human review.</w:t>
+        <w:t xml:space="preserve">State reconciliation compares desired infrastructure with its current state. The reviewed Ansible study shows that defects in automation can produce unexpected changes. Static checks and observation of the deployed environment therefore provide different, complementary information.</w:t>
       </w:r>
     </w:p>
     <w:bookmarkEnd w:id="29"/>
@@ -647,49 +503,25 @@
         <w:pStyle w:val="FirstParagraph"/>
       </w:pPr>
       <w:r>
-        <w:t xml:space="preserve">A Kubernetes study examines 53 security configurations prescribed by the Center for Internet Security (CIS), 544 configuration files, and 20 survey respondents. It compares the support and detection behavior of five static-analysis tools. The study reports limitations in what these tools cover and detect.</w:t>
+        <w:t xml:space="preserve">The Kubernetes study examines configurations prescribed by the Center for Internet Security (CIS) and compares five analysis tools. Coverage depends on rules, versions, and input files. Duplicate alerts and shared blind spots mean that more tools do not automatically provide complete protection.</w:t>
+      </w:r>
+    </w:p>
+    <w:bookmarkEnd w:id="30"/>
+    <w:bookmarkStart w:id="34" w:name="main-literature-themes"/>
+    <w:p>
+      <w:pPr>
+        <w:pStyle w:val="Heading3"/>
+      </w:pPr>
+      <w:r>
+        <w:t xml:space="preserve">3.6 Main literature themes</w:t>
       </w:r>
     </w:p>
     <w:p>
       <w:pPr>
-        <w:pStyle w:val="BodyText"/>
-      </w:pPr>
-      <w:r>
-        <w:t xml:space="preserve">Its findings should be read in relation to the versions, rules, and files used in that study. They are not permanent rankings of current products. Some numerical summaries in the available source version also require further checking. This paper therefore discusses the findings without reproducing a performance chart.</w:t>
-      </w:r>
-    </w:p>
-    <w:p>
-      <w:pPr>
-        <w:pStyle w:val="BodyText"/>
-      </w:pPr>
-      <w:r>
-        <w:t xml:space="preserve">Using several tools may increase the number of patterns checked. It can also produce repeated warnings or different descriptions of the same issue. Tools with similar rules may miss the same problems. The number of alerts alone is therefore not a reliable measure of security coverage.</w:t>
-      </w:r>
-    </w:p>
-    <w:p>
-      <w:pPr>
-        <w:pStyle w:val="BodyText"/>
-      </w:pPr>
-      <w:r>
-        <w:t xml:space="preserve">Configuration checks can also lack information that becomes available later. A template may be filled with values during deployment, or a file may describe only part of a cluster. The study helps explain why support for a rule, detection of a warning, and exposure in a running system are different questions.</w:t>
-      </w:r>
-    </w:p>
-    <w:bookmarkEnd w:id="30"/>
-    <w:bookmarkStart w:id="34" w:name="main-themes-in-the-literature"/>
-    <w:p>
-      <w:pPr>
-        <w:pStyle w:val="Heading3"/>
-      </w:pPr>
-      <w:r>
-        <w:t xml:space="preserve">3.6 Main themes in the literature</w:t>
-      </w:r>
-    </w:p>
-    <w:p>
-      <w:pPr>
         <w:pStyle w:val="FirstParagraph"/>
       </w:pPr>
       <w:r>
-        <w:t xml:space="preserve">Figure 1 organizes the reviewed material into six themes. These cover teamwork, code and dependencies, infrastructure, identities and secrets, supply-chain integrity, and monitoring. The themes provide a simple way to follow the discussion across the studies and guidance.</w:t>
+        <w:t xml:space="preserve">Figure 1 groups the literature into six overlapping topics. For example, a dependency script can create both a supply-chain risk and a route to credential exposure.</w:t>
       </w:r>
     </w:p>
     <w:p>
@@ -759,7 +591,7 @@
         <w:pStyle w:val="BodyText"/>
       </w:pPr>
       <w:r>
-        <w:t xml:space="preserve">The topics overlap. For example, a dependency script may introduce unsafe code and also gain access to credentials. A configuration problem may require both a code change and a permissions change. These connections help explain why DevSecOps cannot be understood through a list of tools alone. The figure shows topic groups, not how common or effective each practice is.</w:t>
+        <w:t xml:space="preserve">The groups organize the discussion; their size does not indicate frequency or effectiveness.</w:t>
       </w:r>
     </w:p>
     <w:p>
@@ -1310,13 +1142,13 @@
       </w:tr>
     </w:tbl>
     <w:bookmarkEnd w:id="34"/>
-    <w:bookmarkStart w:id="38" w:name="comparison-of-the-reviewed-studies"/>
+    <w:bookmarkStart w:id="38" w:name="comparison-of-studies"/>
     <w:p>
       <w:pPr>
         <w:pStyle w:val="Heading3"/>
       </w:pPr>
       <w:r>
-        <w:t xml:space="preserve">3.7 Comparison of the reviewed studies</w:t>
+        <w:t xml:space="preserve">3.7 Comparison of studies</w:t>
       </w:r>
     </w:p>
     <w:p>
@@ -1324,7 +1156,7 @@
         <w:pStyle w:val="FirstParagraph"/>
       </w:pPr>
       <w:r>
-        <w:t xml:space="preserve">Table 2 summarizes the five academic studies. Their samples include organizations, publications, scripts, defect records, and configuration files. These are different units, so a larger sample does not automatically make one study more suitable for every question.</w:t>
+        <w:t xml:space="preserve">Table 2 retains each study’s method, scope, contribution, and limitation. Organizations, publications, scripts, and defect records are different units and should not be ranked by sample size alone.</w:t>
       </w:r>
     </w:p>
     <w:p>
@@ -1873,7 +1705,7 @@
         <w:pStyle w:val="BodyText"/>
       </w:pPr>
       <w:r>
-        <w:t xml:space="preserve">Together, these studies explain different parts of security integration. They do not provide one common measure of DevSecOps effectiveness. Figure 2 shows how the review uses academic studies, standards, and incident accounts to compare existing knowledge and remaining questions.</w:t>
+        <w:t xml:space="preserve">Figure 2 shows how the source types support the review. Its arrows organize the discussion rather than establish cause and effect.</w:t>
       </w:r>
     </w:p>
     <w:p>
@@ -1938,14 +1770,6 @@
         </w:drawing>
       </w:r>
     </w:p>
-    <w:p>
-      <w:pPr>
-        <w:pStyle w:val="BodyText"/>
-      </w:pPr>
-      <w:r>
-        <w:t xml:space="preserve">The arrows show how the discussion is organized. They do not represent a cause-and-effect model or the screening stages of a systematic review.</w:t>
-      </w:r>
-    </w:p>
     <w:bookmarkEnd w:id="38"/>
     <w:bookmarkEnd w:id="39"/>
     <w:bookmarkStart w:id="57" w:name="Xb4b759e58d5a6387bcd89372a95ab1dc17a6ae5"/>
@@ -1957,13 +1781,13 @@
         <w:t xml:space="preserve">4. Comparison of Existing Security Approaches</w:t>
       </w:r>
     </w:p>
-    <w:bookmarkStart w:id="40" w:name="security-frameworks-and-their-purposes"/>
+    <w:bookmarkStart w:id="40" w:name="frameworks-and-their-purposes"/>
     <w:p>
       <w:pPr>
         <w:pStyle w:val="Heading3"/>
       </w:pPr>
       <w:r>
-        <w:t xml:space="preserve">4.1 Security frameworks and their purposes</w:t>
+        <w:t xml:space="preserve">4.1 Frameworks and their purposes</w:t>
       </w:r>
     </w:p>
     <w:p>
@@ -1971,7 +1795,7 @@
         <w:pStyle w:val="FirstParagraph"/>
       </w:pPr>
       <w:r>
-        <w:t xml:space="preserve">The OWASP CI/CD risk taxonomy groups common pipeline risks. These include unsafe execution of pipeline code, weak access controls, exposed credentials, poor artifact verification, and limited visibility. The taxonomy helps teams decide what to examine. It does not show how often each risk occurs or whether a particular organization has addressed it successfully.</w:t>
+        <w:t xml:space="preserve">OWASP’s CI/CD taxonomy organizes pipeline risks. The OWASP Application Security Verification Standard (ASVS) defines application-security requirements. Both guide assessment, but teams must still implement and verify the relevant checks.</w:t>
       </w:r>
     </w:p>
     <w:p>
@@ -1979,7 +1803,7 @@
         <w:pStyle w:val="BodyText"/>
       </w:pPr>
       <w:r>
-        <w:t xml:space="preserve">The OWASP Application Security Verification Standard (ASVS) describes requirements for assessing application security. Some can be checked automatically, while others require manual review or an understanding of the application’s design. ASVS is a requirements standard rather than a scanner. Teams still need to show how each relevant requirement has been checked.</w:t>
+        <w:t xml:space="preserve">Supply-chain Levels for Software Artifacts (SLSA) describes build-integrity expectations and provenance: information about software production. The in-toto specification checks authorized steps and artifact relationships. Their protection depends on trusted identities, adequate rules, and actual verification.</w:t>
       </w:r>
     </w:p>
     <w:p>
@@ -1987,7 +1811,7 @@
         <w:pStyle w:val="BodyText"/>
       </w:pPr>
       <w:r>
-        <w:t xml:space="preserve">Supply-chain Levels for Software Artifacts (SLSA) describes expectations for build integrity and information about software production. The version reviewed here is v1.1. It uses provenance, which records how an artifact was produced, together with checks against trusted production expectations. This information can help identify unexpected production steps or changes. It does not prove that the original source code is harmless.</w:t>
+        <w:t xml:space="preserve">OpenSSF’s Secure Supply Chain Consumption Framework (S2C2F) guides dependency use, while Scorecard checks selected security practices.</w:t>
       </w:r>
     </w:p>
     <w:p>
@@ -1995,15 +1819,7 @@
         <w:pStyle w:val="BodyText"/>
       </w:pPr>
       <w:r>
-        <w:t xml:space="preserve">The in-toto specification describes expected supply-chain steps and the people or systems authorized to perform them. Signed records can be checked against these rules. This makes the expected process clearer, but protection still depends on complete rules, protected verification material, and someone actually checking the records.</w:t>
-      </w:r>
-    </w:p>
-    <w:p>
-      <w:pPr>
-        <w:pStyle w:val="BodyText"/>
-      </w:pPr>
-      <w:r>
-        <w:t xml:space="preserve">The OpenSSF Secure Supply Chain Consumption Framework (S2C2F) focuses on using open-source components securely. OpenSSF Scorecard checks selected security practices and provides signals that can support maintenance and dependency decisions. The Cybersecurity and Infrastructure Security Agency (CISA) catalog identifies vulnerabilities known to have been exploited. These sources serve different purposes and should be used with that distinction in mind.</w:t>
+        <w:t xml:space="preserve">The Cybersecurity and Infrastructure Security Agency (CISA) catalog helps prioritize known exploited vulnerabilities. These sources inform different decisions; none proves complete security.</w:t>
       </w:r>
     </w:p>
     <w:p>
@@ -2714,13 +2530,13 @@
       </w:tr>
     </w:tbl>
     <w:bookmarkEnd w:id="40"/>
-    <w:bookmarkStart w:id="44" w:name="security-across-the-delivery-lifecycle"/>
+    <w:bookmarkStart w:id="44" w:name="security-across-the-lifecycle"/>
     <w:p>
       <w:pPr>
         <w:pStyle w:val="Heading3"/>
       </w:pPr>
       <w:r>
-        <w:t xml:space="preserve">4.2 Security across the delivery lifecycle</w:t>
+        <w:t xml:space="preserve">4.2 Security across the lifecycle</w:t>
       </w:r>
     </w:p>
     <w:p>
@@ -2728,15 +2544,7 @@
         <w:pStyle w:val="FirstParagraph"/>
       </w:pPr>
       <w:r>
-        <w:t xml:space="preserve">Different security practices are used at different points in delivery. Planning includes threat modeling and security requirements. Coding includes source review and secret detection. Building includes dependency checks and control of build inputs. Testing examines application behavior. Release and deployment activities address artifact verification, infrastructure settings, and permissions. Monitoring continues after deployment.</w:t>
-      </w:r>
-    </w:p>
-    <w:p>
-      <w:pPr>
-        <w:pStyle w:val="BodyText"/>
-      </w:pPr>
-      <w:r>
-        <w:t xml:space="preserve">Figure 3 summarizes these stages. Some practices can be repeated or used at several stages. Their placement in the figure is an example of how existing approaches fit into the lifecycle, rather than a required design for every organization.</w:t>
+        <w:t xml:space="preserve">Security practices extend from planning to operation. Figure 3 summarizes common placements; some controls apply at several stages. Operational feedback helps teams update requirements and maintain protection after release.</w:t>
       </w:r>
     </w:p>
     <w:p>
@@ -2801,14 +2609,6 @@
         </w:drawing>
       </w:r>
     </w:p>
-    <w:p>
-      <w:pPr>
-        <w:pStyle w:val="BodyText"/>
-      </w:pPr>
-      <w:r>
-        <w:t xml:space="preserve">Information from operation and monitoring can guide later planning and maintenance. This ongoing feedback helps explain continuous security: teams need to keep reviewing conditions after a release has passed its initial checks.</w:t>
-      </w:r>
-    </w:p>
     <w:bookmarkEnd w:id="44"/>
     <w:bookmarkStart w:id="48" w:name="X590bd841ffd084547f7407df94b329ffddc0a69"/>
     <w:p>
@@ -2821,34 +2621,98 @@
     </w:p>
     <w:p>
       <w:pPr>
-        <w:pStyle w:val="FirstParagraph"/>
-      </w:pPr>
-      <w:r>
-        <w:t xml:space="preserve">Static application security testing (SAST) examines source code or related representations for selected weakness patterns. Software composition analysis (SCA) examines dependencies and known vulnerability information. Dynamic application security testing (DAST) examines a running application’s behavior. Infrastructure checks examine settings and relationships between resources.</w:t>
+        <w:pStyle w:val="Compact"/>
+        <w:numPr>
+          <w:ilvl w:val="0"/>
+          <w:numId w:val="1003"/>
+        </w:numPr>
+      </w:pPr>
+      <w:r>
+        <w:rPr>
+          <w:b/>
+          <w:bCs/>
+        </w:rPr>
+        <w:t xml:space="preserve">SAST:</w:t>
+      </w:r>
+      <w:r>
+        <w:t xml:space="preserve"> </w:t>
+      </w:r>
+      <w:r>
+        <w:t xml:space="preserve">Static application security testing examines source-code weakness patterns.</w:t>
       </w:r>
     </w:p>
     <w:p>
       <w:pPr>
-        <w:pStyle w:val="BodyText"/>
-      </w:pPr>
-      <w:r>
-        <w:t xml:space="preserve">Each approach has limits. Source-code analysis may not reveal an unsafe cloud role assigned at deployment. A dependency check may identify an affected component without showing whether the vulnerable function is used. A configuration check may not see a later manual change. Dynamic testing may miss behavior that requires a particular account, session, or sequence of actions.</w:t>
+        <w:pStyle w:val="Compact"/>
+        <w:numPr>
+          <w:ilvl w:val="0"/>
+          <w:numId w:val="1003"/>
+        </w:numPr>
+      </w:pPr>
+      <w:r>
+        <w:rPr>
+          <w:b/>
+          <w:bCs/>
+        </w:rPr>
+        <w:t xml:space="preserve">SCA:</w:t>
+      </w:r>
+      <w:r>
+        <w:t xml:space="preserve"> </w:t>
+      </w:r>
+      <w:r>
+        <w:t xml:space="preserve">Software composition analysis examines dependencies and known vulnerability information.</w:t>
       </w:r>
     </w:p>
     <w:p>
       <w:pPr>
-        <w:pStyle w:val="BodyText"/>
-      </w:pPr>
-      <w:r>
-        <w:t xml:space="preserve">These differences explain why guidance often recommends combining approaches. However, adding more tools does not always add independent coverage. Similar rules may produce duplicate findings or miss the same weakness. A useful comparison considers what each approach can observe and what information it lacks.</w:t>
+        <w:pStyle w:val="Compact"/>
+        <w:numPr>
+          <w:ilvl w:val="0"/>
+          <w:numId w:val="1003"/>
+        </w:numPr>
+      </w:pPr>
+      <w:r>
+        <w:rPr>
+          <w:b/>
+          <w:bCs/>
+        </w:rPr>
+        <w:t xml:space="preserve">DAST:</w:t>
+      </w:r>
+      <w:r>
+        <w:t xml:space="preserve"> </w:t>
+      </w:r>
+      <w:r>
+        <w:t xml:space="preserve">Dynamic application security testing examines a running application’s behavior.</w:t>
       </w:r>
     </w:p>
     <w:p>
       <w:pPr>
-        <w:pStyle w:val="BodyText"/>
-      </w:pPr>
-      <w:r>
-        <w:t xml:space="preserve">Figure 4 compares the main inputs and limits of these approaches. It shows why a source-code check, a dependency check, a running-application test, and an infrastructure check should be interpreted differently. The diagram compares general methods, rather than ranking particular products.</w:t>
+        <w:pStyle w:val="Compact"/>
+        <w:numPr>
+          <w:ilvl w:val="0"/>
+          <w:numId w:val="1003"/>
+        </w:numPr>
+      </w:pPr>
+      <w:r>
+        <w:rPr>
+          <w:b/>
+          <w:bCs/>
+        </w:rPr>
+        <w:t xml:space="preserve">IaC checks:</w:t>
+      </w:r>
+      <w:r>
+        <w:t xml:space="preserve"> </w:t>
+      </w:r>
+      <w:r>
+        <w:t xml:space="preserve">Infrastructure analysis examines configuration rules and resource relationships.</w:t>
+      </w:r>
+    </w:p>
+    <w:p>
+      <w:pPr>
+        <w:pStyle w:val="FirstParagraph"/>
+      </w:pPr>
+      <w:r>
+        <w:t xml:space="preserve">Each method observes different information. Combining methods can improve coverage, but overlapping rules may repeat findings or share blind spots.</w:t>
       </w:r>
     </w:p>
     <w:p>
@@ -2918,17 +2782,17 @@
         <w:pStyle w:val="BodyText"/>
       </w:pPr>
       <w:r>
-        <w:t xml:space="preserve">The examples describe common uses. Actual coverage depends on the tool, its configuration, and the information available to it.</w:t>
+        <w:t xml:space="preserve">Actual coverage depends on the tool, configuration, and available context.</w:t>
       </w:r>
     </w:p>
     <w:bookmarkEnd w:id="48"/>
-    <w:bookmarkStart w:id="52" w:name="identity-and-secrets-management"/>
+    <w:bookmarkStart w:id="52" w:name="identity-and-secrets"/>
     <w:p>
       <w:pPr>
         <w:pStyle w:val="Heading3"/>
       </w:pPr>
       <w:r>
-        <w:t xml:space="preserve">4.4 Identity and secrets management</w:t>
+        <w:t xml:space="preserve">4.4 Identity and secrets</w:t>
       </w:r>
     </w:p>
     <w:p>
@@ -2936,7 +2800,7 @@
         <w:pStyle w:val="FirstParagraph"/>
       </w:pPr>
       <w:r>
-        <w:t xml:space="preserve">Secrets can be exposed in more places than the source repository. They may appear in logs, container layers, caches, temporary files, or build environments. A successful source scan therefore does not prove that every credential is protected.</w:t>
+        <w:t xml:space="preserve">Secrets can appear in source files, logs, caches, image layers, and job environments. Identity and access management (IAM) should limit each job to the resources needed for its task.</w:t>
       </w:r>
     </w:p>
     <w:p>
@@ -2944,23 +2808,7 @@
         <w:pStyle w:val="BodyText"/>
       </w:pPr>
       <w:r>
-        <w:t xml:space="preserve">Identity and access management (IAM) helps control what a pipeline or service is allowed to do. Existing guidance recommends limiting access according to the task being performed. Code from an unreviewed contribution should not automatically receive the permissions used to publish a release or change production infrastructure.</w:t>
-      </w:r>
-    </w:p>
-    <w:p>
-      <w:pPr>
-        <w:pStyle w:val="BodyText"/>
-      </w:pPr>
-      <w:r>
-        <w:t xml:space="preserve">Temporary credentials can reduce how long an exposed credential remains useful. Their permissions still matter. A temporary administrator token can cause harm while it is valid, and broad identity rules may allow another token to be issued. Least privilege means examining the access actually granted, rather than relying on a role’s name or a token’s short lifetime.</w:t>
-      </w:r>
-    </w:p>
-    <w:p>
-      <w:pPr>
-        <w:pStyle w:val="BodyText"/>
-      </w:pPr>
-      <w:r>
-        <w:t xml:space="preserve">Figure 5 links common locations of credential exposure with established safeguards. A credential’s location affects how it can be exposed, while its permissions affect which resources may be reached. The controls shown address different parts of this problem; none guarantees that credentials can never be misused.</w:t>
+        <w:t xml:space="preserve">Temporary credentials reduce reuse time, but their permissions still matter. Unreviewed code should not inherit deployment access. Exposed credentials require revocation or rotation and investigation of affected activity.</w:t>
       </w:r>
     </w:p>
     <w:p>
@@ -3030,17 +2878,17 @@
         <w:pStyle w:val="BodyText"/>
       </w:pPr>
       <w:r>
-        <w:t xml:space="preserve">The arrows show possible relationships, not an inevitable attack sequence. Temporary credentials can limit reuse time, but narrow permissions and an effective response are still important.</w:t>
+        <w:t xml:space="preserve">The arrows show possible exposure paths, not an inevitable attack sequence.</w:t>
       </w:r>
     </w:p>
     <w:bookmarkEnd w:id="52"/>
-    <w:bookmarkStart w:id="56" w:name="Xdd8a236add4402b004db85c6ae36a4d2acb01ca"/>
+    <w:bookmarkStart w:id="56" w:name="signatures-provenance-and-inventories"/>
     <w:p>
       <w:pPr>
         <w:pStyle w:val="Heading3"/>
       </w:pPr>
       <w:r>
-        <w:t xml:space="preserve">4.5 Signatures, provenance, and component inventories</w:t>
+        <w:t xml:space="preserve">4.5 Signatures, provenance, and inventories</w:t>
       </w:r>
     </w:p>
     <w:p>
@@ -3048,7 +2896,7 @@
         <w:pStyle w:val="FirstParagraph"/>
       </w:pPr>
       <w:r>
-        <w:t xml:space="preserve">Signatures, provenance, and software inventories describe different properties. A digital signature can authenticate a statement or identify who signed an artifact. Provenance records information about how software was produced. An inventory lists its components. These records are most useful when they refer to the exact artifact being released or deployed.</w:t>
+        <w:t xml:space="preserve">Signatures authenticate statements or signer identity; provenance describes production; a software bill of materials (SBOM) lists components. All should refer to the correct artifact. An immutable digest helps identify the exact contents handled across stages.</w:t>
       </w:r>
     </w:p>
     <w:p>
@@ -3056,23 +2904,7 @@
         <w:pStyle w:val="BodyText"/>
       </w:pPr>
       <w:r>
-        <w:t xml:space="preserve">An immutable digest, a hash used to identify particular file contents, can help establish that different stages handled the same bytes. A release name or changeable tag may not provide the same assurance. Verification also requires checking the signer, the expected producer, and the artifact to which a statement applies. Collecting a signed record without checking these details leaves important questions unanswered.</w:t>
-      </w:r>
-    </w:p>
-    <w:p>
-      <w:pPr>
-        <w:pStyle w:val="BodyText"/>
-      </w:pPr>
-      <w:r>
-        <w:t xml:space="preserve">A software bill of materials (SBOM) can help teams locate affected releases when a new vulnerability is disclosed. It needs to be connected to deployment records and kept useful as information changes. An SBOM does not install a patch or prove that an application cannot be exploited. It supports response by helping teams understand what they use.</w:t>
-      </w:r>
-    </w:p>
-    <w:p>
-      <w:pPr>
-        <w:pStyle w:val="BodyText"/>
-      </w:pPr>
-      <w:r>
-        <w:t xml:space="preserve">Figure 6 separates the questions answered by signatures, provenance, and an SBOM. These records can support one another, but they describe different properties. Their usefulness depends on connecting them to the correct artifact and checking the information before relying on it.</w:t>
+        <w:t xml:space="preserve">An SBOM can help locate affected releases after a vulnerability disclosure. It does not patch software or prove non-exploitability. Similarly, valid signatures and production records do not establish harmless behavior.</w:t>
       </w:r>
     </w:p>
     <w:p>
@@ -3137,14 +2969,6 @@
         </w:drawing>
       </w:r>
     </w:p>
-    <w:p>
-      <w:pPr>
-        <w:pStyle w:val="BodyText"/>
-      </w:pPr>
-      <w:r>
-        <w:t xml:space="preserve">The comparison summarizes the reviewed approaches. It does not imply that any one record proves complete software security.</w:t>
-      </w:r>
-    </w:p>
     <w:bookmarkEnd w:id="56"/>
     <w:bookmarkEnd w:id="57"/>
     <w:bookmarkStart w:id="62" w:name="lessons-from-past-security-incidents"/>
@@ -3161,16 +2985,16 @@
         <w:pStyle w:val="FirstParagraph"/>
       </w:pPr>
       <w:r>
-        <w:t xml:space="preserve">The incidents in this section illustrate different weaknesses in software delivery. SolarWinds and Codecov are discussed using summaries in the reviewed guidance; their primary incident reports were not independently retrieved for this review. The Log4Shell discussion uses CISA’s entry for CVE-2021-44228. These examples help explain security concerns, but they do not establish how frequently each type of failure occurs.</w:t>
+        <w:t xml:space="preserve">SolarWinds and Codecov are discussed using summaries in the reviewed guidance; their primary reports were not independently retrieved. The Log4Shell discussion uses CISA’s vulnerability entry. These cases illustrate mechanisms, not overall incident frequency.</w:t>
       </w:r>
     </w:p>
-    <w:bookmarkStart w:id="58" w:name="Xfc29b9d5f9d72f9ba6c546934ea8bc1b0a1b075"/>
+    <w:bookmarkStart w:id="58" w:name="solarwinds-production-trust"/>
     <w:p>
       <w:pPr>
         <w:pStyle w:val="Heading3"/>
       </w:pPr>
       <w:r>
-        <w:t xml:space="preserve">5.1 SolarWinds: trust in the production process</w:t>
+        <w:t xml:space="preserve">5.1 SolarWinds: production trust</w:t>
       </w:r>
     </w:p>
     <w:p>
@@ -3178,91 +3002,43 @@
         <w:pStyle w:val="FirstParagraph"/>
       </w:pPr>
       <w:r>
-        <w:t xml:space="preserve">The SolarWinds incident shows why the software production process needs protection. Receiving software through a recognized supplier’s release channel does not, on its own, prove that the software is harmless. Trust in a supplier, protection of the build environment, and verification of the final artifact are related but separate issues.</w:t>
+        <w:t xml:space="preserve">SolarWinds illustrates compromise of software production. Protected builds, controlled changes, provenance, and separate release approval address parts of this risk. A valid signature or trusted distribution channel alone does not prove harmless content.</w:t>
+      </w:r>
+    </w:p>
+    <w:bookmarkEnd w:id="58"/>
+    <w:bookmarkStart w:id="59" w:name="codecov-helper-permissions"/>
+    <w:p>
+      <w:pPr>
+        <w:pStyle w:val="Heading3"/>
+      </w:pPr>
+      <w:r>
+        <w:t xml:space="preserve">5.2 Codecov: helper permissions</w:t>
       </w:r>
     </w:p>
     <w:p>
       <w:pPr>
-        <w:pStyle w:val="BodyText"/>
-      </w:pPr>
-      <w:r>
-        <w:t xml:space="preserve">Existing approaches include protecting build systems, restricting changes to production scripts, checking provenance, and separating build permissions from release approval. Independent reproduction of a build can provide further information where it is practical. Even so, a malicious source change could be reproduced and signed correctly.</w:t>
+        <w:pStyle w:val="FirstParagraph"/>
+      </w:pPr>
+      <w:r>
+        <w:t xml:space="preserve">Codecov illustrates how helper code can access sensitive build information. Controlled inputs, isolated execution, and narrow permissions limit exposure. Checking a helper’s origin and restricting what it can access are complementary safeguards.</w:t>
+      </w:r>
+    </w:p>
+    <w:bookmarkEnd w:id="59"/>
+    <w:bookmarkStart w:id="60" w:name="log4shell-vulnerable-dependencies"/>
+    <w:p>
+      <w:pPr>
+        <w:pStyle w:val="Heading3"/>
+      </w:pPr>
+      <w:r>
+        <w:t xml:space="preserve">5.3 Log4Shell: vulnerable dependencies</w:t>
       </w:r>
     </w:p>
     <w:p>
       <w:pPr>
-        <w:pStyle w:val="BodyText"/>
-      </w:pPr>
-      <w:r>
-        <w:t xml:space="preserve">The main lesson is that supply-chain controls address particular risks under particular assumptions. A valid signature is useful information, but it cannot answer every question about the software’s behavior or the trustworthiness of its production.</w:t>
-      </w:r>
-    </w:p>
-    <w:bookmarkEnd w:id="58"/>
-    <w:bookmarkStart w:id="59" w:name="codecov-access-given-to-build-helpers"/>
-    <w:p>
-      <w:pPr>
-        <w:pStyle w:val="Heading3"/>
-      </w:pPr>
-      <w:r>
-        <w:t xml:space="preserve">5.2 Codecov: access given to build helpers</w:t>
-      </w:r>
-    </w:p>
-    <w:p>
-      <w:pPr>
         <w:pStyle w:val="FirstParagraph"/>
       </w:pPr>
       <w:r>
-        <w:t xml:space="preserve">The Codecov incident illustrates the risk of giving externally supplied helper code access to sensitive build information. A helper may perform a small task while still being able to read credentials available to the whole job. That access can create consequences beyond the helper’s intended purpose.</w:t>
-      </w:r>
-    </w:p>
-    <w:p>
-      <w:pPr>
-        <w:pStyle w:val="BodyText"/>
-      </w:pPr>
-      <w:r>
-        <w:t xml:space="preserve">Guidance addresses this risk through controlled inputs, verification of downloaded content, separate execution environments, limited credentials, and network restrictions. Fixing a dependency to a particular version can reduce unexpected changes. Checking it against a trusted integrity value can help detect substitution. Neither measure proves that the selected version is harmless.</w:t>
-      </w:r>
-    </w:p>
-    <w:p>
-      <w:pPr>
-        <w:pStyle w:val="BodyText"/>
-      </w:pPr>
-      <w:r>
-        <w:t xml:space="preserve">This example connects dependency security with access control. Teams need to consider both where helper code comes from and what it can do when executed. Temporary credentials reduce the time available for misuse, but do not remove the need to limit permissions.</w:t>
-      </w:r>
-    </w:p>
-    <w:bookmarkEnd w:id="59"/>
-    <w:bookmarkStart w:id="60" w:name="X5666885f7f1f9bd14f6bdf12bcd1f6dde661237"/>
-    <w:p>
-      <w:pPr>
-        <w:pStyle w:val="Heading3"/>
-      </w:pPr>
-      <w:r>
-        <w:t xml:space="preserve">5.3 Log4Shell: responding to vulnerable dependencies</w:t>
-      </w:r>
-    </w:p>
-    <w:p>
-      <w:pPr>
-        <w:pStyle w:val="FirstParagraph"/>
-      </w:pPr>
-      <w:r>
-        <w:t xml:space="preserve">Log4Shell illustrates a different problem: a genuine and widely used component can contain a serious vulnerability. CISA identifies CVE-2021-44228 in Apache Log4j2 as a known exploited remote-code-execution vulnerability. The issue concerns vulnerable behavior in a legitimate dependency, rather than simply a substituted artifact.</w:t>
-      </w:r>
-    </w:p>
-    <w:p>
-      <w:pPr>
-        <w:pStyle w:val="BodyText"/>
-      </w:pPr>
-      <w:r>
-        <w:t xml:space="preserve">The case highlights the value of knowing which components are used and where they are deployed. Inventories and deployment records can help teams identify potentially affected systems. Teams must also be able to update or contain those systems and assign responsibility for the work.</w:t>
-      </w:r>
-    </w:p>
-    <w:p>
-      <w:pPr>
-        <w:pStyle w:val="BodyText"/>
-      </w:pPr>
-      <w:r>
-        <w:t xml:space="preserve">Configuration and the use of vulnerable functions can help determine exposure. However, an incomplete assessment should not be treated as proof that exploitation is impossible. Dependency security needs continuing attention because new information can change the assessment of software that has already been released.</w:t>
+        <w:t xml:space="preserve">CISA lists CVE-2021-44228 in Apache Log4j2 as a known exploited remote-code-execution vulnerability. Inventories and deployment records help locate affected software, while assigned owners must update or contain it. A genuine component can still be vulnerable.</w:t>
       </w:r>
     </w:p>
     <w:p>
@@ -3641,13 +3417,13 @@
       </w:tr>
     </w:tbl>
     <w:bookmarkEnd w:id="60"/>
-    <w:bookmarkStart w:id="61" w:name="weak-practices-and-better-alternatives"/>
+    <w:bookmarkStart w:id="61" w:name="weak-practices-and-alternatives"/>
     <w:p>
       <w:pPr>
         <w:pStyle w:val="Heading3"/>
       </w:pPr>
       <w:r>
-        <w:t xml:space="preserve">5.4 Weak practices and better alternatives</w:t>
+        <w:t xml:space="preserve">5.4 Weak practices and alternatives</w:t>
       </w:r>
     </w:p>
     <w:p>
@@ -3655,7 +3431,7 @@
         <w:pStyle w:val="FirstParagraph"/>
       </w:pPr>
       <w:r>
-        <w:t xml:space="preserve">Security problems often arise when a practice is used without considering its assumptions or the access it grants. Table 5 summarizes practices discussed in the reviewed guidance and compares them with established alternatives. The table does not estimate how often organizations use these practices.</w:t>
+        <w:t xml:space="preserve">Table 5 compares failure-prone choices with established alternatives. It summarizes guidance rather than estimating how often organizations use each practice.</w:t>
       </w:r>
     </w:p>
     <w:p>
@@ -4278,13 +4054,13 @@
         <w:t xml:space="preserve">6. Common Challenges and Research Gaps</w:t>
       </w:r>
     </w:p>
-    <w:bookmarkStart w:id="63" w:name="detection-coverage-and-context"/>
+    <w:bookmarkStart w:id="63" w:name="detection-coverage"/>
     <w:p>
       <w:pPr>
         <w:pStyle w:val="Heading3"/>
       </w:pPr>
       <w:r>
-        <w:t xml:space="preserve">6.1 Detection coverage and context</w:t>
+        <w:t xml:space="preserve">6.1 Detection coverage</w:t>
       </w:r>
     </w:p>
     <w:p>
@@ -4292,25 +4068,35 @@
         <w:pStyle w:val="FirstParagraph"/>
       </w:pPr>
       <w:r>
-        <w:t xml:space="preserve">The reviewed studies show that automated checks can identify useful warning patterns. Their coverage still depends on supported languages, rules, input files, and deployment information. A tool may understand one part of a system while missing settings added later.</w:t>
+        <w:t xml:space="preserve">Detection depends on supported languages, rules, inputs, and context. Useful findings explain the affected resource and possible consequence. Alert counts alone cannot show whether the most important weaknesses were found.</w:t>
+      </w:r>
+    </w:p>
+    <w:bookmarkEnd w:id="63"/>
+    <w:bookmarkStart w:id="64" w:name="intended-and-actual-infrastructure"/>
+    <w:p>
+      <w:pPr>
+        <w:pStyle w:val="Heading3"/>
+      </w:pPr>
+      <w:r>
+        <w:t xml:space="preserve">6.2 Intended and actual infrastructure</w:t>
       </w:r>
     </w:p>
     <w:p>
       <w:pPr>
-        <w:pStyle w:val="BodyText"/>
-      </w:pPr>
-      <w:r>
-        <w:t xml:space="preserve">An important question is how tools can communicate the assumptions behind a finding. A warning that identifies the affected resource and explains its possible consequence can be easier to investigate than a general label. This connects the accuracy of detection with the practical work of understanding and fixing a problem.</w:t>
+        <w:pStyle w:val="FirstParagraph"/>
+      </w:pPr>
+      <w:r>
+        <w:t xml:space="preserve">Declared configuration, automation behavior, and live state can differ. Defaults, defects, and manual changes complicate this relationship. Static checks and runtime observation help examine different parts of the problem.</w:t>
       </w:r>
     </w:p>
-    <w:bookmarkEnd w:id="63"/>
-    <w:bookmarkStart w:id="64" w:name="X268bad6dea0e3f114a981f81130319d0f2c698d"/>
+    <w:bookmarkEnd w:id="64"/>
+    <w:bookmarkStart w:id="65" w:name="trust-in-security-records"/>
     <w:p>
       <w:pPr>
         <w:pStyle w:val="Heading3"/>
       </w:pPr>
       <w:r>
-        <w:t xml:space="preserve">6.2 Intended configuration and actual infrastructure</w:t>
+        <w:t xml:space="preserve">6.3 Trust in security records</w:t>
       </w:r>
     </w:p>
     <w:p>
@@ -4318,125 +4104,51 @@
         <w:pStyle w:val="FirstParagraph"/>
       </w:pPr>
       <w:r>
-        <w:t xml:space="preserve">Infrastructure security involves the configuration that a team intends to apply, the actions performed by automation, and the state of the running environment. These can differ because of defects, defaults, manual changes, or interactions between services.</w:t>
+        <w:t xml:space="preserve">Records are useful only within their trust assumptions. If one compromised authority creates and approves a statement, both activities may fail together. Build records, application tests, and runtime observations should be interpreted according to what they actually establish.</w:t>
+      </w:r>
+    </w:p>
+    <w:bookmarkEnd w:id="65"/>
+    <w:bookmarkStart w:id="66" w:name="maintenance-and-adoption"/>
+    <w:p>
+      <w:pPr>
+        <w:pStyle w:val="Heading3"/>
+      </w:pPr>
+      <w:r>
+        <w:t xml:space="preserve">6.4 Maintenance and adoption</w:t>
       </w:r>
     </w:p>
     <w:p>
       <w:pPr>
-        <w:pStyle w:val="BodyText"/>
-      </w:pPr>
-      <w:r>
-        <w:t xml:space="preserve">Static checks examine the declared settings. Research on reconciliation examines how automation carries out changes. Live-state monitoring helps identify later differences. The reviewed material suggests that these sources of information are useful together, but one should not be assumed to replace all the others.</w:t>
+        <w:pStyle w:val="FirstParagraph"/>
+      </w:pPr>
+      <w:r>
+        <w:t xml:space="preserve">Rules, dependencies, permissions, and responsibilities change. Controls need continuing maintenance and clear ownership. Overlapping tools can increase work without resolving the most relevant risk, making sustained usability as important as initial installation.</w:t>
+      </w:r>
+    </w:p>
+    <w:bookmarkEnd w:id="66"/>
+    <w:bookmarkStart w:id="70" w:name="monitoring-and-response"/>
+    <w:p>
+      <w:pPr>
+        <w:pStyle w:val="Heading3"/>
+      </w:pPr>
+      <w:r>
+        <w:t xml:space="preserve">6.5 Monitoring and response</w:t>
       </w:r>
     </w:p>
     <w:p>
       <w:pPr>
-        <w:pStyle w:val="BodyText"/>
-      </w:pPr>
-      <w:r>
-        <w:t xml:space="preserve">The remaining challenge is keeping these views connected, especially when several repositories, templates, and service providers are involved. This is a wider issue than checking one configuration file.</w:t>
-      </w:r>
-    </w:p>
-    <w:bookmarkEnd w:id="64"/>
-    <w:bookmarkStart w:id="65" w:name="understanding-security-records-and-trust"/>
-    <w:p>
-      <w:pPr>
-        <w:pStyle w:val="Heading3"/>
-      </w:pPr>
-      <w:r>
-        <w:t xml:space="preserve">6.3 Understanding security records and trust</w:t>
+        <w:pStyle w:val="FirstParagraph"/>
+      </w:pPr>
+      <w:r>
+        <w:t xml:space="preserve">Monitoring provides information; response turns findings into action. Incomplete logs, unclear alerts, or missing owners can delay remediation. New vulnerabilities and configuration changes also require reassessment after deployment.</w:t>
       </w:r>
     </w:p>
     <w:p>
       <w:pPr>
-        <w:pStyle w:val="FirstParagraph"/>
-      </w:pPr>
-      <w:r>
-        <w:t xml:space="preserve">Supply-chain specifications make production steps and artifact relationships easier to record and verify. Their usefulness depends on who creates the records, which identities are trusted, and what checks the receiving system performs.</w:t>
-      </w:r>
-    </w:p>
-    <w:p>
-      <w:pPr>
         <w:pStyle w:val="BodyText"/>
       </w:pPr>
       <w:r>
-        <w:t xml:space="preserve">If the same compromised authority can create and approve a record, both activities may be affected. This does not make signed information worthless. It means that teams need to understand what the record proves and which assumptions it relies on.</w:t>
-      </w:r>
-    </w:p>
-    <w:p>
-      <w:pPr>
-        <w:pStyle w:val="BodyText"/>
-      </w:pPr>
-      <w:r>
-        <w:t xml:space="preserve">Build information, application tests, and observations from a running system answer different questions. Combining them requires careful interpretation. A single score can hide differences in coverage and trust if those details are not retained.</w:t>
-      </w:r>
-    </w:p>
-    <w:bookmarkEnd w:id="65"/>
-    <w:bookmarkStart w:id="66" w:name="tool-maintenance-and-developer-adoption"/>
-    <w:p>
-      <w:pPr>
-        <w:pStyle w:val="Heading3"/>
-      </w:pPr>
-      <w:r>
-        <w:t xml:space="preserve">6.4 Tool maintenance and developer adoption</w:t>
-      </w:r>
-    </w:p>
-    <w:p>
-      <w:pPr>
-        <w:pStyle w:val="FirstParagraph"/>
-      </w:pPr>
-      <w:r>
-        <w:t xml:space="preserve">Security controls need continuing maintenance. Rules and dependencies change, exceptions expire, and teams take on new responsibilities. A tool that worked during initial installation may later become inaccurate, difficult to use, or poorly matched to the system.</w:t>
-      </w:r>
-    </w:p>
-    <w:p>
-      <w:pPr>
-        <w:pStyle w:val="BodyText"/>
-      </w:pPr>
-      <w:r>
-        <w:t xml:space="preserve">The practitioner study also highlights the value of collaboration and activities that cannot be fully automated. Findings need clear explanations and an owner who can act on them. Several overlapping tools can create extra work without resolving the most important risk.</w:t>
-      </w:r>
-    </w:p>
-    <w:p>
-      <w:pPr>
-        <w:pStyle w:val="BodyText"/>
-      </w:pPr>
-      <w:r>
-        <w:t xml:space="preserve">The research gap concerns sustained use as well as initial adoption. More accounts from different organizations would help explain how teams maintain these practices over time.</w:t>
-      </w:r>
-    </w:p>
-    <w:bookmarkEnd w:id="66"/>
-    <w:bookmarkStart w:id="70" w:name="monitoring-and-incident-response"/>
-    <w:p>
-      <w:pPr>
-        <w:pStyle w:val="Heading3"/>
-      </w:pPr>
-      <w:r>
-        <w:t xml:space="preserve">6.5 Monitoring and incident response</w:t>
-      </w:r>
-    </w:p>
-    <w:p>
-      <w:pPr>
-        <w:pStyle w:val="FirstParagraph"/>
-      </w:pPr>
-      <w:r>
-        <w:t xml:space="preserve">Monitoring can reveal changes that earlier checks cannot observe. However, logs may be incomplete, alerts may lack context, and action may be delayed when responsibilities are unclear. Collecting information is therefore only part of operational security.</w:t>
-      </w:r>
-    </w:p>
-    <w:p>
-      <w:pPr>
-        <w:pStyle w:val="BodyText"/>
-      </w:pPr>
-      <w:r>
-        <w:t xml:space="preserve">Teams also need to review software after deployment. A newly disclosed vulnerability or a changed configuration can affect a release that previously passed its checks. Continuous security involves responding to this changing information rather than assuming that a successful build check remains sufficient indefinitely.</w:t>
-      </w:r>
-    </w:p>
-    <w:p>
-      <w:pPr>
-        <w:pStyle w:val="BodyText"/>
-      </w:pPr>
-      <w:r>
-        <w:t xml:space="preserve">Figure 7 groups the reviewed practices by three functions: prevention, detection, and response. This distinction helps explain why finding a weakness is different from limiting the opportunity for misuse or taking action after a problem is identified. The functions overlap, and some controls can support more than one of them.</w:t>
+        <w:t xml:space="preserve">Figure 7 separates prevention, detection, and response. The functions overlap, and a control may support more than one.</w:t>
       </w:r>
     </w:p>
     <w:p>
@@ -4506,7 +4218,7 @@
         <w:pStyle w:val="BodyText"/>
       </w:pPr>
       <w:r>
-        <w:t xml:space="preserve">This is an explanatory grouping of existing practices, not a new security framework or a measured comparison of effectiveness.</w:t>
+        <w:t xml:space="preserve">The grouping explains existing practices and does not introduce a new framework.</w:t>
       </w:r>
     </w:p>
     <w:p>
@@ -5217,13 +4929,13 @@
       </w:tr>
     </w:tbl>
     <w:bookmarkEnd w:id="70"/>
-    <w:bookmarkStart w:id="74" w:name="summary-of-open-questions"/>
+    <w:bookmarkStart w:id="74" w:name="open-questions"/>
     <w:p>
       <w:pPr>
         <w:pStyle w:val="Heading3"/>
       </w:pPr>
       <w:r>
-        <w:t xml:space="preserve">6.6 Summary of open questions</w:t>
+        <w:t xml:space="preserve">6.6 Open questions</w:t>
       </w:r>
     </w:p>
     <w:p>
@@ -5231,7 +4943,7 @@
         <w:pStyle w:val="FirstParagraph"/>
       </w:pPr>
       <w:r>
-        <w:t xml:space="preserve">Figure 8 and Table 7 bring together the main questions identified in the selected material. These are areas that need further attention within this review. They should not be read as proof that no other researchers have studied them.</w:t>
+        <w:t xml:space="preserve">Figure 8 and Table 7 summarize questions raised by the selected sources. Wider literature may already address some of them; the review does not claim that these topics are unstudied.</w:t>
       </w:r>
     </w:p>
     <w:p>
@@ -5294,14 +5006,6 @@
             </a:graphic>
           </wp:inline>
         </w:drawing>
-      </w:r>
-    </w:p>
-    <w:p>
-      <w:pPr>
-        <w:pStyle w:val="BodyText"/>
-      </w:pPr>
-      <w:r>
-        <w:t xml:space="preserve">The figure summarizes the discussion. It contains no performance measurements or new experimental findings.</w:t>
       </w:r>
     </w:p>
     <w:p>
@@ -6022,107 +5726,111 @@
         <w:t xml:space="preserve">7. Discussion and Limitations</w:t>
       </w:r>
     </w:p>
-    <w:bookmarkStart w:id="76" w:name="answers-to-the-research-questions"/>
+    <w:bookmarkStart w:id="76" w:name="answers-to-the-review-questions"/>
     <w:p>
       <w:pPr>
         <w:pStyle w:val="Heading3"/>
       </w:pPr>
       <w:r>
-        <w:t xml:space="preserve">7.1 Answers to the research questions</w:t>
+        <w:t xml:space="preserve">7.1 Answers to the review questions</w:t>
       </w:r>
     </w:p>
     <w:p>
       <w:pPr>
-        <w:pStyle w:val="FirstParagraph"/>
-      </w:pPr>
-      <w:r>
-        <w:t xml:space="preserve">For</w:t>
-      </w:r>
-      <w:r>
-        <w:t xml:space="preserve"> </w:t>
-      </w:r>
+        <w:pStyle w:val="Compact"/>
+        <w:numPr>
+          <w:ilvl w:val="0"/>
+          <w:numId w:val="1004"/>
+        </w:numPr>
+      </w:pPr>
       <w:r>
         <w:rPr>
           <w:b/>
           <w:bCs/>
         </w:rPr>
-        <w:t xml:space="preserve">RQ1</w:t>
-      </w:r>
-      <w:r>
-        <w:t xml:space="preserve">, the reviewed studies describe DevSecOps as both a team practice and a technical process. Collaboration and clear ownership help teams include security in everyday delivery work. Technical controls examine code, dependencies, infrastructure, released artifacts, and running systems.</w:t>
+        <w:t xml:space="preserve">RQ1:</w:t>
+      </w:r>
+      <w:r>
+        <w:t xml:space="preserve"> </w:t>
+      </w:r>
+      <w:r>
+        <w:t xml:space="preserve">Security integration combines teamwork, clear ownership, and technical checks.</w:t>
       </w:r>
     </w:p>
     <w:p>
       <w:pPr>
-        <w:pStyle w:val="BodyText"/>
-      </w:pPr>
-      <w:r>
-        <w:t xml:space="preserve">For</w:t>
-      </w:r>
-      <w:r>
-        <w:t xml:space="preserve"> </w:t>
-      </w:r>
+        <w:pStyle w:val="Compact"/>
+        <w:numPr>
+          <w:ilvl w:val="0"/>
+          <w:numId w:val="1004"/>
+        </w:numPr>
+      </w:pPr>
       <w:r>
         <w:rPr>
           <w:b/>
           <w:bCs/>
         </w:rPr>
-        <w:t xml:space="preserve">RQ2</w:t>
-      </w:r>
-      <w:r>
-        <w:t xml:space="preserve">, different approaches support different stages. Source and configuration checks identify selected weaknesses before deployment. Access controls limit permissions. Supply-chain checks help verify expected production and artifact identity. Monitoring examines conditions after deployment.</w:t>
+        <w:t xml:space="preserve">RQ2:</w:t>
+      </w:r>
+      <w:r>
+        <w:t xml:space="preserve"> </w:t>
+      </w:r>
+      <w:r>
+        <w:t xml:space="preserve">Controls address different stages, from source review to post-deployment response.</w:t>
       </w:r>
     </w:p>
     <w:p>
       <w:pPr>
-        <w:pStyle w:val="BodyText"/>
-      </w:pPr>
-      <w:r>
-        <w:t xml:space="preserve">For</w:t>
-      </w:r>
-      <w:r>
-        <w:t xml:space="preserve"> </w:t>
-      </w:r>
+        <w:pStyle w:val="Compact"/>
+        <w:numPr>
+          <w:ilvl w:val="0"/>
+          <w:numId w:val="1004"/>
+        </w:numPr>
+      </w:pPr>
       <w:r>
         <w:rPr>
           <w:b/>
           <w:bCs/>
         </w:rPr>
-        <w:t xml:space="preserve">RQ3</w:t>
-      </w:r>
-      <w:r>
-        <w:t xml:space="preserve">, the studies provide findings from specific settings, while frameworks describe risks, requirements, or recommended checks. Table 2 compares the studies’ methods and limitations. Table 3 explains why the frameworks serve different purposes and cannot be treated as interchangeable security measures.</w:t>
+        <w:t xml:space="preserve">RQ3:</w:t>
+      </w:r>
+      <w:r>
+        <w:t xml:space="preserve"> </w:t>
+      </w:r>
+      <w:r>
+        <w:t xml:space="preserve">Studies provide setting-specific findings; frameworks define risks and expected practices.</w:t>
       </w:r>
     </w:p>
     <w:p>
       <w:pPr>
-        <w:pStyle w:val="BodyText"/>
-      </w:pPr>
-      <w:r>
-        <w:t xml:space="preserve">For</w:t>
-      </w:r>
-      <w:r>
-        <w:t xml:space="preserve"> </w:t>
-      </w:r>
+        <w:pStyle w:val="Compact"/>
+        <w:numPr>
+          <w:ilvl w:val="0"/>
+          <w:numId w:val="1004"/>
+        </w:numPr>
+      </w:pPr>
       <w:r>
         <w:rPr>
           <w:b/>
           <w:bCs/>
         </w:rPr>
-        <w:t xml:space="preserve">RQ4</w:t>
-      </w:r>
-      <w:r>
-        <w:t xml:space="preserve">, the main remaining issues are detection context, infrastructure behavior, trust in security records, effective permissions, maintenance effort, and response. These questions come from comparing the selected material. A wider search may identify additional work or different conclusions.</w:t>
+        <w:t xml:space="preserve">RQ4:</w:t>
+      </w:r>
+      <w:r>
+        <w:t xml:space="preserve"> </w:t>
+      </w:r>
+      <w:r>
+        <w:t xml:space="preserve">Coverage, infrastructure behavior, trust, permissions, maintenance, and response remain important challenges.</w:t>
       </w:r>
     </w:p>
     <w:bookmarkEnd w:id="76"/>
-    <w:bookmarkStart w:id="77" w:name="what-the-comparison-suggests"/>
+    <w:bookmarkStart w:id="77" w:name="main-interpretation"/>
     <w:p>
       <w:pPr>
         <w:pStyle w:val="Heading3"/>
       </w:pPr>
       <w:r>
-        <w:t xml:space="preserve">7.2 What the comparison suggests</w:t>
+        <w:t xml:space="preserve">7.2 Main interpretation</w:t>
       </w:r>
     </w:p>
     <w:p>
@@ -6130,123 +5838,127 @@
         <w:pStyle w:val="FirstParagraph"/>
       </w:pPr>
       <w:r>
-        <w:t xml:space="preserve">The reviewed material suggests that security cannot be described simply by whether a pipeline has security tools. Real systems have different controls, exceptions, inherited protections, and operating constraints. Comparing approaches requires explaining the risk each one addresses and the questions it leaves open.</w:t>
+        <w:t xml:space="preserve">The reviewed approaches are complementary. Their value depends on context, implementation, and continued use. Counting tools, warnings, or signed records cannot replace understanding which risks are addressed and which remain unresolved.</w:t>
+      </w:r>
+    </w:p>
+    <w:bookmarkEnd w:id="77"/>
+    <w:bookmarkStart w:id="78" w:name="review-limitations"/>
+    <w:p>
+      <w:pPr>
+        <w:pStyle w:val="Heading3"/>
+      </w:pPr>
+      <w:r>
+        <w:t xml:space="preserve">7.3 Review limitations</w:t>
       </w:r>
     </w:p>
     <w:p>
       <w:pPr>
-        <w:pStyle w:val="BodyText"/>
-      </w:pPr>
-      <w:r>
-        <w:t xml:space="preserve">The number of installed tools is also an incomplete measure. Tools may repeat the same checks or rely on the same execution environment. A framework can guide a review without automatically satisfying its requirements. Monitoring can collect information without ensuring that a problem is resolved.</w:t>
-      </w:r>
-    </w:p>
-    <w:p>
-      <w:pPr>
-        <w:pStyle w:val="BodyText"/>
-      </w:pPr>
-      <w:r>
-        <w:t xml:space="preserve">The main lesson is that technical controls and team responsibilities need to work together. Early feedback, limited permissions, artifact verification, configuration checks, and ongoing response address different concerns. Their use should reflect the application, infrastructure, organization, and risks involved.</w:t>
-      </w:r>
-    </w:p>
-    <w:bookmarkEnd w:id="77"/>
-    <w:bookmarkStart w:id="78" w:name="limitations-of-this-review"/>
-    <w:p>
-      <w:pPr>
-        <w:pStyle w:val="Heading3"/>
-      </w:pPr>
-      <w:r>
-        <w:t xml:space="preserve">7.3 Limitations of this review</w:t>
-      </w:r>
-    </w:p>
-    <w:p>
-      <w:pPr>
-        <w:pStyle w:val="FirstParagraph"/>
+        <w:pStyle w:val="Compact"/>
+        <w:numPr>
+          <w:ilvl w:val="0"/>
+          <w:numId w:val="1005"/>
+        </w:numPr>
       </w:pPr>
       <w:r>
         <w:rPr>
           <w:b/>
           <w:bCs/>
         </w:rPr>
-        <w:t xml:space="preserve">Source selection:</w:t>
+        <w:t xml:space="preserve">Selection:</w:t>
       </w:r>
       <w:r>
         <w:t xml:space="preserve"> </w:t>
       </w:r>
       <w:r>
-        <w:t xml:space="preserve">The review uses a selected set of accessible sources rather than a complete systematic search. The five academic studies share a coauthor, so independent perspectives are limited. The discussion cannot represent the whole field.</w:t>
+        <w:t xml:space="preserve">The source set is limited, shares an academic coauthor, and comes from a non-systematic search.</w:t>
       </w:r>
     </w:p>
     <w:p>
       <w:pPr>
-        <w:pStyle w:val="BodyText"/>
+        <w:pStyle w:val="Compact"/>
+        <w:numPr>
+          <w:ilvl w:val="0"/>
+          <w:numId w:val="1005"/>
+        </w:numPr>
       </w:pPr>
       <w:r>
         <w:rPr>
           <w:b/>
           <w:bCs/>
         </w:rPr>
-        <w:t xml:space="preserve">Source versions:</w:t>
+        <w:t xml:space="preserve">Versions:</w:t>
       </w:r>
       <w:r>
         <w:t xml:space="preserve"> </w:t>
       </w:r>
       <w:r>
-        <w:t xml:space="preserve">The available manuscripts may differ from final publications, and standards change over time. Some numerical differences in the source versions require caution. This paper therefore emphasizes consistent qualitative findings and identifies the framework versions reviewed.</w:t>
+        <w:t xml:space="preserve">Author-hosted manuscripts and evolving standards may differ from later publications.</w:t>
       </w:r>
     </w:p>
     <w:p>
       <w:pPr>
-        <w:pStyle w:val="BodyText"/>
+        <w:pStyle w:val="Compact"/>
+        <w:numPr>
+          <w:ilvl w:val="0"/>
+          <w:numId w:val="1005"/>
+        </w:numPr>
       </w:pPr>
       <w:r>
         <w:rPr>
           <w:b/>
           <w:bCs/>
         </w:rPr>
-        <w:t xml:space="preserve">Different evidence types:</w:t>
+        <w:t xml:space="preserve">Evidence:</w:t>
       </w:r>
       <w:r>
         <w:t xml:space="preserve"> </w:t>
       </w:r>
       <w:r>
-        <w:t xml:space="preserve">Surveys, software artifacts, standards, and incidents have different strengths and limitations. Their findings are discussed together, but are not combined into one performance estimate.</w:t>
+        <w:t xml:space="preserve">Surveys, software artifacts, guidance, and incidents support different conclusions.</w:t>
       </w:r>
     </w:p>
     <w:p>
       <w:pPr>
-        <w:pStyle w:val="BodyText"/>
+        <w:pStyle w:val="Compact"/>
+        <w:numPr>
+          <w:ilvl w:val="0"/>
+          <w:numId w:val="1005"/>
+        </w:numPr>
       </w:pPr>
       <w:r>
         <w:rPr>
           <w:b/>
           <w:bCs/>
         </w:rPr>
-        <w:t xml:space="preserve">Incident information:</w:t>
+        <w:t xml:space="preserve">Incidents:</w:t>
       </w:r>
       <w:r>
         <w:t xml:space="preserve"> </w:t>
       </w:r>
       <w:r>
-        <w:t xml:space="preserve">The SolarWinds and Codecov sections rely on summaries in the reviewed guidance. These examples help explain possible failures, but do not show their overall frequency or prove that one set of controls would have prevented an entire attack.</w:t>
+        <w:t xml:space="preserve">Secondary summaries cannot establish frequency or guarantee that particular controls would prevent an entire attack.</w:t>
       </w:r>
     </w:p>
     <w:p>
       <w:pPr>
-        <w:pStyle w:val="BodyText"/>
+        <w:pStyle w:val="Compact"/>
+        <w:numPr>
+          <w:ilvl w:val="0"/>
+          <w:numId w:val="1005"/>
+        </w:numPr>
       </w:pPr>
       <w:r>
         <w:rPr>
           <w:b/>
           <w:bCs/>
         </w:rPr>
-        <w:t xml:space="preserve">Application to other settings:</w:t>
+        <w:t xml:space="preserve">Applicability:</w:t>
       </w:r>
       <w:r>
         <w:t xml:space="preserve"> </w:t>
       </w:r>
       <w:r>
-        <w:t xml:space="preserve">Organizations use different technologies and face different threats. The review does not establish that any approach provides complete protection in every setting.</w:t>
+        <w:t xml:space="preserve">Findings from one setting may not transfer to every organization or technology.</w:t>
       </w:r>
     </w:p>
     <w:bookmarkEnd w:id="78"/>
@@ -6265,7 +5977,7 @@
         <w:pStyle w:val="FirstParagraph"/>
       </w:pPr>
       <w:r>
-        <w:t xml:space="preserve">This paper reviewed selected studies and guidance on security integration in CI/CD pipelines. The academic studies describe teamwork, infrastructure weaknesses, automation defects, and configuration-tool limitations. The frameworks provide different ways to examine application requirements, pipeline risks, dependencies, and artifact verification.</w:t>
+        <w:t xml:space="preserve">The reviewed literature connects organizational responsibility with security across code, infrastructure, artifacts, and operation. Each approach has limits, so DevSecOps requires complementary checks, appropriate access, and continued maintenance.</w:t>
       </w:r>
     </w:p>
     <w:p>
@@ -6273,15 +5985,7 @@
         <w:pStyle w:val="BodyText"/>
       </w:pPr>
       <w:r>
-        <w:t xml:space="preserve">The comparison suggests that each approach should be understood within its scope. A reported practice does not prove effective protection, and a warning does not prove that exploitation has occurred. Similarly, an approved configuration may differ from the live environment, and a valid signature does not guarantee harmless software.</w:t>
-      </w:r>
-    </w:p>
-    <w:p>
-      <w:pPr>
-        <w:pStyle w:val="BodyText"/>
-      </w:pPr>
-      <w:r>
-        <w:t xml:space="preserve">The figures and tables summarize these relationships and the questions that remain open. The main conclusion is that DevSecOps requires several supporting practices, clear responsibilities, and continued maintenance across the delivery lifecycle. Broader literature coverage would strengthen the review and include more independent perspectives. The paper provides a focused discussion of existing work, without claiming new experimental results or a new technical solution.</w:t>
+        <w:t xml:space="preserve">The figures and tables summarize existing knowledge and remaining questions. Broader, independent literature coverage would strengthen the review. No new experimental results or technical solution are claimed.</w:t>
       </w:r>
     </w:p>
     <w:bookmarkEnd w:id="80"/>
@@ -6810,6 +6514,15 @@
     </w:lvlOverride>
   </w:num>
   <w:num w:numId="1002">
+    <w:abstractNumId w:val="991"/>
+  </w:num>
+  <w:num w:numId="1003">
+    <w:abstractNumId w:val="991"/>
+  </w:num>
+  <w:num w:numId="1004">
+    <w:abstractNumId w:val="991"/>
+  </w:num>
+  <w:num w:numId="1005">
     <w:abstractNumId w:val="991"/>
   </w:num>
 </w:numbering>

</xml_diff>